<commit_message>
Update schedule.html with new activity details and styling for plans
</commit_message>
<xml_diff>
--- a/downloads/legend_sheet.docx
+++ b/downloads/legend_sheet.docx
@@ -105,7 +105,31 @@
                 <w:sz w:val="28"/>
                 <w:szCs w:val="28"/>
               </w:rPr>
-              <w:t>指南與圖例卡</w:t>
+              <w:t>指南</w:t>
+            </w:r>
+            <w:proofErr w:type="gramStart"/>
+            <w:r>
+              <w:rPr>
+                <w:rFonts w:ascii="Microsoft JhengHei" w:eastAsia="Microsoft JhengHei" w:hAnsi="Microsoft JhengHei" w:cs="Microsoft JhengHei"/>
+                <w:b/>
+                <w:bCs/>
+                <w:color w:val="FFFFFF"/>
+                <w:sz w:val="28"/>
+                <w:szCs w:val="28"/>
+              </w:rPr>
+              <w:t>與</w:t>
+            </w:r>
+            <w:proofErr w:type="gramEnd"/>
+            <w:r>
+              <w:rPr>
+                <w:rFonts w:ascii="Microsoft JhengHei" w:eastAsia="Microsoft JhengHei" w:hAnsi="Microsoft JhengHei" w:cs="Microsoft JhengHei"/>
+                <w:b/>
+                <w:bCs/>
+                <w:color w:val="FFFFFF"/>
+                <w:sz w:val="28"/>
+                <w:szCs w:val="28"/>
+              </w:rPr>
+              <w:t>圖例卡</w:t>
             </w:r>
           </w:p>
         </w:tc>
@@ -393,6 +417,21 @@
           <w:szCs w:val="24"/>
         </w:rPr>
       </w:pPr>
+    </w:p>
+    <w:p>
+      <w:pPr>
+        <w:pStyle w:val="ListParagraph"/>
+        <w:numPr>
+          <w:ilvl w:val="0"/>
+          <w:numId w:val="7"/>
+        </w:numPr>
+        <w:ind w:rightChars="440" w:right="968"/>
+        <w:rPr>
+          <w:rFonts w:ascii="Aptos" w:eastAsia="Microsoft JhengHei" w:hAnsi="Aptos"/>
+          <w:sz w:val="24"/>
+          <w:szCs w:val="24"/>
+        </w:rPr>
+      </w:pPr>
       <w:r>
         <w:rPr>
           <w:rFonts w:ascii="Aptos" w:eastAsia="Microsoft JhengHei" w:hAnsi="Aptos" w:hint="eastAsia"/>
@@ -403,15 +442,15 @@
         <mc:AlternateContent>
           <mc:Choice Requires="wpg">
             <w:drawing>
-              <wp:anchor distT="0" distB="0" distL="114300" distR="114300" simplePos="0" relativeHeight="251675648" behindDoc="0" locked="0" layoutInCell="1" allowOverlap="1" wp14:anchorId="586256ED" wp14:editId="588D4F82">
+              <wp:anchor distT="0" distB="0" distL="114300" distR="114300" simplePos="0" relativeHeight="251675648" behindDoc="0" locked="0" layoutInCell="1" allowOverlap="1" wp14:anchorId="586256ED" wp14:editId="5890BED4">
                 <wp:simplePos x="0" y="0"/>
                 <wp:positionH relativeFrom="column">
-                  <wp:posOffset>4083050</wp:posOffset>
+                  <wp:posOffset>4187190</wp:posOffset>
                 </wp:positionH>
                 <wp:positionV relativeFrom="paragraph">
-                  <wp:posOffset>57785</wp:posOffset>
+                  <wp:posOffset>26553</wp:posOffset>
                 </wp:positionV>
-                <wp:extent cx="2496185" cy="2440940"/>
+                <wp:extent cx="2291080" cy="2275840"/>
                 <wp:effectExtent l="0" t="0" r="0" b="0"/>
                 <wp:wrapSquare wrapText="bothSides"/>
                 <wp:docPr id="1507067665" name="Group 13"/>
@@ -423,9 +462,9 @@
                       <wpg:grpSpPr>
                         <a:xfrm>
                           <a:off x="0" y="0"/>
-                          <a:ext cx="2496185" cy="2440940"/>
-                          <a:chOff x="0" y="0"/>
-                          <a:chExt cx="2496185" cy="2441050"/>
+                          <a:ext cx="2291080" cy="2275840"/>
+                          <a:chOff x="108578" y="252511"/>
+                          <a:chExt cx="2291470" cy="2276707"/>
                         </a:xfrm>
                       </wpg:grpSpPr>
                       <pic:pic xmlns:pic="http://schemas.openxmlformats.org/drawingml/2006/picture">
@@ -435,23 +474,21 @@
                             <a:picLocks noChangeAspect="1"/>
                           </pic:cNvPicPr>
                         </pic:nvPicPr>
-                        <pic:blipFill rotWithShape="1">
-                          <a:blip r:embed="rId8" cstate="print">
+                        <pic:blipFill>
+                          <a:blip r:embed="rId8">
                             <a:extLst>
                               <a:ext uri="{28A0092B-C50C-407E-A947-70E740481C1C}">
                                 <a14:useLocalDpi xmlns:a14="http://schemas.microsoft.com/office/drawing/2010/main" val="0"/>
                               </a:ext>
                             </a:extLst>
                           </a:blip>
-                          <a:srcRect b="4757"/>
-                          <a:stretch>
-                            <a:fillRect/>
-                          </a:stretch>
+                          <a:srcRect t="2389" b="2389"/>
+                          <a:stretch/>
                         </pic:blipFill>
                         <pic:spPr bwMode="auto">
                           <a:xfrm>
-                            <a:off x="0" y="63610"/>
-                            <a:ext cx="2496185" cy="2377440"/>
+                            <a:off x="198335" y="252511"/>
+                            <a:ext cx="2099516" cy="1999639"/>
                           </a:xfrm>
                           <a:prstGeom prst="rect">
                             <a:avLst/>
@@ -472,8 +509,8 @@
                         <wps:cNvSpPr txBox="1"/>
                         <wps:spPr>
                           <a:xfrm>
-                            <a:off x="441435" y="0"/>
-                            <a:ext cx="1446450" cy="301625"/>
+                            <a:off x="108578" y="2227593"/>
+                            <a:ext cx="2291470" cy="301625"/>
                           </a:xfrm>
                           <a:prstGeom prst="rect">
                             <a:avLst/>
@@ -488,11 +525,25 @@
                             <w:p>
                               <w:pPr>
                                 <w:ind w:left="200"/>
+                                <w:jc w:val="center"/>
                                 <w:rPr>
-                                  <w:rFonts w:ascii="Aptos" w:eastAsia="Microsoft JhengHei" w:hAnsi="Aptos"/>
                                   <w:color w:val="F04E69"/>
                                 </w:rPr>
                               </w:pPr>
+                              <w:r>
+                                <w:rPr>
+                                  <w:rFonts w:eastAsia="DengXian"/>
+                                  <w:lang w:eastAsia="zh-CN"/>
+                                </w:rPr>
+                                <w:t>或</w:t>
+                              </w:r>
+                              <w:r>
+                                <w:rPr>
+                                  <w:rFonts w:eastAsia="DengXian" w:hint="eastAsia"/>
+                                  <w:lang w:eastAsia="zh-CN"/>
+                                </w:rPr>
+                                <w:t>使用：</w:t>
+                              </w:r>
                               <w:hyperlink r:id="rId9" w:tgtFrame="_blank" w:history="1">
                                 <w:r>
                                   <w:rPr>
@@ -500,7 +551,7 @@
                                     <w:rFonts w:ascii="Aptos" w:eastAsia="Microsoft JhengHei" w:hAnsi="Aptos"/>
                                     <w:color w:val="F04E69"/>
                                   </w:rPr>
-                                  <w:t>qr.link/fwkPK</w:t>
+                                  <w:t>qr.link/</w:t>
                                 </w:r>
                                 <w:r>
                                   <w:rPr>
@@ -508,7 +559,7 @@
                                     <w:rFonts w:ascii="Aptos" w:eastAsia="Microsoft JhengHei" w:hAnsi="Aptos"/>
                                     <w:color w:val="F04E69"/>
                                   </w:rPr>
-                                  <w:t>4</w:t>
+                                  <w:t>KCA</w:t>
                                 </w:r>
                                 <w:r>
                                   <w:rPr>
@@ -516,16 +567,9 @@
                                     <w:rFonts w:ascii="Aptos" w:eastAsia="Microsoft JhengHei" w:hAnsi="Aptos"/>
                                     <w:color w:val="F04E69"/>
                                   </w:rPr>
-                                  <w:t>4</w:t>
+                                  <w:t>6OT</w:t>
                                 </w:r>
                               </w:hyperlink>
-                            </w:p>
-                            <w:p>
-                              <w:pPr>
-                                <w:rPr>
-                                  <w:color w:val="F04E69"/>
-                                </w:rPr>
-                              </w:pPr>
                             </w:p>
                           </w:txbxContent>
                         </wps:txbx>
@@ -550,7 +594,7 @@
           </mc:Choice>
           <mc:Fallback>
             <w:pict>
-              <v:group w14:anchorId="586256ED" id="Group 13" o:spid="_x0000_s1026" style="position:absolute;margin-left:321.5pt;margin-top:4.55pt;width:196.55pt;height:192.2pt;z-index:251675648;mso-width-relative:margin;mso-height-relative:margin" coordsize="24961,24410" o:gfxdata="UEsDBBQABgAIAAAAIQCxgme2CgEAABMCAAATAAAAW0NvbnRlbnRfVHlwZXNdLnhtbJSRwU7DMAyG&#10;70i8Q5QralN2QAit3YGOIyA0HiBK3DaicaI4lO3tSbpNgokh7Rjb3+8vyXK1tSObIJBxWPPbsuIM&#10;UDltsK/5++apuOeMokQtR4dQ8x0QXzXXV8vNzgOxRCPVfIjRPwhBagArqXQeMHU6F6yM6Rh64aX6&#10;kD2IRVXdCeUwAsYi5gzeLFvo5OcY2XqbynsTjz1nj/u5vKrmxmY+18WfRICRThDp/WiUjOluYkJ9&#10;4lUcnMpEzjM0GE83SfzMhtz57fRzwYF7SY8ZjAb2KkN8ljaZCx1IwMK1TpX/Z2RJS4XrOqOgbAOt&#10;Z+rodC5buy8MMF0a3ibsDaZjupi/tPkGAAD//wMAUEsDBBQABgAIAAAAIQA4/SH/1gAAAJQBAAAL&#10;AAAAX3JlbHMvLnJlbHOkkMFqwzAMhu+DvYPRfXGawxijTi+j0GvpHsDYimMaW0Yy2fr2M4PBMnrb&#10;Ub/Q94l/f/hMi1qRJVI2sOt6UJgd+ZiDgffL8ekFlFSbvV0oo4EbChzGx4f9GRdb25HMsYhqlCwG&#10;5lrLq9biZkxWOiqY22YiTra2kYMu1l1tQD30/bPm3wwYN0x18gb45AdQl1tp5j/sFB2T0FQ7R0nT&#10;NEV3j6o9feQzro1iOWA14Fm+Q8a1a8+Bvu/d/dMb2JY5uiPbhG/ktn4cqGU/er3pcvwCAAD//wMA&#10;UEsDBBQABgAIAAAAIQAkL7RHgwMAAC0IAAAOAAAAZHJzL2Uyb0RvYy54bWysVdtu4zYQfS/QfyD0&#10;vpEly5cIcRZu0gQLpLtGkyLPNEVZxEokS9KRsl/fQ0pK4tiLbRd9sDxDDudy5gx58bFravLEjRVK&#10;rqLkbBIRLpkqhNytor8ebj4sI2IdlQWtleSr6Jnb6OPlr79ctDrnqapUXXBD4ETavNWrqHJO53Fs&#10;WcUbas+U5hKbpTINdVDNLi4MbeG9qeN0MpnHrTKFNopxa7F63W9Gl8F/WXLmvpSl5Y7Uqwi5ufA1&#10;4bv13/jyguY7Q3Ul2JAG/YksGiokgr64uqaOkr0RR64awYyyqnRnTDWxKkvBeKgB1SSTd9XcGrXX&#10;oZZd3u70C0yA9h1OP+2WfX66NfpebwyQaPUOWATN19KVpvH/yJJ0AbLnF8h45wjDYpqdz5PlLCIM&#10;e2mWTc6zAVRWAfmjc6z6/Tsnk8ksnIzHwPFBOlqwHL8BA0hHGPyYKzjl9oZHg5PmX/loqPm61x/Q&#10;Lk2d2IpauOdAPTTGJyWfNoJtTK8Azo0hosAoJOlsmaXpchoRSRtQH2Y+Opl60vmT3rg/Sn1pd4p9&#10;tUSqq4rKHV9bDfLCj7eOD82DehB3Wwt9I+qaGOUehavuK6oRMgmc9JtDyWD+O+acQK1n5bVi+4ZL&#10;14+Z4TWqV9JWQtuImJw3W44yzaciQfMx4g7xtBHS9TNlDfsTBRBMWbaYLYZFZ7hjlSdViWy9ga+O&#10;5nbcCKWN1fQwWZCTbNs/VIEIdO9UKOokOefTeTLQ7zRBp4sFOBogHWkG7I11t1w1xAsoCVmFEPTp&#10;zg75jSY+c6k80sib5rU8WEAhfiXU4LMeRDTPzxYuODv2AdpRJ/7TDIcGI0vv9g3plrNlcp5mc/Sk&#10;J92Dx+E31ZHQgcHajztxHZYHfvn1PuFXVIapz7Ikm2K+j0c/ybJ5hpkNoz+dJPN09j8CS9pVNJ/C&#10;/UmEXxP2kuu2Hfrhxa0qnlEcxiBcWFazG4Gu3lHrNtTgake+eK7cF3zKWiGIGqSIVMp8O7Xu7dEt&#10;7EakxVOxiuzfe+rvkfqTRB/PgYR/W4KSzRYpFPN2Z/t2R+6bK4XXCC1CdkH09q4exdKo5hGv2tpH&#10;xRaVDLFXkRvFKwcNG3gVGV+vg9xfT3fyXuNS68fec/ahe6RGD8R24MJnNTKH5u/43dv2cK8xZqUI&#10;5H9FFXT2ClgcpPAmQTp49N7qwer1lb/8BwAA//8DAFBLAwQKAAAAAAAAACEAYC2Oky3UAQAt1AEA&#10;FAAAAGRycy9tZWRpYS9pbWFnZTEucG5niVBORw0KGgoAAAANSUhEUgAAAlkAAAJZCAYAAACa+CBH&#10;AAAAAXNSR0IArs4c6QAAAARnQU1BAACxjwv8YQUAAAAJcEhZcwAAIdUAACHVAQSctJ0AAP+lSURB&#10;VHhe7N13fFvV2Tjw5zlHsp09IGWTEpxYkhsybEsytNC991vofrvh1wGWnFCgy00XI7ElQRe0fft2&#10;t9A96HxL6cCSHGcAluQkpIQVKJA9bEvneX5/yHLkY9nW1dW07/fz6afScxQjXene+9xzz3kOgMVi&#10;sVgsFovFYrFYLBaLxWKxWCwWi8VisVgsFovFYrFYLBaLxWKxWCwWi8VisVgsFovFYrFYLBaLxWKx&#10;WCwWi8VisVgsFovFYrFYLBaLxWKxWCwWi8VisVgsFovFYrFYLBaLxWKxWCwWi8VisVgsFovFYrFY&#10;LBaLxWKxWCwWi8VisVgsFovFYrFYLBaLxWKxWCwWi8VisVgsFovFYrFYLBaLxWKxWCwWi8VisVgs&#10;FovFYrFYLBaLxWKxWCwWi8VisVgsFovFYrFYLBaLxWKxWCwWi8VisVgsFovFYrFYLBaLxWKxWCwW&#10;i8VisVgsFovFYrFYLBaLxWKxWCwWi8VisVgsFovFYrFYiqBL6BGLpWJabrfrocJYv2uLpVpYO6Nl&#10;1nJ5lyYAAPX4TOBoC7TrMUtJoNMTeKseLITDduIpPVYIp3vxF/VYpS1vu+VMPWaxzAZWkmWZtZj5&#10;AgBgPV4pzrbNlwLcKfW4YS1X2oXEV+thyzi4cm33Gj1oHAOiKEpCK4VYoscKw5frkUqby3Uv1WMW&#10;y2xgJVmWWUsItOmxSkK0X+/0PrFBjxvlEKsXAvO79bjlFJc3+CN7vbxVjxt13rpbzmLgD+rxCkIh&#10;5YXg6qrTGyrF6Qm+i5DfrsctltlgRt4qKTLhaAu+QaB4GyCdpySdDoA1ud1QQQqZ9jHIPqDkTxJb&#10;r31Qf81s4vAGRlIkTt8T7Tiit1WCyx14HACSsaj/uXqbEY727rsl2F410NtRk7/TcnB5Q/9m4rnx&#10;qO8Mvc0Ih7fng4Lx67GI31zC3hiqb14GQ8X4zlzeoEoqftHuPv/f9bZKcHpCDyHT2bGof47eNhs4&#10;2m47TSC/HRBerIAuAMnz9dfUBmap8DCAeBSU+r+DRw7/ZP+uTc/or7KMZ3qHnilWXLT5OfVz7C8H&#10;hO8IxFnZw5cifpIJ33dif+rexx7bcFJvn0lWtQbbbDaOKKXePdi38Qd6eyW4vAEChuFYxNzJqLk9&#10;xAAAxThhz1Su9iAjoNlthC5vcC8AL4+F/aaOGU1toU/abPAFGlaXxrd1/kNvN8Ll7kkRiBsTUd+n&#10;9bZKcHkCJ1Fw/UBvp6ltVO1WtgXW2kG8F23QobfNFkz8Oya+JV4lCX41mNE/+umc7958gdMTija3&#10;h9ScebYnhcDvzdYECwDAJvBMuw1+v+g824nm9gA5vMH/O3/1jUUaJ1JdpB1vQBQopK1KbmN02RAB&#10;gLlIM8wAGteGlukxSxoW5/qSAXh5ul+7y1RPFgq6HACA68RGvc0Ipzv0fpRSCoGf0tsqBYVoAJDY&#10;2Biq19tqncvb806np+c/ze09VGeDbbM5wQIAQIGvETZxb3N7iJ3ewMiqtsD/6K+ZbWZfQtFyu93h&#10;ufVbLm+AFkjbQ0JAW3o7iKIcdWcOgRLxxQvm1z/b3B4gV2vPN+EycyeSaiKA3ggAgAyv0tsqweVZ&#10;/C4AgSBQODzBl+nt+TrX2z3WC1ZnVzvGt1oAAJze4P/LPG5qC7x3fKsRjEBMAAKb25cm9VYjpBBr&#10;AAAk4uv1NiNQ0C0A1TOgYaUn4AEgBgCwncYf0NtrEJ7r6l7q8AYfaW4PEKL8vhByGYBE6xwynkBh&#10;t9vE+1zunpTLG6DnmTiu1bJZlWS5vMEHXfaTQ1Lw+xGFtVPkJX3wQLv8QPPI0mGHJ7i9qenmBfqr&#10;aonD27M+892jQNG0vvtF+mvKDYX4NgAAokAp8E96e77mg9ibeYw2efb4VgsAgED8WuaxzZbe7oVw&#10;eUMPoJSmZ4O6PKErTz0jdri7vdnt+WpcG1qGCEszzx3e4K/Gv6L8bAy/z+xrUuBX9PZa0twautjV&#10;Hjy+aJF4RiKeZ50/8oNSSkSBLPBPLk9QudzBkP6amWxWJFlOd+Cp5vYeQsRmnMW3A4tASMFrbEsb&#10;jji8oSf1xlohUfZnP7fV2/6a/bzcXN5bd+kxhztwgx6bjqMt0C5RjKtH5PL0jCVdFgBHe/D7eszl&#10;DRoeP7LKE7wIEZuzYy5PoKBxjCjg9lPPBEpp681uz5e9np/IPvGb7RUzy9m25SVCji9L4fT27Mx+&#10;XiuavcFhsMO/EHCOlVwVDgUKlHx1c3uInZ7gd/T2mWhG/1gcntB1UsBNetxSPErx1Ymo78t6vFq5&#10;3D1DKGXOsSEmB0EXxOUO3IBSfEmPAwAolWpPRDeE9XgujetDF9bXwx49DgBAzN+Ih31ZvSWzU7Mn&#10;+F8g8Kd6HACAU3RlrM//DT2e0+hMQD0M6YG//4hFfJfq8dwul83tz0/pUQAAxXw8EfblPQutuT3I&#10;kx3OB56GBtjTMazHS8nRFmiXNnGfHgcAIOJgPOLz6/Fq5PCGnpQIpmagWqamUnRxos9f0IVFLci9&#10;V84ATm9gRKAo2iBiy+SY1PDB1OGl+/s3ndDbqkeXcLUvVVP/4BkGen1Tv6SImr09/wCUz9fj2RTD&#10;PxPhjhfo8WzNnsCnQIjP6/FsKUX7Bk2Whqhlzd7QPwBhym2dIvj7YKTjMj2ezeUNfgwRb9Pj2Yjg&#10;UDzSMeWEkeXLv90w/+wj0/Z8DfSeZQO4QunxbK72wGEEsVCPj8Pq9QPhzt/o4VJweYM/RsQpq+Az&#10;wLZYb0eLHq8WqzzBi+wCds7gU2RVYYIHY5GO1Xp8Jphxv6CVnuCr6wT+To9bSi8F8IHB3o6qmk1y&#10;4bruxoYG2249Pp2TJ4dW7d1x4iGATaS3meHydi8FlF9HQENVuUnRTUkQN2Zqep3VcvvcJeLEFWhw&#10;TJFi2HtSDV+yr+/jNXu7N18rWm5aVCftn5fSdrXeNhWl6Af2k0NXP/DADQcBAJYv72qoP2vhC+1o&#10;+73+2qko4pRC9dzd4Q2PpyNdYsXauRc2zGnYZejAywAjKXXh7q2dY7d+L2zdcp7dZotLxHnjXzy1&#10;Y0eTzn31ux6C/jtMDdTXNTXdvICX1H/Yjniz3jaVlOK/sEq9fVf/xqqpt+TwBh6VKM7V45bSO3rs&#10;xNJHRve7mcLQvl7tnO7Az4UUb9LjlvJRTDsTYf9aPV5qjY1X19uWNL5bSF4PAO9AxEX6awpFQElm&#10;+D4QbTus5v/P/v6r8uqxW9UebLMxX8GE7ULiJXp7YYjTKwHJIuy7iknhXhDil5RS9w5uLU9PRyms&#10;dHevsQu8HEBcisjPL864GTW65FJxtnV1/R0AZiYAvItIxeHI0JcTiU88q78mF0fbllWI9nehUF5E&#10;8bLinUYUsxIPsuA/KeK7d0U7yz1WEh2eniNSyLxv01qKT5G6IRHpnDHDfIq1d1ScwxsclohVs5TE&#10;bMZEynQF7EK13G5vHBk6o24u/wAFXspMnJ5JahQxgECl6F8jqK5vOHo0GottGtFfNQ0E6MJzvQvr&#10;57PciIw3oKCGwt6PYmYEYDwGyMcA4EwA5EImcmS2CbH63xMnD/v37Ww+Ot0tqRqAkC5h0bCQsQMB&#10;P8kI8xALS0iZiRnECWT1H0B8LiIygPFtnfkdEUGfENTKiqmwGYnpvwMpiIANRssiGP8dsVIKBAoC&#10;THCKrht6+vCf9+3blHN82RQQAPjcc7vnLDxb/Dcj3IgIi4GRURjfRultzSkG+Obh5OGN+/tjwwB3&#10;UboPr3wyRXwtlZci/vtgxDflrftaYXgnrUbWzlGdDnNq7mPhyleOd3p7fipQ/pcenwyz+nMs3Ply&#10;PV4ECADscPe8XCDejULkdbJlomFSqdbRZZAwc/I5d033OQsa5INC4GL93+RGzATvj0X8/wvACIAz&#10;eb9BAOBV7ZvbbGT7BwqRc7KDTjGPAODLE+GOe7O3daM7tLAO6H6UYrn+byZDrK6Lhztvyf47kK7T&#10;dY9AvizfJImIfhiP+N+Z9XcQANjpDXxFoPiI/vrJEMP98XBHERbFngABgC9c191or5cDRi52ScEb&#10;49GOX+nbqJwcjttOk0uoam5XWtKI4al4uGPcbOlalNdOXs1cnsBQvgdQS/lVYsZeLme13D53ad3Q&#10;cT2uO5aSZ+3r+1hZxiu5PMF7UeCUM9EI+MZ4r+8Tejybyx24CqX4uh7PpogPJSK+KQdjz2TN3tAd&#10;gPAhPZ6NSP02Hul8nR7P5nD3vFxK+Uc9no2YD8fDB5dONZ6vad1tZ9saaHSs1uSGFSyaem3NK+3N&#10;7c3T9rCmhlMXDW7b8IAeL4Umd88nbFJ+UY9nYwVHY9GOqQfrl4l1kV69ZsJxqypOgIWydo7aMDDS&#10;UAf9VxV1oG2hXJ6eFIqJt2uYic2uP1cIpyfUIwTknM6uGLoS4Y7P6fFcmtb1tNoaZJ8eBwBIknpw&#10;V6RzRs7cMcLhDnxGSrFJjwMAMPOtsbAv7yVRJjv2GL36dnkDlOv2MRGk4pGOvGdHuzyB1GQ9o4cf&#10;fXjuY48VVsOrUM7W7ncJu+17ehzyTGbLYfmawOL5c8WMGmQ9EylQTyV6O/Pep6pN2U8qxeLyBIyO&#10;I7BUSHPd0LRX2uUSi3TmHCsWC/tznqBKLR7p6CSmCT0VRPCLfBMsAIDB7Z1bVYo26HEiPmQlWGmJ&#10;qP9zimlCMUxF6hEjCRYAQDKVezkmIwkWAMBQcjjnVbqRBAsAYLIxkCMpWlfuBAsAIL51w/eJuUeP&#10;K4anqiHBAgCwEqzaIEGe4XQH/6nHa0VNJllOT+jn1i3C2uLyBia9dVJuKaJxy+gQ0dvMjAdxtHVP&#10;eRtqOvGwf8JMyHik4816bDqJPn8PEY8rbhmv8a52XZM7aKj0hS7XzNdEpDPvcVYZu/o6/sBM/86O&#10;FXJrfG//9YeBOKviO0BKpV6c/Txfw8PDjdnPlaIDu/v8FVu/Mh72bcisW5iRMJiElspkPZGW6iQk&#10;XtLUGsj7orOa1FyStbKl+9VCgFWmocYgCnR5At/V45UwGPH/7dT0fKB4xP8T7SWGCJTP02NGseKr&#10;0yckYpVKGU6wMk4Ar8w8VgSPjG+tfYJ4tdlhDkz8/sxjxdg5vjV/sfChRgAmSA9yL/h2+EDEN7Zg&#10;NTPxYHTDPeNfkZ892z7+kCI4lHmeiPpPG/8KYxzuno/qMaNSI/Bi5nSipZg/q7dXgsvTU5axaZbi&#10;stnFp891dY+tzVkrai7JqquzWYVGaxQKfteKluD5erwSkiR+DOlerB/rbUahxGtWtNw0oTfKiFjU&#10;9xUAwcwAib4Nv9Db87Uv4n8483jk6ZMXjW+tfSzwFUtW3GRqwHQs4vt2JsNOhK8JaM0GbKJ0XQ2g&#10;eLh3jt5qhGL+NQAAEN6ptxkhWb0VAEAxmb5Fj0I+H+CynLch8zXY7/9bZsxZInxwylUJymGVJ/Aq&#10;FOYviiyVsWiRLa9abtWkppIsh7fH9IGjUMzErJQaffwsET2kmGIM/EBV/495gAkGiekxYjqRLvin&#10;VObqsrwkzqnjsSSgkg6fTPqYiUmIr+hthahH2wo9ZhADgCDisZ6Igo1+s3v3Xn9Yb6pxKCW6zzqj&#10;wXR5DVLjb6sWihl+CUAIcJepOmPEqR8CADw7lPyA3mbEQLTzT6yUAoWm16oUyG9b5X3jgB43hlEx&#10;HwcAmmq2ZbnYhbhbj5UHMTOxUpxiIqWYnmTmXbVwDlFMsdH3+iQRp5TiVKbXXf+U5eDyBgf1WDUz&#10;1e1eTk3u4CdsEqecFlx8igEQiPCrlFS3j06BHlerZvSFtbAdM+8ZAAAc7m4PgPyYlPyO4lUQzw8T&#10;98Yivov1eDmtbL1xhd3WsCel6NW7+jb8QW83ork9xMWoQdTcHmJWfDQW9ZnqqcmMNylkjFC1a24P&#10;ECs8ZnYbubxBhYjC7DZyejZ7EGz/mmzgeb6cbYEPC5v46lAyef5DWzc+qrcb4fKG1MjI8Ko92z7+&#10;kN5mRHN7iIsx69blCf6CGJ6XiPrGbmVXgssbfBoRT9fjpUXM6XRkY2pYfG/Pjo6ntXNItct+n2Pn&#10;vbNabp+7yH7yFQLoZkRszLfmW7GkkslLBrduzLkAebUxtfOUU7kTLCIaGujtFAO9fhGP+D6WVWMm&#10;k1hlZ/FcA/8b9z4T0Q3hRNT3roFevxjo7RRENDT2qhJDge3LXF+u6NIVdlvDFxEF2oXtbXqbQQgA&#10;IBCKcGuOCYDm6tFCNbq7TCUi1eaMizbPIwUEgk3/dgqplJ/LE08eGyRik709ACD5JQAA9Xa5RW8y&#10;CAEIzSZYAF02gPRYSr3FqOND7GeAfj1eTg53z8vLnWARpX400OsXsbBfJCL+ntEEC3Idj6v4f9nv&#10;c+y97++/6kQi7PtFLNy5aqDXLw48fGAeMRU8LtEom93+Lz1WrYpyoCk1l7vnP3qsVJj4lwO9HRiP&#10;+E2Nsag18Yh/zkC4A4nUl/W2Uli2SB3VY2XF+Mb0/9F/601GuNzBotySc7h7Xg7ACAKFo23LKr29&#10;EBIXTZhCX8uWNNi/JKSQ6SVuCudy3zo2e2+lu+c141uNObxv0yEQ8CM9btTYigQEb9DbDGJiLGjg&#10;fDane+nb048Ur179VVMzVPft9D9MzBVdi266ArLFRIqvS59DNrxDb5up9u/fdCIe9tcN9J5lI+ax&#10;hcxLyeUJFjx2tZxqIclClFDyKxAGgNSBoYWxiG9Wz1yMRzqv5sMH6llRSeuQmb48NqFp3c1no8AG&#10;AABEgBUXbX6O/pp8ocQFmcfN7sDvx7fmT0rxRwCBiAJR5i4qmg+nJzjWhW4T0tT4nmojJV+dfoTC&#10;2R74ud6eLxI09j3ZEX81vtUwVGDubyxvu2WsrAEKqGtcHTp3/CuMIcZb9ZhRQsLoTGCE1Lzk3/R2&#10;oxqGhvbpsXJxtd86oX5cKSjg6EBvB8ajvlv0ttnjChUP+y7kETZcFsUoFOkL5WpX9UmWyxt4oNTj&#10;hRSl/ifW24GDg9dVtnelSsRim0ZiUf8cSvGH9bZicnlDpgYLF8rW0JC1nInAOfPqnspuz5fTG+gd&#10;F5DilWe1dBm+3dfYuvl12WmnQLHQuW6z4YNU49rQMiGwPTvm8gR+mf28Vrnaev6UPe5DgHhTU9PN&#10;YwluvlZ5ghdlr62HQkiH57aXjX+VIbw74o/rQSPm2+r3n3omsH4+mBqTtSu9FmDBmr3Bb596JlAg&#10;XOQyOSv4gQduqFjhTwQ2ewt2WqkTdEGi1+fR47NVrN/3yEBvByriktZpc7aHfqDHqk11J1ktt9sR&#10;waWHi0kleXUismFGXfEXS7zP93U1rM7W48WCCGJlS7dbj5eSyx3Ypscg3QNkaAyL0x38uEDh1eNL&#10;65ZOuz5ithVrgyvr7XXp6ftZREPdwwC3G6r6XT8HJtxWRyHe4GgN1fRq9k5P8NVokxMSIdvShgmV&#10;8qdyxkUb5tkFTqj4LgX96cJ13eMKeZaLyxPIuX5hszsY0WPl4Fjf7QXE9+pxrMOK9USZ4fT2fFyP&#10;FRMTDw2MNNQN7jxVOsVySiLiWzei6D16vFgEgNkxtSVX0h4is5ye4A+FwNGxAcVVjFkzs8lUa6OZ&#10;QjwyEPGVpXq/q73nMIKccjD4QG+HyBrkmdMqb8+f7DjxpJ/t2BMH5uzbt2nKW67P84YuY4Qpb8Uk&#10;R5LOXf0bE3o82zLXl+c/Z5oxbkxwSyzScZ0er3YOd88WKeWUt3uePDC08NlpeqEdrcHnSTtOWYQy&#10;n21dRNjcHpqypAGxejYe7iz5UImMJs+t77UJzurFmujkCC/f2++rmSK3pazsTkwn4mH/PD1umcjV&#10;FliLNrFdjxeDYvWhRLjzm3q8WlR1ktXcHqBSTA21EqzCZKa963Gz8klICtdlc3oXhwSKj+gtkyFF&#10;34xHD12l1/VxuXs+ihJvSz+b7ndJrEhsTTG8eU+04/GsxA1XuXteLwT+UKLI69YiKz5KhK9LbL3m&#10;7wBjg77R2fZlF0r1W0RaPv37ASBiIuIPDPb5/1dvqzZN7sD7bVJ8S49PhgkGU6nkG3f1bxzUtvWL&#10;hMDf5LetFSuWJ5BTV8QjG34/XbJdmC7hbF/6PwLov/P5zgCImTAUi/xro9laXJNxuANvBwHfkSjy&#10;6jllhv3E8LpEpGNbabZRcZy/vuesBfXyCT1eDIohngh3lPQuy0yzsu2WtXW2+hIkWsQDvdV7Ps9j&#10;J6+Mla03rqizN+zJ70BkTD69FZZcLpfN7c8vShHHU4iJxHfjkY4JtygK4Wr78plgU39ngmWItCg9&#10;E43R2O+IOJ3MMDLBCCDUpSe0YR7JlU4xgETFPCKYZbo3kNj430kjghQgsUBhL+zvpP8NMxAwPUuM&#10;WxNR36v1V5Wbsz3wAyB8KSIvS5cNKPyzEVMSWKAQUGDtqtFtRKQAxX9SQL/ZFfZfpb8qHyvWBlfO&#10;qYO7WfBzEMXCTO09Y5+NGIAhXVwejgLgk+r4ybcMPnDDlD1zk3F4Q/8jgV7FIJ6DCMLUtgZKAsNT&#10;SPSNWHRDVa0t5/B2/1ui7bl63CxF6lgi0ml4PKAFwOG+9e1S8g/1uBnMRLHwL+sB7i3yuak4qjb7&#10;k3Luj43v+NNTSV5tJViFukudGGJTBTcnEigE/XexEn7FI23AtAuBZfpkjcL47+jUv0Mh6tN/RxpM&#10;1DLSkzYkQt2p262F/J00IcAmEEd7HAr5O+l/gwgCBI4IBHK29TTrryqns1q6TkeGRYh44lRdpsI/&#10;mwC0F55gwaltJIQEhiM2xEXLlwcW66/KR4Md3SxgEBhGB9sX8jtK//4QBQJzPQDsxjkNBS0Ns2rV&#10;ltMF8FwGPJJOsMD0tgYQB1jgBQBdYxMKqoFEYXjySD6sBKtwieg1P2Li8ROGTEIUwuV+/YRxrdWi&#10;gJ2rPJrbe6jYswpVir6d6POPLQ5rKYzTHfynkHiJHjeBBno7ij/ea7QitxD2sNGfemqEXjTY7x8b&#10;L7W87ZYz5wj7I1Lkd0slg4heHY/4x5V2cHpDPxJobMAmM38xFvZ9KjvW5A1dbUMwNF2fiXcNpYbc&#10;e/urd8md81ffuGTevPrdAqWhBY6Z6H2xyPhboc3eYDegsUWgmel7sbDfVP20yTS5Qy+ySfirHp8O&#10;QXJ9vHdj0W+1LF/e1TDvrMX3YI5JHFNRxDckIr6K1r6ayhkXbZ53+ry6I8XuSDh5fOSMvfdfO2GC&#10;icWYUoyVM7t6Q6lU5ZtqXBtalmumlBkMALEq/RJqUbF3EiL+XDzi69LjxeJy97wFpbxLj+uIOBiP&#10;+Px6PONcV9fShQsXPzNdJWxSsC0e7WjR49mc7YERAVMnbUxwNBbpmHKwvssbeAZRTJmQMDPFwr6S&#10;JLKl5PKG1Kkel9xUKvVUom/DWK2pXByewFEpxJSV4ploOBbxN+jxUmh2B28CidNORFApfl2iz/db&#10;PV4KLm+ApvtdA8CBgd6OKX9r1cDRFrhL2sRb9LgZnKLvxfpKk3zPNqUYL1etw4CmPHhVir2eX6HH&#10;zHrqwNCUJyqLMUqp1+oxUxDep4eKKRbt/OlIUl2ox7ONJNWFUyVYAACPxTYdmG7SBAFcO12CBQAQ&#10;7/XXKcV79HgGK942XYIFABAL+08n4ikXuq7FBAsAIBaeuoeTWd06XYIFAJCI+BcQq/v1eAYTPFiu&#10;BAsAYCDquz6VJIcez3Zy5OTyciVYkP4dCWaetIdTMf+6FhIsSN8Of4keM8tKsIrnkW2d+5nJ/HJU&#10;WVzeUNHzhmKY8mRRMYjf0UNmMPEvp5vibTEmEe38nR4zAxHPK3XP6u6tnXtTkyTbQ0Oplbu3dua9&#10;HMRA74GcJ38CDsZ7O/IufpiI+lYS5F7zKxb1TZuoZcQjvo8pgpyF/0av8GrWQO81Od8/A/8lFu7s&#10;0OOTiYc7c44nJKZkLNKxWo+X2uBW/yBT8gV6HADgmeMj8/f2X1/2UgmxsC/n2DOl1MFE2Gd2yZ+y&#10;QeCc+3mhho4kTRVjtUwUCx8qwnqvpzCob+ixapDz4FVpYprbA0bN9qVySoWI8j7BTQcBCKBryltn&#10;xTA4eN1RpeD72TFi3vrQ9g2T9ijltomIUuPWvWOAk/HeqXvCcon3+icMGC5kfEEi0rGOmcZ1l4t0&#10;713BXeguT7CkPYz5QdaL4iqCVKzXN2Wtslxybdd4eOL2N8JMIdNYZOM/WdG4Qp9E9J2n7r/WUFHb&#10;bKu83a/UY0bk2kaJaOdSPWbE8jVdOZO3Ujh/9Y1LUBZvPC8z0EMDG01V4bfksomKuXybQGlqOapS&#10;KWoyU42YivclWsaLR/yGBl1PhZmwqW1uUa9sJpOIdrw7PZUeAAAoHvYVVHU+Htlwd3ZSM3ISCp7N&#10;RIrHBmxTisYNcDdCKXxX5jEDwAMGeudyQKLKLuybkdjWuT9dNiAtSSfXjn9F/oj4xszjlOKfjG81&#10;rs4uTF3ExaL3jbuNHY/4TZUzQZIbzPYKnzr5EStmQxMHcmmQp5+nx0qlYY5tHTOZ+vzjILxVD1mK&#10;IxY9NOOLuc7wJEtxLOKfo0ctxUOgClr3T4cIIMWcsi3/QgS/g/RYnHvM9PQkidZlHu/Z0fH0+Nb8&#10;xaNzrgQgZqVUvM//Rb09X4N9vrEaNMdTw2eNbzWMpU0UvHh2sR0+TKczkWImfqjv+oLHc8Qjvk9k&#10;Hg9GfYZmeepWtNy0CABN/Q2Au1SmN4uI/6i3GtMlbBJfauY3DQBAqeMr0o8EJsK+gN5uROPqm86F&#10;utS1erxUJNa1Y5FSrNEJUz/V45Zi2UTZF08zURUmWV1FfE9F2tMskzpx4vCUg3fzJ5CQLtWjpTIy&#10;MuRnJk4C9+htRuyObtgJAMCKB/U2Y65KAggkwJN6S6H29X38ST1mxAWe4Bl6rJIei204gAIEgzih&#10;txnFDFMuaZMvGzasQgEF96qNEdwNAJBMjnxUbzJmEzEzrbpo8wV6ixGJbZ/aD+keZtMnQNu8hoAE&#10;LOPiyfSSwmp/TURMpvYhy/SUApMXFtWtiAlNcTS1L/kvPVYoIviqHqsWR7e3/erw9taTh7e10dEd&#10;bp7sf4d3uEeO9LceO/BQyyL9b1SDfTs3HdJjJrykXJnxieN1hwAYUEHBvU/ZmFKm19hURA+hEKZL&#10;lxBhUI8Voo7gJUxUkqVcCoQAAEz4Ib3BKAIuSnVoFLABMV2K3YxYuPM2AIA92z5uaKHyXBARoEE+&#10;X49XBiMQvxIRV+ktJYIEONa7bFYi7DfbG1wSfCfUHelvOXZkW9vw0R1tE84bY+ePbW10ZHvryaM7&#10;W/+p/41qgZy6sRjJPADAKk9wbLhEtai6JAsVF6W2CTMxK/y6Hq+UI/1tlx7e1vLo4W1uOrrDzYD4&#10;eoGiQYipO7YFgB2lmGc/Kg+ldxo3Hd22/hr9dTOBRCzb/fnFi2EjIoKUUJQV4o8Pz31YjxmFBH2k&#10;6PN63KijR5OfJ+atetwoKfgKFEI6PYEy9kJMiVnh9pPDz44r7loIiWhqsPsotEm+AkBwuS4OpuNc&#10;e/NKAACU8tN6m0FF+jzIQuDcrDGQJWdDLNsg+3I6sn39lZnk6dgq9zBKOQ8F1k31VQmBiCgagMUl&#10;py7c20YOb2up+FJaGfG+6L+gSD3LEowVeS6HqkuyhKCCBw+PQ0yJrb4H9XC5Hd3RcvvhbW5ihL8J&#10;Ic8VYoo9Ig9CAIKwhQ7taEkd3daWuOceM8uHFIdSZLr3BSBdMNPsWJJ8Mcr3AAhE4A/obUYxwdcf&#10;eeAjB/W4UaToS4N9h76rx416LLbhIAL8QY8bhvg6AACG6rlYIUG/37fzs5PWcspHozs0NgtpVevm&#10;tvGthmR+q8LlDphNaopzC7PB/lMAEDaggmc8AgCsWhdcDQCQXrPTBFdXHTAzAMKFbYF2vbkkTB1h&#10;q8+x7W33H+p3K2ZbUfbD9FJI8reHtrWpo9vafqa3l99dCopUUYABy16KZTpF+WBFRXLawoL5QCll&#10;JXe3w/3r3n14m5sA5JVCAE7XY2WUBClBYFPrEnfyyI62x3lrS8nLH0xGoCx4NlxFXNZlk0KcCenb&#10;PfXnntttcnIER/VIIQa3bXggPRDUNB5iMJWsNTZeXY+YnqElBeWsL1UJqNT96cW7C2cDvifzWIi6&#10;gpNRp/vWD4ytcyjFJr3dKGJ4TI8ZJTBzkhG4fE1h6y0CANgbcGf6EYLTEyx4QV/ngiX/m16zU2CD&#10;Tdynt5fC6MWaacypiB4rF2YQR3as356+QMfVUoIwe4GeTQhAKVCAwDcf3uamo/2tFV3cmwGP6LGZ&#10;ovqSrCJhpmfL1SuS7cDWFYsOb2sbFtL+3WLuFFNBwLOP2eTIkR2tN+ht5UBE+/VYNXOdXJp1a0/g&#10;wvNEwTWJIF2H7dt6rNL2Rny79ZgR9csah06tHSrR2Rb6k/6aSoj3XXunHjOmS0iJY708UsLSMy76&#10;bkG3qYXkb2Y/d7pDG7OfG5WIdJjqxXd5e76XPeB7XgM8M/4V+XG0B7NWcxAoBL69kAuRxsZQvRA8&#10;7vaNozVY0MLWxhTnsEskQnqsHI7tbHvvsZ1uhWBbW45ziBCAIMWnD29vTZ3oX2fqN1goBCzK3ZBq&#10;NIOTLDhUtL0tT4d3tL7Objv9kBBFGe9hGIL4Urr3rMwkFXUNqlJyuINfRQnnZMcQBLq8wbuzY7OZ&#10;wx2YMOZJ2OBly11fLkovcyU1ty+dMJD/9HkHj+mx6TS3BydcwAkJm5e33VKRbbT8sm83IMpxg35R&#10;COnyBBPZsXxIwN/osUXn2QzP6KxfBkP6LD9pxweyn1czlFC0mb75Ory9ZT8zVuSiTaCQStofPrLN&#10;3a23lRoymLrQrWYzNslCFGUtQnp0e8u9AsSv9Xi5CQF4dId7wgmglJLDXBNdvU5v8A4p8cN6HAAA&#10;EV/l8oamXP9vNnC1B/8spchZMXz+IrXf5QmYntlXCWe13D53qkXNm9tDvPyyrrzWLnR5Aicnu36b&#10;b6vf7/AEDVeiN8PpCb56/siRnAkBCmxyeXt26fFcLvAEz5hqGzm9gTxPhHdKlzsw6ezN5vYQn9Vy&#10;+1w9Xm2IoJgzp6d1dIebBRZnuIwZKKDz2PbW0dvF5cHAM3bZuxmbZAEDl+t24ZHt7kcAZdlqPOXj&#10;6A4384NQlh61epEc0WPV5LSmmxe4vEElcOqp/4jwEacnlGxad9u4JVxmA0dr8HkuTyCFgC/V27Kh&#10;EHe4vIGCbkNVisMd+P3SuqFpE4T5I0tPOj3BScdoubzB9zS3hxiFmDIZkwL/5PQGTZdiyIfLG3pC&#10;CJxyHVFEudLlDakVLT2X6G0Zrvbg/XMFTlkTSqCY29weZKcnNLY6gc7R1vOr5vb9KZQi59qeGUvr&#10;ho47vcE+PV5VlCrbce3w9tZJk9JKYBQXHdnW+qweLxVinnb/rFW5L8cqyOUOPowSTd8XZoIHY5GO&#10;i0qdaB3Z1vYICizbkhFGzV8TFYil3QauluD5WIfj1l8rBDNTLOyb8uA8vS7R1Lp4pUDxYkC+VUgs&#10;ePYlAzExbuAR9ZfBbUfiAJuq6kBYsMu6bKuG5rkkznmLQDI1K44VpBjxfUwj0UTf0T1FGrhfsOVr&#10;Aosb7MIl7fglBHWpfrsqf8TEEAEQDwikD5r5O4rFfzDJ71cyGd8Vvfbf+ivytaIleH6DlB7G5E+E&#10;QCj8PTGQgpsB8Y1C0KrC/w4xE/6KGaSQ/Fpzf0cMqBRdTXbavTu84XH9FQagyxtKYRFmq6WSyUsG&#10;t24s+WD9ct95MITpwIJ1W0/Tw8Xm9AT/IAS+Qo8bpQgeMTu2sdgK3ClKp5aSrKPb2/4GiGVbCqYQ&#10;xKQWrdtacKKRj2pIspavCSxuaJBvlKzeCwIuRQRgQkaBBR9siZiEYAQQyAz9BHxbauj43Xt2fLIo&#10;BUzLbZV78wWItsskio8hQsvoSdLUNkojBhCoiP/KIL43mKr/AfRfldRfVUqOtuCbpBQeJvV+lHA6&#10;AAAzMmJhn42ZKVNklBSQmKZnZnLpIovMDERCCYTfEvIvEmH/9/I9Njm8gf9GgrewwFcIIDuimQQL&#10;gIkJRXYB1cL+1vi/I7jwOyOZbYQMzEki+CEI/FMi4vux/so81FSSdXhb23ClxvDmi0ANLFrbX9IJ&#10;C1aSVUa1kmQd3e6+HBBMznQqD2aAheuiJfuuqyHJ0mDme3e4g9+XEt+pv2A6KsW/TvT53pB+1iUq&#10;3UNTfKc+k8Pds0dKXGHkZMtMDAybYxH/delIVW0jAQB07prucxbNkXsB2Z7/ZyMmhtTJFKx+eKt/&#10;dKmkq+sd3hUPS0yX/cgXMxABvS8R9mfKaYz9Lgs09u+bPKFPSqTPI+b7uSDdq6bw6UTUN7ZckqO1&#10;+zKU8i9CsMx/GwEw0XDs8UeWwGOB9Fiws7rmus5ffACFqNdfOxUCSqYIXrA74s+USzC9jWolyTq0&#10;reVJKWRVLV01GUb67sI1W4tSuDkXK8kqo1pIsg79Y/USuWDOAT1ezZjptoXrtpakUnwVJlkTONqD&#10;v5KAr9fjOkW8IxHxFW1Zjlri8gQeRyGmHY9GBD+MRzoMJ66V4my7qVnY5uRVmDjJ6vm7wp3/0uMA&#10;ANByu91pG/qPEDBt/Ski+FQ80lHwQt/5WuUN3G5HcaUe1zHzM7Gw7zmTHQ+b3D1vsUl5lx7PZfhp&#10;WLRnT0fOyS5nt9122hIb5TVmjxVfEYv68vpvGlATSdbx7S1XEcqiFBctF4KhpkVr789rEoVRMznJ&#10;Mv1DnI1wXsOUA0SrEaK4Wo/NJole3xsU05RXYqzo/83WBAsAIBbxn0NEUxbVTKVEWy0lWAAA8b7r&#10;BwZ6D0ybvA/0HpCTJlgAAP1XJeORjiWKaMqSD8mR5LJyJFgAALvC/qs4JadeX09xNBb2LZsswQIA&#10;GIx2/nSg95opzwfMdGSgtwMnS7AAAJ7ou/rZgd4OVKSm3EYDvR2iBAlWzai1BAsAAKg+rocs05ty&#10;p7JMdLi/9f0AWLHq6mZU2wyWckuE/d9VKnWbHgcAIOaeWNR/ux6fbeIR/2cVQ85SJIpVy2Df1abX&#10;RKyMTTTQ25Gz554ZRtvyu92ZiPgXKIJH9DgAwJGhoXN29W/MqyenWGJ9H3vy6OP7l+pxAAAFFBuI&#10;+vJcexJ5smRUKU7Fwv68F6lPRDoX6LE0htHvYdKEb6Y7tr2l5i7SAQCEQHFkR2vO46dlclaSZRSK&#10;b5ajCm8pCBTy0PYWtx6fTRLRDdcQ4YSB6/Gwb4Mem60S4Y7RsWinKOZfJ8Kd2/R4vpye9MLFZjWt&#10;u3na25lTGejtmHDMO66GxxWnzUf2LYlMtqBYffbR7dcVXJi3uTXwZj2Wr0ceuemgIhrXO8IMlOj1&#10;N2fHpreJkkmecIw4+dTBSZKmyQ30DkwY0J0kqJolmirh6Pa2ZsbaGIeVC5P4qB6zTG3CAccyucM7&#10;2r5cqwlWhkRZsfW4qkU8cs1zMjOaAIgHeg8YGqxbOl1F2x+b2gLv1WNGpHsb1Og2UpwIZyYBFAZx&#10;juHK47mIurq36DGDOEWpHZknROqJfX0fL6hnIUX0BgAam6aXCHdOeat1OmSD7+kxIxIR/4eZM79r&#10;gFi4I2ev1HR2bfVl1a8iJuZv7Nu3qYDiznckSfE3Mu+JmJK7Ir779VfNKoh5jQ2sVkIAHtnuLspa&#10;rbNF0Q7qswEr/Igeq0WHd7Y26bHZhhVuBwAgxscANpWt6OBUnJ7FV61cF3DqcaPOuGjzPCG4RY8b&#10;l167UBGOLahcKEQuyrGGAZ+/fHl+ldkno561eTOPaSTZNr41f4MR/685k6qnyHQpF0RRjCroo7d6&#10;TyVbhUglyZF+JDAe9k07sH4y8ajvSkSRfi88YrBXbWZhBkFU+7dJiaBVj1kmV5QD32xwZGvL87Gm&#10;+7BOEYz/0GOzjSK8mpmYSXxKb6sUBn6fzQaf0eNGLQH7BYjC9AUBKfo8AFDi8UeyFgyuKATg19ie&#10;s+hCvcGIPXs6hjOnukETt/cAAIjEo8zE8T7/3/U2o4pxeImF/W9ipRQx3qK3GTE4Wr4iu2esUEyU&#10;BFAcj1xnatHyWnd0W8ueWr8TAgCACHB02/p36HFLblaSlScS+LOZsIMAABDh6Xpsthnc2nEfAaTs&#10;J20TFsOtGMRmlvBCPWyUmENbCy3CmY2Yf81K8VgtJJNWeUNX6DGDWCA21Alxs95gFBMNFWPsNTL9&#10;rBgXXxd6e9brsQIxCIlE6o96Q4UgAfxHsShrcdpqhFJeoMdqkRCAIGw/0OOW3EwfiGcLBLFMj9Uu&#10;huM7101bM2qmEwC2Bx74yEE9XimCuF4AnGG2UwOFHB1jZm6M12Df4W0oZUHjerI52wKXAgBIoJfo&#10;bcZcaUdkRORX6y1GoRQNJjczpA8LeDUzms7WGkC+EQDA4ekeLe5aMAFAOPTUkV69oUJYAHUJwL/o&#10;DbPJ8Z3rvUoVIau31BxTB+HZZKb0YgEACIGolDR9W6rWMUDVlLQ4szG0DCWKsfErRbDKPd9kUb7P&#10;8ujtIlO/fRR4EwCAyKNo5lRWtjmbi9H7BHDnWOK4vO0WQ1XcNSwES0QUq1q/UvDYLgAAQPg0AACy&#10;NFuDjABxX2ED1U9xtvU0w+itIbNikQ3fBuaf6vHZhBR+XEpz+1G14a0tNVnKqNysJCsPR7a5c9YN&#10;qmUMOGuLbmYQ8MNmE4hiWXwa/zi9rAmh0xu8UW/Pl8MT6sw8tsu6veNbjUJWzH9N56OFQ4Htp54V&#10;3rtWZ4NtABIRBa703vpSvT1fDs8Td2Qez0V7IevjAQBA9iQFuz1V8Iyrlpbbx05WQuLq8a0FIPMJ&#10;jbDhA5nHDm+wa3yrcceS9Ac9NltwFwgQ8k16vNYdBnxMj1kmKviAN5swUsEHdEv1GgwfdphNIIpF&#10;Cnxx+pFAgVjwLSOBtGVc4NzuOeOeGzQYOfxyPWaEwx38fPZzp3dxQT0sK1puWpS9tp4duOAxR1Lg&#10;+zOPhRQFzwq018ED2e+paf1tBSVIJ+tOHs5+7nL3mCrlEIscKvj3c0rmcwmUyKaTrEe2de7XY7MF&#10;bgIi5rwK3dYSlLhEj1kmspKsfDCamjJelQQx3wmmx9vUtvwqfJeawxsc1mPN7UHDyZ+jPRjRFwxu&#10;Ps92Ivu5cYVvozVrAoulxHGzNwUKu8MbnHJ5o4m6xJy6OYeyI4ggXN7AL7Nj+WhuD03Yrg5vaML2&#10;n06zN/Q/KMS4/cdWT/dDVq9UPpxtW16CgOMSYZTyXatbv7oiO2ZM4d8Z5NxGAh2eHtNrk85WzNXR&#10;W15sokZXPik3K8nKgxDFGJlQZUjisfOeN+tnGVaayxt8WiJOqIwNgOD0BB/So5NxeoP3SMAJlboh&#10;/d9QeqzUnrtu8/LkXJFzUoFE/N9mT/fb9PhkmtuX5nz/iOINTm8g7x4tlzeUs1yDRKhzekN5FyR1&#10;ugO/BoT36XEAgOa6obxrrjnbApcKmz3ngHCyJx9qdneXvTq6yx3MmZRLIc93eoJZRUot+frb30By&#10;pqDaTDLzzoolYSVZsxQzYLLeNlpw0FJm2Ny6ua25PcSIk5fTEAJXNLeH2Llu86QD2B3re85qbg+x&#10;QJy09AMiiub2EDs8wbwTGzNc3uDd8xrqHp7yGCxsP3K4g89OVVjU6e5598RelfEEipc3t4f4Ak9w&#10;0qVKmjyB56a3NUy6kLJAOKO5PcQXtG1ZpbdlrGrZcnpze4CEFK/T27KNbutJ65QtX97V4PQEDgib&#10;uFdvG0fadjR7g+Hsgfql0uTteV1ze4hRju9VyyYEtja3B6jRfdO5eptlcu4zL34OWqfaWWvK42Al&#10;uNzBh1HipCeVfDHBg7FIx0XFGHNzdIfb9N+oSorevqBla8EDfzNcLcHzsQ5N305gZoqFfSU/oVQI&#10;Nrl7NkjA16IUl6Urco+/tTcdZv4dAfyfQDgEjK8AgMsRCfP/O+nCkorETmT6zbBMfXlv77X/0V9l&#10;lNMTXAnIVyHgexDptEyl+PwoViSSiPxNBL6PWa5E5jej5Ofl/7kgXdWLkZnhJ8Dq/wBxPjO+Ukrx&#10;SmPbOv1aJvg/Av4LMO8TiK8E4Hfqtwenlv47pCihEH8BRDsEiksE8pUoRJ2xC1zFROIwIH8rxXDX&#10;7oi/CEtjXS6d7vbrGOGNUmBr/tsHTn025p8DwJ/j4YN3mL1FWUTo8oZSWISsJpVMXjK4deN9etyo&#10;Z3euX21Tth1CmH9P1WbB2qiB383knJ7gH4TAV+hxoxTBI9nrilaDomygYrKSrPJhgA8uXBv9lh43&#10;ykqycnN5u/8NIJaPHydl5ISvy/zbTBVuM38Hxv49AwAr+E88euCsfE6WK9d0n2ObI/4tUGSNyTDz&#10;uaBEn83MeyrW+4HRv8Wjh1uzf+fUvyfiFCXl+sFtV4/NBJyKwxPYLxDOKP7vMY0ZiJn/HI/4Xjn+&#10;dWVVdUnWwZ3r1wtl67OSrMnN5CRrxn3plvwxp/Ieh2IxLhbecEEs7BcDvR040NuBwwrOY8KCp9cT&#10;43cOc+q0gd777ARY8Aw0VvB3TsH6zPuK9XZgPNpxRj4JFgDA7p0bHo+H/XWZfz/Q24HM+C7FVNDv&#10;iZlZMX5xoLcDFYk2UljwiY0YvzPQ6xfJZ5PLiPE7enu+iOEnavjo2QO9fsFE3y70KosZ+lMgnj/Q&#10;2ylYwWf19nwR0UEegQ9nb/N4xGfPN8GC9ALSZ2X/HpMjSWcK8P/01+UrxfD9Z46PzB/7HYU7ZIUT&#10;rKokFB3VY5bZoyhZaDFZPVnlQQTEnGxa3LJ9j95mlNWTZZzTG/yZQHyzHs+FibbEIv5r9Tikxy29&#10;QEiZ17p5xLQzHvav1ePFdP7qG5csmD/3gB6fzPAwNO7Z1pFzgL/THYgLKfIaN6g49cJEeEPOMU6u&#10;tkAQbaJDj+dCDD+LhzveoscBABwtwZfJOvyTHs+FiZ+JRXw5V4lwrtu8XDTUPazHJ3Py+MgZe+83&#10;f1t3Ki534G/p29jTG06q1+/Z2lk9y1GNV3U9WVtvb7E3tuGQFML0e6o2Vk/W9Gbcl27JDwPBoiPb&#10;8z7QW4orHvb917ETB6atM5McSS6bLMECAIhHO/8x0NuBRFNXryfi15Q6wQIAeOSBGw6m3w//SG/L&#10;RgxPDfR24GQJFgBAPOp3pgRPWQGdCFIDvR04WYIFABDr8/tOjpxcrMd1hzl12mQJFgBAot/354He&#10;DmSinLMdM5ipa7IECwAgvv3afaN/Z8oLE0W8Y6C3A0udYAEAxKL+F6phdbYez8YMNNDbgVWcYFWl&#10;lif6FYqZOL3Qkg8rycoDE+c9LbtWIAiEF8KUJwtLae3buenQ8DA06vGMw5yau6t/4zN6PJd4pGPS&#10;mjWKUy+MR3x36/FSikd87yBFOU/GxPxoPNyR13I2g//y/TCZSr1Kj2dM9bmz7e2//vBUSe2wgvMe&#10;C2/IqwcuFvHb9FiGYvXeWNj/OT2eSyzify4R5UwyWdH2RMRX1lUZEts693OKJv1vxsIds6KXudhw&#10;ExArOePOtUQzr8BqKcy4L74kmGfeCvLIjGj+VqrFnD3bOh6iIZpwm2bgiQNzHgtvOKnHp3L4cOo0&#10;PUbEv5uql6eU4lH/60fXPhwfD/vO12NT2dW34Q9E9As9PtB7YNJyA7ns27np0EDvPyckSMkR9cY9&#10;0Q5DS4QM9HZMuE1CxH9MhDsNjQOLR/wTkmxm4ljUv16P56/wpYtiff4dydTEXsjDJ1JW2YYCMQPO&#10;wEqLAMCGi/jORgXvjLPJ/AWHpuxGr0UCKGehSEv5xbf7x42pUor3QAEL/D4W23AgRTzub8Ujvtdm&#10;PzfK4Q78S48ZcfwkLM1+nhoWF2U/z1c84n/zqZl+AMz8EwDj2wjgLkV06reviEd29Xf+avxr8kMp&#10;GlsDEdLbuqBB38Mn4TnZz4cwlVcv32RcnsVf0WNG7OrzvSP7OTOFH9u54fHsmCV/iMCAdL8er3mE&#10;V+ghy0RWkpUHsWrPET1Wy4iAmWCzHrdUjhqGVmZiZmI4csKrt+drMOIb6xUj4nePbzWKUUpxsZkJ&#10;Mvt2+g8pgkcyz43MhtMx0QfSjxTHwr6CC6umFLdmHrNKvWh8a/7iff6rMj11CvlWvT1fe3Z0PJ15&#10;rBQdNFu7jFCYXoyYFF6aeRxLzh17bCkMK9xMNLPGZS1q7futHrNMZCVZsxAz8EhSfk2PWyonsa2j&#10;H4gJQHAi8Yln9fZCxCO+H+gxY67IHB9MnRxI8VsAAIjUl/U2I2KRI9+DdNFRvcmQ3Vs792Y+ksnZ&#10;YwgMI0xMift8ec1enBTD5yGd1hZc5iFDAD3nrJbb5+pxI+LRa/4Bo7cuof+qmTdcoswWt/b9gBlN&#10;7UfVhMjcMWE2sZKsvLG5g2gVQeTU6d7ojOqdmxEECgB+Sg+bYOpAuMrb7mWlTE+O2LXV1wcAgIwP&#10;6m3GbEoxIyuG7+stRhHx0wxgaMxbDoyIQRQmsz4AoKGh7wEADEauKbhH7BTBC8SQ1ftUZSTScT1W&#10;q1Bytx6z5GYlWXlasLbvVqVgZsymEPBNPWSpAsTEDMvM3J4rpvQSQCCWrwlMW/5gKg7Hl04DAGCB&#10;EwbmG0WKD6eQ8pq9NxVkfBKIzS54jMRwFZP5Hor4jut267FCIQIIG79Rj1sqSwL+Pz1Wi4iAF8i+&#10;T+pxS25WkmWARC7agbCSFq3t+6ges1TYud1zUIIYvRVm+qQNALDcdYupAdQAeDWAxHlzMaS3GCEW&#10;zvkZAAATbNLbDEP+3UPP2B7Vw0YNDSVfqnD8wPUCMCIvQkF4/uqvTloeopycnsCnAEBI4Cv1NiMu&#10;bP38eQAA45fgsZgxd33fD/VYTRLqCXwezLiyRqViJVkGDBKtVqo4J8BKQQCT43QspeA8S2wAkCgE&#10;Sacn8GG9PV+N7tDYoPl5C+z/Ht9qjECeCwDAhONmmxkm4FIAAClxQvkEw1D0wp4O01PH995/7X8G&#10;w53m9oXGUD0AMoDE+fOTedXYmhLRMT1kFCPckH5kLjmqty0cXYSa2OEJFjzJwDIeErxHj9USpYCO&#10;pWCVHrdMzkqyDGht7U8KpBqeyswwf230XXrUUnnCJj4Poz0HQoiv6u35qgP+a+YxCtEwvjV/ze3B&#10;SOZELQTYVq4PePTX5MPl7nlLdm+I09uzdfwrjHn2qO27eqxSHKfzbkQUMHp/94yLNs/TX2NECuli&#10;PWbEBeu7V0sUYwPeHZ5QwWVaEOGs9COBgsn0GDhL2vz10e9yDV+nC8lHz2ntP6HHLZOzkiyDFtDW&#10;FXqsVjCDqVsIltJweUNP6DGnN3SPHpuO0xP6JEocV6DT5Q0eyn6ej8b1t1wIgO7sWF29CGc/zxdK&#10;eVf2c4GyZWVrT8H70NOxj5nu7SkGV1volRLxvOzY6XNspmaFDoY3FFzeAgBgbr1tXC0mKWBxU0vg&#10;hdmxfDjcwXGfA6WUDnegCAPyLQAAgKpmJyXMP7F/NPm25MtKsgzCVkiyUtfr8WpHxLRwXd839Lil&#10;slxtgR+d6jU4RSC80NEW+h89PplGb/dlQsAX9DgiLmr2BPK+vXbGGZvn1dfX51w0vNkbMnAJ3iWa&#10;23O/vs4uHzLb61NJjrbbTkMb/F6PgxD1rkk+c6lNtq1tdeIeI2PzmjyBASlxXAFZAAApxdUOT+BD&#10;etxi3MI12/7BQGZntpYdAwfExY/V3PuuNCvJKsDClv6bFdfWuk0Lf9WX1xpvlvJp9oYYbWLS8S7S&#10;Bu9zeEJTLiIMAODyBn5Xj7a/6fExQtQ5vMHh5Wu6ppwl6PQErjl9Rd3kPUWYPpk3tfWMFfPMxdkW&#10;uLS5femUpR9On1d3zOUNXa3Hq53DG7xL2mjS9SRx9HttWndbWVaJaFy72TVd8jt/Uf1+hzv4eT0+&#10;jqurzukOJW1CuPSmDCnEHU5v0HAPq2WihWu3mqpjVgkL1/Z16jHL9EwNjiwFlzv4MEpcrseNYoIH&#10;Y5GOi4o1UyuXozvcJfvbxZRUyecubdk+7cm6UK6W4PlYh6b/PjNTLOyb0YvQOj03r0RsuA8RTtfb&#10;pkIMTx0/fsL5yAM3jI6z6Wpo8iwdtAkwtA4gMx9mTP1XvHfj/2VijtZgTNrROf6VUyOmpCK+ZVe0&#10;81OZmNMb2AKMHUIYGeDOQIS98UiHqfFIpdVV5/IseQAFGhvwS3SMAD4Yj/h/ojeZ1eQObRSCviRQ&#10;GLp4SrHaPRjuHPscje6Q1450txDCwOxIBsX8ZGLfoQth/6ZqG5+DLm8ohWi+AyGVTF5isljtlHhr&#10;y9xjNlkTtbMWrI2WNFdweoJ/EAJfoceNUgSPJCIdpvOHYirphitELSVZUAuJFqV8C9ZvMzUFfzpW&#10;kpWbqz24gRleKxBfyMyESAggze5zxESMQpjcTkysiFGiMDcTjYmJGQUiQHoQeGGIAZCZGREZFMPX&#10;GexfGwwXvgxPIZpat7xe2sTliPJdzECjC/ua+FwAAIqZERAFKoJHAOlbifChLwBsyqs33OkO3sRI&#10;75RCnstMjMhg7nekmBUQSmHyOwOAdAl+QETBTHczwc/iUX/et7lLoGaSLACAI/e3XoYkJu+FrgLz&#10;loq54vxwSW8TzuQky/QPcbbbt+tYvR6rFgSpjaVOsCyTi/X6uuPhgy8ZeBoaaITaSNluSa91d2qh&#10;43zx6O1pxXwjI39CceoEgDL8d9InRWIF9A2wST8z7M6sv2dE5nMw828AhZ+I7i78sxEz8YAi/HAy&#10;xY0DvZ0iEe78aLkTLEgvs/PrWPjwewZ6O1ClyEXMH1XE/ynkc6WTK2JS4jvAeGlyJLksEelYngj7&#10;P59vggUAEI/6bkhEOs9LjiSXJRW8kBXeZWpbK3yEED9OLIIAAKRoylu7kxj9PeLnkmqkZaD3gD0W&#10;PvS6CidYNWfhRVvvVaTMlUgpqaEzSp1gzXQmroZKo2g9WcwDsbBvdal7sjIOb29NCTTbu1A8KUht&#10;XLJ2W1mWPmjyBJ5rE8JUTSaYgT1ZUxAub+AgolioN+RCpJ6ORzqfA9Alsk7OCADs8AYelSjO1f5J&#10;Tkw0FIscWgCwKaW3rfL03GYX8mN6fDJDKbr4oT5/rx5f5d78YrusG7sVOR1i7omHfRv0eDVyeXt2&#10;IcqVejwXJlKxyH1zAe4qWdFGl3uzC2XdgB6fjFL8g0TUl6OES1ed07v4oMgq/zAVxeqxRLhz3MzK&#10;KlK0niwmfkEs4vunHi+Fo1vdLwYb5L3flBoR80J6bD627i/L7eAmT89fbEK+RI8bZfVklRETl/Vk&#10;vWjdVgPjUErLBrCiXAkWAAAkaYEeskyJYmH/IsX8Rb1BpxS9I51gAWi9HwwAkAj7zxtOJtdnxXMj&#10;/mks4p+TK8ECANgV6bx6oLcDp7smUcyPDvR2YK4ECwBgV/Tavw70diArmlCWQjfQ24G1kmABAMTC&#10;nauIhqYdl8XMA7GI31bKBAsAIBa9NjbQ24GKOa636Q6MNMzLnWABAGwaiYf98zhF0/Z6p4heVMUJ&#10;VlERU15JZzEsaI3+9RgMzdfjlbJofZ8oV4IFACB54ozWmWLmJlmI88rVi5WxYG0UGXmLHi8XIqb5&#10;v4jKOWujpnuVjEDgqrpyqBWJsO9TitRVejzjOIw8NxH1/0iP6/Zs3bh9+GmYtPAoEwcHIr7L9Xgu&#10;A72+SY8JBHAyEfblNdA+FvWfw0RDejxjoLdj0v9ONYtHrts91XtXRDtjYd/z9HgpJcK+SWcEwui2&#10;3t9/1bQnzFif30eAHXo84zCn5g5G/FU9fqiYELBsSRYAwFlr7z++YG0UGXDa76pUGPjuUg9yzwEh&#10;fb6ekSY9WFQKkSrODwz5tErcDl24pu/aBWujSKwKGedQMCb66KL1fRI3lX8Ra2GvX6bHLPlJRDrv&#10;IFK/1eMAqU8/3Htt3pMJ9uzpGB4ZnljkkAj2xiI+vx6fAqd7tCaK93YYOumke84mGv37Zb0AKjKm&#10;lJqQSClWTyUi/rV6vBxGe7Qm9Jwde+LAHCPbOt57za25esZYqcsfC2+oibE56QkmRYAw4Tsuh4Vr&#10;I/OI1Gv0eCnxaCfBwrV9Zf3vjmICGO2tn3mqLslCGz6mxwohkXMe4Mtl0bp+m2BV0FIk+SBKHziJ&#10;+acL1kZx4fqtBS/FYl5q2tsM1cjpCd5XiURcF490vk6PDfRumFBYdDq7t3X+g5jG7T/xSMeF2c/z&#10;xcQbs5+nhobOyX6eL5Xk1ZB1lqcUjJV8KESTN/ROPVYJ8b7OAUWwIzuWCHfmXfSzFFJ0cPzFDqV+&#10;tG/fpkl7Eyej94wx8zOxaOdPs2PVzcxs2VME83V6rFwWre+/e8HaKBLSxzPH+mIbW4eXRl6+sPy9&#10;V9lQCpyyhl8tq7oki0mMLkxqDqvy9+jo5q3rjy5YG0WikVWK6D+KmIm44B2GCFgpIGJOAvBXF6yN&#10;4qJ1fXndBiolFKI2x2Qhtxq5yi+lkVTqzczEzMR5jbGaRDzsHxsvQ4ruHd+av1jE1z02e415/+D2&#10;66YdY5VLYqvvQVY0nDmCx/s6ph2HNhXJtBbg8qKMt1x10eYL9JgRiUjHOlbpHmsmelpvL7c90U1H&#10;FNOTo2dOHohsKHjWGhF+Ov1I8cjxoXV6ezXjAmZd5iRlxcdILVqzdfOi9VHBKfosEQ8rBWQm6SJi&#10;VsQMwIcBUm0L1kZxwfodf9ZfV15dMj0aoRjKegMpL1WXZI0QFKdwn0DRuL67ZD1JRixav2P34vVb&#10;z1i8vk+AgNcDU3g04SICpYiAxq4qRhEBKSIiAiZiAlJHGeizqeSBJYvW9dUtWt+X90ywWjG62G7Z&#10;rqiMFnIspd19G34BxASAvGfrxu16eyHiT9Cr9JgRSsEfAQBSSS74ZA0AQAyfSP8/mx7PQwCvPn/1&#10;+rxmZU7F4Ql+Xcy1f1OPG4USBRNTLOI/Q2+rhBSJlyAAKYK9epsR8cg/bgQAYEbY88D1Rbm7UCYM&#10;zDmXhaplC1u3blq0vq9h4YIDcxHVhxn4EUVMRMCj54kJSUrmHKIUMDETMCUE4lsXr+8TC9b2LV7c&#10;sq1f/zeV4GxZ/Frm4tziZTBfr7HYqi7J2rvV96AeKwSiwLo620f1eKUtWtv32wXrtrYvXt8nFq3v&#10;kwvX9NeLk0NnCaQXAdDbWakPJ4FeDzDi2EPcsHBdVC5a3ycXrO9fuHj91s+d7t1zRP+blXRhy2bD&#10;C9BOhknlvcZeMSjgkTPOqJ419FggAbOpRYbHeczcGBoU/G1WSg32mxvsnOjz9wAAoKKf620GoRTC&#10;Na+hYdKliPKFAC9DIoceN0oR3oGCq2aM2Z5oR4yJGCV+Vm8z5q7q6xLIGxa0mHktEKv2DC9c13/7&#10;wrV9yxev75ML10XlosPz6odUatUIqdcw85VAqXcCp15sm5M8b/vhrfWLW6Ji0bo+uWDdVueCddFx&#10;C7ZXA7SLryIW5xavZPkDPVZpVZdkFRMiVcX4jakgglpwyf3/Wbh+670L1m798cKW/q8vXbv1N4vW&#10;79jd2tqfRKyOg/dk7HZ7jkHbhWGQfyvXyWqlu3uNYLYvXl5nqrenmJDEA4S4VY8bpZLwQij8rvQp&#10;JBpRCoSW2831+F3WZQMAIASzZU4YgFjYhOnxh0LgCiGl6fUFkfkyPVZxzABkbLmlXFipp4ngy3q8&#10;2qUYegsp1JqLw9vzpB6rJojA+KJ7U2e0bXvotPX9dy9c1/eNBeu3/XDBum33zHNuf+JFL4KcJVuq&#10;CSIVbSxjLHrN7Xqs0mZ0klWm8/WsJos29ZYYWP1Vj5aKXcgbEAEE8Nv1topBupMQuvSwUXx0aBsz&#10;fFePG0UC/h8ACmfd0KTT+vPhPLnk55DuXTb12ZY2hhaSSles19sqBQU0ASCnC8VWXpO7+3KUKIBh&#10;k95mFKL4eSLqv0aPVztSKlyMawwAAImyKm4Dz1RNnsALizVRoVpVxYGhdCQ6PQFTt0wsk3O6gz/T&#10;Y4ViBiC2ly3JQuQrAAQKyW/S2yrlKTny1V29vj49btTg4HVHGWCbHjfKhnwuAACSuVlWCPxqSPce&#10;LdLbjDjjdPqlkEKm1+4rfOxeY1v32BgzR1vwPeNbDUqPoxPN7Uur4vYagvwygEBji3TnlmS6U4/V&#10;gj1bFzwIPHGMUqGcrbdWTW/3TCNRVE2V+1KpyiQrRVy0LlqBYtIijRYzLpdC4pv1aKEQBQ8ef+Z+&#10;PV4KTd7u1dlXT862nubxr6iMZ++77qgeK1Ty2Ye+rseMcLh7PprZRijw9AueFyzoit7RtmUVylPL&#10;TTncoYLHSQoUL0o/kuj09hScjNbbTo3bkDb83/Gt+XN4Q/9AKYsy07EYlrm65kvJY2UcHO7A98e/&#10;wphd0c6yXfQU11UpFMU7t7GNfqnHLOY5PYFXFWP5o2pXlR8wRfxePVYwBHB6em7TwxZzHB7vfj1m&#10;BjMhxDYl9Xgp2NCWlcwJFDZZlMkW1WTPnttMTSKQUo4bizN3ARZ04SNt9sFxz2VhY3xc3p5xY9UE&#10;ypaVrT0rsmP5cLmDH9M7wZyeLYYTrca1oWUS4fnZseb2UFlXWtA9Z9HSo9kXD1KKqh+TWiJMCgsq&#10;OZKLRKxztH3pND1uMUcIcbceMyOVoqqcVVqdSdZ/DhVc3ycXIeTHwNVVp8cthbnAEzxDCluRq7zj&#10;vnIMonO6Awf0GACA0xM6qMdmpy7R3B7M+T043T3/0WNTcXqDx/QYpK9gDQ3GdbUGbkaULXq8zi4f&#10;OtfbnXfR4abW0MUoccIFlxD29zS1BV6hx6dSPwdybYvnutyBb+jBctCT0Izm9hAD3Fk1vW3lgsxF&#10;LZ4qbXOeNnOL2jKewx00XGx5OoL5w3qsGlRlkpWuUlzcwa2uBYsP6zFLYeYiPqLHzGLFAT1WbK72&#10;0AkhxRI9DgAgBCx2eoJl6UmrVitW3LQoPbYo97lESLnM5Q3ktR+5PMEjYpJJEUIImT75T8/pDcXQ&#10;Lj6uxzMWoe2Eq3XL6/W4rtkbuN1mh3/p8QybTfzB6Q78Wo/rmtyhF7m8gUnH+6AUH3S6e8p6Re3w&#10;BA7kSkIzmtv3p5ztX55V64vG+g51Fq/AJQCAQGfblk/oUUthpMRP6jGz4ls7q3J8V+6jaRVweIP/&#10;JxFfrMfNUAo+loh2fEWPW/Ln8oZ+hwiv1uNmTbZenllN3u7VkuVfUeDpeltuxIrgUEqplxSrKGi1&#10;W9nS7bbbxL0o8h+/qAD2QCr5mkTfxl2Z2EpPwFkn8G4AXp7fjCHFQDCSVOIFu7aeGvDftO7ms2Vd&#10;3VdRiDeMf/3UiNXL4uHeezI1ns5q6Zq7CBe9S9qlgWndxKTgOjo88vXBwcwYuculo+1it7SJ+/RX&#10;TyWl6C8pUu9/aOvGR/U2s1ze7kZW+DNhkxfpbVOhYfLGt/mLsqpGtWtuD1B+v8N8KT78KM97zGT9&#10;udku3wssI4g4FY/4zJWaKZEi/gCL61xX99JFi/AZAFnU93h0WJ39yLbOoo4nmi0cbYHrpE3cpMeL&#10;YaC3Q5i9XbiytWeFFOJzKKBdIBoerzMecfrtSGSlniAQ9wDglxPRjpoudLjaHfImgT8mBL4YEc7S&#10;2ytHsfl9PdP7nTmxKk4f4oyeaE999+nnZv7OqX/DirajwJ0nTySv23v/tbluN+Z0rqtr6YL5S24G&#10;AWsFYqveblx6WyuiYwLht4ptPxqMXD1tL16tcboDfxNSFL2OWakuCGcDlzewF1GYWs4qF6XU1xLR&#10;zo/o8WpQ1T+W4l+JpFk7iXGN7pC3XkKvHi8GUvjBePSab+nxQjndW96IaPsuIM4zM3uFGQiYjxPi&#10;ZxLhjqDeXsuc7aGNSPwZQJ5vptoyEaQQ+CQAz0VxahahUczEwHiMEOoloqnxk8R8HBEFMswxc4Rj&#10;gJNIpEAIc2vYMY+kmI6nksmXPrTtuoJLa6xo62mtF+KvADDHTImGU9uavp8IV+eJqRjSF+q24q2g&#10;MIqZno2F/Xn2jFsyHO6ep6SUz9HjRUADvR0FH3tKzcQhqPRWtfXcZrfJoq/Rx0QqFvEXfJCabVa2&#10;dLvr6mwlu8VQ2qT3TunyPN6HQuS9yC0xx+Phs1cDXFEVtY/KwekOPiUk5n0AZFZ/joU7X67Hnd7Q&#10;PQIh76WWCPjxeK/vXD3u9Aa7BWKnHp9KkvgFuyK+f2bHnN7gBwSioTUKUwzXDIY7xg2Qd7aG1gm7&#10;sdpjKYJbBiMdpmqMTcXpDf5MYP5lVJSiY3x45OxTt0FnvlLcmgIAIMX/ikd942aXWibn8nT/AoXt&#10;jXq8OIgHev0FX0yXWglPbsVwuWxub0+av40wETNTLHzQDrCpiIMjZx6HJ3i9FHijHi8WItoZj/jX&#10;6vFiO399z1kL6uW007qHksnzSzGGphY0td3WarPRtPWnDh9OnfZYbEPOWZoAACtablo0p27OIT2u&#10;GxpKrXxo+4bJB4m33G532E8em65nixR9Mx71f0iPZ3O6A3EhxZRrFbJSKhbtnPLiy+kJfVIImHZm&#10;1LEnDsxJT+AprXO93XMWoe2EHtclGd66K9xRk8VFzXC4b/2YlDxhRmkxMPMzsbCvyLOsZx6XN/RE&#10;6YYmEI8kuXH31k5TC6KXUtGTl2JzeILbpcCSnYSTxGt2RXxlKYJZa1zewO8QRdEHuWcrbS/WRC5v&#10;SE12C/HAyIF5+/s3TXvCmsnObvvSaUts857R4zB2YeLLu1ve5Q0qRMy5radL1LK53IHHUYqc6wym&#10;mN85GPb9UI/n4vQG7xCIOZMxIvXbeKTzdXo8l6Z1Pa22BpkzGWVWR2LhTlOV7QsxVY/NsRO0ZN9O&#10;/7RJ70zl8gbIzC3x6ZQroa41jY2h+rqldAhl/hNqClHuc4hROQ+A1YQPDV+qx4rJLnCn0x0cd4th&#10;tlvVsuX0Zm9ouNQJFjGVvWRC7MiBnHWVTh4fOWO2J1gAAE/0feLZkSFy6XEAACMJFkzx+lSSHPkm&#10;WAAAsaj/HFI8obaWIro+3wQLACAe9l0Jiif8dxXD8XwTLACAwe2dW5VSE4cxMEAlEiyY4kSjGF44&#10;mxMsAACl8F16rJjmn730ZLM34NPjs5nTHfxA/TIYKnWClUqpql9bM+eOWW2c3tCTAqGgZT2MGCF+&#10;ze6Ir6hVaGvL5dLpufhpIXLXkiq2yU4MpfY8b+gKRvhJ5jkx3RQP+28Y/6rZzeEJHpQCF2eeK6Ve&#10;m4h2/m78q6bn8ATeLIUYW+MyxfTkYNhf0K2Dcb01zCMDYV/9uBfkSe/1KfR36PAEn5Li1Di2Qv9O&#10;saxqDbbZ7RxhEIgAoJifTIR9BW3rYlvVsuX0Xf0bc/aQloOrPcTl+HJOjpxcvLf/+rxqyc1Eje7Q&#10;wnoJZfn8zMSxcPWOxcqo+jcIABAPd5ypx0qhTuDvmttD7PQEO/S2mc7p7flpc/vzU+VKsIjhb3qs&#10;XB4Md9zJoEZPtMTVkmAVskxMqSQiviWZkghMNFRIggUAkIj4f579vNAECwCAFTw+9hhUwX9HKfJn&#10;HpOCz49vzd8xVM9l5qoZ07lrq69PERzPJBPVkmABACghV+qxckop9RI9Vgpz6uYccnl7DjvW96zX&#10;22ayFRdtfo7DHXq2XAkWAEAK0aPHqlFNJFkAAMxQtm5BITDY3B5ipzf05PI1gbGr+ZnmwpbAC53e&#10;4LHm9hALlP+lt5dSPNwxuthvZTDDzwEAFOFYL0ul2YW81tl+a4lm4BhHhP8GACBGU5Wuk5D6OaQH&#10;qOddGyqXkQPgYmICII6F87/dqEtE/WPlOOLRjs+Mb83fY+ENJwEYARQP9B6ojkKICt6jhyrNdXFg&#10;bT1CRW+n7Yp2/lUpKPg3YwSiXCjrZb/LGyBHmav/l5vDE7zL5Q2pOfPqnpISlurtpbSr91QB42pW&#10;jh7UonF5AkMoREG3CIpBEf+HWX0GpXwcmJ4QwEcgKUf011UTZWPBkFwoqO58IWAZIAcRxUL9deWU&#10;GoHLB/s7irq2mFGO9T1niTp8XCVTLx7sv7ZivWrZnO5AHJhH4n2da/S2SmhyB66SyF+JRaaecZeP&#10;5vYQK6U+loh2mlpxweUNKmA4EIuYm9Xl9ASTQoBtoNdn6hjocAd+LyW8opqmkLvcPSkWtqvi4eLV&#10;njOjydPzF0RoSoQ7z9Pbyk2/VVxurOheRLwNGI+mUqn9bLMfsymq6lIxw3ZVZ1O4WKA8BwW3AuKn&#10;TO00RVDpW/NGVM2BIR+xZ/dWZFBphhT4HJu0fV0C/kai7Ee07cY63FfN/7MJ8W+7qN8pbfgbFPg/&#10;lU6wiDhV6QQLAIDZnt5JZV3V7KwooAmkqJo15hAp58D1Qp04OZz3IPWpELDp98WIu0lxQo8bJdj8&#10;eykFZKyS98UoENslwjl6SyWolPrQqZUByg+luAwE/hQk/NFWb7vfLnmvfsyutv81oG23zSb7hIRf&#10;YhUkWErB2O3+WlBTSRbsuW04Bfx+PWypFYqrZX0pmy35GUQAxFRJZx4ZgYiMwBVNgschfDsKKZ2e&#10;7qLMMn3kgRsO6jEjzvV2z2FiFgimb+EzUAgExvS4YRJfCoAM0FUVx9JGd7cXJQjA1Bf1tspAFijm&#10;lqLWYSESfZ3fZAUVG4BvMYcJjiaitbX6RlUcGIwY7PV9mxXNioV7ZxqiZJMeqxRC8Q4AgRJtVZG0&#10;N7VsfiFzegJU4+rQhArolSCkuBjSY0wCelslLAD0CykkIpruiRgM+28/sX/RO/W4YYwMgMLlXvJH&#10;vakS6lD8GEAiIpymt1XCua7upZmeI0drd9HXESxELOrPe2UDS3WJRTqq5yI0TzWXZEF6J1nPVN33&#10;sS3jJRW8MR65brcer4SljaGFQuICAABA4vNX31iWGZVTkTbbXxAFIgqsm0t/19vLbfnybzcgppM+&#10;RFyltxtFxKYHPgvE0UrrKFyeoOnq5fv2vc9UAUmnN3gHinSxVZT4Ur29IoQYHfck0OXenLPeWTkt&#10;WCh/lll/VtptVTH2EQBgoPefpscZWsproK5KJpcYVJNJFgCAtfZg7SCCX+yKdvxKj1fKWcuypxkL&#10;XDB/bllmHU1mlbfnkuzFlVGIC067+OZ0Elgh888+cjJ7cXanJ/TQ+FcYE4/4QnrMCJc79LXs94MC&#10;Lz+r5fa5419VTl02vXq8yxv4ZfbzcnN5gn/HrGM6yrqB8a8or8bGroUCcdw6lo72wNuzn1fOXUop&#10;aNejlup0dFidDfdumlCQuBbUbJIFAHDsiYU5q3dbqgcxPByPdOS9iG2pOb2BnLd1nN5AhaYD3ynt&#10;KCesOHAmNxzRY+Xi8gYnrPEoBKxwugO/1uPlcKFnSwtK+H96fKl96LgeKxenZ+lJPYYo3tBYod4j&#10;lzvwGRT4Aj3u9ASf0mPlUr9s6YSaSRLED51rgxWtmZWRiHaEh1i16HFLdRmh1Gse2da5X4/XiqoY&#10;jGhWpaflWnIj5ofjYd8FerxSnN6enQLlRXo8QylKJaL+snVJN63vXm2rt025buaJo3zmvx/0le1E&#10;OV1lbCa+KxbxXaHHS8XR2n3ZlLeZGCB1cGjh4OB1R/WmUshnQWYi+nQ84p92EelicbYFfiRs4m16&#10;PFs5p7yfv/rGJdP1DlfTmrGO9T3rZb3s1+OWymPFV8Sivrv0eC0p245XUi2325vrhqq6XtVsw0S/&#10;iEX8VdGD1eS5dYNN8BY9nhuDIr4+EfHfrLcUy/nPv3HJ/NScAUTMqyI3E20/mDr0/FKurejyBr+K&#10;iB/W45Mh5g/Gw76S1WFqdIdcNsFRiThPb8uFUvDjeF9HSW9FOduD3xGA/63HJ6OGVUtiW+c2PV4s&#10;Te6et0gp78r3IJ4i9a3BSOcH9XjRuO6scy7c/0eBMO4W4WSYeT+okfWxvo8/qbeVm6Mt0C5t4j49&#10;bqmcVBIuGdzaUfPfSb77Z00o9WrrlvyMKHzt7ug1BS3DUgyrWm99q7Sp7yEICaQYJYrs8TzTIwYQ&#10;zAzAQAoJr4tF/3UrwF0FTbZYufrGFfa5Df9LINqlANvo3zfwfk4hgpQQqf7hY8m37Hng+sf09jwJ&#10;p7tnIwj4AgLa0mWjRAFDB5iYMbON3mnminPlmlvWygb5KwHiHBQCCxvKQOnvDCGFBL9NpdSVha+X&#10;d3W9w/3czSjF/0MGGyKA8e+MmAkZgJkBjwLxG+J9/oInNTjbgi9ByT8BwCWZSQlG3xMzUbqMFqSY&#10;+WuJZ/79cdhz27D+unwsWhNYfFaDuAOB3yQEFjhGNr0vMJFipR4dkrY3/LtiPVyXy+b259fkuJ+Z&#10;ZqD3gATYVDVLVplhaAetBS5P4LsoxLv1uKU8UklyDG71D+rxcli57ianzd7wJhT0ZmBcC4jp0lMG&#10;T0RpxMzIiCiIaScD/Nmm+CcP9nVu1V85GZereyktkC9HhncgQjsgLkWkAt9PGhETMDyDCPcx8I+H&#10;T6bu2Xv/tXkvV3Oht2e9ZPEWG8DrUWBzeu09xkIuTpiBmIhRIBJTPxP+ipB+uzu6Yaf+2sms9Haf&#10;YwN4JbC8nJkvQYA5KAQiFpJkAQAoBpBITI8h8L+YxXcPnEze+9T91+Y5fovR4b31UmT1FmbxSimx&#10;EQCosKQvvYgtExAIIGTsVUA/B4V/MLKPrG7tWZEEfL2w4ZsJwIPEEgUiYnpmozHpxA8Fo1K8FwDv&#10;ZgU/Hzy8tzffZGv58q6GhrOWvkwwvQ0BLkHB56dPJcZ/Q5Du0SJIv7MTgjEMBD8cYvi/vf2+R/TX&#10;lkOzJ3AUhJivxy2lpxQdTET9ZV2ep9QK2imqnXPd5uWioe5hPW4prXKO+8gDAgCnbwPAv4ydAIhh&#10;BF480O//W7rIZFGuqEbfz22nCUz9GaVYp79gcsRE4k9Jhiv2RDuKOCC+SwA0o8v9xJtRouGSCCMq&#10;tXY0ocL06KjiuLB1y3kNdrvhEywn6ZbjTx/q2rcPRor0nQEAYGNjqE4u5Q02iYYKfDKRUgCNgxH/&#10;w0XcRggA3Oje7KpD2/3Zs1KnR6xS/L5E3+EfAGxSRXo/AADQ1HTzAtvihm+BoLcY2ddY8b6REWzb&#10;s6Pjab2tkpxtPf9P2OTX9LildFjB12PRjryHLNSKvHeGWuR09/xLSHmxHrcUl1L0jkTU/yM9Xk2c&#10;nmBACJy2VhMR/DEe6XilHi+FfCZsENOJeNif17gks1ye4G9R4Gv0uK5c3/d5624+e0F93WPT9bIx&#10;0ROxiL8sy7a4PIGHUUyz9BEDjNBYAlpSjrZAu7CJ+6bcQOke0N54xFeWY6HLG3waEU/X47qB3ovs&#10;AC+q6ttzLm/wECJWdDm3mY6Jhg6mDp1WyjGnlTTdvlnzzmrpmru0bsnxWfBRy46Z/xEL+y7V49XK&#10;5Q65UMKktYNKPVA5l6kO4gRwf7y3o6yLRa9q7Xm33S6/q8czeISXx8p8G2eqGY9K8W8SUd/r9Xgp&#10;ubzBLyDiJ/V4Rrl7dM9quX3u0rrJy1kw8cZYxNetx0vJ5Q7ejxJX6/GMcm8jM5yewKtQiLtr5g3X&#10;EEVwVSLScYcen0lm1e/G5Q2pwsd6WDKIOFUtaxAatWxZ1/znNC6dMN1fKfXaRLSzIoP1c03YYCaO&#10;hf0V+a0623puEzb5MT1eyRNjrl4/xTSUCPsrUiuv2Rv8O+DEulSV20Zdorl96YSJGcR0Uzzsv0GP&#10;l4PLE0jptzOZFcfCnRX5XZvl8ASvlwJv1OMW41JE+wYj/ufq8ZmoJn/shYqFO6QaTrYC82i5h8qt&#10;xl5b0tuJFW0f6O3AWk2wAACefnrTMcX81+wYMcQrlWABAORKpmJhv4GxNhMtX97VoMfyFe/rvFqP&#10;UYpMrV/Y7A69SI8ZwanhCWPYKpVgAQAMhH2XqrHjSBoDl61+2ESbSIH6WPYxjUkNVyrBgvSqHBOO&#10;E7WaYAEAJCK+mwZ6O5AINultlumkf5ek6KsDvR04WxIsmG1JFgBAYtvG/oGwr374aWggBd8d/fKL&#10;NUh2RlLMVw70dohY1L9eb6tFibDvJaeeKY6HO5qz2yuBCH6beayYv2B2UPK8Mxd+VI8Zkd0jwwAQ&#10;7/N3jn+FMYTwJz1mRKzv4zuyE4gUkamkrRiGUsPjCtvGegsvYVEMid7Or2Q/j0U6C060Id1z8zI9&#10;ZhATq0+OXaQRFFhOo7rEIx2fHejtwNTQ0DkpxXvSny89Q9KSjTg9aYdTqSQ4B3o7MB71mzou1aJZ&#10;l2Rl7NnTMRyP+t870OuXA70dkpk/q5gfHW0m5vQPRPtnMxRx+vOmk01WtC9FvHGgtwMHejswEe78&#10;ptmTftWhdG8Ws4hWw2d75uiBt6d/dqQSYd+n9XYjGhu7FjII0wkxA5wEAEBi02vyCQEF1lE6JXUC&#10;VqSn+xMPRvyTV4HPQ5O7+0VOd89NetyIh7deN5g5ToycSJ2rt1cCExXzdtZ/6QGj4uHOL7FKf2d0&#10;WDj09lo2uP26JwajvpUDvX4xcPjgHEqpnynFB0bLoszKcwgTKSJIEcP9ScUvHej1i3jEZzdSsmSm&#10;qdD4gaqGjY1X18klF6xOVy7GSxngRVLifOaZ0+OFiIJJDTOIvwHCX1UK7rGdOLgzFtuUrIako9Rc&#10;7pALBD1ICv8r0ef7hd5eCc3tASKGk2ZnEza3b3kFgP0PZscHudp6rkeb+OJA3cF6s4uzNreHeGCk&#10;oQ76r0rqbUY0tweICFPxiK9ObzPC4Q0MIOFQPOoztXZdeoA3P2+gd+It30pxuXtSwPjJWJ+5VQua&#10;3KFnmemnu/r8V+ltRrg8gZMosG6g12fqFngtcbm6l/IiXgdguxSZXw4MbSiEzNQEmwkQURCpZ1GI&#10;3xHhv0aA79kb8e0uYrkSyyyCMzAhnYmfKW8Ox22nubwButATMnWSLabm9hC7PIG8C4tOprk9xLkG&#10;ihvl8HS/zeXuMZVcZaQ/W8+VetwolzeonO1B0xXBmz2Bo8XYRi5P97ea2wNVdeJ0eYPK6Ql49LhR&#10;ze0hdnnNfzaHt3unwxM6qMdnmZl4vJ2Jn6noqubqq8rxDMzMZ+Jnyt8i9RFEgDqmkq53ZwQrpVCI&#10;ZcU7cN0+YeCxEYLFm1BKubItsFZvM8Ll7X4HAACjeIXeZoirqw4AAZmfpzcZVpyK3ohCvj+9dE6x&#10;vjOzugQiinjknLxXJii1lJKfFEj36vFZZiYeb2fiZyo6K8myzE7M7wEQCAhVUWH4wnXdjSBQMBPB&#10;8q56vb0Qze3PmkqOQOBbAAAk4u16kzHyEwAAAtHUguGr5i96PiIhojB1YG9qunlB5nHj2pBrfKsh&#10;zMyMAoXT2/1+vbEyNhFR6kGAKyaUczCiaf1tqyGdRZpOHvf0+X6rGP5Hj1sss4GVZFlmocullOJC&#10;SA/IngPQZWp8TzHU14m/IApEFKLpzMUFF+dzeAJZS4HMi2a3GYSYXhUZpES33mgEImbN3ryz4HE5&#10;dol/GV2yRTg9gWv09nzJxXVjMx1t9fCH8a35c7QFX5tJQgTavqm3Vwqz+KEeM8pWr0ZvyRI7vcGC&#10;f48ZyZOpsB6zWGYDK8myzDpO98UPnnom0OlZ9Fh2eyVkL9ViE+Ld6XUFjZNC/L/s583e0Ouyn+er&#10;uT00blFkR1ugoJ6IJnfgz9nPm9v3FzTGy9EWfG32mngCRWj8K/ImUAhv5okUcN745vwJib/Kft7U&#10;FppQX6wSElG/qRmGF6y/bfWpu58CBeKHzCTHAABGFjG3WGaSgg7kFkutcrg3v0bI8VPJhZDLmtpv&#10;3ZAdKyPMNQA7V/Xu6eT6O4Dwa2gxNjbL4Q5+X49Jm3jf6tVfXaLHp7KqZcvpNileqscNJ2wtV9ql&#10;DX8zLoYAze3BiZ93Gs3toQnbNed2m4bTE3xIXz3CZoNb4aLNpmaGVl6XbW49TZhYUGhybLHMdqbv&#10;t1sstcLhCXRKISZdw40UfT4e9X9Gj5eKy9VVh4uWDuvxDAY6Euu9bynAXRMSA53TEzwoBC7W4xkH&#10;Rg7My2cBVqcn9AMh4B16PIOJ3hCL+H+tx3Uud89bUMpJi3NSiu6I51EaYKW3+5w6tE3e08j07EDY&#10;P+1ixACXS1f7848iQM4q8czEseTc+nxKTDi8oZhEcOrxjCSgc1fvNQk9XgumSjgV8IFEr+80PW6x&#10;WCZnJVmWWcHpDR4TiNP2MjDAyVhvx/xSrwKwyhP8oV1gXjMbUww3DYY7ci6P4rgk8Gap4KeQxwBl&#10;BojEejvGbpVlu8ATPKMB+VGBYtpeL2Y+HAv7Jk3oplr0OhsxJQ8lD529v39TzkrgDk9wuxQ47eB9&#10;ZmKVhBcP9ucuUOpsC/UIG/j1eC5Kqe8nop3v1uMAAKs8t1xkA/s2fT2+XBTRQ4mIv1GPVytHW/Ae&#10;acMX6vFcKMUfjvf5vq7HLRbLRNMemC2WWuNqCZ5PNnUxMnYLKc/W2/PFRM8QwzVA+EBiqy9rHJdR&#10;V9qb250vBoK3sxDvwbEq0NMnRjomDAKnDqGUn9XbjGCi3zHiL5AxgAIWpCtTF/J+eFCh+hyS3CQl&#10;FpxUMNARINlBQr1Vgnil3j49xQASAQBSKfqUkHC2QPxI+hBX2GdLkfqWFCKOgFv0tvyk/7vEdA8g&#10;3Dp8PHVfNYxNamwM1Yul6pWS5buFzWRVd6abFPE9iWinqWWTLJaZyvCBx2KpRsvXBBbPacB3IHO3&#10;kMLUmm05MQARfzI5gt/Ys6Pjab05F2d78CWs+EtSClOz8ywzBxGnFPC7dkX8d6Z/VeXj8ARfJgFv&#10;AQHT9g4WQin1BwZ5y2C04x69zWKZrawkyzKjubyhfyOC4RXfmenfsbB/hR43y+Hu/owQti590PR0&#10;FPMIC3jH4H2+nwEANLUGmmwSthovqsmggO9M9Prfmok4vYFHBQrDa++xSg3GohvGJhE4PYG9QogL&#10;xr9qeorgkUSkY2x2pcMb+KVE8Ybxr5oeMx1JArl2hzc8Dunv/p0E/D8S0VCJDiZSLHhDvLczBKPj&#10;wmxse1AImPQWaS7MxETwx0TU/yq9rVq42kNfQ4BxM1LzQUAnFOALd/X6+vQ2i8VyipVkWWaF5vbA&#10;fgBxph7XEdMJs2sH5sPh7XmPRPm/ejyXpKI37Yr6cy7SvHJdwFnXIGJ6PBciDsYjvpxjk864aPO8&#10;JXPtT8k8xq0Rq/54uLNVj2c4vcE+gThpe4ZiOH5y/4HT9+3bNKS3QXqWY0hKzKseVlKNrNgVvfbf&#10;ehzS6wtejhLv1OO5kIL/jkc7vqfHIV24dFn9HMjrdp9i+HYi3FElBUqn53T3bBRSbtbjuZBSl8aj&#10;nf/Q4xaLZSIrybLMGs1tgc+CTXTp8Qwm+l4s4v9vPV46l8vm9udPOTV+oPcaAYDT3lZyeQJDKMSk&#10;leKPPXFgzmTJTDanJ7hDCFyjxzM4RVfG+vzf0OM6R2voSmmHSSvFE9HOeMQ/7W2r5cu7GuafvfSk&#10;Hs9gouFYxJ/H7WHG5vZbp5zMMNDbIfK5hTfdtn708IHTjsQ2HdDjVa/ldntz3dCIHs6W7zayWCxp&#10;hm5ZWCy1bKDP/1lFnLNGkyL+aXkTLACAu9RAb8ekFzrptukTLACAqRKNkyO8PJ8ECwAgHvGtVUw7&#10;9TikE6OOfBIsAIDE1o47kqRylsNghkg+CRYAwL59m4ZSJyjnLUhSnJrqc4+HPNm2ZqZMW97bWgHn&#10;TKJoaOS5NZlgAQD0X5UcPnnsOXo4w8g2slgsaVaSVSTL1wQMjdeYTFPrlov1WCEubN1ScCXrmSwR&#10;8X1Aj0E6frkey9f5679wlh4zYuREasJ4qIEnDuSs5zSVYzn+DSn6/N5+3yN6fCqJ8MQEiJi3xiP+&#10;W/X4VHZFOj9PDA/r8Vg4dxmJyQzu9D+cIt6ox+Nqzlw9Np39Tx+YUFpiSKLhMXuJXt+E2lxM9L34&#10;9mv36fFya1p3c8Ezavfs+OTTSYVvGh8l5sNybL3HSnI4vlSUOl2NF21Zp8cKsWrVlgm/g5miWNva&#10;dVmXwXGjuZ1n4nddSVaSVSQNDaQdmAoj7DJnrR+j6myyo9ClWUqlaX33aj1WCQO9B7JqQREffjRl&#10;+GSdbb5t3uv1mBG7d254nJmOZJ4z8+8hz56nbPv2bRoi5nHjvAotrprutciUmgCIh31t41+Rn3i4&#10;Y1wv1Phtn7/BiK87+/0oVl/Lp3Co7sCeTUeYaWzsFhMf3vsvY0noKFbEH80OlL8nNDdsqMtrbNVk&#10;dkWv+SVnd1gx/iwW+9ix7NdUCi6cO20B2+kx1s2RRRmwbztNvkyPzRRi4Zyf6bFC8NCSR/VYIRbU&#10;1b1Nj9WCqjoJ164uIVjm7CExSsD0xSDzgSyuBNg05RiUcpM2+WY9VhmbUqQoAelZe/957LENk475&#10;yQuKnIPJjTh2IrV2NImg4/sPFryd4mHf+zKPk5R8wfhWY3j0PEvMW/U2IxTxjlPPNk05Bm0qKUUv&#10;SdfDIk6EOz+it+fr2PH6lrEnqKYdoD+ZRMT31UzipxRNWiW/zBDZ+MxM3YjKLOpNPBAuvJe32BDo&#10;c3rMOGQwOLt3UgqunZljmxlRisv0aCFGV6IwvY0IsB0ar550LGS1Ks4PbZZb3rJgFQq+uBg/pGJB&#10;AQvOXdN9jh6vlCbPlvcyg6ken6IS8mpmYiHw03qTUSig6bmrb27S40Y8cv+1/2bFRIop3/FT09kV&#10;2fhPPWYIwo0AikkMv1hvMkI02F4A6VmJ1+ltRgxGj9wLgGPJX6EeeeAjBzOPY+ENe8a3GoJKwUEm&#10;pkTU/yO9sUIYgecsWXHThNuiRuyJdsQgK9GuBivXdJ+DUk5bbT8PiHmskJAXKdatXNt9kR6udctc&#10;X5l2lrFB5n9JyG9oXHjehKEV1c5KsopgDuKLMb3LmvohOVuLM04gjWleA5+6Yq8wgfIOlLC2WhLR&#10;EyfVVkQGRRTW2wrRMG9OMW4bHGAB+/WgUcQwYYHfQiiV2s4KaPC+647qbUbE7h291US2Xr3NmE3E&#10;jKxYmLodBukd9WQRMggGxG+h4Kr4TZ/CeObp9S/So4UgBdOum1kuoo6fp8cKccZFm+cCMJ11Vpep&#10;YQIwejCz19lercdr3WkNI5dl3543h9jZ0mO2dxUlgs1mr7tRb6h2VpJVBChkiCm/WWBTEvKdAMQu&#10;T+C9epNxhALluDEjlYQMYjQFNb+dimBOPbyeGcFGWJRCkRLpNj1mFAkYFMw5azQZMXxi5GXMlHM9&#10;QCOElJehRGFmIHW2ePQa07WVWMH+oaPDAT1uFALMgdErIxMQkH1F2feLZXlXA6JgRGF6fBgxhQmw&#10;gCWOSkMK8T/p28XmLK23/TcA44LzF31KbysECfikHqt1KOW79FghLmjbsgoAAASaTES7EABACqya&#10;W9f5spKsIhASbSgIne6QqWydUXwAQCAjvkdvM8LhDX4bQCICFKN3pShQIAICrFzzhaq4hSmF+BCi&#10;QCWkqYTW4e7+WPqR6RM2AMFN8sRQgevknbL3/mOHAND0Ar4C8KMAAsFe9x29rVJYwG/3xfY8q8eN&#10;OTUhZIW522osAGwoUDguGj2ZVJjzrCW3AoBAQW/U24xiBZFdfb7/0+OVgkKeDSDR4Q58X28zRPIH&#10;AATaEN6iNxnhvPiWd0H6Ast0j1iVQWGDtwEIdHoDWeMpjatHGQIQyBLfqbcZcWHbIme+5WyqjZVk&#10;mbTM9eXR6akSWXBeVaVzu90uhVoEACAQX6i3GoGM7wIAQBRV8aNs8gQ3ADAiopBz5lXHQrJIlwAA&#10;CCCHmQxJCFso83j5mi5TZTwS0c7fPfDADWPjhQq3aYQY/q5HjUv/fmxSvFRvMYoI+vVYYbgf4A7D&#10;swqzOdyLg5nH9ac35Kyblo/G1aFzM51hcp59UG+vBAYavWgwP+aISH1Bj1UFAVfoISMEynUAAIhy&#10;pd5mSKru2+kHDOev7zFVxqXKcKbHUKCYtDBxPqRML/YukecCdNn09nzV2/ABABQAAKtagwXNdK4U&#10;K8kyadmC5KHMY4lYd2HrVwqqT+V0nwwDyLEDo9MT3DT+FflxeoLvEgIyP2bh9ASf0l5SdjaBWzIH&#10;fYnCpbeXm7Pttk9m3g+iQEdbMOeSNdNZ2Ra4NHsNwnkNi02PpyqWRMT3Zz1mRHN7iLOPDw53wNTt&#10;p3iko+BZfNkSkfyKoU5FSnF15rGQWPBMzrq5tCc7mTmt6ZsVrSXldIfeIBHHTmQub+Dw+FcYs6t/&#10;o+lbzsXiaj/1WSQK+6oCx/i42gJfzP5dP88bKmgxa6cn4BEys60lzreLqkiyi8HVHjyRfS5yeIIF&#10;zeRd1ZJ9Z0egw7Pw6ez2fJ2/+sYlmLWf2e0YHf+K6mYlWSY4vcE7UIhxs10a7EnDNXca27esExLX&#10;Z8eEwM842m4zWAzudrsQOG5MjxD4HIenu2L1RRze0IR19Vye0FhNqHJb0XLTImGjcVfo0oavX+kJ&#10;OLNj0+uy1dnEvdkRFKLB4Ql8MTtWi5raAq/QY1KKqrllaEZze8+EsiYuT8BwCQ+HO3CrvrTOmUuP&#10;Vex3DQBCSPhldtKHKBau8gSLMramkhyewHUIYmF2zF4nfwlwp6GZho62205Dm/hEdowRXti0/jaD&#10;9fvulEKIcRNmUOAChydoeqZypTncPa9BwHFFjaXAr2Q/z5e9DsZdvEphW9zk7jY8IWPB/LkTVlBw&#10;egJ5rftaDawkq0DNbYHbBeKH9DgAZnoB8nJB25ZV9WDfpscBAKRNPbOiJf8xI83tudcdk8L2I0dr&#10;sCgzc4xwtfX8SSJMSF5QwAKXN1jQVY0ZK1puWjSnbs5Yz2M2uxAx57rNy/X4ZJrbl+a8ZSWF+ITL&#10;HbhBj9eKVS1bHDab+IMeh3TPyIQEpZY0eQIPZl+hZ6AQDU5vIO+CiQ534Nbs3rBTjO37xdTcHso5&#10;C9Au8Hsr226ZUMG/Vji9oSukEDfpcQCA5vb9eddcW74msFjack8GsdXT/Reu627U45OZ7L8rBX7O&#10;6Ql8WI/XClfLTedLKX+rx+FUz3beJjtW2KTtrxe29YzWYJueyxPIWc5GCPEeh3vLr/V4NZpwwLFM&#10;o+VKu8vu2oeI096DT6aSL93Vt3HSgaMud/DHKPGtelynFHcmor5JZ1S5vKF3IsK0g0EV085E+ND6&#10;UhcpbXSHFtZLyOtWBaXU8+J9nQN6vNic7YFPCRCf1+O6VFJ9a3Br5wf1eMZKT/DVdQJ/p8d1RLw3&#10;Hjl7FcAVOU9+VQgd3sCD+dzOZcVXxKK+u/R4tVq5pvucurm2x/S4jhkgRSMrdkWvHasIP16XzeVZ&#10;vA+FmHa2ZVKpl+yKdv5Vjxeb0xN4qxDix3pcp5hiifCh1aXe94vnTulof+IBCTjhIk1HSXpbfKv/&#10;J3o8w+UJfhoFTlvENAXqW4O9k+/7rtbA69EufqXHdcS8Nx4+2GSm8G6ZYZOne5tN2KZNxpn5nbGw&#10;74d6PMPhDvx3Pr3eBHRvvNc/6djjVa3BNrsdotOlKIr4WCIVWwr95sZpltLUn2B2w0y5gSUt1y06&#10;037m9QD8PoHyDP2FU2IAIv6NUuLmoZHjsXkNDW9DKT6ASOuNDk5lRfcqxjtODp38fUPDXI8U7BMC&#10;X2a0R5KZdwHDt0cYv7on2pG5xTH2eQ0Y+zfL2758ZoNMfU4yvg0FGB6bwin6sVJDXxrcdsMDepsB&#10;WZ/hculsf/47QPFVQuIl+gunpphZRAnwm08lT971HKhfJ2xigxDwWv2V0yGmxxjwf1PPHL91z55P&#10;ZnrvCtnWxXLqv728q8F1xpIPg4T3IdDzcvXyTIFY8V8Z+Cvx6H2/Abgrk0xW8rONcV0SPJ9TcBMC&#10;v1m/rTctJiaGHw0P42dtJ1IH5VK5gYHfJ43u+wBAin+jBN28K9z5L73NgHHbdKWn+9U2kNcIQS83&#10;+J2N7fvHTpy8/ZFTkywq+Z2N/beXub48f9mCET8gvA9R5lwUfHKKmcUfiDA4ok5G6uz1b0DCK43v&#10;+8TMGGUQ3zh+/PjP586bexEybBQIrzV6tlSsHgOA75w4PtxdbdsaXF11rgWLPwYg3odCNRv8HREr&#10;/msK6MtDJ4f/PmfunBfbED4CSC8y9ncUE+P9wPhtPnzi+2Je/YVgkzeg4DcYPTcqooMC4FtDJ+s3&#10;773/I/8ZDVdyW48x9EFmiybPlvdKkF9HIeqBaJhR2BEJjX7x2ZiJR79ww9WGOeuLYiZGTF91G/07&#10;4xEzAxBiUgLbmWCYGd4ej/rzGgTudAe2CIFXM7CdEJOC2W7u/aQ/W/r9YB0BJYGhPx72t+uvy2Wl&#10;t/scG9p2I0M9oVKoUKAAYeY9mfnOxiNmRkbmJAhRz0TDzPjReNT3Lf2VpdS4vttrt4l7UEA9MiYZ&#10;0VaU3zUDAQICCGBQQ0fhnNMfC7/V8DgnM5rbAreDxPcCYp1iGBFA9vTMP2OfTd/XAMzuZ6O/a4CU&#10;ACGBiQHFo7HwPxuzEtMpNbUH9kuCZYACiYiEAGnuPaX3fUSRBIA6Jhoi5rckop3T9tAW0yrPra+y&#10;gfo5INQD8QgIrCvkO8uWPj4iM7OpfTb93SOnZ0UX/nfSBT0FA0BqdFsPK4aPDEb9Bc9qLcQq7y2X&#10;2Nj+F0BRx6wUopTF2PeLsa0zv0coyr7GBERJlDJ9nJX4ufh9vi/prysnUx9otljVGmyTEj+KwO9G&#10;kZ5Gmj9iYnicgT9FLLZL5rcLCaPLixj7QXE6Y/80oO1XAOoSCfwFRGFwcDwxgEAm+joLdUe8d+N2&#10;/RV5wtG3BACMTe6eF0qU16CgNxi7moH0NR/BViC+MXXQ9n979hTau8aYqaXStObG50LdnPfZbPiZ&#10;zGfWXz01YsX8JeLUnZLtrSzgixLhDKN/h4mJEL+jIPX13eENVTAr5tQ2WtWyxSGl7UMo2F/IyY2J&#10;jyrgT6WU+sVDWzdmxjQZ/M6KDgG60NW28OUg5TXA8Arj+ywQMf+dibYoZXvaZuOPCAHvNt5jTAyE&#10;T4CgT44Mnbx7z46CezLHXr+qZcvpKPG/pJBfQMTT9RdObXTfV/TVJMM3dvf5d2TnlNqLy2XsszVf&#10;cusaUuojAvlDxo8hxKTwaUbxKcZkGAGvkCA/VdgZjpgJbkwB/kQytyLC51HAWUb3j9Hf0XdJya8M&#10;9l29tYDvvchO7fuN7s0uO9o+iAg+4/s+MTMcZYZPE9ruQVIvFUg3Ago7opF9bXTdT8ItisUPhODn&#10;IdEmKWGFsfczepxl+JGUqa8O9B4NA2ziym7rUwx9EAuAszXwKmEXd+vxyQw/vadhz57bhvX4Oatv&#10;Onfx/Dl5D7ZNjiSX5ZpSfcZFm+edPq8uvWxJHpSC9kS0oyhLyUzG1R76GgL8Pz2eCxEl4pFDzaUc&#10;K9K4NrSsfg5kupCndSw1fNa+vo8/qccbG6+ur1/WmHMgZi5qJPnyRP9GU6UUyuWC9d2r59bb8l6O&#10;59gJWrJvpz/nJIIqgw5v4C8SRV7rLxLTznjYvy7XAbqp7bZX2GyUc1JALgOHD9RDbFPOySjFcMZF&#10;m+edNq/uWL4H8STxC3ZFfObWsyyTptbQxTY75HmLleHAyJx5+/uvOqG3GN33TxCf+e+Ib0LZm8bG&#10;UH39MjCw7/PLE/3myqiUy4rW4PPm2DHvYRpHj51YmnX7c8zyNYHF8+eKCfHJHE+S4+Gt/hylL+6U&#10;Du9jJyVKu96SCxO/PxbxjdYsqz757p8WzXSzLUhxTzzq26DHdQ5Pzz4p5Pl6PIOZd8XCvmkXH3Z5&#10;gz9GnHwQPQNArLejbN/3WS1bTl9SZ396qv9gKkWvHOzz/1GPl4rDG4xJnHwgrSL1SCLSOe0MQ4c3&#10;+FWJOOksImagWLjD0PTyauHyBE6iEA16PEMR7UxE/NMOkK02+Qx+P3lyaNXeHdft1uM6lzeoprpi&#10;J1Jfjkc6c8w+LA2Xt+d7iFMsg8IAA+Hy7fvFNO1xluiH8Yh/2mriDm9gYKpJHcT0WDzsn7bGocsb&#10;DCHiNXo820AZj7PF5GoPnUCAceUbshHz1njYN20hUJc7sA2lmHQdXiI4FI90LNHjOmdr8BPCjpOW&#10;xGEmjoX9k+6H1aImfwzVYrIDADF/OB725b2sicPb82SuQbX5nvQzXJ7QnShgwtpO5U6wTumyTVbq&#10;YGhYtTy0rTNn6YpScnoDjwoUE1ZyN7qtnW2BTwlb7tmKtXqQzZjsd61SvCfR5zNXJbuCLmzdcl6D&#10;3Z6zjt1IUl24e2vnXj0+mcm2EQH74r2+sVUAysXV3vNNBPkBPQ7AMNDrm5G/R1Z8ayzq69Djk3F5&#10;e/bmGlDPDPtj4Y5pZ4xmOD2BTwkxu/Z9Bn441uubsO0m43L3PI5STtimivhQIuKbNsHKaPIG32FD&#10;/IEehxra1lWfBVazXF8yseo3kmABACTCnWfqMQCAhIGTPgBALNJxBTEcnxDP8T7LY1NqiFMTTsrE&#10;9CdzCRYX/Hkmu1pNGNzW8T7/F4goocefOT4yusxS7cr1uwbmkVpOsAAAHtq68dHhYTWh0CpR8nNG&#10;EiwAgIHegTo9RgQPmkqwXF0T/ma+Yr2dHyTmCft+rSdYMMnvkYGeNZJgAQDEwp0r9BgAgJEECwAg&#10;HvF/gVL8sB5/Zm/V7PsTtle+Bno7MDPhI4OYkkYSLACAWLTzHGaeMATESIIFADAY9v2QmX+vx0eS&#10;Jy7UY9XKSrJMIkW/yXrG8XBnQcuHpFJqXDfs8LGTOZOB6cTDHeN2dJVKTnvLspQeCm/Yoycj8bB/&#10;wonOiCZ34L/0mBHHh0aee+oZ8bHDw9PWPMslHvGPu/WomH/91P3XTjjR1aLkiHp+9vMD+w4aOjhW&#10;qz3bOv+kWI3rXY1HNnZlP8/PHckU87jaTPFIh8HK4eO5Fi7Je+xQLvHwwcUAMHZiU4rLdsuy1JjV&#10;1049I471+g0O+k87fCJ1bmbANQDAUDI56VCNqcT7xicdpPjnTz1VHfu+yxN4nR4zIkX8pszahQAA&#10;h/YdKmhN1lQylX13hpIj/IKs53mLhX2vzv7OlOLo7q03GLooqqRZn2S5LjZXDTke9b8+85iYfz6+&#10;NX+DfZ1bTz0j3vPA9VOOH5kKEz2RfkSc6NvYo7eXWzxyzmi1eWKlJvYkGIWIppZUeHj7tftY8RCk&#10;bxXAvtjEQe75UpQ6lNn7E2FfQeupZTjcoZefWnC8snb1d/4rcyXKxIP792+aMKi4ViWZxsqCKEq+&#10;fHxr/gbDvrdlrvoZ6Bd6u3E8bukY4zalWNHYZJpE1Pfl8e21KxbuHFs/jwFHj2/GPbZzw+OKTvX4&#10;Zc2KNYyYRmdBE8ejPlMXfk536P16rEDIAJMW+czHrmjnrzKdYaTooUL3/V39G59RDKPbl3BXf+GT&#10;LlKM38w8TkR9nvGt1W1WJ1nOtp4/AdUVZaV5JqZ4uPMtetwIxfw1AGImHLe+llGxiP8cAGIiKuks&#10;wvxdoZiZmJET0c4/6a1GONq+dJoUYp4eN4qRrxut8XSj3mZEIrJhScF98xrk1A2nLUxVtOcxGwN8&#10;F4A4lRJv1Ntq2UORjf2Zx4mIqdmfSMApZqZYr7/ghaYzzNYIAgA4eQI9zERM8He9reYpPgCgONbr&#10;mzCm0hjsAiAmppzL9eQrHvYvAgBgAvMzSFm9zeEJjJb2KZzL1WVHhkknQOWLCO8GID7MNnMJjaK3&#10;QrpO4J16kxGD4YMfAaBMOa2aMquTLJRiHQEVdHsvGwNdj6LwcUIZTPIeAIZYxGdq508TzCC26NFK&#10;YeDMjCxT2wmxYdxtrELFI3O/BsQ0NDxiqlcsgwCmXUpiOizRCYzFuqI1TQH+hBXTrv5rJow9q3XM&#10;9Cyw6ZMjM8luRPP7/rmu7qV6rBD/ftD3VDr5o8LHhlUpQni3ycMHAAAg4G8AGA4l5+YcvG4MsULO&#10;q4DzVBihFRB8etywRYt/h1KcbfY4KxTdDgDwRN/Vz+ptRiT6/L2QPj5OuuxRfjYpAABOqYJ7MStl&#10;VidZAHxarll9hjFeW4wUW4iR9QAITZ6Aqe7eUSJ5TPXpwUohxdewou3pDpLCMcuNeqwwVyVRSpXP&#10;lP18IMN79JhRAvA5gHym2QNksRw8cuCfKGVNlqKYDjE8RkRZt+gLc5LUN4wWTsxl0ULhAwBY1Rp4&#10;ld5mnOATJ+rv0aO1jgGK0suLDGsBEBbUHXuv3macQAS8TI8ahFLiYsGwTG8wCkG8dHQ8lbnjrD2/&#10;unL5EZgI+4pwOx0AbRNnLFa7WZ1kYbr4rWmIvBQR2chK7rkg4H8BCJQCx8YfFEoxH39ooPDxBsU2&#10;2Nd5BwnMu4jrZKQNng8A0NQWzKvY6VSY2abHjHKOriifrppsQsuV6WVgCITZA2SxPB3blClya/bT&#10;VR2F9Bpi/p4eN4qefHS/Yv61HjeKAN4JACAETFmDKQ9IQEOPPPCRvItC1gop8MUAAE1tPaYG9LPg&#10;DwIItCn5Jr3NiPPdmy8AAJAocs4Oz9dpTTfPB0BGIYp0QYPQ6L7JzC1VJEUfBBDY3B7IWT6hAKaO&#10;IY2NXQsAinC7qAJmbZLlbAt9OPO9N7d2mxq0mL6SRWGvFzv1FiMQ5UpIJ1sTal0ZhQC3A3RV0/dL&#10;itRderBQKMDsrVAExAmV+I1CKfKukj6VJul8PwCAlCxXeXuu0NsrBFOsYtWS9BXT7vCGxwf7Og2V&#10;WsnlsccCJ4HBdEFdgWIFpJMssxNDWCD+xuxJrXoJFChu1qNGCBQvBwBAiS/V24yYi/bRKunjSx4Y&#10;tWxRnT9TlmaVt+eDenveXF2jk2YESqzPe2WCHFgIMRcAgFm8TW80ignJ7DHEvmzJ/lrNV2ryTReD&#10;sNFXxrr57baf6u35cnmD/848FigazvV2T1oxdyoOT/D67Oer2rpfmf3cqOTIyFdLuVRNIXZHN5hK&#10;Qh1tp7a1FDiv0R0yc7XGJ5I0aVXifDgcXzotu/K3wx0s+NajTYqvp3+PAu0oTY5fKBpGRaau9meD&#10;//DB7+sxI5zuno9nHiMKbGrtMTUFXxFfb/akVm2c3uBYEVkhqaFp3c0F3TZyuHtenp0UNbUF3zH+&#10;FflZviawWAocnYAj0JH1/oySEj6bORfZUX5Db8+XY8GSsTsXNgGTVrefjtMb/FnmuIYIwtm6xdRx&#10;kujYc/SYMZdLATx2XnV5gzU1LmtWJlkOd8/vxxKsUS5vyPD4DIc79HJEHKu5hABiIYqCygFIgeNm&#10;udlttgkF2IzYs+3jD+mxWnbh+pvXS9upbQ0AUCdgX/Zzo3Kvm5U/sXDeuNuxUmJjc0vPJdmxfDi9&#10;oQnJp9Mb+JEeq4RE38Zdeswy3oHopsyC5gURUo7rmbHZpanbj4MR/4RCmbXswvW3rReIWXUDJdrq&#10;G8YuuIyQUv4x+9hvs+WuJj6deQ0w7jgvkc9t9hrf913uwDb9XORo6zF80e9oC75JCsyqZyXQ4Q0Z&#10;PhetaLl9kUAcN1NW2O0mCkcDJPo+YWrwvNPz/GeytxEinuVY31Nw6ZVym6FdypNzeoMfF4g5u5uJ&#10;+MZ4xJdX+QTH+p6zZL3MmVET87PxsC+vYnnLl3c1zD976Uk9njHQe0BWW49UuS1f07V4/tylk44x&#10;yVURutScFwdGBIucC5hOtshsLk5vT7dA2anHIb2g70d3RXxf1eOWmWGqBceZmWJhn22m9UgZVbx9&#10;f/IlvgAA+PCB+liei3lPtvQMGNz3V7Xf+iU78A16HACAU3hlrO+avHq1VnhuXjlHNOS8GCLmv8XD&#10;vhfp8Zxabrc31w1Nug3y39bF4/IGH0TEZj0OBSyFVSll32iV5PCG/iExPXB6MkzwYGyays1Ob2iL&#10;wKlnuhDD8eQzcPaePR2TXuU2e259Kwj+sR7XJYd4za7tvqKM/ak1TnfwE0JOvkgoAIBiSh4DOvOx&#10;8IYDeluxnb/6xiXz5zQ8gXLyRZQBAFLMNw+GfeNuAeucnlBCCJhy8W9S/K941Dflb9ZSe5zenitE&#10;HreF+QSti+3079Djs4HDHbhBSvElPZ5NMY+khvDcPTs6ntbbMpztgUsFiHv1uE4p9dpEtPN3ejxj&#10;+ZrA4jlz4HGJ6fFKkyFF3fGof8pZ0I724G4JOOVEKVZ0byzqn3Km+bSLgwOAYjie0FYC0TV5e/6f&#10;DWVWVf3cTh4fOWPv/deaWpkgH42NoXrb6fysxMwt2dxI8f/Go7736fFqMiuSrCZP4JjNYAFLZqJY&#10;2D9utofDE4pKAdOuQp6NGWhkZHhV9u07hzv4eSH4k0aKDzITk8L3Jfp8pusx1YJmd+D3LOAVxrYR&#10;0FBqZM3erdc+qLeZ1bh2s6uuoe4BRGO32HMlSS5PUKE4NZYrH4rUwUSksyi1lCyVU+i+r5R6/2Df&#10;xqLUdKt2rrbA70DCq4xtI6ATQ6n1D+84Ne7T4e75qBB4m7G/Q8yEn4pHfWPJ3aqWLQ5ptw8Io/t+&#10;ksLxrf6x1QUg3TOTqReYN2J6Jh72jyvv0OQO7ZaCLjT22YCO76fT9u3zH8rEnN7gtxH4Pcb+DvHI&#10;CL9yzzZzhaVzWbnyC+fYT1vwiPHjLCXi0fHLnFWLvDdsLXB5eq4EEI0AsMHoSawmKd5DDN2KUj/d&#10;1b/xGb25Frg8wecTwEWS8fMgoehJhGL1T8Hye7FIxx16W25dwuVZ+kFEfiMgFqFmUYkwgGK+HRC3&#10;JsIdY0tOWKqDa113I9TZXsxMHxdSFH0xWybaBww3Ett+mjBZMLJSVrX0XGKzyWYGuFkIKGh9PEt1&#10;YMXbAPH2408e+O6+fZty3gLXoMPT8yFgcamU+E69sRiIYJNKwfZd/R2/0tvKaUYlWRkrWm5a1CDq&#10;LwAhQijgUr3dCKXoIQAVk9JuasYPpO+P/69ANF0Aj0j5kiz/vCfaEdPbaleXaPKe3owq9QFpEx16&#10;q1EppS5XqdR2MxMAmtbdfLaQYg2Jul/bJJiqqaWA/oCEFwiBU94enA6RepAI3pekkd17+68/rLdb&#10;qg6uatnSJOzylRIxYPaQy0yfSCXlL2ZWFf4u4Whd4hLIH8Qi7PtE/CMh8O163AgGBib+jkDxHpNf&#10;GTDT3cywQgjh0NuMUEQJRIzpA9ONIoJDCOrPKKSpUkHMxATyvQLEfbHwx/bo7flacdHm/8/emce3&#10;UV57/5znkewkZGeHlEBwYkkuWxxLcunG0paydLktXeheWpZewJKTAF3ddLksSSw5dGHtdm83eLsA&#10;ZelCKW1pJDkJELAkJ4ESGsISsi9eNM857x+yHOmRZM9oZFtK9L2fe5F+z8TXmcw8c+Z5zvmdYybV&#10;O05QQjzusBlsE/Df0ODg9gFj42vrK6Nht83LpzpobLxlmpxZ9zqKkfNoMjBwnzFonFRodcjtD/cK&#10;xAW6XgxS+MFE7Lq8tgtN3tAjIIVpmwYm/lE8Grhc1w9lPN7wepQ4Yn5cNoopmIwEw7peLt7sW/VJ&#10;FuYNLIk5kYgE8kqpT1rYefxUJ/wbhazXxwpBDPsTe3bMBpOJuTUqG48//DBaWCUl5p8kIpWdd1Ju&#10;3P7OZwTK03W9GIpgcTLa1qnrZnKWsmGi38Wj+X0o5/tWfLZOOH+s68UgomQimr99Ne/05cdMmuzY&#10;bPZZRAz7E5F/zgC4T+ljHn/XVkQ4XtcLwQwENHhaPLY078Xc5Q89LVGcoevFQINWPNcdXKrr5aJp&#10;0fIWcDpjZsMTJtocjwZzKs8rCXN/i0MEd0vom8IhOnQ9GyZeHo8Ghn1rCrHAt+KtTuH8h65nQ8z/&#10;SUQCJ+l6Lh2iqXV23s2jMxFVHZWCpyV0JjrEU7qejVL8ejIWOC69iTb2eHyhl1GIEX16lDJak7HF&#10;Izbo9vg670YhRwyclQE3JrvbClbD1qheRqsqhqGLOX4YVxc3+lee5kDHiAU/TLQtHg2O6sM0UkVg&#10;hjf2D04dbfXD7Q+/lGsnkY+RgrN717T9S9ez8XjDd6HEEY1HieBriWjbiEU/C7yhDzilGLFljVL0&#10;fDIWHDHJvmHhrafW19ePuBrFCvriatIMWHtl0SrNctLoDW90yJGLA0YrVqgEDruHt3tR1+eFE+7R&#10;dQAAQ+H1vbHrlut6MYrduKxoIB4LmnpTAQDw+ENUKPGQGSgeaStTq4Vq5lLZ1NqaApB554iIjUQ0&#10;UNBKYSxx+cMDErFO18FiUOzxd3Ygym/qOgCAIv54MhoYtfq0RvVS7N4nYkpEA7V7HwCb/F1U6ElF&#10;QKnE6mDBe7AQxZLOmYnjkWCeXowmf3gAynDvu1u7lgiAgs+bFKuPboi036vrRcCm1q6CgTgzPRyP&#10;BC/S9WIUux4n6lnU1BJeCw5cqOtg8VxPJKYvrEOFxJq2H7GivIvXUPSUlQALAGBQqbx8L0W000qA&#10;BQCQvsFVXsA2ERd1ZXKfMpgLLmdPRIAFAJCMBOoVUaa33zADA0ZONdFoxCPtywzmqK6TMn5SC7AO&#10;fYo93GsB1jBsgJG3bUjEhpUACwAgHil8Tov9GxSjJxKoZyItuZt4cNDw5Wojk1jdtoIUP6nrTPAz&#10;CwEWAAAbivNacSmmV60EWAAAg/0HjtU1mMBnUU93oJmZX9F1Irb095pILF1chwrxWPCjer+p3liw&#10;YLQ8Ehtj7f9g5iwTOMVJY0rBi3Q0DIachM+UUudlf7eK27tyzPbMS6XhzK6Su8z3RhY/y6xyXJ4H&#10;1I4Z2d/Hm31IOdsUpCi5ad3IW4SF6I0E/LqWiC0+rHJwDmeY6Irs74Os3pX9/XAnfe9zlou94v0H&#10;6kbdIixEitVbs+f+lMKS5tk9L1NOJTSz2Lxx7eJYtmaGtL1L7rMoHm37TPZ3M/TGAvcxcVYhDHEy&#10;EjSVr5XNpqe/uo0Ifpat7RtM5eWWjSfxyM6c9mmK+T+JaODhbK2SOSyDLAAApeQnMhd3isF0EqpO&#10;PBIYrhYjJbeWul/dG2m/Lfv7hlj7X7O/W0bK95djO9jlDY+Yw2aFuklgqxVCPNI+L/OZWW3fZLOd&#10;iV22RBb3KcVG5rsdnxZF/PH09UicUoMlTfw1qpN4NDjs7M1EamOk/S+5R9SIRwKnZD6zEvteevZL&#10;RV3gR2JDpP1JJhjeWtsQu66keXbLlsV9SqmhlWzieKRt+PezCiu4mjn9LOo3yHQxlE48GhiuzDMU&#10;PJY7ap5EtO0zmWejYt6/ee2SCa5kXUZENPw7JEfNda4sDtsgKxm77peZfkgbIm12Opan09yJKaEm&#10;lXyjQfqCfgCAWBHdro9ZRQCePXduh6nqtZFAgWc3wLW2f05DU9epzGyrrDoHZbxZlyaCZKw825XJ&#10;aOBXrJiYBW+ILS1p4q9RvTDD/wEAMKLp6tXDE8WDgHkVu1Yghh8AAJBiW/5yyVj7tPQngXZeaOOx&#10;XXcBpaOs57uDf9THraO4fwDs2TOQ6AEAkIo/pI9NBIm9u87QV/yqhcM2yAIAYFIDulYKivBOFIyl&#10;rmJlUAp+AiAwGQ1erY9ZhZlp8nGzC/Z8soJAflfdorm232Tqp9C9zNBqZzICAFCKggAA8e7rLTc/&#10;HUsIyL4Tv0ABrEp6Qz/c4Oc8dTvWzJux9e8NR+9av2jenjXNR+198vRj6F9zJuvHVgOGgb8AADjc&#10;rBqsYDB8EgBhU6xtiz5mhdTAwB0ATClj8GZ9zDrEpFIPgq3K5mUMQmDudl9pMAMBSNz8zC5bq/yD&#10;rJYBEPeUJegrA0P2NQS5KSPVwGEdZAHYM5g8CN6VfpvpsHU+N3YHRizFtQIiAAB9TNetgwDCUVKe&#10;WTYk8HSR0yW+NBDhTF2rBBRhnkePVRhgPUD6DbJGLrtjixr3PLXop/ueXrRt3zNe3pua2u+QR+2c&#10;PmP26w4Wzwun3IZTJ722b/IJ+/c85aXdT7UM7Hu6ZeP+ZxdezU/NtX3djTUb1lz3iK7VyEWQektm&#10;98EOsn7KsQCMUtTbWhFLIxDQaWsHAwCYgJMEYDuAIMM4lxQbdm0/nIB2/07lBgEEppS6WB+odGwF&#10;BVUOopBlqZjoe3VHDzNtsHthlwvX6SsWAKBAwICdlaN5826YAQCAEm2vDgiBDkQGmLPSUuWlDgrx&#10;GQCAU8+42fYqXbkgUmpD9Hd5Jn9WMQgeSLH4mq4fzux/btEVe55qGRB1IgkgPgUojgIAEAJQiPxr&#10;O6NLgXWA2KAMx/f34bE79zzTsn/3uoUjNnWvUdkIKb8EoPjUhSua9TErSKQvAAhEhA/qY6UgBLzZ&#10;zjwLAIDMf91L8nxdt0ryiD1PokDbPQUZ+RoAgY3elVfqYxMEs8HR1MC+rfpApXPYBlmNi0KXZPZ4&#10;3b7whfq4FTZvXtZPgLbzqGAo8VXXrCImyX8CAAjB0s4ydt0xxwYy5+iElv85Uh83y7zmO2akfw6K&#10;xuOdH9XHrZCZyeonT/qzNjRxMH4Z4InhBPhS6du3K7wxdt2IJreHCzvWnnX6vmda2BgUtwuBdYjp&#10;AEo/bjSEAEQEEIBTABzL9zzVQnvWLXp02z8bh/JpKgcmKkv6wqGNRKdD2rr3heCPAQBIB9jamvX4&#10;O7O390qeZwEAaDB109Zy9KB8YplBQP/UZasIFHMAAKSQ39HHJgyB925+Ztlwc+tq4bANsoQDhhPf&#10;hUDbjrFKDT6ua6VACCFdswpKMWSVINDd0lXQ6NIMErEjc45myinP6uNmmeTsS2R+jsPBpltT6Hi8&#10;4WHvGES0XJ48Zgge0ZHeLFviy3bo2uHI3mcW/bPO4XwGAEFK64FVMaQEFAJRSPGeydOm79n91FlW&#10;vIjGHEbMKZ2vcRCPPzTcmkxKLnn79+Szls/N/j5/UedwxbJVEOX0zGePr9NWRWjvUzeUbYWmrw9+&#10;qWtWcHs7P4XICOl59qjjm++Yoh8zERio8vwEq4GyTWDVhMfbeS5KmVPiyoq+Eo8Fb8rWqpFCLvQ9&#10;q493AHzE0gqZxxf+AwrMMXwz9pGr99lgb7Y2Gk1nrjoDJvPT2RoT/yweDVjzgvF01DXNmJ3zpk9E&#10;exPR4PBEV6O6YQbc/4y3oLv3WEJGyjO9+amErteoDDyejjrU733FLydigRz/JDMUnh+tO4d7/F3/&#10;RoSsfnmKB7bJyZs2tVX7amQB93iGntUBy+eoRprDbiXL1bJigR5gQXr153/mN6/06no14fZ3FXyD&#10;afK/Ymkry7Vo1X/pARYAgGOqSDY0dJm2c2huvsOpB1gAACjw0/O9t7xN10cA9QALAEAIMc3t7/p/&#10;ul6j+uAOEPuebj4w3gEWAIBwOOP7n15kezW7xtigB1gAAELiie7Wrp/r+kh4vKGXdQ0AwOXvtFSp&#10;7PKGVuUGWAAAEuuPBs0Fvvpw+0N5XSwAEJpaQ7WCnBKZgClt4nC1hC+WDnxQ17Mh5qsTkUBZ8qvG&#10;E5e/81WJcsQqQDNvbI2+8O8cAj+g69kMIp218V/BvOApG09z+K1YhyPmFxnAP+tdPfqKVqG3z2yY&#10;1b+zjUprVB971i0aEFJYapNSboh4YPpZ3bYKM2qUl9HvfdgYj7Qt0HUdjzd8YMQCHobBnkjbqC+Q&#10;Hm94PUo8TdezMTPPViKjnWtiOpCIBI/Q9RojU5UXg1VcCzvfLevxUSvlv6lB9YENa9vvHzpHI158&#10;E8XcuR2Tphx7ZLuQPGKn9myYuDel6MKNa9pfyJLFAl/4Mqcwb4RITCkgPi8Ra88JpBp9oXdK4L9Y&#10;qdw0mD/RGwn8Mvs8zzszPH9SHf8ZpcjJoRgJQ6mlvTvkbVD9S/aHFXufPiuK6KyIVWRiTk1z7D8J&#10;3xy3tLpRo3yk7314HCWeqI8VwzBwidrJ38verjvptB/MmnrE4A8R0XSxjVL06G6lPvXK2iVvDIvN&#10;dzhdjr4vSsHfM/sMUQS7BMPZ8Vib7arjseTURSveVC+dv0MBpis2ifCmHX0D331t/dL9+liNfExd&#10;MNXEgtOXn+KY4lwKAOcB8HxEZGbGQp3FR4aYCQiFkKxoMwOsN0B+fWPsumf0I8eLRl/ofYi8FAAb&#10;BMPRKFgASIt/r7RhHROxkEIOVf0xQH53+tFgJgZiQiklMAMgUGnnGtLhHwMggiBFCgWK0n6OYlJA&#10;KHAXM/SywJuSqwN/0I+qURnse/r0swDr11XSVMTAwCp1zPSFT2/Tx2qUl+ObO6bMcM5sEwyXArMH&#10;ABxQ0r1PDMDAhIRCyPQcAiX8nPS8xsSEQiAAA2Lm4rT2szLzIwgUDOJZJn7wgEHff2lde17D43Fh&#10;bsekBcfOvlwifAaZTmNgZ+nzLDEpIECxFwESrOCHiTVtPwc42LKoRhrLD9ZKZ8P6pf8eZHgMEQWw&#10;2MeKOG3MaRWBwAxAtA+kYBb8wMbYP57TjxpP6g7U/wOY/46AtpzlEQmFBMFE2xhEfzq8KR1m3s0A&#10;u1mV3vaAiZmB+5l4GwqBpf2bAQBIBhDMAH2MvGaPIVfrR9SoHBTUxSopwAIAQEAQ0vn6G5GGWlHF&#10;GPPK2mUHyMC/EMNrIMReENZfGtMIBJDMAshgetXeHAKAAgUBv44ghvJZrQciiOnSdQDYwUR7Gfkv&#10;ExZgAQBsXtaPwvi7AN7EiHuElLL0c8TpUl3m/QbSs5Q68I9agFWYkk9xNeFp6boWHbBK14vB6cDh&#10;q4lI4H/0sUpizpyVk6fOcfxJIrxVHxsJxao5GWlfl625/eGbBeIN2dpoMPMn4pHAL7I1lzf0aSmF&#10;pRYzpODbiVjbN7I1l7fLLyVYCpCI6U+JN8T7atuF1cHup0+/WOKkEXMkJxIipmm7uuvxHLBUOFLD&#10;Hq6WUKt0iH/p+ogwP7LvlZ3/tXnzsuHk83mnLz9m0hRnFBG1JPXiMMMrakAs6n3q2oOWCp6OOs+0&#10;Wf+HAi31AzQUnNsbayuLtc9Y0eDt8tQL6LESCTDBc46+Qf/62nahKSyc2upntMS+DFWXuNjQVd9k&#10;orIlpahjQyz4LV0/CGNT66rR30YYNvaMkmzq8q96VSKPmIjPTByPBGR6u7IwLn/ndyTKr+q6Ts/W&#10;6ZNh8+dGPQc1Koc9T7WQEKW/S48HpJimL+w2nV9Yo3y439J1k2C4Udd1enbvqM/0tivEHP/KyTPQ&#10;cUDXdbb37Tvm1ae/OsIWcYejqXX2qLsIBtH/9kaDn9b1SsblW/kxKRwFq9OzUTvFUclkGUxTDyMq&#10;eoIbC0aqnmPAtfHV1y3S9WphpCDSOECn9D4TfFHXC+Hxd21AhPm6Dum3mNvj0TZTDaw9/s7vI8ov&#10;6ToMvQ3Fo20jVulkmH/myjPqJjuKVjNWXVBcA/asO/NowLrXSnFxH28Iad3009eYTgyuUT7mLwz5&#10;6upFRNczmL73C/jsZaMG1AlJk1t5I86zKfW+3jXtFbs6OxLzTl9+zOQj6l7T9Qymz3WNHA65nKzR&#10;6I0GCvarYgV7qznAgmHT0XwUGR83G2ABAMQjbQtYUd6qELGx3myABQAQj7T/NxPlNT1VxPvNBlgA&#10;ABufXvwMs3GtrgMA9KzeUVtlqEKEkN+0lwk4fggWC/euP9N2X7ka1tm4Lhhl4iW6DgDQs/qfBee7&#10;gsSXDe6Vztm6DAAwmFKnmg2wYIT/v0x0Y7UGWAAAL6xf+roxSOfoOtQCLFscdkEWDF8wuUna8Vjb&#10;IZDk+hFFBuSUKyumV5PRxb/K1swQjwXzPGUSkcVn6NpoxKPBPP+qZDQwVddGIx5Z/D0G2pOtqRR9&#10;yE5Tbrc3/BVdK4VGb9hSrkYNAGD4WDlb5ow1yHW2+uUd7ng8KwsGOGaIRwMrmTmrTyDx4IC6GOA+&#10;S10sXvrnl3Yqpb6bPfczGX/X7GxMcJ9KscrJg2XFe+PR4C3Z2kTR4F3u0TWz9K4N/o2Jclr8MKtP&#10;Zn+3ygJv1/t17XDisAyyAAAU4/DNpggqOsHdConutnsPNpolTkaCJff4I+LhFjqKaVTT0GIww/BN&#10;qhQ9mjtqnvjq4IzMZ8U8mFwT/G3uEZZARMpJti8VRHDpWo2RYSFKfuhOFHufWVR026rGyAxMMp98&#10;Xoh4JDDcr5AJBjeuay/JoT8Za/9a9vd4dPE7sr+bZUOk/cnsefa13QOmPb0KcfKiUKOulYpEx0d0&#10;zQrxaPDEg4EoQzzSbslZX8cpYbjv5OHIYRtkJSOBr2fKcpPRtlETq6sJRr44/Umgnbw7A9V5mc/J&#10;SLDk5rXxSNvwTWqAMG0MOBJIbPfnMApZb+f8ZJACvzXHvzJv5a9GYfasO/NoUljyCuREgSB8e9ad&#10;OdR8vYZZXC0rFtQ7xagJ7GYh5Ct1zQrM4hFIOyHaeUmDeDQ41B1A4PbeGwq0ozHPEQ5cfPrblp+i&#10;65ZpvsMpEN6uy1YhxbsAABSbr8ofmXTD6cORwzbIgvTqzKiVItVIItL+FwAgg/hbYMOtfmNk8cuQ&#10;tkYYtTJnNAgoxcS0KdaWs+VnFSYOAwAkYkHbb0es1EA5giwAgOlKlO1N9FBHSPEmXasahKNbl2qM&#10;DApHJyDZzncl4m+lV+fbLVnE6CgD0rsYirv0sVJgg6N25llI76acYww6H9F1qyxwDPwXsv0gi1F8&#10;LX2uA236WCk0nLnqKF07XDisgywEfo0Y1uv6oQAzAxH/Ttctw8RAULSyzyzI/DcAKFq5YhZC2qVr&#10;pXDcmd89GgTUeXwr3qKPlQKj+Lau1SgMk5peruB2vBGIc/leqBVbmIaREd6Z31DZOoJ5p66VgnKm&#10;+gAYUqz26mOlgA6w+3NQCJwHjCfoA1ZxCP4VCmH/+lTw91IMWAtD7KhXBQvODgcO7yCLxN0G0bO6&#10;fiiAiGJj9xTbndOJxUOJWPBsXbfKnr4Dn2MiawaDBZAovwlDRqz6mBVmOid9FRGBwGErqTODkDC0&#10;RVtjVNB5LBa3RqtwEPYu8Ja8dX74gSyAp+hqSUgRAmA49vTltpoUO5X8BIBEp5Bf0MdKA8+3+dLA&#10;QIpRwjR9wCrpX0JxQ0OXrUKu5JpAWbqbuH1dVwMIRMSP6WOHC4d1kBWPBZYNvjazTDdaZUFMfwLY&#10;aqn6phDM9JiulcKWZ772Mgke1ezOLNPnoK0AUkj5WQCBgPA5fcwKLl/4eV2rMQoKbD6TJhaBcJmu&#10;1SjMkY23TEtvpUl0tYRa9XHrSJw9pc5WAMCIlw99tJXb5W7pGupjS2xnu3BeS+ciEOnesUd7OixX&#10;XueDII407L48Iivu00WrMHM7AIBAUdAa4nDgsA6yAAA2H6Iu4cx4vx17gwzJWDCsa6WS2pb6i65Z&#10;wX1253DVDKK0kSTa4UDEGQAAEtnpsTGxSYHDFhWNi7oqooS70mGH2FotHlnF2L+20fbWzuHAsTPr&#10;f4YoBACA5VY5WTQu6rwk81kgzc0dNY/H872pUvAMSOcGyrlnhIarFq0iHHD60Cds9HaWbAcz2YGx&#10;TJPmo6fOekIfN4vbF/pJ+pNAp3B8Xx+3CDNAQW9CC6CU2DD0meyc62rmsA+yDlWS0cAPdG2ieeGF&#10;G7O8bqyDSuashLn84fuzv5vF7Z2ZFVgLxBmzS8qpcPu6ckqbHU64Pvt7jcKQkXrFzpt/JUCO6bfr&#10;Wo1c5sxZORm17hru1vBwxbIVHE75wMFvAj2+UGmFL9NS27JzjaZOESXleXm8oV9nf3dI/E72d7O4&#10;Wzqbsm8FlLjw2GMXW94OPb65Y4oQIsdmx+3vtDUfJWKBe3TNCp7Wrmz/MVHqua52akFWjarA7eva&#10;iZh7vUrE97n8nQuztdFweUOPCJmfGOr2hf6gayMx78xb5guRv23k8YVtVU8eDsx44KkXQaiqDrKY&#10;4N26ViOXGW/K7xcoAP8CDV31uj4Sbl9oh66hgPfNO335m3V9JNze0G9RiCHbhSzdH/qjro3Eya3L&#10;56IUmheVwFLufZT4LIDM2Ts/at5Jlu0gZtfNzmvWLFDecuqi709IJa/L27kCIb/YweXrjOnaoU71&#10;JkbUOGwYqVcYpPPPrk9Egst1Xcft63pQiOIJ6orhn8lI29t0Xce1aNV/SSf/RtczMJGKR4MFW2/U&#10;SLPnqRYlhvJQqpWtk3dMWrBgU9F+eIcrDd6O6fVy9oir1saAOL133bWjFh2Ndu8r4i8no4GbdV3H&#10;5Q/fLxHfp+sZiOnxRCR4rq7ruH2hjwohRuygYaYFjatlxQLpcA6bPRdioA+O2fR02wgNqwGOb75j&#10;yixn317E4veSUkZrMrZ43Ix0Pb6uH6KAq3Q9g2L+TzISOEnXD1VGvRhq1JgoPP7Q9xFFwQbTOqyg&#10;TxmGr3fd4ryJ2+UNfVpKYcpbh5mYGK8ptN3qelvn8TiIPUKIWfpYIZTinydjAbsJqIcku9ctfFVK&#10;x7G6Xk0gDcw54qxnXtb1wxmPv+shRLhQ1wtBRMkDr+46a/PmZXl5sR5v1/dRgql7n5gOpEi0bIq1&#10;xfUxT0v4MyD5x5mcp5FgJmYW/52Itv1QH2t8yy0nCFXfIwSayisqfu9f4XT7m9YIzORzjQwx/y0R&#10;CRRMGvd4Q7/OX1ErDCt+ef9rOxsKnety4fGvvADRYdLri0ERfSMZbT/krW9GvfBq1BgPGhtvmSZn&#10;TG5BSY+V5bJkBkD7P6dMPwYAACiV+tiBlPzj5meCZfH6qmb2Pb2oQ5HoqKb+hdkoBay4752zm5/9&#10;uz52uHDSaT+YNXlS/ycdDlkmV/BKgyvuEVmu38gA/gsa8mNJenYPrL3Tsin33Lkdk+qPmjbV6ZBP&#10;gBAl90rMJmXw+egciPX+64aScmQrlXL8e9WoUTrNdzg9zr4rAdiLiJ861C9JJv49M3Q7+1Nd69cv&#10;zcujOFzYsWbeDIc8aqcQ1fsPzkzfnXbmmpxeeIcD85pvnjFJTgqAwLMR4V36eI3qQDFtEYA/UQY+&#10;0rumzXTlp6slfDEivBUlX40gbPlxZcNMDIz/Cwzd8dgJPwT4iG0Lokqgaie4GocuxzffMWW66P+r&#10;wwE+fWw0UsRv2xAN/DP9rUO4WmZ8XjrkXfpxo2Eo/mrv5J23whPLDACAhkVdZ9U7YZ1+3GgoMBJi&#10;d703Hr/GcjLroc6+Z7wj5ttUOqz4jmkLu4vmnhxOLGhecZRDyBfQISwbahr9/Sf2PnXDVhi692fK&#10;/X8WUlrvxMDqrT2R9ifTXy6Vbu/ZnxUS79YPGw2D8Ou9k7bfnLn3XQs7F8p6uVY/bjQUGb1ib/2i&#10;zL3vWth5vKyXW/XjRoMB+gb7YG4mP+uk026aNWVK/Xop5Bz92NHIPtflZEHrivOc4LRs0cOG8aPB&#10;nS9+adOm2w7Z3MZakFWjovF4Qy+iFKP64hgKbu6NtX1Z1zO4WkOPSBAX6LqOQfz33mjgHbqewdMS&#10;/gw6cMiPpjiK6dVkJHi8rtc4yL5nmq8HkFXrLVYLsgrT5A8PAGKdruukWL11w3BQlI/Ze5+UuiUR&#10;ay/agNrtDT8gJA77bBVjtOR3s7mdxPBaItJ2nK5nmL+oc16dU5oyMe5Z3SaGdgkL4vJ17ZQCRs0T&#10;IzIuSkQXP6zr5ca9qOunwgmf1nUdVvxsPBYwlZdW7dSCrBoVj9vbuVJI2a7rGQgGT06sXrpZ13Ua&#10;vV3nOCT8VdczGIb6ZG93e473VSHmNd88Y3Ld5KJ5VcTw50SkrVbiPwrM4Ni/viVVrdMQE90+7aw1&#10;V+t6DYAmb/hFkFg0QBoteMjg8YWWoxBLdD2D2Xvf3RI+Tziw6EqLYfAnersDv9B1ndHufQP4L72r&#10;A6a2UEeqnFTEryejAVOFIR5/179H6g1pptqxnCxoXuVy1nFC1zMwq+vikfbbdP1QpWjZZ40alUIi&#10;1r443SYon56tOyabmWQBAHpjbY+ToT6q6wAAZNDXzQRYAAAvrL1x974DVLDCkEFtrAVY5kAEg4Ae&#10;1fVqARFe0rUaaXpigZOBeVDXmYGGHvpFA4xs4tHgUgIq4IJO/Mq2HTPM3vuJ7sBjzFCg2g8AFX7T&#10;TIAFQ/f+67tlgS1RYsX0jNkAC4aCH2Yu2JXDbIAFABCPtJ3CVLhJ9XgHWAAAG9Zel+TBvoIBNlPq&#10;nsMpwIJakFV5uHxdV+haKTS2dC7StYmno+TrLREJvkcx5VTBKKYusFiSnOhuv5cJVmdrSvGORHfQ&#10;kmPz5meCu4jVDdkaM3F8dfuCbG00/v2Oz0zacfEVd25/7xU/2XHhFz+15x0fP0o/5lBm2o61o27j&#10;VCJKAYM0xnz7pZrpiTw5BSDXdHbfoLKcR5RYHXynfu8z4Iodm5ZZMv+MR9p+TgTd2RoB7Xkudt2y&#10;bG00tsWv2UdEbdmaUqiSkeCZ2ZoZ4m9gXvPsnt07LJm1AgDEo21aArrilFIluetnaFwUatQ1s8TX&#10;3viSYv5/uSpxPLqk5F7BrkVhS+azlULJD70aYwMifU/XSgGF+EI5toNdi1YWzU+yyoJFs5p1zQp9&#10;r+zKmkgYkpFgIHvcLPFoW1ZSLXEy9uQx2eNmSUTab2Wm4YfIIBmWJ4Hp0+r3IsovCof8DErHz9T0&#10;mdt2XnwV77z4it07LryiQz/+UAPPAUMpVXQLt1KRElBJ5xZdr5HNfUop/N5QA2UAAHhpXfsruceY&#10;I/veT7/MBEpqGZOItvkAYHj1KLE6OGo+UyES0eAqHl6MUyzY0aIdYo5NbQNs0LC3HxPcCvFleSuA&#10;ZiDimw5+Q9gQa7d1XwmpB0nWSEYClx78Rrxv6668gNIKQlRnJethHWS5Fq18h8cbvkbXJxKBwqlr&#10;pSCRrjC7JD8SKEVZVtag+Q6nRP64Llsh20hPEd2XO2oNUvQvAABlYBLgvpJLhRXBcE7OptjSPDPE&#10;0RAk8ydURACU01HKb+685GreecnVvPOiq3p2XHRl27a3fL7AVkV1M2Ph2vPKcKmOMwwzPN3bdbVG&#10;LslY8DomZACAgX1QcouX7HufGX6WO2oJJqZ1Qx822JkjFatPpD8hxLuveVofN8tew3FBJhCNR9ty&#10;VsetkIgGhppUEw8MpObr41ZBIS2/NOoQwR8BABRDn10jVAVw4bGnL7fc13GiOayDLJTyR4CU08D0&#10;UIFB8vxFnfN03TIM72r0ryq5w3wGt2PgBpRoO1eJmB8CAEhG2005HRdjEMV1zMQg4Fv6mBV6Y8E7&#10;AACIqKQHLjMXzBHLQ6AHhQg7jqzfs+PiK1M7L77ilZ0XXbVsxzmXFcx9qDaUYVgv2Z9IFG7QpRrF&#10;4EEApk3Pttla+ctsPyWiwc/qY1ZAA74NQMxK2XIb740s/gUAABnCVF5YMf7z1LWvAAhUDPkvXCXB&#10;sGnd9aaqF4sx7/Tlx9jeBgGAhNFzCQCxALCUjlEIKeDcI6eIqqvYPqyDLEA4FoW0tW9dTjzezqLl&#10;w1ZBZJAOfKuuW0VIcbRkKloebRpU30DEJjt5WZAOsu7UtVJIHTjwAqSreJL6WCmoAXyvrplh9iO3&#10;/4FIva7rI4EoHIDyOBD4DZw648Wdl1zNOy++indc+MWvvnru5aYTZiuJGc1PrWZOPaTrFQtmb83U&#10;KA4jIypmtv/MJvGT7K3HUomvCT6gFKrEmsX/p4+VAgteo2sWYVJqmwAu6UUtB8U/H2o4bet819U7&#10;zy7Huc64yTPjf/QhqyAyAks7q5gTgq0HXpWDArGylh4RLwUgbvSGba8cATAC4X/rakmU4TwhCJmu&#10;pFlWsJrGLDv27rKVZ5BhypRJn0MEcAJk5Q2UzoBzsORJ5MiH7jy29E2LIRCBpePbjiPqXtl58VW8&#10;871Xbdlx0RW3b3/XVcNL/mxz4h1rpp351MXMXBWmrVPP6h7VK60GAAAyMk/C9I6hLYRQv7Cxu5cN&#10;Solla+COSO/XNauwEKsVse3uAbxv5+eVouftbIMCAADyFQACT2j5nyP1IStkcnoR4WJ9zBodDkg/&#10;tFv1kUrnMA6yOuozlS8nLeysjCVI5s8BCETBQ3v9peFqCa8HECgE2qowPOXM5S2QvkFsXyeZSfak&#10;026ytYW5Lb5sHyuytTwPAICQPteEWHK1SwbF9P82d1//qq5bQQ3QF+zOiwIAJQACIoADT0QhrxST&#10;8NmdF1/N2y+6anDXhVc8wBV+z089o3vGwYTiyoTJXkLwYQczACA0nLncVo87RDEdQKLL3/kPfcwq&#10;zAeT30ulydd5GwCAQPsBGzP8rDcW/JGuWyUeX5aSEh7QdYuglPAeAIDpYkpRbzFTSPkNAIEA/BGw&#10;8ZLnbp55MUAZIvUJoKIn3LHE7ZtxX+bffKpD/FEfH2+OP75jCkqoAwCQaK/hpnTgaQDpO/fIxltK&#10;TpSeXOcYnsxc3nBX7qh53N7Q99MLhyiOOGJSVB+3ioHSrgEkCgFNAABS4jGZt6RSEcx/1jWrHPXn&#10;O+5RqrS8rlFBACHQqaS8aMeFV6TS24tX7t7x3it+ueuCL7a89OEPT9b/yESBCJR6fftMuwHnWDL1&#10;zG5b+YCHE42LQregRAEg0FnnsNyaJoMra0VFgLCbv8cAsEMXrcIovzT0Cea33GrZviGb3mjgN7pW&#10;IqwU2/WeG775pEBbfy8p8FxI39cwd26HZWuKDKIOfguAAgDA5e+0/WI8nhymQVaHQwh5cTrCBkA5&#10;FJRMIDNPmrllaC8dAAAafeGnco8wR2NL6LrMZxQojp1R/1ruEeZo8HZNRymGbwopcfjnWkVIMTQZ&#10;AQgUtn2gNkSve0TXrOBuDT+Tfa493lkv5h5hjXi03XJvxELsoPoTda2cSAAUUqbveRTT0SE/Zjgd&#10;0WkDRx/YcfGV/TsvumL19guvGLX10Fgz+10v7D6id399JQZaBqmvIVbgL1ahOJzi+sw8K6SYpI+b&#10;BeXkYesHREZPS3hx7hHWiEd22MpdbGwJXXdwhV+iQzpj+jETRTLWXtC42Sweb6g/828GAODxdZXU&#10;+srtC2cZvAqcfNzMbdnjZmk8c0VOUC3Rei/aiaTk5btqplA7AyZS8WjQ1opGqbhawp+RBfrh9bMx&#10;//nI4k26XoyjPR1Tj5kxO8/5lxWviscCOeZ5I9MhmlpnF7Q1sOog3OTv4kJXmdWfUy6KtXwwBumc&#10;3rXBv+n6eLP94qv+RyAW7cE4fjAQqfudjJ3THr7zHzgBEc+ONc0zHAJ3CCkq4mWQWe2ZdubaGbpe&#10;ozCF5llggJ6ItXvf5QvfIwV+Xtff2D849bX1S/fr+pjTfIezqa4/rxJQEf+/ZDTbG6r6cPlC35VC&#10;5OUE9+13HvvC+i+ZLtBxn7V8rphUl/fyaqTU0t417St0vShFz7V6KRltr4rKaksX+6GAy9/1qkQo&#10;+BajmPcnI4Gpuj6WuHyhL0ohilbMGQrO7Y21Pa7rOg0Lu06tr4eiAZli+HEy0pY3URXC09pVtBSI&#10;mLYkIkFTfjcef3grIhbOdythsrVLY0voPQ6HKLqUbih1aW+sfcLzbbZfeOVOIUVJJoljAgMw035k&#10;9dZZD99dsh9QKTx3r6du7vzJr6KQBdsYjRfMAFM3xBz4ESj48lEjF7c//JJALDJPMPSsDpi6913+&#10;0I8kis/pegY1oE5IlmhwWgrHH98xZfbJs4sGdkx0fzwarEpbILc/vFIgFu0RqxS0JmNtEV3Xme/t&#10;fFudlH/X9QxK0VeSsaCp6tyCgfoQTNwTjwZse3mNNaYu9EMBT/PNJ2HdZFMJ06wGz4vHlpalim0k&#10;mvxdA4DpPKyRYCaOR4JF3+Yb/eG/OxDfpuuFGKkxq9sb+ryQ4h5dL0TP6kl1AFfmtLo4SEddU+vs&#10;AV0tBJNxRTy6eMyXf0e6WbNRwIPJ1YGScwfKAcM7HDsudg8KxMq6P5nh+VeobtFQWfZ4snvdWWul&#10;dC7U9fGAiNlQ22fNXvTCbn2sRi5z53ZMmnrC7D5dL4QxSFf1rk37zBVANLV2mQpoiSmSiATHvOrM&#10;41/1M0T+lK7nwQA9kR1OgGWGPlShYFNrmMyEA0TqQCLaXrTafKQX9GyGnmmy2LPI5Q1/W0o0VW25&#10;b+v0yZs3f86W0elYYuZ8VBsIALzAu+oUyeoSlPxpAHEWImP2PvNoMDMx0HPM+FMEfDARDWwEYCyh&#10;wgEBgI9vvmPKDDlwjgD6AAi+PF1tdzAvyAQETMggViHzP0iIZmbVJhEmW/l7pSsqEYjwV4D0ewLR&#10;gIxXSkFvsvJz0u1kBDPw3wHo18xCANHHpQPPTh9h/mcBEBOJfyPC3YME92+K7UgCfJNLONcAQxP9&#10;5ONmvQ2B3icE/nf6PrZyromZAYjxToH4+/19FNn8THBX5t9SP3os2P7eK34sHNKW6eJYwCn15dmP&#10;3nlztnbtwxfUz5lc9zMkOIFB/dhwqge/+vZHS8q/GIk9z5z2NqBJTwAgCDFecxcDQv+bjjjjWVtG&#10;mocgCADc4O2a40B+n0D4GCIP+fJZvPdZ/BuZ72LEF5DoQyDww8DpnFL96OIQs8J9jPA9Jvlgcv8b&#10;ayH+zVSJcwgCdKDHf+QiIroEEa8RgmZY+3spZhasGB5AUL/uI/W3oQrkcZtDijH3jNDMKfXwTkT8&#10;ICJ+GlCxtfkRgJVSgKITAaKE3CpQlJAjl55nmcXPiPkhKcADwNciwmzr51oyAP+RgH5tkHxsU6xt&#10;SyWcazjUgixXS/h2BPi0cOBkZmJE5ExFQukwMQMgpn8Ok/GjeHTx5fpRhXC1ht8sFP8MpTgLhi7M&#10;TKWNfqx5iFkxoQRh9cbQSf8+Au2eIyZSAAAohNTHrMHEzIgo0jOjonvjsaApR/TTvF1zDMn3C8CF&#10;UPZzLSUAABtqowOcF6/vvnZc3L53XnL1hE8QebD63qw/3HltloLL/3qJgTiUUD+EImYA2gIMt99w&#10;/oP/kz1mB+4Asf+Dzb8ClGOe+8JsbJ/6u3XH4DL75f6HEh5f1y3E6otSylllnWcVceZeKx3FrJBQ&#10;puciImN1Irr4bHMPW8YF/tAfHQDnI0pkIoWC7c+zRCozNyqgV4XBS+Ld7T/XjxtLPL4Vb1Ukf+xw&#10;iAYYnh/tnuvM/Gh3ni3zswhBIApUxPsFyi/HI9feph83ntg6MRVKTvTq8XXdAkhLEa1eBMSg8O6e&#10;WOAqONhQtNTIePjPuRaF3ywF/A4kNugHjQwxk+jZfQDe+/KzbVvmNd88Y5Kz7jFEWGh1ElAMr4EB&#10;H02uaXsCoMPh9s3+nRDWzeKYqJ9AfDUZbesEAPD4Om8kFMsk4qhboNkwEAOJ38ejx18K8JHMFoHt&#10;c+0+a/lcUe94GBDc1iYBxUxyg1L0/t41wd4hsdTfp2TeOP9yt5xcZ7kf4liCA+Sb+ac7hiupbnr8&#10;ovOd4CxqYaEUMCKAEICGYTwvBP405UzdPvi2R7cvw9KDF3587qQDM495kkU6qC4nxEoJ4hunLlxn&#10;PkH3MMfd2rWEmb9r9d5Pz2vwQDz6rw8B3Kdc3s53C4G/QBSWTTCJeU2Kdp63KbZsz5BU6j07/OeO&#10;PX35EUdOcTyCKM62Wo3PwLt50PhsYu2S3+tjE8jBZ5F3pR+EvFcWzZ0rjiJ4es/u/edvTX5l+7zT&#10;lx9TP8XxJ4HiDP240WDmF41++MiGpwPd0HBtfeOsht86HHChftxoENMBVPyleHf7T/WxicbCg6e6&#10;afSFP+QQaCqpmYjaEtHgKl0vJ42Nt0zDWXXbpYmG0On96385izUy9njDa1Gae9jsHVAnvFQkUbTR&#10;F7rFIYSp7vaDxBdtjAYe1nUAgEZv54cdUppq4ExEoUQ0WDTZsiy8o8PRNDjbVB6RYh7cnZo865W1&#10;Vx7QxyaC7Rde9RchsSJaPzEDqB0D04/+14+GK1iXP/7+75DCr0g5+lxCBCwEoFLA6eONrcT464HB&#10;gdDXL/hTSY75HR0glnzgrG8COr5uP4WNQRnGzdMXPvWVmk1DaTT5wh8Cs/Msc2ciEii4zWQph5Y5&#10;Go8E/Lpebty+zgfT1j8jwwAA/cb8+FPmK8MnkjmelbNnzJDbzYQDimBXMtpWtAjF4+vsRyFHzWll&#10;ZtqzRx29Jb64oF9ZsYrSQqgBozW5bvGoCfkTxehn9RDD4+9SIzmY96zuqQMYv8Retzf0pJDFzfUU&#10;w/8lI22jJlt6/Mu/jFhXdFuGiPoT0aAp08mRksSZgeKRNlPLzCOfa/MVRuXC1RL6kXQUr1Ri5g3x&#10;SKBR1yea7RddRULYjiDswwyz/nB7zu9x618/kGSCBWaCrNFgYCDmgGNS//8ufsufCk6+I8GPw6QD&#10;sxc9bBC/RaCoT5+xYr9W5hJHYGW8YKTUh2b5nhnXyslDGY+v00BRfDuqZ/VvnQBPjJoY7vGF+lEc&#10;9OvTUSm4MrmmrWh1drlp8na9GyQUNa8mYiMRDYz64lyJuP1d+wRC0aR2Ig4nooGgruu4W0LfFA7R&#10;oesZWHFfPBaYouv5dDiaWou/HDMRx6PFC8IqhWIz0CFNsSCCdxtHxotE1mOJ2xteKwqsRCmDH0h2&#10;B0z3xWr0hr/ikPhdXVcELyWjbaY9ReYv6pxX55QFu7hb9bcqdq77BnnuC2sDL+n6WOP2hf8gBF6k&#10;64aip3pjwbx/g0pg17u/0Mz1jjUTfbsqUnTUQ3fmPDiXP/4BU9VEVmFmQKTtzPJ/GQd/ev05D1sO&#10;gLb9s3Ha5CMmnUoo/ILkfJY0AwFeEMzP70v1/b0/tW/XSW/ZYqoSroZ1it37Vv3/XN7wdilxtq4b&#10;DJ/sjbSNa24TAIDHd9v7UND9ug5E+3qiwZI7bFQCbm8oIaRw6TozrYhHgkt1vRguX9cPpYCrdF0p&#10;3pSMBebrejHcvlvmCzGpYA6s1WfRRFEVv2S5cS3sPF7Wy63Z2sAANGxa11YwsDBHRx3AsjzTNLMU&#10;mpBKuYhc/q5/SIShKp80Jf0cbzgoJXZma3v3HZj90rNf3pmtjcaseTfPOOHYybuyNaVSlyVjS36Z&#10;rVmjMs71eLLjoqsiKNCn6+OJMvilox65PSdYX/H4B/LO5VjAwEDAO5Bgbff2B957X82vquIpZI7M&#10;DJ+MlxAY6fcsKX4yEQvkzHNWWLDgjqM2bLjyDV03S6M//CsHYlZRDkPP6hMcWTmlE8g7HGZWCYvR&#10;1Bqi7BxWUtyXMLXylIv+bwZA3LPa+sqTu7XzNgHymmxt39YdkzdvXlaxtg3ZWP4LHwok17W/QgzD&#10;brRMasBegAXg8s/6uK5ZYe+AOiH7u7Gjf3r2d7MkI21ZflnEyqCiW5EjkYwFQtnfWfFfrAZYAAA7&#10;X7hxNxFnLa8T2wuwANzeWaNun46EseOIrHNLPLANKt7Fe/ZDt/tLy+EtH4hqwlqHICBIELOFEO/y&#10;Hf0B49bH3k/LH79k162PXfyT7/7lAs8Va5qrcoumkpnXfPNJumaFbfFl+4jgjwA0fOGWEmABAChW&#10;X8x8Zia2E2ABAMpZ/QXzUs3SGwl87OA34hTRN+wFWB1lexa7F30w63ezzgFDubL/zUoJsCDvxVXx&#10;zp19R2ePmyWxuv3a7N9HKfp5tQRYcLgGWQAA+wfVW9KeUQAHFFquisilQwhGWw/+l9a1v0JMKUhX&#10;Smzp7b0hrz2OWZTBmyD91gjJ7uBqfdwsKYPPz3yOxwLvyh01TyIauCDtZcI0aIDtLTkB8D1ds0Jv&#10;7xf28lCQzYR7Nm1qy1QjVTQIqXfr2ngiDPhB9vdvP3bBqQCq5ApBOwiBiCBnCOH4TL2c1LNgz5sG&#10;V/z1/fuX//WS397yp/NzXlhqlEadrF+ia1Y58OqOD7BiAgAYSJV+7ycj7XdnPhOLZ3JHLcPFc0XN&#10;Q8wPZT5viLZ/O3fUGu7WGWUq/ukQKPgdumqFf3cv2chDIY3i/BZkVmDF69KfJG5NfmW7Pm4WIhzO&#10;BUvGgp/MHa1sbF9o1cpL69pf4aFskhcPlumXhKtlWgMKOM/u24hSGAYgRiRbN1yyOzAfgAm4QN6A&#10;BTZ0Bx6D9D56yUvPGZiQmJg3dgct59ZkM6/55pNAYsmNZjMQ02JmYmIw5SpcCcx88J4/E3FeP7Dx&#10;Ytaf7spp7+REx0VKWbMPGTMQABCnIMoPSufUl2957GJbLz01AFDwO+Z7V9haod+8eVk/CaEAmDat&#10;aSup6X0GIkoCACSjbWfpYxZBRLJ93SYigYsBABSh7U4AzPB+tz9s6+URAGDOnD31hOLDum4RJhA/&#10;ASBORgIefdAK/f2p9wIQK0W2vKoS0cBtAMQTvJhfEraCgmqHGHYxs/0bRDjOTi9nLrP1Vo+IMQCG&#10;+OrFpuwPRoKZUYm623W9FASC7eRgBuwHAWQ3D7DOUb9I10ohGd31e2AgTsnf6mOVzOwp2xvSPskT&#10;j1D4nnJUFY4FUjh+pmsZUveceT5fCkUr32qkEShPdwpZ0vbeQRgRIFWWZw3KnG2jUpkzZ+UkAGRo&#10;6CpatWgFBM5rqGwVJHEGE9s22J16wknPSgEz7c6zchB+pWul8ML6pa8DAAhGuxYLBABAyC/rA5WO&#10;/Qu/ipGM/2aAf+q6VQTDneXIl5FIPgCEBS2dH9HHrIIIMLhX2Vo1ykAMpqwfRoKZPoqMa8DmiUKG&#10;W3WtNJYRIIjep67NKYCodPC++xSTMZyfMm4UiOvQISq6OWvHo/6cirT+H53+XwP3LGICx58H39Ns&#10;9N3d3N9391nP7bvdtbAWdI0VyAzgLEdwxKy6bE4fAAAwbQ5cBsDoPtIwXS03Eik2ntA1a3QIIXGa&#10;EFBSzlI2UopTM2kwdujp3/E3awbOhTnJ9Z3jIR0c2fUxE+n/gyfqA5XOYR1k4QG4EAdFTgVdKQjJ&#10;EtJmnu/Ux6zAjJ8GEOiQ+Bl9zCqs+I1/Pxd4TdetsKB5hQsAQEp06GNWScbaH2IG287HQopTIV39&#10;mJMfVBJcuuP4RHLUw3ffA4r26fpYQkxrdQ0YbCVGjzVOx5E5LwdMdQffzhFBINYLlE1O59S1gxcs&#10;MvrvWcT9dy/ceODOMz7BP/Ycl/1nDzcWeFedAgBgvVNGPgLYAYAw7/Tlx+hjVpBCeAAkuvzhLn3M&#10;EiQ+DyCQ7W+rARE9vim21FZXhnmnH3sUgOJynOs0CPMXdZ6iq5aIf7OoP5UVps6cfA+AQCHY1jPt&#10;1EUrTiyxD+WEc1gHWc89F3gtvu66v+q6dQQCSJTAj+ojVhCSjob0xGa5rYAOg/iR7SVjp2M4sfPN&#10;LbfleZ5YhYht5Yhlg4K/oGsWQUYYsHuOJgoe5Dm6NpYIFr/O/n7pvSDtO6yPLSm5b/glg9OLuyNW&#10;IKbTukSDlM7/G6Qprwzc3cx9d521tv+u5hv1Yw91pODhghlXS6jklVOPL/RZREAAgc7JdbbTIIaw&#10;NRchoh8AQJbQBkYHBdyla1apnzxwa2Ya8vjDo5p9FsPdumKoM4RAh5T5L0WWQFaGekBXrYLoeG/6&#10;vzgN4N6SV4vrpdyQ6Wt4mvfmcZ377HJYB1nlwOMPD3tAocC6Of6VeaZ5ZnD5Q7/P7kHY6A3b2p9P&#10;7FjQYXdrTiDOy3xmB/0wd9Q6WX0ASyL7XAsUzsZmWyuHvHcLHWX3HE0Us/9y5242aLmujwUEwAao&#10;NdnaWbPOm5n9vSJ55xMHVyrvBWE5nEYEIeRCFHjTwD2LuO+uRTRwz8LewR+feSN/zzNVP/xQQiAc&#10;m/ksHXBH7qh5UIgfZ7adHALero+bxeUNDwfMEtm5oHlFSRYO7pbQdSgONiF2e8Mrc4+wRnzrrt/p&#10;mlWEgE9nzhFirjehFQQ4/zL8WcBMaL5jxJeK0Uh27/6QrlnBvWhFlo+YQJfvlZIq3efO7ZiEgofz&#10;50hOKqkF10RRC7Js0OgLL0bELI8lgdPRYblMtfGM0MkSRY6zu0PivdnfLbPpwgFdsoLHF86zNXD7&#10;Oh/UtfGiyRf+WO65BnDUicftrERt2bLYdkL/RDL7kTuuZ+L9ul5uGACOeu2VaLbmgMkLsr9XIsuy&#10;A+geT8lv0RmEAAQQC5gcNw1OnrK3/55mHrin+cWBO8/41oE7PBW9dWqF7JeZNAI9vpWWgwm3P5TX&#10;fib/Z4+Op7Xrw1Ji1lajQGed4x+l3PvCIXK2GoXEdo+ntBdjAACw6dfk9oV26LlPLn/Ici6ty5+f&#10;PuF29ln2Ncxlma2qcuF05iTPS0GLGlq7LFeGHnHczJ3ZCxAACI3eTlvB8XhSC7JKpMnfdYlD4Apd&#10;RwBwt4ZMu5HPm3fzDDlF/FvXAQA8/tCE5Ay5/aH9KDCvPYQQ8mKPv/N/dX2sOX7BiqNAYEED06bW&#10;rgk5R5XCTPXikbpWdpgB1/4hp2E2SWGrtH+8Yc90yUMVSuUCAYEITyJ0fg0cU/7dd1czHbjrrL6B&#10;Hy285cD3m96kH18NuP2h/frLDAAACscHmrydpisNPd7wvQJFnq8bIs5weUOmc0VP9N48BwEKbDMi&#10;ePwhS+afRefTGY7tsxs6SjJ/toOrNbxRCJHXbFmiOMPtyw9Qi+H2h26SiFfrukA8wtPaNSGN7guf&#10;a4H1AOtOPM38dt9Q78o8yx6HlO1N3q6Arlcilt8EanQIt3/GUwLl6fqIjpGCs3vXtP1L1zO4W7q+&#10;KRxQtJFmBiL6WCIazMmJGQsaF4UaHU6R1HUdZrU9Hmk/StfHAo+/80+IclQjVAXq4uTq9uEcssOJ&#10;nRdd2QVCXKfr5YIVH5j98O05jWNX/PV9/wIUrdlapbHknN8Pz2/7fuw5TqSmbB0Pywml0r4FQgAC&#10;q9fq/jNwEi6Lm37xmgjcZ94yHyfV9Y6WfM3Mb8QjgRGr4Jp8nXtByFG3U/v7jfnPP1W8h6HbH/pj&#10;oUBNh8i4KBFd/LCuZ2j0rfycQzh+pOs6TLwkHg2M+QqJpzl8EtbhZl3XIWbCPSdMjsc/UvTacfs7&#10;XxAoR01yH+wzztz49GK7Jq6jssC36pNOwaO+iJPiuxKxwBW6nsHlW9EshTMnRaEQiiGRjOx4s137&#10;pLFkxBuqxkEa/Z1XIeMSKdLVbWZhJiaCPyZjU94HcGXK7V31NkS6BQVafkAphn8aNHil3WqWXO6V&#10;bu/W3yHyhSiEpS0VBeo1JL49EV38TX3MDp6WlZeBlF9BxCZ9bCSYiYHg79v2OS/eFr9mXKvvJprt&#10;F1/RL1CWxfcnD4NemvXIHTk9C5f/9X37EUVJ7TbGi+wga+D20xYqUb9mPIKsQtRfvmZC/v+OTIej&#10;yT/7Nwx8MeLBPCUzKIDXkOj2RDT4TUhvV31bAFyFiFZfvgZJ8R8SscClAECu1tDHgeFrEoUlE8zM&#10;va92T7ukt/cLe+e33HqmlPW36X1czUCKnwTkxYloMGeL3C6N3s5fScD3o8xfmRkJIt4FBD9JdAeC&#10;AAAuX+gGRLhGoDC9IjQMwwM9b8BHYFObrXSSbBZ4V50iBP+slHOtgGNs8Dd6u4N/BE9HnXvajN8I&#10;IS/WjxsNJt5MDF16O7hKoAJv/InH5e18txDiEasTz0SgmPfvThknv7J2ialmp57Wrh+izeqckWAG&#10;YMZvJaLXjbpCBwDgWriiGerFagnSVpLmSCjmhF3n4krnjXd8Yo6cPn1sEkIV3z7r4dtztiNufez9&#10;JEQllxcyLDnn/uHf78A9b34HqEmPT1SQRaB+Pvnyp4bbgbz2jkunOqfOegFQTAFWT/Ogumr2oNqE&#10;T/zUVo7PSLj84R8U2laqMTrMQKSEO9l97QZ9rBCe1vB3EPCrul6JEMCfE6vbRl0xTNMhXL5ZcSmw&#10;UR+pRJDV1c9F2stiyl0qEzLhVBWejjrXlBlfFEJciRJP04fNwsRLmGi/EOLtILDkfBYi9T0m/muy&#10;e7HlRFSdBc0rXMLpvAAJlgsJJXlhKUXbhBDf7j8w+OuMu2/pXCrd/rM/C8yfF0KU1NgaAICYriei&#10;Nb2xxTltYA513rjwygekFJfoul2Q1EdmPnRnTl7MrY99gNKJ4JUJsRq8/twHh1f2+u4663NCyFG3&#10;jMYKJvr3pC+uG67WLbbyyEQDAPAAKbr7qEfv+pM+Xi6aFnadqhxwCQAvL9UHjxVtY4TvIApmoG8L&#10;FHm5XGZQTClkXoosDQa6TMjS731FdCMo2iuk4zQUpb9MEsBPmfjRZDRg2/l8gXf5KRIdlzDicolY&#10;p4+bgZgOAMOXEZEAYDEinqwfYwZmJia8AZD+UY6VukbvynMkOi5AAdfrY2ZhpvuJ8U/INEVIWXLF&#10;NDNsBOBVg4Q/2xSrnH60FTtJVioub/j/pMRP6Hoxeup2OOGJ/CqNBS3h85wOHC65HY0U8RkbooH1&#10;ul4+OoTHPytldvWOmN9IjJKbYRe3r/N/hJBf1vVi9Az21MHaO8tiolet7Lz4ai73Xa1SjhlHPXpb&#10;zqS14vEPVLT1BZNKLD3vweHVy4G7zvw2CMeE9alkhucnfWFNQ+b7zkuu4tGmX+IhAP8kFX139qN3&#10;2u5OUZhLZVPr2cZov08GZrUtHmkvZCyK7paVrwiHY9j+YSSYmeKRnc5C+TTultBXhUN8R9eLUeze&#10;P9XX1TxJwKi5PRlSKbpww5rgI7pePjqEyzdztxRi1Jw1SJ+j3fFIYBYUsJpxtayKSwe7db0YPav/&#10;6QC4z1KxgCWa73A21fUXzR/TGSD+1KZo4P90HaDD0dQ6O+/fshhE6plEtP1MXa8UzN1VNXI46bSb&#10;Zk2bOmWHrmfDTPfHI8EP6LqOyxfaO9INR6y2JCLt41ap1OjrusUxyltJajDl3rB2yagJ8uWiqbUr&#10;b4LJRimOJWMBn64fjux+zxWtVCeLFltYhgFm/eGHOfPEdx+78L8cXPf/JmrrzQys6Mml5z8wnCMy&#10;eNfCX7IQH8s9avwoJcjKg9MztiL1VwRx6+x9icfwiSfyXuBKxeUL3yoFjthqpt9Qb36+u71H17OZ&#10;7wu564QYMW9UKfXNZKx9ma7rlOve97SGt+AILVmGgplx837z+ENXIooRt7FSlHrbhuiSEQPrBaev&#10;OsV5BL+g69kQ052JSPBKXR8r3P5wXCCOEPwp7lndPurLvLsldIdwiKLJ8QAAfYM894W1gZd0vZIY&#10;9S9aI5+Xnv3yzp7VbUVnSDaoy0yABQCQjAanseKCfk3E8Np4BlgAAL3RthuUAUUdnpmNI8czwAIA&#10;6Fm9o2hCPhE9Y2aSPVyY8cc7V7NhjDjpWiP/GVeP8iuVHGABACjEvdnfmal0L6RKYeiMo5DngMBH&#10;tk91Dey85Or9Oy+6qmfHe658P3suLWkrKkMyGrhesSp67++VB2aPFmABAGyMBhOpwVTRVW5WeJmZ&#10;AAsAoGd1W9FnlFL8pNl7P746MIcUF0xnUErtG88ACwAgHgnewQODQw7t+QwoeNNoARYAwIb11/17&#10;39YdRXrLEhuGum48AywAgEQk4GFWRf0izQRYAACJ7uCVirld1zP0rN4hKz3AglqQZQ/ePXC8rilS&#10;L8W7g5b8O+KxQMEqrUSkbUL6pyW72+4m4Cd1XRmpxnhk8YgreGPDMupZvSMvMZ6YDiSiQRvLxB1l&#10;uv7L9XPKw6xH7ppfqKFzKRBjKm/JhUXRFYFKQQjOmXwNKUrKYalERLq/CEohBABMAYEerBO/33Hq&#10;Uf07L7mad773i1t2XXB1i/7nzJCMtN9NRHm5jIahWl7655dNm1tuWLvkjX5D5TUQZ1KPxWPXFfS8&#10;KwL3rG7Lf8ki2peMBSxVsyVigYLbmMlYe54noHlKv/fj65b+lZh/ouus4NJNsbYtul6MzZuX9acG&#10;81eOmHldb3f7bbo+HhS2+FE80uJEIZKRQEgpjuk6pWBhoW3mSqTkC2QiWbAo9F5dmwji8etfVYqe&#10;PagQJ6PtOaXuZhlkleMFNTAwMLy1MBEkVudOYIrVlmT3ElOVNcU4tWmFjVW5ZYZiyOmlNdQWp2Q8&#10;vlnxcmyZe3yz7fZRLCsIQMzq/VxgFcoKBMAI6keoLWexgDwDxUqDGXLepB0gKt6h3i4icy07HCey&#10;E2I7Lr6yJBuTRDR4bvZ3RfBSb3e76bymDM93t/cw84vZWjzafn72d5MQE+c0l99h7CoYMI3G/n39&#10;ruzvAwos2cToNPlmfVDXrJCIBD4HQMP3l2KVisfa/l/uUaOzYe11SUWc5RRPHI+0L8o+ZrzZZ8is&#10;RQjFKYX/lT1ulvRqpRo+R6zoqcSatqdyj6pcqjLIkg5xnp1mk9mctqhzuOKnFJKx4LApqWIsuSnn&#10;xkj7X5jTNxsz8aZ11z+vHzPeGIqGq3OSZdi2rJsmLtI1KyQjbcOthxSpl+y2xWGAUwvuh1lFwAW6&#10;NNHMfuiuB4CULUsHAYCqn+/RdQTMq4qrNBBz/+6kyrS0V0UgiiN2XnRlUZPOkRgkGupbpzgZbSvp&#10;xREAYN8uegszEQDAQMoouddoPBoYDmaY1fZX1i4rycn8xWdv6M2ZZ2NtI+aOjQYj57RDK4VBA96Z&#10;CbRSe/db8mHMJhkNDLWsIWbGCVnBymZz9zWvKuKhNkoSN8SCOYGyFQwS92fOUTwWXKiPVzJVGWQh&#10;88Wz5r1QNFncLAv8K39jOMQqXS8FJqZkJFDSEn0GZvgZADEBflcfmwh6Y7vugvTvZXtZ1rVwRTMy&#10;fFjXraI43asvWeKKYTZClFa6roMAHzxpYWfe1vFEM/uhu06yE0MSETn3U06w3/HwBdYNECcCkrm+&#10;cbbXK6sTxWDZ9BjSeVW/BQBgtnfiXkq2v5I++cSb1ix+Qh+3AiveC6B4/yuzbF2DROKb6f9Cyc2Y&#10;MyCKTzWeEbK1Fb2xO/h3JmQAgOd7vm7rxSgNw87NO01XZY8lDPIzAMSk2Fbf297ozkt1rVqoziBL&#10;0IJjjq6z3f5AkHwrA4zaHmc0lIIOFDZnIwAgw/gJgMBkJPB1fWxiGNrzHgpsbFEn/0Ao/LpsFaFg&#10;xGoTKyim1Lzmm0vy9tGZ5LTWCWC8wJQxbIBpGWaYGbknJwdv6hHC1srveMFSWW6yeygiEMe8HdfI&#10;MDJAX+mh/kEIxMcBEDZv/pwtw1buo18DKK4fANMWESOBdWi56bEGAlBKKbad78qGUgASX3llma1V&#10;/nLRG732AQAARviFPmaNtA2SwfQPfaTSqcogC0CiQ8jLAewFNkLAURLR9jYYC/G7dCf10pMgAQB6&#10;1y79m65VBmyragkAQDAcjcSW2kkUgoHK0n9rwaJwiwBwOIXDcguHQjgYStqWGWtmPnr3z5n5ZV03&#10;g0CR53mDhnyHrlUiB3jfK7mKramiKiEmY/ZDt5dsyKlYbVEKvqXr1kBGZok2VlQzCFSXp+dZe3Cd&#10;cAEgDNSh7a0+AAAQ0KVLFmEAjEvIT/C2ioFq/lC1uv0TXjYEJqMnFGjybQ1mZAn0eV2vdGwFBRPB&#10;Sa70tkx6Xz29xFoqZo03R6M3Upc0iJ6qlmoHs2S2wFAI2zk4KAQKCaLBZrf7RHd7TzmmD4eEryAK&#10;lMJRsvs+AMCcM75zIgAASrRRoTS2pPZuz0n2NQtpeU1pDYZydSoZhlc27Ctbb7bqhGH2H+6w9XIk&#10;WP6htzvdm9AOKMQkAIS5cztsvWShEB8EIPb4u0ybQRdCOtQXAASChJISsTM0eNNzmRT4JrtRPAM/&#10;uu+1XbaS6AEANsTmvqREboFQZfAR289GIv7Tzs1Tt+p6pVOWIGM8mToDnoX0XjjPmbOyiD/I6Li9&#10;4csziXQLvCFTnlbFuTIFDN/T1VIgZtNOt2PNVCf+MPP51JbOkqtw5vtC7vS1JtAxe+Z/6+NWIaJv&#10;65pVUAwnrNqqVJ0+eVrF+7Qc+8R9+1gZltzOCYCRMG9llUnazoUbaxgQ7rxybdlMOqsNRcyDz2+f&#10;pleFWoXY+KmuWcXlXelPz7MCJx87tQxVuAIZ4A5dtQIiXgQAIBHfp49ZoQ5nDdksENtdOUpsl8s2&#10;b15maxs0zUeUVJhnvzORKMWG3fOTBv/0yitXllTwMJFUXZCFQh459FFMO0Gs04ZNIyTenVl6dkph&#10;uw+g6hsoS58xBPVZXZsoUIjh5XSnxJKXsiXA8J+VEmwn9Q/uV3fpmhVc/s6FmX97FCgavSvP0Y8x&#10;RUNXPeLBe8jtDSVyD6gcZj9813eJybTPEQOAEiovWVUIZWslcjxg4ryHHrOy/SZdLRzYnjrq2Ph9&#10;Jdk3ZJOMLY7omlUQxcOZe03KupIr3hr9ncMmqALVlHmtywu19RkV18KV/uy25u5Fq0p8ybpUosis&#10;Xgt0+UL2cgA3tZVt5ZVA2Mx/Ki8G4Cm6VgpMXJEpGaNRVUGWyxd+Lfu7kMLVuHCl5abNnpZQWNfc&#10;vnC3rllh07M3mjaPG4l4ZHFF3CB6wCBRTJnvC1+YrZnB5Qu/K7dtkEC3Nzyqk/FIPN+zJG8bywoS&#10;ZY7VhkM6/pr93SyeoyEnaElfj7dZvh7Hi0n9qTxzyGJIABzsl/n5bygqf87Q3pn7f3imB6S0tZ1T&#10;LQzsHzzuJK1YYaJw+1ZeKITI8VTztIYt29y86axbTnCgHO5DCSBxEjlKWkGW9Y7V2Xldwlnag9vT&#10;+tacjgJSiDNcLSsqwost2X1tUbf1icCKsepI9K4J9upaNVD5E+YQHl/n3VJg3tuLo96xvvEtt52g&#10;68VY4Fv1XnSINl0XAhe5fZ15+uGIuzX8P0KKvDyeOoEPuVrDph/UroWdC6XAvBU+IfFst3flTbo+&#10;Hnh8oYJL8k3+sKXlbE9r5xoEyNuudtTT+qM937NtLzIWHPGXH20FC6XUJ/7lzpwH2ZcffuvRaC/1&#10;ZHzQfkWW0ApKVyeOe9MxrC7bgpiZFZ583F/vyXkRnSjme1eeIYTjIV1HwIVNvpAF64QOMX3SpLzC&#10;DRSi3uML5ekj4faGC241eUbpj6jj8q7aVOjelw5nb0NDl+381RqHFlURZHn84a0o5OW6nsHB9HJj&#10;S+g6Xddx+1f+ximKv7kIIcNuf+iPun444fGG1gnAoh4rEvBZd2vnqMv+Ln+4S9bnrhhlI6TjRrsr&#10;WtboEE2tXVw0iR8Rmlq7uOGC0SdJty+8E0E263qGY2aovY2+8Od0vRKY9fDt7yODla7rEOebdx7l&#10;mFqRNhU6iLm/u5D2K4grHR5M+Wc//IPNuj4ReLyhH9ZJR/HtMyGCHl941CbmC7yd729qnV30WkUh&#10;TnD7Qjvyw+p8mvxdLCTmBUYw9IfTgdYVea27dDz+0BtSctH7oP5o6He1hIr2f6xx+DHqxTkBIADA&#10;3DNCMybX8xopZdELOh9iQ4kv9L82/RcZL5VjT19+xKxJjpukhGvMl/8SE+BPcbfj2nj8mn1Dv1Pe&#10;Q+cQAAGAG7xd0+skPYAgLJXnExvX7wX43pZI2nn9+OaOKTMdM4NCCAv+M8RE4qEUwyc2xdr2pG0w&#10;ylWl2eE45fRp86Yc4ei1dqkT9x/g0553JDfA2jtTAB1iQfO02U6H3ALFgrQCMBMrg9+vdsk/bUrn&#10;XFTEdbT1nMvmTjpixovZuSk6RERHPnRHTleFm/56yZ1OlBX/AGHivUvPu384d2zwnjPvNJTjCxPZ&#10;1JoZnp/0hTUNMLSS9a5Lri5LYj4zABq8cNajt09UmxEEAD6+uWPKTDGzXTjgW5bmWeKHSKYu6/3X&#10;DXsBABoauuqdR8u3Ckj92fzPASCm/QdUqmFz9/7X0/NHh6PxtCmnOqZOstjMnnigz3jzphn7NsAT&#10;y4zMvS+djhcF4hH60cUhNlLwAbVL/LGS7v0a44/pi3gs8SwKf44QzwDJ75aI7vR7NHKpFgvMTJm/&#10;GhOxkKKkFjykSAmZXu1jwjizepBAruuNBWx7fkwUC7xdn5JCNSGJC1HiaQDEpIDsnCMU6cmQSbGQ&#10;suSfkz7XApm5hxn/hMhr4pGAqRy1uWeEZtZPEh9HpFYgvMgheSgXRHBpK7aKARDS1yFj6dcjMbNI&#10;T65MDMB/A4C/EMg/J6NtRVf6xprtF1/1W4FYvGQ8xX+f9ejtOUH38scvGUCQtmwBxgNm2rb03AeG&#10;Uwv67j4rKlB6c48aX8YiyGIAEKQ+MvOhO8d1Pmr0d14iWJ6OAO9GAW8vxxwiJAhmZAAEREIrAVYG&#10;JiYUmXuVsaLufWBgxj8j8N8oZfw5uW7JhN37NcYXyxfy2HGvdLVsmok45XIh4Zb0O5r1Gy2z0UFE&#10;/xECZyLitNJ+TnolgoH7FPOV/QcGH3rp2XV7AO4runxdPVwqTzpt4fQjpkz5mBDwAxgqsdaPMgcx&#10;sNjOwE5Enm7r54BAZcAXhTR+G4/s2ZNx+bVCQ0NXff+0/W+aVn/EtxHoo4il/j5AzIQMYp1AWph+&#10;pJWSPJ2+Hpm5h1heJ/fJ7qHV0QlnxyVXcbEcK0f/wGnT/vyj57K1FY9/oCrexJlUYul5Dw4nSg/e&#10;1byBBc7PPWp8KXuQxQCEdNmRD97xS31onMDGxlumylmTziamX0gBM+3c+6yASOBzAvh0AIDS7tvh&#10;e22dEFjyPctKKRAgGOQ6BFqYXvEt/fcxWPQwqy8599U9VSn3fo3xo4QLZ/xwt4Y+L0DkNagtBgPv&#10;HtyGxw4tzw7TsPDWU+vr6uKAaOotnIiNwX468/ln2ofLhg913L7Qe4UQRfPV8mAe3A3q+C2RxTmV&#10;TPNOX35M/eS6l4UA830BB8U5PWuvzfNkKheulvD90mHeE4cY/paItOXZOnj8q76DyF/V9WIQqecT&#10;0fYGXa8Utp3z+UY5tT5ZaBKY9eAP8+RqCbIU0yM3nPvAcCVs/10Lt6AQJ+YeNb6UO8hSKfraUY/e&#10;YdsOpZyc8ubwsfVT4SVpcp4FADCIzumNBvPufY8//BwimvbmY0W3x2PBq3Xd7Q09IKS4RNeLwYqe&#10;iMeCeY2s3d7wzULiDbpeDGbYGI+0VUS1YY2JJW8irURcvtDeXBuAfFjRVfFYcESTOk9LVxgdMGIF&#10;IbP6czzS/m5dP1wwc64V0Y3JaPAWXc/G4w1/GyWOaIDJBvXHu4MFk1HLjcfTUYczZo/qRTOg4E2j&#10;lByjxx/eiYgj9jxUxO9ORgN/1vVKY+fFVz4JKN6i69UcZBGnfnn9uQ9dlvnef9dZb2T5600I5Qyy&#10;GDg0+8Hb23W9UnD7Ql8TQoxoGEyEuxLR63LsHXRc/s6Fut2KDjGlEnt2TYX4srwWUMN4OuqaTNz7&#10;/anUSc+vGckehtHjD+9CFCN6xQ0q9faNsfaq67FXY2zIm0grFZe/61WJcKyuAwC8uqN/+vbedOLk&#10;aLj94ZsFFn4jYQO64t1tAV0/3PD4ww8jYkGTvkGgyzauDpraovD4V16D6ChYiagMeCDZ3Vae3mEW&#10;8PhCBor83BFm4ngkaDrvIj3ZFg60ela3Vc19BQCw4+KrCPFgGjwpRUc+fGdu0vtjF77dKeqeyNYq&#10;FWZ119JzHxxuJN5/V/MACvOrK2NBuYIsNNSPZj5yZ9FK60rB7Q1fnjZ8LoCiR3tiwYLzSz4ddU2t&#10;hQMkBuiLr26bouvF8Pg6DRT5OaNW7/2RXkR7VreJ9K9Wo0Ya0xfWRJOMtB3HrPbkqsSK1WfNBlgA&#10;AIlI4EZielzXFfHrtQArTTwSuJCZ8gztiChkNsCCtLHq94ggpOusaOtEBFgAAPFosOA2ppVJFtLn&#10;aCYR5eXnKcOw1Q9tIkgNDpyV/R0BfpL9HQAAhJynS5WIUsAEmLvNjzChAVa5IKbHqyHAAgBIxAL3&#10;EKm8VmNK8evmAywAgGWDqcGBt+oqAICVAAsAIB5tL8u9n4wGC/YpHVTq4lqAVUPH0sU10cQj7Tkr&#10;B6RwWzLSbrm/ViISPFfXktFAwVUys7gWhSrq4erxdtrqERiPBI/StUQ0aHmLIhFty/sz8VjQVn7M&#10;gpbwebpmBaXUe3K+Aw1vLVkhYUzJ2epUzP9Jdi+23aJpvDn2Tz9+ZrA/dRYAAAEfmP1w/oP8y+c8&#10;mB94VSBCKBacejZbG8mqolpABX898g935M1blUwi2n5tuqDlIMmY9Xl2w9rrn2TmF7O1vj4uKd/J&#10;IHo/ZEVCxPDR3CPM0TM4KSdwZ8Uvb4y155mvTgTzm1dNaCVtjVyqKsgCAFDAmwAAmJnYoDP1cbOQ&#10;ouEG0YZBto0jhQNadW0iUQgfTHtO2YAPdnMfHFBvzx00zyAN+jOfCZRtp3cU0KFrVkjG2rNd6Clp&#10;YXUuh7VXptJ2IWmSkcBJuQdUD8f++e6nZz34QzzywduLegENDBxwM6jdDDzUC1CRUsBEPPS/lfAW&#10;j2AQD7c74g4QzNUdZSHzMzMf/qGtF4uJQqXoHOb0PMtc+n0bjwSG+98R8/4Xng5szD3CHL3R4AOQ&#10;lSeTiLTdm3uESdZemVLM+9NfFMdjgTn6IVZoXNSVlxdZKg4nVdQL/+GOvYfwBNC3lVvSnxiT69pf&#10;0cfNkogFf5Qpy+3tDtp6Sz/ptJtmMcFndH0icQh5HngsVPgV4PU9Oz6R+bxxXemJnBujS6MMxACK&#10;D2zd/S193BqXSofAt+mqVZTinw/9t7QAa4g9W1TB3IxDka9e8Kfk0nMenLn0nPtx6RMPOnnQcTzK&#10;wYUI9GEBqhOYo0xqONRiAFCgFDORUuMTgCEy7IbUcDugrSccP6maV7KYeMvMP9xe8svkRJNcs/iJ&#10;jB1DPLLDgklxPukLSPGAAcMvbaXAZPwIAMAgMF25XohkZOfM9CfrNhE6Uqir53tX2Z7XoPkOJzKe&#10;r8s1Jo6qC7I2bw7uAlDMCrfqY1ZRzINchrl/Ul29R0g4qpIKCZiZ3FNmmy6BLsS2+LJ9AACKyLa3&#10;CzMYABI3b4biVUAmaGp5S1kmkF2DGGQmBubv62NW2LIl7XZPxBWxVTBuLANa+p7fvX79OQ8/vfS8&#10;B3+75Lw/LLn+/Ptbl573oFxy7u9xyTm/x6Xn/B4fhgcnDab47UIMXgPMPyZW/2BF2whIZVbA8hv4&#10;2OPmdz02nE84g2fMqNY0GSZ4ffZDt1d5SyBGxbyfQbHdTg4G4X8DSHxhTSDHv80qqQFYBaB4MGV0&#10;6WPWSPv4EYHtFAEW8E6noF/rulXcov96FNBcSc+iw52qC7LSILDgGXYvJGQQxcwYreCQmPGrqZjZ&#10;HBGBHfwhXS8FRPvXCRP+PJ1XYW+iZYllSZif5lDTAAAIRMEKQcswVO1W4VjyxDlgfPU9Dz659NyH&#10;f7Dk3Ps/f/25D7596fkPHHP9OQ84rj/vfnH9efeLfbjTaRjGXKWMDxpEtwDx/wPmuGLqs3pDMYuc&#10;a3UKDY7TGlqZUbx39kM/tJy/VHkgswF/JiWf10eswqRG7XdoBpRyGgCCs14OdwWwAxMt1zVrdAiB&#10;cg4QDK2MlY5wwHfSjvVVedUfkth+eI43sxu6pgMIFAhH2LyQUAi0tZ2WASW8nQnt/C5l5aTTbpoF&#10;AIKJRvQEG5U5KycDKBaIlqp4CjGo+gMAaLshNCJcDQAwx7Nytj5mBYcU30EEkII+po+VgpB4mq7V&#10;MMeyc54wbnzXH1664fw//P7G8x64ccl591+65Nz7m24494EpS89Jr4rt/dvv5UnbnI4BRU3E9DUD&#10;6GWGof/h9H8BGDZO35KTkCy+9MLrzNyfrVU8DDDr4dtH9GKqKiQHBdA6XbbKxu5g8abTFhAO+ByA&#10;QElcvK2USRgAeM+grZU1gGXERAollMkzEG3PjzXKR9UFWcfM5rTJHTHZSexuWtg17Orb6F2Z5+5t&#10;DYEoUJjpLD8eHHHElAQAgBRWGprm4zlBfDq9WIjQ4O2yNem/sPbG3ahS/6fr1kmvPE6bjs/oI1ZA&#10;oP8CEIgIn9bHrNDY0mnaPqSamTNn5eSGlpWXLTgr9NFTFq487cTTuuYc2XhLwVL2sWDZMqCPfOQ+&#10;9dXzH4hff+4D373xnAfmLD3nflx6zv249Nz0f5eccz/euWhtSv+zdXtenw1MeQazRFAhyfpZEPfP&#10;3Bt36nI10xsNvphisF3wAunVLNt9GgXjxwEAhBC2KrABABSr63otWAgVYr638yJAEAAI85rDZVkR&#10;nz5dllxkUKO8lBykTBRS4nWQXvKV7tbZ/08fN41TDVfOOaT8a+6geVytoUeGvyDbSsgsF2LItBVR&#10;oKcl9Fl93Cwoxe2Z4oA6wbYDyJ7uvXn+ZFZw+8LDnlsCZcnVPG8667YTUMh6GDpH805fXvK2gcNx&#10;0JTQ7et6MHf00ODURSvecsSJ8oBDOn4u6sWv6usc66dO4f8cPat+T6MvzI3+Lm7whgcafOFtC1rC&#10;Gxu9oej8ltD3GxaFPj/3zStc+s8bb8TiLX31X1j3pvrL1+DWl7ZNVth3EqSomdRgmxTql8zGq9nH&#10;j03wddBS7dIRVuBnTtk+A594oiSj0krGuZ+GixHskBKY571lhbmeW49DSZOGv58ROjn3CGugwDW6&#10;ZhWnwAczxQH1Di55tc7tDw09xwQi8rX6eI2JwX5C0jji8nf+Q6LMMaaz4vaeYd6i5W+e7JTrc6pC&#10;jNQFPd1L/phz4Cgc33zHlNl1/UNlvGmY+aF4JHBxtjaeuP2dLwiUw+XOUKILscfb+QOUMqcX2O4D&#10;xpwtzyx+OVsbPzocTa2zc1YpSu0P1tTalXcuSnFp9/jDEUT0ZWu7/2NMySTDHyo0+rrYeoWeGjrH&#10;koEJIJP8yENVhwxKCLGRQa3lFPQgqQ2DZKyTDtw5qa+vLx5flsq6ZtHq9WsFTltp5fx8urNhTp+a&#10;2iwFnCEEn06ILcziSAR0MoCTAQEEMCjI8soHEKLInErqkfovPjXcT3HnxVdz9pFksJp9IDHpUAyw&#10;Koly3fvlotEfvsyB+PNsLQXo3rD6umS2Nhpz/Ctnz0BHjoE0K/51PBYoSzpEjdKZsIvLKh5v54dR&#10;yoJLxVZukqM9HVOPmTG7YFCmjFRjsnvJBl0vRqEbFgBAKePaZGyxrTeuUvD4wvegwM/ruiLaV8yl&#10;uBCullCrdIiCK1dWznU58XjDB1BiXs6CAr4juTpwla4Xw90aWi9A5OVPMcOL8UhbTnA6Ei5f6AYp&#10;xM26DhN4jsYKl7/wdV5eaCj8kpxZYWdmIiCFAK8xi/8opucdIP5jCFjPgxD/997ne2HTbXrLlexz&#10;P2a/N3eA48CJpx3nRDFXKXkmSj6LAZsB4DQhhGRO20lAOrPBmPyFp3K2AHe894o/M8K5LCUiscFq&#10;71FHPfpzraNFjXLi8oeelijO0HVF/J9kdPw97lyLwm+WTswxzs2wb+uOyZs3LzOdS1jsWcQKz4vH&#10;rit5p6aGfariYeDyd/2vRPikrmfTs/qfDoD78tqcZDP/zJVn1E12jLgcu2tX/4KXEzeMYnR3qWxq&#10;feuIb5ys1GPxWHtZ7AbM4PF1PYsC3qzr2fSs3iFHq+5z+VZ9SYqRbQ327tx7wkvJr5XsUWaNDtHU&#10;OnvEf1elOJaMBXJWlArR1NqlRtsiNxMgefydaxBls65nY+ZcVwPzFi1/c52j7pnRzlulwABAZLyE&#10;4Pgns7GOFTzp5PpXdgnntlfWXnlAP34i2XnuFxfyQP8bs5/837JspdUoTrEgJBsz9365mN+8yltX&#10;x1FdzyY1iO4Na0de0Zrd0DH9+KNn79b1bMigOxPdwSt1vcb4MG4XVSk0ekNXOqS4XdeLoYh3KUXN&#10;G9e0v5Ctu1tWnIdCPoRC1GfrxVAMg8j8wUQ08HC23uDtmuOQ/LgEbMjWR0IR/3cyGviBrpeLJl/4&#10;SyBwxKAoG8X8132gLt4Syd3SavSHL3MA/tzsFcHE/cjC3xO7zlYCejEavF3T65D+iEKYznMjoi8l&#10;osEf5qodwuOf3YkIpisth1bHvgQAOUGSp7XzvxGk6RVKJvXcfqp71+bua3JyfqqJBS2h7wrJXy6H&#10;4eL4o1j/vRkYgBGYyGCBA8jwIiH/jRVHAfF1ZPF6f8p4fcsze145FILkw5sO4fHPCiGm83jNQIru&#10;TsT+ddVoL+ylssDb+X4H4G9Q5jepLwQTDTDLdyVi1+WYQTcuuqVROupiiMJ0QVLKgC9u6G4r3LS7&#10;xphRUROn27vyLhTyfEA82e4vxgwEwICI9t7AmUEBpyQK2xU/DPwyMDxtJ2eryR/6PQE0CxQlJ35n&#10;MQhgv3kuEykG2Ags7knE2lbo42ZoXNT1FnTQXQJhDoL5iaMYTNSPQgwnuJYMqQEYSpK3A7FKMeNG&#10;waIjHmsrvWBjnGloWfmMQzpO1/XDBQWUEowHiHk/MhwggS8BwAOqz3jk3+vNpxbUGHvmNd8xo965&#10;/+9A4jghseRilgzMvJtBbE4Rf3xTrC2uj5vB4+/sAJYfB+T5dp9FzEDMQELY6+TBDABMm5nV+kRs&#10;yfv08RrlxdY/ejlpPCN0MqJcQMCT7AZYAGkDTbsXNUD6B0nEoQArt9mpVZjgCACY7vKuNL06k03j&#10;oq63MItZwAcr2mxiO8ACAEAhJDM6EOHsec13lGTuiYLfi4AHyhFgAQCAQPsBFgAw2g+wAAAQ0CEQ&#10;GYCqqQcdCnCUI5ivWiQIJyLOkEKcIKRocCCe60AM109x9rr8XZz9v42+MDe0hPc0tITXN/jDDzcs&#10;Wrlq/qLOcUsZONypr+t/H7LYhRJN55+OCPNUBHXAIejd+pAZ5sxZORlAegGprhzPIkQQAtlWgAXp&#10;nwMAMAXRMcPTvLLWTHqMKUc8Myac4gsfO1nw3xGEpeoxpSCYjLWFszVXa/h2CWhpT5qIf5mIBi7L&#10;1ly+lR+TwmGp1x2R2kqDqZbep26w3QZIZ0HrCpdkuVagsGQWqog+lIwGf5v57vF0TKWpM/4opbTW&#10;pFTRt3tiwQ4YgwTjkQodisHEexmgORE92DzW3RJ6O0v4i9WVSEX87mQ08OfM93nN4ZMmOehpFHJW&#10;7pEjQ5T6WCK6xHa7jImi0ReiTHl5jdIwFO/d1B0oz8tDDdO4/F3vQOK/CGnNdJqM1PmJ7iWP6XoZ&#10;QE9r6DcIwpIJKjGtTESCS7PnWZcvfKMUaMl7jAmeIxLvTHZfm1OFWGNsqYrJ0+MffaI3DNrc2x0c&#10;0fPE4wv1j5aXRUCpxOrgiCs8bl+4WwhcpOvZMAP17eMT/v1c4DV9rNycfNbyuUdMqntR1/Mg+mtP&#10;NDjiSorH36VGa6OjGPYnI23lWk0bEbc//LhAHDaOLQQzcX9q4OQX1t5YNIF4vrfzojop/6DrOgbR&#10;13ujwaKNbE9w3XbkzJnGttGuR1awLh5rGzE5vhpo9HfxiH/RGqYggp9uiLWV7FlXo3QavV0fdkgY&#10;9YWNlLohEWu/VdfHArcvnBqt4wgT9cejwbyK6mw8vtAbKMSRup4NM3E8EhxxTq8xdlTN/DlSdQgr&#10;XhWPBUwlNo8YIDH39EQCI1boZXD7Ql8TQqTd5wswnpUqGUY6R0T0sUQ0aGpFxeMPb0PEo3Qd0omh&#10;DyZiwXHdx3d5Q5+WUvxU1zOYPdenLvr+myY5Uy8Vu+xTanDehtjSf+t6IUY614rwy8nodQXtHaqJ&#10;E0+7ec7UIyb/p/DZqmEFIn5hQyxwqq7XGB/mNYdPmlyHm3U9AxEvyF4BHw88/nAvIhbcqWGip+LR&#10;4EJdL4THH/4BIuZ4GmZggL746jZLOx01ykvVRLfpkvh8FPMDZgMsAIBENNCiawAATGrAbIAFAJCI&#10;Br/DilfpOozwu441aRuLfJhosdkACwAgHgkcnS4c0GAYHO8ACwAgGQv+jAi/petw0GjVFM+v+e//&#10;KEMWDB77+niB2QALAKBn9fEFz7VB4tZDIcACAKirc7hrAVa5sJfPWcMeL6wNvMRsFFzxGWRjzngH&#10;WJCeZxuZqKAXltkAC9I/50uKOaHrAADx1W22WqvVsI/pB9TEs4z6BvtyupQr5sFkJPD+bM0MhYKg&#10;eLTdcqJ0PBZo028SZdBb7JR+u/0h0xYB+dynDDJyzEiZeXc8GuzM1swQj7TlnaOeSNuIW62j8o6O&#10;goGJGRLR6zpYcY7tBCn4dHaeghmS3dduV4pyHJYV0zMvPG11kv2IMhhyAk4m6u+NXntDtlbNOISw&#10;1dexRo0Mc8/oyJm7J4J4ZPGOFFHOirgifnpjpPQuFo0ttxXeFTFJejsw0x0hjdmV+WySkYBH14x+&#10;caLV+TGbxubQiGkaZinbz/GV5+eMN1UUZKWbDOdcMgaWVPUBsIyIaWXm7ZKBf6YfYZY9SCdmPivm&#10;wWR3cHXuEdZAAtPu5YXojS7+MSs15PGiOB7ZWXI3dsVqOJ+MDWXaa6YYCwZnvF3XrBCPPTlcNcRE&#10;KhFr+9/cI8yRjAU/mTWxUTISPEs7xBS9kbYHmQ+uUPT3GXNzj6huUGCeM36NGqUwSU5/k65NBBui&#10;wc9lBzXJaKCkez+DkClbQRYAAJP8feYzEVtKZs9GpehDmc9EtKf3qWttFVuhEywVeRVDOqEsjvMS&#10;wPTqXiVRVUEWAEC/4TgJhpL5kmvantDHzZKIBJdkmh/HVwc+o4+bZUtk8Q5IrxiRoJStGxYAwKxJ&#10;3UgQ89UAAMySAZaV/CbDfThsNRHvbr8td9Qaxx67/AhhyBFd+0fnoEEgAy/OHbMGETwE6cqdJ+y8&#10;7fUbxrCH1Avrl76eO1rdMAvTprs1ahRjzhk/PBEdUCkrvMwKH4P0S7H9hz/CyuObO2zlPL2ybdLn&#10;AJggnc7yFX3cLMk1mYpx4kGlTKe+FEOiOE7XSiFdJGS/foYRPz73jNCEr4hapeqCrOfX/Pd/ABQz&#10;cJ/dxH0iNmw8X4chMlYjMsZjS0syrCs3ye7Fd6V303i5nQCi95ngiwAA+jZdKcw62bkSBdlayYJ0&#10;4v3dAACJaHuXPmaFwUEOMhMz8Up9zAovrFn6HACAYRgWtxsrHynI1sOjRg0AgKmT+sNCyIK5sBPB&#10;INF3AIhJ4XJ9zCoC5JQZcrots96dL2zdC4CCFdieZ9MgP79myX901QqNvtCIlfpWaXzLrXar0VEg&#10;LprsxKrz7au6ICsDKvG6nQACAACBX1cMBRMGrYBC9uhaKXhauz6sa6XCRCyIy+KHQki2W0wg8ueF&#10;EKfaDYwl4oi9vMyyf69jNwDDgHJs08dKokzXQI0ahxaMAHBBsSq6iWDTmsVPKCXUhu62R/WxUhDs&#10;MF14VZhlxMAvg6Bd+ohlmAEAhd15lom95SvWIBaG4yO6ahEGIEZJj+gDlU71BVkN19YDSATJtvNf&#10;FMGvBaDt3nsIfDkT2r8gid4HQOzyhey9YXk66lAIiYK/qA9Z41IJACCFtPsWAgjgSC+Jd9i7+QWn&#10;z03zFZbMRXVmzaZ2RIRJTlXyVnE2DoEf0LUqBzPb6TVqlA6yQJyiJ3dPNFLaa02TDTrgY7aDGoP/&#10;QcT2fdQQAUDx0Z4OW1WFDolBAIGntKywFRx7Wjo/AemFiOF8sZIYmu+FkLWVrLFmwcx55wIAIArb&#10;N21vd7B9+4HBL+i6dQSiQNHY0mW5ik/jMgCBwCKnQtAqnmmz16c/mW9kXQiX199SrrcZRABmhFMX&#10;TrOZt5Z+8Lule+jvWBos4LMAApHE5/QxK7h9nWt07VCgoXn5hyrtwVij+pg7t2NSesMBoaHEdmLl&#10;h7GgRY1FXL6up9KfiO3uqgwS3JGMtf9J10sDYfYRMyxX3WeDCD4AgHrpGE7KLwWWcD2AQES+wE4g&#10;6nE0tutatVB1QZbTKR4e+igafeFl2rBlXlu/dL+uWaFxUWg4IJKSArmj5mk487tHo0j/e0gJswFK&#10;tztAAY2QDkRx/qLOefq4WaR0rB4OalpCd+jjZlnQGvpJ+kYDMaleduvjZpnfcuuZmc9CClfuqBXu&#10;lZmkTpQ0Kd1jrDSEkMOu7p7WFf+dO1q9CClvBpAlT4o1agAAHHHM7B8jCgEgsF46bFVelw9kYjLt&#10;iVcMKWBoPhLo8nVdoY9b4fm1wb/pmlUa/aGhKnmBDgeWVHkNAHB88x1TANKLGBLRrY9bAAXK4Xy1&#10;OZ4OSy3JskEhbso8izzerpL/bhNBVQVZHm/4muzvDoHfKEfVgh0cTnFP5jOiQLe3a0nuEeaoq5v8&#10;Svb2TJN/ZkmJix5f+N7s73UOUVLOWaN35TnZ34VDXJF+K7XGHP/KyU4QWVtyAl2LwiVVvjiFM2fV&#10;yO3tyvG7MovbuzXL+VngjDc5DmSPm8XlDeWY0SI4bXicVRYCZc2dvIYtGhqurUcHfTRbc7d0NmV/&#10;nyiS0aC9VX5/OKfwRiD8MPv7+HOpdKD41MHvAl2toY9nH2GWmY7+3dmxgcsfLqmPo9sfjh38JnDG&#10;jJlvZI+bJf3cP/hsRAk2q9THl+oJso7vmIIS82wE3P7wgK6NFx5fKM+tV0hYPuO0myxF7G7vygdR&#10;ylzrBhTHubydRXvoFWKOZ+VsFHhpjohY5/Z1Zl3s5pBC5N1YRxw/03IwMgPzAxjpwGd1bTQ8/nAv&#10;ilx7CyHhMjjeWvn0Al/nbULisLdZBndL5//TtZF401m3nSCluFbXG30hWyujlYKtvY8aNQCg/uiG&#10;/uyHIwCAcMjnsrNioHIAANQRSURBVL9XI8eevvwYiZjjG4gIwuVbuTNbG088vrfkPQcliF+kc5jN&#10;4/Z1PihEbr6aRDz3FF/42GxtNDzezg8L1NvXCXR7ww/kaiMzu6FjesHnfmtoUNcqlQldBTLLfO/K&#10;M+qk42ldz6CIdiajwZJNN0thpN51MOT8bsaY1O3r+okQUDT5mkjdlIi2j+qdsqBl5QVOh6No5YUC&#10;TiRX57sC65ziCx87ReCrup4h3bT0xKkAHxml4rDD4fbN7tNv2Gxe3dE/fXvvDXt1XcfjD/8bEYuW&#10;FCtKvTsZXfJnXddxeUOrCgVGwyi6rScWHNV01e1d9TYh+e+6nmGoE4Glya3SaPR1MVbF7FAdEKnn&#10;N8Taba2eVA3NVzjdsumAGCG53NjRP73XxL1faTR5V54D0lHUX4sIjES0zVZRjlWafJ17YYTipMGU&#10;OnXjmvYXdF3H4w8/jIjv1fUMTPS5eDT4E13XcXtXLRWSizbaZkX3xmPBnBXOQrgWhd8sncVfyBm4&#10;L746YOkleyKo1GkUh16m0eMPP4uIppaYGWFx/F9tnVl/vuy4/SsvF+i4W9cLQcS9iWggkzs0/HcC&#10;AG7wLvfUoWO9vjpTCFbc19+fOnnI7DLn5wB0CLd/1osCcVRHZSZSiuCi3u7gHwudI7c3/E8h8exs&#10;rRhKqR8mY+1f0nUAALcv/FMh0FRLFmL+WyISyNmazPxubm/n+1GI3yLiqCuurGhzPBbMBGLaub55&#10;jlPWvyBAjDr5EbGRSg26Nq27/nn95wAAuFq7NkqA0R+WDGAo4xO93Yt/UehcVzJvWnjrqUfU1W/S&#10;9epCMYBkAMqa43Do+/jnmh0uQZbL3/kjidJUMQkpeiIRC1Z6q5The9ftC20asqEZFWb4ZDzSVlI6&#10;g1kavSu/5ZCOr+t6IYhhfSLSdsbQ15x5rbF1xVsEy78JHH1+BKZX3zhgNAzlMuf8HI+nYzZNm7lJ&#10;CjHqTg4RG0TU2tvdvkb/OZBOe3kOhcnnvkGL493BMX3u22HcJ5siCACgxrNuOQGdjvNRyGUIPJeQ&#10;DQly9H/4HIiZAZjh9wSwqu9A/TMvPfulnaX8AzR4u6Y7EOYLVEsRccjnw1pZOyulQKBglC8TqfuE&#10;gGsEZN7wrPys9N8LmAcBsIsBr0Tk6QDA6cRS8zATIwpkgtuZ6Z0ooBGIKW/LchSYmAAZifBRFORA&#10;wPOHqj4t/T7pvxwhs+hB4BgK/Hzmd9QPHAlmpqHKoV0IcA8iXgfIQ9ePlZ+lGACBmA1m7BKInwDg&#10;40r7u6WrMwnEL9mg7w3SQPyFtTfu1o+qJBqal3/Y4ay7T9crH2IGgcT0Kihxl0TRtZvq+oy+lHBM&#10;dpIT9x83CeSXWPBlAuF4ALZ8jZXKIRZkIQCwq+V/jmTHEY1S8TIQfF565dPy+Uzf+wqfI+Sw5NTD&#10;8e7rM+28LM3XZQIBLhWNb3n7sUh0oQD+lr17XyAR/QJSsOqAgt7NzwStemEhAPDcM0IzHZPUqU5y&#10;fENIvqSUc515FhHDCwT8iFPIa0qbZ4EACIFhUAF1IcqAgPQ8a/VnpZ9ryATwPQR8HwLNLeVZNPzc&#10;J/wdId8mkdbH091YLD/3y43FEzI2uFu6PgLC8CPLLwDyFMC0J4J+nHnSD0kmIABOMOCvWBn3J4fc&#10;uUdj/qLOeU4pPsjM/4VC+BEJh6otLN5kB2FmQmRkQkYx+spMMZiYULD932f452Qo9Xynz3UahtJX&#10;CQ5aRZTrHNn+OZl/My5l8shmKPgjIEJ4Dhh/RSx+vSF2ne0Kp7Fgfks4JCWWXCk7ITAAEd+xoXvn&#10;NQDLDH24EPNbOpcJFF+zc42Y5VAKsk71dy50sni3RPw8M81LV0Xbu/eZkYGZEcQBQroTGf4ejwYt&#10;5e+UA4+/8xME4mwE/gwCTgJgLMu9z8jAGGeknw0O0O+ef2qxqZXi+b6Q2wnifUzqMhTYZP9cZ16y&#10;AZiRzewSFIMUKSFBVM48mw7+mIAYcQMw/4KF8fvkanPP/bHCzl9oTFngu/V0p3A+bfXhT4qNROzJ&#10;Sdl97spDh/B4Z+1CicNNis1iDNI5vQdLdNHtDz0qUFhubk3M309EAtdmInOXr+sKKcCytQITbotH&#10;rz02vX0CMK85fNLkOsyquDNPz+odzoMPtTucTf7+wVKuqt0HjDlbnln8cvpbh3D7Z+0QiDP040ZD&#10;KbwsGbsu09gUPd7QnSiFZS80UvRgIhZ8//C59nZeJKX8g37caDDT9nhk1zEAy2z78owXDd5w0iGw&#10;UdcrFVK0b0N30PJ9maHR29mPQo5pDt2hFGQVpsPR1Do7paujwgB9BwaPreS+n25f+EIh8CFdHw0F&#10;sCO5esfR5b/375Ue/8sDiKOnmugYA8bpvesWZ/Kc0OUN75ASLfYDJAZFN/TEFg+bZru8K78hpcOy&#10;pRIzb4hHAq7MPLugNdziBLRcqJXOFd51RPnPtX1KeByOL+7W0OcFHLRJKAoD9ETaxuHv0+Hw+Gdu&#10;RxTT9RGdFKmbNoyQtO7xhtahFKOacxqkHuuNtp+v6xk8vtDPUGSX7xaGibbFo8FjdD2DuzX0AQHi&#10;d7peiNzgKp/RCgMyDCq6bGMsWLTbu9vf+apAOWplCxH/MhENXKbrGTyt4YcRiid1DmPwpp7uwHxd&#10;zuDyhW6QQtys6zrEvD8R2TlzpHNUqcz3du4th8v/eEBET2woQ15PY0vo9yDE+8cq2f/QD7KGwSZ/&#10;F5l5srDBn4h3B36h65WKx9f5dRTyW7quw6z2xCO7jxyPe9/cPMtALL6QiFxX9DnqaQ1vQcivutZh&#10;4vvi0UDRFjkef+f/IspRLRaI+Y1EJHC0rmdwezs/JaQc8v0aCYaBbThp06a2vOrKSsHErTDxHO35&#10;3tRjZqiilSiK+NVkNHC8ro8lo13cRn//ib1P3bBV13VcLaF26RBFmxQbRJ/rNVHRscC7/BSnrCta&#10;QcIEa+PRNq2ktjAj/d2I1Z5EpN3UCpPH23UAJRQ1+uxZbS4odvvCjwqB79H1DAbRKb3RdDPrkXD5&#10;O78gUd6l6xmIOJCIBkZtPD235dbjpjrqX9H1DExqIB5tt+wpVik0+sLKzjbCeKEG6X83rguaKrAw&#10;wwJv+Akh0HYT80IcRkEWQNpbaZ9ELNrapWd1m8isXlQTjWfdcoJj0qShFfd8lAIjGRvf6kKXN/ya&#10;lFj05XlgG5gKQty+rm8KAR26noGUensi1v4PXddZ0BI+z+nAv+h6Bmb13Xik/Wu6rjPqc1/RvmSs&#10;9BXs8aLiJ1IAgG3xa/b17R8suJpBBLvGO8CCoQBBMWQSNHNIbU8dbSbAAgBIdgc7leKCVSgE/C0z&#10;ARYAwIbY0n/3DfYVXPZVBiTMBlgAAD2r/1mk9JrYbIAFABCPtRUur2XzARYAQCIauIAZCjZg3rvv&#10;wGwzARYAQDLSfrdSlOe5AumH4PfMBFgAAJu7r39174A6QdcBABTTq9UcYA2Z+1b8vGAw95YzwAIA&#10;2BALvEMxV43/TiWTjASKrIRy5t6vugALAKD3qRu2DvTtKxjQMNHW8Q6wAACSscCxTKpgEPXG/sGp&#10;ZgIsAIBEtO2bpPhBXQcAICN1vpkACwBgQ3fgMUVU0AFfAd9nJsCCzHO/yDONifdWQ4AF1TCZZnhh&#10;/dLXSam8STUR/edRujZeJCNtx+UqxIr4yxs2LLHkbJuMBfKWV5XiHYnVgaJvFYV4Ye2Nu4k4Z4mV&#10;FBvJ7rZR/bFyuU/1EyzSe9ft27qrcNA0Avu27shbyTLAGG61YJZ4pO3NTJSTZ8fEP3rp2S9bMgBM&#10;xoLXAbG2CsWQiLYX988qwEvr2l8hRXkrkMlIcNwD/nIy78xbG3Cs9szKBDPApoPWKGUlNZiy1RC3&#10;xkF6du/Iy3NTAzTchqpa2fT0V7cNGpT3QhaPBkfdbhsr4tHdeUEtG/BJq23jErHA+0hxzjanYn4k&#10;0b0kz5x6JJLR4F2K1T/z9NXFtxoL8cLaG3eTost1PR4NjJquUylUTZAFAJCItef0LFLKCJY/wd0a&#10;/QPGuZnPpICS0cCo+TqF2Ld1x6zsCrtkLHBk7hHmSEQDn2HO/BzirQM7i+57j8Tz0ba1nFV8aKTo&#10;1s2bl+U53I/G5s3L+olguN0ME6neyHDipSVefhWGA2pm4ng0kHfzmaEnGjjh4Lkm7lkdr9OPMUMi&#10;Flxy8FwDEKtRDfYqHeGotxwAjy/E+/v4NF0tFy8+tXSzIj4km35bpbGl0/Tqd0HiywaJ+a7MPcLM&#10;lFzXvk4/rBrZ2B0MZM+zKaU+oB9jjUstJ7HnsswgxcP+jczE8e7SfLoSsYAT4GAD7WQkcGHuEeZI&#10;RtrfdvAbcc+LO4puH49EIhb8UfZ3Azic/b3SqaogCwAgNbhvqGElcTK2eMJP9vPrFj+e/kTMAkt6&#10;6EM6GNnFCvYBALDBtiYiBfgwDL3x735mmVVflmFSChZmPveuCd6QO2qeRLTtWgBiZqYDg4YpM79C&#10;7N580GOGGW11rCcQTwEAKMItAHdar4oaQhk47GyciLTn9I2sRoSAi3WtkiCF27asD4xpSfbG2E6f&#10;rh2OSCFLns8yJCKBK4DTVcz9/QNjsvo4USDDNzKfN8Ta788dtYbb+5YO8HSU9LKXIRELfDH9iTjF&#10;0KqPW0RAOu/JcqVfNsT0OAAAK9EPryzr08fNYig4N/Ni3Ls6ENTHK5mqC7I2rP1qMv1J4EQ3h87A&#10;nN5+SkYCP9XHrECAXQDEyoGWtq50eiOBiwGYgOnH+pgVNnYHn4b06pOpPf2RYAJiYn7xqaUlWUVk&#10;IDb+BkN5WvqYFUQKrmUmBgRTjsnF6F0TuBEAgIBKDtQqCuRP6FKlwABgAF2k6+VnGZGikh8IhwzI&#10;F7h84Rt12TqcAlD8wtM3bNRHqpmeaPA7AACsoGgRjGkEvtczfWaZXtIYNkaDUV21AjOtSC9kBG29&#10;cKTeEO8FICZBNw/dwiXRG2sbskAq+UdMGFUXZKVRTATdGZ+niYaZL+ehtzU7GIO4CkBg7+q2f+lj&#10;VmFFzEI8o+vWYQDkfbpqFWLcDQgpuxWtirAsq5c9a9r+RQDGPlAFEz2twoM4Dg//scdUa42JgtTA&#10;C+k2HGOOEFxdZqxjACKeLJD/R9ctggrgdWIcczuDiYEYBJpKCB8BROI3A8Bb9QGrkKIHh4xK7c2z&#10;hrL7dwIAgEzSPQM/r49ZhCG9X2Q/oB1nqjDI6hAAEoWAlkpZyRpU6jkCMOxe2Juebtuma6WCEgWS&#10;+JCuW0URdRsH9rfoulVSzBcDwmq7ryL9fQNFGzNbRQDKLenWC7ZRThXXtRrlRDEJWKqrY0XSSP7Y&#10;1oVaIwNLwA6E4iX91Y1AAvigrlqEAbEOUJSUh5sN7tv1YcX8H7vzLEjn5wAA5s79sa1K6VMXdi4E&#10;ABBs3Xw7l3TOmkBRdYVFVRdkec6aPm/oI1XKStbza5b8B4h/b/vCTi/T2v4ZLn/4YQCBgJSVeFga&#10;QsH6Deu/brv9y/PdwdUKxW903SpD1YRlCYwYuCxFE2zQwxsjGbf6GmODxI2R9oL2G2PC2jtTyLnV&#10;tYcT7pbOJgCAchSaxqOBHzMZ/0/Xqx2Pr+sGAAA53B+1NBp9N50MyOU41RCPL0shs91zjQ5B7wcQ&#10;OOW4XRF90Ar1dfhtAIEI8Ek7ixALfGe3luHxOiFUXZAFkxyZfX3h9na+XxudOARYbrtQEOai5mtm&#10;EQBp405GhoauvDJqKwwK2a5rpSL7By23pSmEYsNym5xCsMLNdm78YYSwlfRaKZzcEipq+DrRKGZL&#10;pejlgAh+m0m2PdxAh1if+ezxdlqykinEfkM8omvVDjN8J/1JsKtlRcnWHwIm/TzTs8/tC3Xq4xZh&#10;JvyrLlqEeeiqRyHO0AetgCguBABI98ntKDkYdQr+e6Zfo8vbaXNVbHypqiBr7tyOSdlPRES0vTJS&#10;LpKRYI69RKnE9+4uyXIhQ6Ovsy3j1o0ChetIeFU/xgqbYm17dK1UEjaT3jMkI+2/17VSSHY/Odwz&#10;yw7x6I7h0ulqxslQluB1LCjD27llGPE3Zbg8qhKEjOO/QJTym/q4VV5a1151uTQj4fat+qiQkDFt&#10;FgJlyfmvQhysBBRC2K6cS3YHbL3wu/2h3ZmgDwHA7Q2XVGXq8oa+fPCbwCbfzO3Z42bRA1gUsqoC&#10;9ioKsi6VU0+YnVPxg0JIlzdUKSe8PLNxfFnpjtPNVzgdQuYkhksBM92+LtuTZGVRrm3icnmsVV5T&#10;0pJgHLJHqTxSffnGr2NN39aXfg8gynStVQ+F2mp5fGFTHSwOC5rvcArBv8qWUEK9yxe+PVszg8cb&#10;6ktXyh+k0Pm3SMl/3uULf0lofXmFxLvn+FfmmUqPRMOZ3z1aSpFbNCHEVLcvZNFL8F4pHc7e7HMk&#10;EITbH/pj7nGVS9UEWU2tby1YnSKluMDVWjGB1sTxjg5HU11TwQBNCOhwe0MrdL1GjWxQcCbfseKQ&#10;fXvKsgpqhS1bQn1MmY2TwwO3P1RwWxYFHu/2d41LZWel01TXX2CeFSgFXunxdf1WHymG2xd+DaUo&#10;mFju8odf0rWxxu0LXS0Ffl/XAQBmoONAg/fmObpeiKaFXafWT576uq5DeqXuV43+LtM2MU2trxR8&#10;7gsU7/b4OquimMJ+PsoY0+Tv+gIgFG3qm01qMHX0hrXWWtocCni84btQ4qhbPYp5cHdq56xX1i47&#10;oI/VqOHy236DHjOSEfO9LsvJgpZQnyjyILRCpTeInu8LX1gn0NQ2U9/+wWNfWL+04EP0UMbt7Vwi&#10;pFyu6/kw9A32z3xh7Y279REAgFPP7myaRNKUoS4b8vh49zW2Uj5Gw+PpqKNpM7ZLIfNa8+iQwgcT&#10;sevep+sZ3L5QtxBi1E4BitQ+Y7s8qlhfxSZv56dAypwWccVQxv6jkt1fKWkrcjyYkIlrNNy+0FcB&#10;4FJRYtIdMf2AiB/vjbWPex7HeODxr5yN5Agw0uUoRMFGxSMxVMG4khEfTawOWOpJVePQ5GjP96Ye&#10;Ob14x/uJRBHt3xgLjvoAGAsavJ1vOIS0XVrPxC/0xgIldzsYCzz+8DUI+FHA0vyZFMOPQdDq5L+C&#10;pl6Cq40Gb9d0h4ODqOhTQsiS/u0IOEwK/gWojkcW75VSlGSizMy/Vor+1tu9+85ypCe4F3WdBQ7+&#10;KAIuRbS+o8WktiHK24lpNSJ6mbhNSDFLP84MzPxdg7BbAHlQiI8JBMutvRgYmPkHRPi33ljgPn18&#10;IqmAIKvD0dQ6+zVgmD1Wvw0RG8z8l2Qs+F59rDrocHj8s94AxBljdIpAMQ8C8HeTkeC39LEahz7H&#10;Nt508qxZ9S9kKngqCVKwaUN323xdHw/mt3R+Rkr5E123ChM/0hsrrQdcuXD7QtsQ4chMUnO5YSLF&#10;JHoS3W0lvRxPPB3C7Zu9HZFmjNU5KhdMpABxZzwSMFUo1ejvvFaivAUBLOVWVTNEbADQo4lo+yX6&#10;2HhSkReS29v5NgQRRonDvfPMwkzMIH6Ne3Z8MR5fZtupvFJp9IYvlcDLUfJJVh+MTKQY4PZENHiN&#10;Plbj8KRh0crPORyOnEaslQIRPbEhFnynro8X871de6RQU9PTpfUdVaXEvo3dgZxk4krAtXBFMzrE&#10;KiGxVU++NgMT/M4wUlccyikabl/ovSDESgHKZXmeZSZi+EkyGrh8QfMKl8MpViHKd+nHmYEYfsOD&#10;6tpk+ao00e3tXIEAbSil5ebUTLSVGL6cjAV/5vJ3fQEBviMQjtWPGw1iSjFjOBkN3OBuXf42VI4w&#10;SnGWftxoMBMrwHt763d+Fp5Y1q+PTySWLprxp0O4fDPXSZPbhimlztsQa7frEVJVNDR01TuPpN1C&#10;CFN+WAMKWjfF2mwZzNU49Jjv7fxfKfATpTxsxxpW6v96u9s/pevjyclnLZ8rHehygLXnUf8g9G5+&#10;JviirlcY6PaH/yoQTQWySuFnkrHrTOXLHEp4fOGtKNCU47hS6j3JWHvBJvYub+j/pBSmkr/J4G8l&#10;ugO2fcpGwrVo+Zuls+5ZXS9G32BfwXwzV8ttR0oHmQ64U4DuDauvG+pFnIvb3/WM2W1DI6Xe17um&#10;vSzt0caCiptQC+FuWXGecDiLVhIQgZGItpVsdHYo4PaHfywQP6vrGYjpQCISPELXa9QAAGjwhpMO&#10;wQsqMcgyiC7fFAtW5CrbocRJp900a9rUKUW7KTAzxSMBa1HmIUajN/wVh8Tv6noGJlLxaDDjn1Wc&#10;uR2TmjRLIp1Xd/RP3957w7jlSbp9oR1CFM+rYuZfxyOBj+m6TpMv/AsQ+HFdz2JHz+q2UfMcPd7w&#10;pSixaNPsarkeLSe8TQSJ7iWPkZE6X9czHO4BFgBAIhL4HAMUbObKxHtrAVaNkRAI8ysxwAIAOLCn&#10;75Bw1K90Xnr2yzuNAaPo6kE1PNDGmt5Y4H8MQ12t6xlMBVgAAJuX9RtEp+hyhp7Vk+rGM8ACAEhE&#10;g7NZUUE/NAb+mZkACwCgJxq4jEgV7O5BzP8xE2ABAMRjgfuUGupeUoBquR6rIsiCoUALSOVVwhk7&#10;+isu12GiiK9u+6pi2pKtcbp3WO0c1RgRMdQloBLZmqzc8uxDjd51i58l4l/qen8qdZKuHa70drff&#10;zoqe0PWe1TssPfR7o8EXgSHPDmHwgDEH4MqUro8H8VjwRF0DAIivDnxG10aicLI5cSISsHQdJWNt&#10;fyJWeZ1derZtsm2rMl5U7MRaiJ5oe85qllL0895xjvaL4fKGPq1rE0EyEnxTjqD4IznfLdJwZpep&#10;6hUzzDvzlrJUiM33rTT1RjVeeHxdV+hajRrVSiIauOzgN2Jmjj6/Zsl/so+xypwzvlPw4T1BoMvX&#10;ZSuIiceC78wugiDm75dirdATaXtQKR423GSizRufsdds3uMNX6prViAif3bPzp7VpXnU7XhxR87u&#10;iUph0VXSkUhE2j+c/fuQogdh020F/bUqkaoKsgAABog/nP5EnIwFP6mPTxAIgirmwc/Mr6T/Sxy3&#10;6RlSV88361qpOB3OsjT0dnBlVcERqglNyrbLSafdNA8ALD8gahy6qBQMJ8HHU/G35Y5aZ9qkKUPz&#10;dkXAogRvKB0D+an0J+JEJFBypbbC1FszQcT2PqNJH7eIYMGmChiKkYgGo5nPTNybO2qeV15ZdoAI&#10;hv48cXJNoEc/xixM4qbM50QsmLf6V8nYvtDGm03RwG/TIa1AAC4pwi438xd1niLR8V6Ajoo4n/FI&#10;4AQAYiDM2161CiMucrWEhhuYlorLF36XEOIDum6VuS3fO07IyvJ6kSjf2nhG6GRdrxKwfsqkKwFU&#10;RdxLNSqD5Jq2JwAAmAFg7Z22Vn083nAQES7S9QkESzHg1On9V3AhAAARj5jAPhobo0ujAIKZiV9b&#10;v7RgWyOzzJ3bUYfMtlayIG00+xsA4nj0SVtB3yCpDwEQG8Q/GspeKYl49J/fAKjOHle2L7QJgBEU&#10;swHR8jUKtofDIRcxM5WyXDxWsGJiVrbLWgXC6UKg7WacAvg+EOy1W9E6xZHy61olgHVo2dulQmBm&#10;utyqB9B4QWSUqYl3jQkCFfL1DAdXxiac5isczERleylGsUyXrKKY+4DAtP1BMaYdN/vvKOTRdudZ&#10;afCQRcd9tu6/57vbewAEIonf62PWuI8AALBAvmClU56LbNyRiA7wVcpKFhL9ArEyfpcMKAUyirN1&#10;vRQIwZQH1yhMRUZp520G0svX39S1SkBIzkvOrBaEEBVbGMEoY7pWY5xgigPj5bpsEZYAswSCuaq7&#10;cWABej6KCOhqntWmj5WCYnhU16wiGNYzoO0qWhbQAqDY7jxLiCW1/ylGsjtQsNrQAqwYDEb1DX2g&#10;0qm6IOvUphVDid3ElbKShRIEgGD3oq6KWM1o9K1cDIBCSrjUzhtNw8KuUyEd0tbpY1ZBAQKQ8fjm&#10;FUfpY1aQQp4BANDoC1VEsOXyrvQDAFR6G46RQK6cB2AepGpB1gRBBH+LRwM/1nXLoHACIJx02k1F&#10;PZjGE4fgLwAIRAfZzhNjw4huiAbW67pVCOiBRKytTAU0CPOaw5aq+DQQET8HINDd0lmu/r+250dU&#10;8Jt4qnezrlc6VRdk1U1zJmAoV+BU//cqpKu9QAAQIOBJfWQiQJRDflnC1htNndMYXuJtbAlnVRxZ&#10;w7Uo9F8AAhEFTnfITn28FBDhy7o2EQghK+Lf3A6VHCAqIWvdCSYITDlDumaV+S0rPwhACCBwyhH1&#10;q/TxiQCleBuk79236GOWQdGlS6WQjM5ZbnfRoOHM5Z70J4H1TvinPm4BRsmTAABQ4P9n78zj27rK&#10;vP88z5FsZ1+6pk2bNnVsSe6WOJbksu/LMPCytAMMy7B2BmgtOSktFDCBQpfElpSyDPvOAIUyDMPO&#10;AGWpJTlLN0tyki4ppemafbOt8zzvH7Ic6ViW79WVbTnx9/MpSL9zrUjn3nPuc895Fsd+tKLlcSf3&#10;oTyCkHDqHzgdzDgjixDmwciNoU6y036D8wWjo8nbSOmGsy7dOK1JP1etjngLVp7I548W5c2yA5Lr&#10;4vxrlwu/V9xqHeWm0a00F0HFEaEef3Q0X5JCqruorceRU6ZTmlo3nY4F+aV8/oij0Ovp4PxLN46b&#10;ELEmGOanTGmWqSG1/UO7TM0udS78Sd6IV6gqHvvVojnY/dbC+57PH/tg8RH2OK4Hf2lqlXGVI98n&#10;AID6OXWj0XuEsrxSn7PmYDSeT0yMRKrJ3/Ni8xg7pJ5cdJGpVQId5hlZyqmikzBd+NojRfWSiPBM&#10;T7DHVpK0auINdL8asbCWlcLT5rmfLjxmqqlroFThe1R4btPaaFuhZgWPPzKmvEZzoOerpjYRPn/k&#10;h8UKodcfebJYm5hmf+xFSuHSQq3BpR4ofD/VkFsVZUdGRee0tEVfU6jVOu4GtFQXdLrYPzy0w9Rm&#10;mRl4A7HvmQEVnkDPmHllKnGhq+hhERV8rvC9XUrV8JsOPMHop4sVQm9gqe0kvhcFuxtdiIFCza2U&#10;syj13e+qSsHmVGrdtF47lTJjjKyW9pggjHXQVai+6X3O1K9orHjBNxqIXL8wdQSc09Iec7w0Wgnj&#10;/btuNybtrLB5ApF7lBpbw8pF6j3N/sh1pj4enmD0Q6hoTDJUUnSmLxj9s6mPx/mXfGGJS0HJwt/j&#10;/ebJpqU9JgppbDknF/68sTFWjUCBKUEBOQ73nkz23r91j6nNUvv42iKdRDDGxUCRWuIL9mwx9cmn&#10;i3zt0ZJzRW4OqWzVpxZo8m9+sUL8mKkTwWJfsMeyEbhs2ZfmNqBrp6nDNM6zJwM164uRZ+WlG8+s&#10;a3D/Qyks65yrRX6ciYem5Ibh8Ue/qxSWraIuAnxo8Ph5f99+fclaUNWkKRC91E14r6mbaNafyCQ6&#10;jSeeEzRfcesClzQcNHUTFvhTOt7xIlMvxOuP/pUUlo1uFGa9L7t/4Z6tG46abXl8gcitSPRhUzcZ&#10;Hhr27ti6vmRF92rS5N94oUvV7cIJHlA4y19O94WvNvVaY1UgOqAQm0y9FhABGEhUlm16lunDE+z5&#10;i0L1XFMvRuDA3/Xcxx5b5yjHlBU8bd2vVy7XnaZukgV+z0DvzCpE7gtGf4mIrzL1QrSWLB3WZ5Vb&#10;CfIGoh1EGDV1ExnKBlJb180Go9ig1iYwzDvIef2RdwvgRqVkifXCtVpEq37mobdktlyX30oa/Uz7&#10;dFE+99VFq7sb6+pdP0HgSxAh5x1mAWbYLwIfyyQ7Pj8iOfg+AIV/7/PHPgEAN6DiBqvfB4CFGbby&#10;0NDrBkYMQG9bz1VAdDsiFPkYlUO01kLw6BDAmx6Md24DAGhZu7FNlOsOIDpvIiPkBCws9JQIfyCT&#10;CN8JIxGk7nn4P0R0mfW+ZmHBoyhwUyoRqlaW+tG+9gQjIQLYgAgLrH4fAADNeK/W/MadWzofyukn&#10;rqlaoCkQOUJIc029FhBmPZC0WHB3lulgdHysau32K5frDkWw3PoOSW7sA+ur08nOfPoCJ/Pj6N8u&#10;a+2au8i15HZEeXsufYS1MctMWkR++Ozhff/+dGrD4ZEGJ9+pSpyYNzxroxcjyR2kpNncjh0fFhHY&#10;iwCd/fHwtwEAGp/7mTPqjzf8ANw08sBspY8AtMgQCnenE50fLZBroI9qE0udOrl0kbdtyU2g4I2E&#10;2CQCDKwFlbJVbLMYLVorTQQEwCiAd7FIZCAR/h/zyFJ4AtGXIcp6Qnq5iDAiI4AS65PHWERrDaQQ&#10;gFEE9qCG76a27P+ItRvulcoXfM7tDPJ6AjgLAAVHrA/zSOsIs2ZBAECFZHWA5ZHRi0eL6FxJllwq&#10;C6uD3oSFNTAiAFLuf80jrJLr69zfs4Z9oOS7mXinxZw4XeQNnrYRWL+OFKwUIXF+PQoDIIgIICIx&#10;y2+ymjft3NL5e/PIqcYTjLDdcz9VaJGhnYnQjNl6PVXw+nveDkBXk8LniAgLi5ASR2NftDCQQkQg&#10;Eb2Dhb6RsfiwdNll3ecONdBtAvhqQlwIwIhIjuZrGCkzJQKAIFkW+AmDfHQgEX7EPHAyaW6NvYnc&#10;2Q8i0AsA8nORk3l2dH7E3D3EwTzLrGEkcz6LHEHBH6SfvOca2P2tqvhgnSxUfKImBV9XXfPcBWvJ&#10;pV5JCB+rdPLXWrKE9D6tde/AlnDFtZcAALztG1dw1v0cl5LNgHSa2W4NFtB4Gyv43SHRdz8Wr3yJ&#10;fFlr19zFuOgKQLySXPC+yvqIRTM8RIifFoBzCfEz5hG2EP0+DQoUwlfMJjto1h8BxMeVyKeB8LxK&#10;fxsIfIEFf7n32PBdTspUNDbG6l2nZ4Mo9DokCGFF3wdACz/BTB92UbY3FV+3q1ae+s7wdc0/beHS&#10;Aw5vRpNGVuTIrkRovqnPUjt42jY1EblfiARfMtvsoJlvQJG704cPJCC1YchstwACgDRfcesCFze8&#10;UDN/QCl4RWVzCIAW/Vdh2iw6+8cdW9c7zsReDbyBW1cJzmlXKN8y26zDwkyfApBdhPwJQGysrI9Y&#10;gOnbQPLjLA7eNXD39YfMI2bJUUHnTiXvd3uD3iNUysG4BFrL3kwyVKEhZI2WQGQPEJ1t6qUQYUnF&#10;w5N6A1u58kuL5px1fL+pj4do/lEqGf4XUwcAaAlEB4GsJR7VAE9mejtK9oMvGH0aES0lHRXmwVQi&#10;3GDqAAC+YOwXiPBqUx+P/t5L3QAvGq1oPxn4ApEsElla1dIC6Uy8YyR3Te1x0dpN57ldtNvJU/Fk&#10;orXcv7MvdKmpz1K7eIKxJxTCWaZeEpGh/vjkrlR6AtE3E8r3reWCE8iCdAz0hmsin9dE2JlnGXg4&#10;3Xv3nFJlcnz+aAwVXmvq48EsTelEqKSD/CxjsXDhTT/NgdhPXQRlk6INZXn1zr7wPaY+GXjbelpo&#10;gvQBmnUqk+icsqhHbyCyi4jK5iM5/PjeObt3byi7lNvSHusBgLCpF5JlftFAIvwnUy+kqT36Ejdg&#10;2e2wLPNtA4nw9aZeyMrWWxbNqZtT1ogUgZ2peMeUOW/7grEtiNBq6oUMHxlaueO+6x429VriojU9&#10;V7nr8AeVPclONiw6K1/fuaXzvWbLLLWNJxh7gUIoOz8wcCTdG+409cmiJRgb3doqjUB/b6gGx0F5&#10;PMGeNQrVVlMvRLT8MJUMvdnUTSaKIBSRPal46BxTn6U8M+aiammLfAlcVLLswAHJznWyBVcZgi3t&#10;m0v6UzFLbzoRcp5N2CblBkl/bwdZ3aLyBXpuQFI3mzoAwOGjvGT3veGyRk+eptZNp7vrSucNy2Zx&#10;/UDftd2mXpouamlfOuYJDABAgx7O9HZaWn2rJr5gNI5GPpk8/b17lTVfu+mlqS0aJyX+WjWyWOCD&#10;OxLhL5ots9Q+nrbbT1MuLrnNxswfTyfCN5n6ZOMJRgdLlQgTAEj1ztwo1nJR4VmWTw0kQl2mPg7Y&#10;0h4bd97qn8F9NJ2Usexri/6+8NWieUxG7WMgl0y9gQUAgKJ5eK2pspanpsPAgpFBwMJjyg48c2Ro&#10;vlUDCwAglei8Jat5u6lrzr7FqoEFALBj6/pnsixj6oOx5rutG1gAABt46Gh2uamCyNB0GFgAAKl4&#10;KMjM+0yds+rimWBgQS7gIVCbBhYAgIBomd2SmKFk+q55dljr/5ePss0jmrdPh4EFAJAZZ2tyJhtY&#10;AAADd19/KCvZMdvqIvywDQMLAEBGHsbHMGtgVU7JDq1VUslw0Y2WRd/3UG+o7LbdZJJJrN/KLEWO&#10;9enk36Z1OXVwePCMwvcs8s1KnL8HkuE1he8168OZxLofFGpWGEiEfqK1zodCAwBLOhkumz+rFDvv&#10;XfcPZi6qY3foSF1JnzCr+IKRXieruXhof9G/zwL3pfs+NFraYhZnZIf4UVPzBqLTXprFAL3+nteZ&#10;4slBl6P0GTuSnT9jgaLcTCljXplqjg/q1kLDj4f1y4qPsEeuLuv0MxBfdz8LjKSJAQBgScXDKwuP&#10;sYhokI2FQvY4nVv43i5ef8RRQFQejz/yDlObCcwoIwtyK0W/yb9MxzunvSRIOhHy5F+zlqdKORZO&#10;JQ9tveEAszwDuScZScdD7zKPsYow35Z//dSzquKBdvRYw0hFeBat4d/MdqukE+H2/Gst8OSj939g&#10;zEqSHQSg1c4Kn0kqtWFItB7Mv0/HOxxdj41ruoNTmXm6YutyChBGePi+9WNL6ohcDnClpcCDKUIQ&#10;cYLEmzMTb9viG0zNLkPAwbxRo0H+2Wyfah7c1rlNOJeeAQAg7TSNihtfbkqV0Lw25rhv0vGOEZ9c&#10;Fgb6L7PdKpne0IdHz5mGvQPbr3GUUJsUVcmvEleZykxgyib0apF+XL8ecgZEDd0jWISF08mQtaia&#10;SWZY8CIAAAHcbbbZIXVo/8dhxFjbu6uj5J6/FR69/wP7RFiEUTLJ/d832+3AzIMAAM8eVI1mm12s&#10;Rq2WI5XsHImMrNhWG8Wl1Ed8/tM+YOqTRTarX1uN711tBASOD0PJoBEhedX5l7xoTHmt6WJF2+fO&#10;BsCaz+xfCQzQvrI1OvKAVBkPxtftEkEB0JLpDf2v2T5NRAAARGvH/n4K4OpGf2ysK4NNlJJ3Nwej&#10;Y8oQVYbAU3uP/7up2oEZEgAAGrKOikNXEwKpSl9PNTPOyILH1h0D0AKsamZbhjXdiiQ1Y/TtSnYc&#10;FK21MDsLRc7nqxEs2O6rDEHIYi5BqCN/JQG4BgDg6dSHHH8nDTJ0xhldVcnDpLMYMzXbEF4upKcs&#10;4mrXls6fZw7uqx8eHH6dDOrXmv9lh+UqFObDR+USs83Of4PHsgEEAZ2Vt5ht5n/HhodeNBAP0e7t&#10;4bT5fXNuZMo3d/7xKt2MnDOXBl8KIDWZMd8pygWvcru4qOC8fQRR5GgtrZsOD8HXAbQckeynzDb7&#10;ILiy4DhNCwtcoQQ2mXplIDw7cL2j+VEANgKw7Eyum7BcmxWaAreN8RmzCaKiM9wAVVk5nEpmnpEF&#10;ALm8PlkvQI0YNiivN6XpBhUhAF5o6nbRGvYC4O2mbhfUeBtrzjh1Cketq1Jc9sI13ZeQiHvphYte&#10;abZVgujs10zNLoR8HjI68jOzTWrD0IPb1//PwPbOn5v/uV3YRITw2H2pAbPNzn8P33twGyGCIl5m&#10;tpn/7d563Z/KLAsKAIsC9TmzYboQdn20fGqAmQsCoUJ0aECiaKY7WOh+s2W6QBevAECYC/XPN9sq&#10;wiX5kmkV0kVK4ZmM4DjH4xDyai04XGYMWWNYeqsUFIMALAR1lvMdjoMAsJASx/PsVDPjJofGy2M5&#10;x25CAkBnF1KVIJImEZTzz795idk2HTT6Y0EAJCC82qnrDaL8JpXouNHU7ZLSczYg4W9N3S7pLevH&#10;RD1WQp1L3YgIQAIT5o+ZCGbZN7DtoNOVVUJEYUDHW5jVgkC/HwCppd1jsSRRaTxtS34CuQvx42ab&#10;HZY2di1kndubN9umC1LsQUSZSl+6qaCxMbYQACBXvcsZzx5R1yLI30x9uiCl3gNAyEpXxWldKWx0&#10;NM/6wCXMulR6CbvsvHv/A4T4C1O3S2Zb5x5TqwRfsOfbAIQIULFvMADAihVdDQAkTrp5uphxE4Nr&#10;juT29VnY5+tyfFFWB0JEpHnL6gqiO6YPF8gvAAAUosvpE40If9PUKmLr1cM6m/2hKVcCs0xYLX4i&#10;lJKrAAjJRVVYhZQbna7QNbf1vAUAiYhV89rYtKQAGQPheQAAIuDIARoRXw25m5ujh5CzTl/yM1Kk&#10;ECW3AV0DMJMGQPKNk8dtpuJaAiNbaQIXre525P/4dOpDh48fz/lB1QIK5Y0AAC5UJStfWMXXFh3x&#10;U2VxMs96Fix8J1LuXty4NvYCs90eG7KopSgKu1KYeWzgiV1QvQ1yCxGOnNbnn7XkbzPRXoGZ+KUV&#10;oB8AAJVSsnDJtD8d+QI9o8vgRLiouHXq8fm66pTCpSNvyRuMfsM4xBaZZKfj1ac8A1sSCVOrBOGs&#10;I4fVi9p6Wk7UIRRsXnP7JeYxthiGbaZkF5dLfRcAAJFQKf0Hs32q8QZ7/j2/XYCoTlt56cYzzWOs&#10;4L381lWkYDQVgKc9VjKhsBUI8YW5Vwq9wc19ZvtU4wvE7lYjv60mLL4qolwwsnqpsL5O/dlst8uB&#10;Y4NPmNp0cOGa7ksKt8EuauspGWBhBXThgtwrQq8/+lez3SqK6Ev57+RW4izaEQAOZfk7plYJemj4&#10;SlOzQ5N/44WF48LXFn1nwVt7KFmdf+kJRpzuGkwpM8rI8gViRfv6hNLauOa2sqVkJpPz1/QsQ1IX&#10;n1AUegI9jiL6HLNg8dHCt4RYccqE6lOd9BaZvhKh/TZoKCqJROiq5/sK2+2S3hZ2ZDw2BXp+Xvge&#10;SdW3BG4fMSimB0JVZMg2zK2raPsAG+qK8sgpqKyQsCcYKSqZRQitF6yNNBdqU8n5np5lSDCaUgQA&#10;wOuPPlb4fqbiC0aLVkKQ5Oym1s2jqWoq4dmB2iggPLfeVTTWi+cC6/jaY8XzrMLnLPd15R9uLePx&#10;R39UaPQRoau5LfKK4qPs8WiVtvp2bP+wo3nRrQp3dgjRJRU98HsCse2FfaSQfE2ro04d6aeMGWNk&#10;ef2RTUhQYNAAABDW19fvOq35qyNPFFPLgno1Jn+IInW+JxD9T1OfCryBSLpU8eJcuZ2Ty2ekUryB&#10;WMncWh5/ZFpuAs3t0SvdpF5j6kD8R08gVrY+4uTQRaXKMyEC+fz57RFreIORI6UK8458/hh9PLz+&#10;yM0KaUwOsnluyqy4LLLY1KeCBUvGjn1SeK4vEJ1xjrmF+AKb140tF0XorpP0qrU9lSS3rBl8wUjJ&#10;Mj8tNse+JxC9AwHmmPqiRUuftXNde9qir1cKx6wWuVz06+kZ+9XDU3KeJfQFo7YetD3B6E2K4HJT&#10;dzfgvWf4PleVyPDJxvIFMZ14gtGUQvSaehECr+2PdxStCEwWHn/PPymlyuZ80SJ/z8RDjnLM2MHr&#10;j+wlRWV9Xo5mh5sfdrgKNINBXyByDIlKltbIwdLfG54yY9Trj/yVFJXNfq+Z/zOTCP+HqU8KrV+a&#10;21J3vGx1AGbYn050lL3OILcash+x/Pa5lVIdXn8kTYrKrqJkh7NvGtiy7iemPhl42ja9RrlcPy83&#10;dYrm3alk+AJTr3V8bdE4ukwDqxgN8sFMb+gLpl7reIKRIVUmL54w61QiPGGGe18g8g8kKlvVQzS+&#10;JJW8tuyWvy8YiyNC2b5m5kg6MXVFtKvFVI79Qc6+aVdiasZ+pUz4Q6cLT9vtpyFlv0JkzzF5UEP7&#10;rmRHwokj4jhgUyB6iZvQVt4QLfqvQ0f1Gx+677qnzDantKzddB4rihOpsoPeJCt06UD8mpoJqZ5M&#10;vIHoKhDZSoosr3aKliwAXpZKdjjMETSWZa1dc5e6Fr0PSNly3ucs/Eu6b++dABuyZptTVvm7L6tT&#10;rqLtuIkQlsc1yHMGEuFH8tqqtT0rlUvdrRBsJeUd0nj5zuS1o+PK03b7aaiGv0So3lh8ZHm06NZM&#10;/MA9ToMQSoCr/N2X2u0j1Pruo8f16ydj7FeLRn9soRv5k0QUNtvKwSz/lE7s+/Uk9HXV8LRtakJ0&#10;bSGV952aGNF6cBhx9c7EiTxtvrbbzhZy/5yIxtSqLccwy2U7EqHRLbezLt04b8lc9X6Fqqf4yPJk&#10;s/KvA33n/BDgKlurQFNJk3/zhUTSa2fsCwCgxsv7x4x9/hIh2Br7oPHy/uSz99fi9VgTRlZjY6y+&#10;7nR9A4DyI4LTfBqjaIYhAvi6iL47ney05QzY0h59DYv8MzK+BW0M0okQkb8wyz0HtP7Unq3rSy5f&#10;l+Lsy2NnLG3gG0FwNRJWJ7/LSE1CRPw+CPx3OhH+ldk+k2jyb75QkV4PQM8lhKrt2YuWfzDiz1nL&#10;13dsCdlyuPa1RToBIYCKrjLbnJAV+aFL4M/9CXurCqv83Ze50fXvgPJKRJxxqy1WEc3HAfn7mtX/&#10;DfSFbFUZ8LRGXwYueCMA/IsirNp2pLD0Csr2o3v237h79wbLhdariTcY/SgAtCLI60tt5VZELrbu&#10;W5qH/5rpW/9Vs3kqaPJvvtAFej0TvFAhOU4OWquIAADID0F0XyqxrttsnwrOvvwzZyxtmPcxAHwO&#10;ItTctqYWGUKQb4qWuzN9nd8y26ea6gyyKnHB6o0r5rjdaSRpqHwCYAEgFGFhLX/L9HU+zzzCDh5/&#10;z3eI8F8h55eSc7m1xYnvIxoGh1m/dtfW9b8zj7KKd23PSwHxV6hAVd5HWmQkAl4Yvp1OhmvIOd45&#10;zWt6/lXV4Xdg9JyBzfN24pxBbovsk5lk2EF26K4G79qlu9DF5+TOWe7zzaOsIMLCIOlnD9YFnGS9&#10;b14buU654FYAgFxKBFXB92HJTfo5KutrKLoeAXIRlkXNlikY+wJ/zCTCLzGPsIPXH/0ykrwXqjD2&#10;WXB4mIde+GDfh3vNo6aaZU1dpy9ZsvBBQFpQjb7WDPeYBeWnC28g+jZE+TY4uh5z4yz/2smYrdbn&#10;QH7si/w9k+hcYbZNB7622CtB8S/BUV9Xf+xrxr8MJEMOU2FUjwp/0NTQEoh+Dgg/aOrlYK2fn052&#10;/sXUq8Gq1m6/cqu/2EkaxyJfScdDFYetT4QvEP0pEv4/Ux8PEXlGDw5eNrD9+jGOuyclvq4678JF&#10;dxMqy09cItKfiu+7fDK25gAAPG2R65WLbjH18RAR1iLvGUiEq5OzzKT1/W6f8j2MCi0XARfRv0vF&#10;O80SF+j1R/5IiixPcJrh0UyiY8xNw+OPbFaKrjH1cgwPyfN2bA1VHEpfjqa10Tblkr/ZqXepRb6Y&#10;iYemrBZlpXiD0VsI+cNWDW0R4CzDG3YkO35mttUUre93e92eXjtjXwunss/Qml27OkYLv0POp+vr&#10;CslyQk0tcsQlcMUDBduFAADN/uhHXQo/U6iVQwRYS/a9A4l1FUXmTSHo80f+iLbH/t4LzS0+b3s0&#10;QoChQm0iZGj4eamt6ydl7DvF0qCaVlq/5Pa4jx2eyLBhzd3pZHi9qU8GnmBPeKJ9dS08fGzP/oW7&#10;d284brZVmzN8XfPPXLR0wggZzup/Sfd1/sjUTwVWBb94bh0OTRhiP4jQuOvujgdNfTLwtUWOoovG&#10;RCkVwln5U7ov9CJTnwy8ayIBqqcJExkOHjt85q57bnza1PN42m4/Tbl4wq3w49ljFz/Yd8P4OW98&#10;XXW+RUv3l4rkKkSYN6US4etMfTKwMvaFWR/8By947LF1x8y2WsYbjAxNZESK5h+lkmFHSTynmlXB&#10;7nPr0DXh2GeWpnQitNPU86xY0dUw/5ylE57TLMv6gUSo7FZeS6DnEJAqGx3HwHele8PTmsrFLsuD&#10;3UsXoetZUzcZHhZ/OdcLn6+rDuYv2Y8Ky459LbwpE5+asV8ptW9kjVAuqoM1vz6dDP+3qU8mqy7r&#10;PrdubumBKyIHUvFQ1Xw5rFIq9D5P/+N758AUGHy1ji8Y01iy1pxAf+++eoCRothThDfQ83MqlcIB&#10;AETL5lQy5KikjV3Ov+TmJQvmz91r6jCyopaKh8akCBkPXzCqEbFEXwPQYffS++//QIkw77H42mOP&#10;IUDJVTZmfvVU+xJ6A7euImooGaU7XWO/WniD0QcJsWSqBq35o5lk+GZTnymUux77e//qsprHzxOM&#10;Do730M/Hhy5Ib7/OUq7EcmOfRT6fjoc+ZOozBV8gki2VTgjsjv1g9HFEXGbqAADDzK/eMcVjvxJK&#10;XnC1SCoRPpc1jNm+EZb1U21gAQDsvHfdPxik5JLmdE2y/b3XljyfWeYXzRpYOVLxa0uGae/LqtOn&#10;2sACAEgnOv9ZtIxZhWQt90+1gQUA8Oj9H9mXFSoZNGDHwIIyxw9qaLE6yQIApHo7lmuRMeeGtdw4&#10;1QYWAEA6cf1OzTzGBUCmcexXi3Q8dJGIHDB1ycIPZrKBBQBwZM++eaYGAHD4KC+xamABAGTiofpS&#10;weta4H1WDSwYGftay5gHGtacmckGFuTu1yXnWZ2lZltjPx46R7SMWT3UIp+ZCQYWzCQjCwAgnewo&#10;WsrWIkOpCZZlJ5N0byimNRddME/sPb6w8L1dvIFI2fwq5UEZ1MVZqLXI3wcS4T8VatOFz9dVdnl8&#10;akDRw1gUHpzN8obH+66ZcIl7skglQ2OumXQyVNLQsYpnzU0ln/6sMBC/5n5hLjLKh/RQySfuCWF5&#10;U9FbrZ/eVUFqjNyN7QSiWaeToc8WalNJJhH+itZSlJohZSH3z0zANBRFWFJ9HW8p1OzS1LrpdFOr&#10;hOZg7J9NzSq7d284zjr73pFagwA5g+aW3feGbUd6Hvj7vtMK3wvLM5l4h+3IykwyVPQ5AALpZLh8&#10;TsgpwuOPODrnw8NclClAa0lm+q4puQJcjlQyNBdAnzhnzDoTD32s+KjaZUYZWZB7Wngy94rlmMi0&#10;ldXIk0mGR0spiObjTstHIICj9Ay7kh1x0bkbpLCw04So3kCkaokws/MXOYr2qhaZLdfeKaODVstA&#10;X/iT5jFTDTN/HEZuaNms/KvZbhdxz7va1OyQSoTn5G9GAnBsZ/K6X5jHWKE/ESpKFJhOdlZUAxEA&#10;gIVHtudZDh7mij8nz7LWrrmmZofDj+++QERqLi9PNWCRLfnXWRZbuQpLQVTvqEBwHgXaVjCESTq5&#10;7mvCOHrDTifDHyk+whqPPbZh74kVFi2pROgM8xirCMvG0bHG8G6zfZpAAqyoBFaeHVsKV5pYMsl9&#10;RQsAdmCGUR/P4WfJdvmi6WTGGVk8PHwxQC5fyO6CRIjTC4uw8D6933gqsc94+9h2yHL2+QAASKX9&#10;D+yAAI7qaOVZ4bvtbBfgW019uhBRdwIAaKGayBacToQ/AwAMLGw3r5PJcl/3UgR0lLoEAEBryAUA&#10;aLnRbLNDFuCnkPPpGddZ3gqDTw1ezJq1CMBjqXVjtlns4PP3fHCJa7Gjfn7sscgxAEEALf29/SV9&#10;dGYqzxx0jQZb7Eh2OooiXOXvvowwW9K1wi6I6mWmZhdB+G/I3bgdnf+DpE8DABCLUZnjkUr87SMA&#10;JLnXoVqJIpRq5IfMCnwFAIAFd5pRhHbY/+iBCwByDzS7dnXYKu813Ti+CU81O7aufwZAi4DsrRXH&#10;fWH8GZLgnq0bioqG2qc69QV3bLmuD0BYa/6o2WYXEXmNJxD9P1O3y9z5dV8WkOea+nRxZEhfI8Iy&#10;PCyfN9umCREBYCRHK6EAAPPm03sU4YtN3S4CsEmYdSoZiphtdhjo7XhD7pVsMNvs8NBDNxxAQhSe&#10;OHJxIgTwQzJRqS4LiPBvc9PQl4fNtplMPgdbYZ6nSnEjdjPJFaZul1XBbr+pVQJrvjm3/cSbzTY7&#10;PBbPRY9qFocpg+5gEUbNUrak1VTS6N9YlYSuA/GO9wOwsAZHc8iePRuOAgiW8l+tdapyU596EESU&#10;4xWfasGCt44kZXTUn572Re8FAFjZekvZuk9WEAEYYnRcy5GUUoASNHXbKHklKXW2KU8XdcO560cp&#10;cXTOqgmDDIjIw6ZuF5ei20ytEhBZlXLwrZSjxwYdrRzkEcGSTrW2QGokxCZTtgvX0DxUo6Agtiss&#10;HR1qhzpxOV7FAgBAFBcAAFdh1wAAgKhKc0hNLBnkUOJ+fqHvmjMIjx8ZchqchgCEWR6uCZcTO1Tn&#10;4phCcs7ThIS8KPewPf08e3jvAyzyDwCoeDkUAICYXgXAUu9usFXXrhSISA9tCdl2MC7C11UHAKCQ&#10;HPmuAAAQjOTfeUGX8xtkFXDN1x9DBHAhOfZ/qhYo/H/A0mXqlXLWpRtLRlNZRTG+BUmpVYFoVUpd&#10;PXr/RyxHFZViebB7jrAIKeelboigKtehInkJAEq1VqFriGrd8oWQ5lpNdFoWgpsAtJx9+Wcq9n8C&#10;ACDCtwAoJOGqjH0Ceo7D/hJgYYXoaLxWE1RyDQBhY2BTVQzb3akPj/hSV4wwy8Chg+j4IXSqmXET&#10;gyxcNJJB+YTz4nTzdGrDYQT8mqnbJZe5nRAZHCf70yL/A+Dsfu2Zv/jNJ55mflT5U9+IsQbA2HR0&#10;ieWMwJMJCb4FgBAJa8XRFI4N6U0DWzodrz7mOW2u+wZTs4MougIAgJAdG/3VYIGmdaRIYa4OUMU0&#10;rY225V87v4mgACD5/It/Y7bMZLz+yOsARsqlLA+XTQhZjuW+7qX5h89mf6wKSXUVLm6Yt9VUbcG5&#10;zO2E5Cgbf7M/MuITzOLkgb/Z3/0iGPGfXXnpFxwHdFQDheAFAHCj68tmW4VU3D+jiHxtzw7r9X5r&#10;hRlnZBGqkXprSM3B6A/M9ulCMzral79o7afPy79GhXNWrOhy9LSOLD9z4mgIAKAUfStfi8rrf/wu&#10;s90q3oVLRm5AhG4lFddtrBYrV96yCJFG0iawnH/JzUvMY6aDR2zk2BkPXzD6y/xrRKw4zHn58h/O&#10;QcwVFXMhNprtdpEsXGtqdiEXjNSPRPIGohVvPboUj45VN7hH+8suXn/kK/nklqjopWb7TIYU/TT/&#10;2nvOiorH7ML5dGf+PuNSUHF6Gq8/MprVWyGOzpV2We7rWopKRlPJnO8g1YlSNFoOyheMxopbrUOo&#10;fpuv2TdnzuC9ZvtU07T6tkvzixhUhSLykoW3mVolIMKAqc0EZpSR5fNHflj43oV81YoVXQ2F2nSx&#10;oy/kyDm8wb3w0cL3889Z6mhrJZ0Mf93U7OALRItWQUjhcxobY2PyOU3EissiiwnxRGkIJPQEut9c&#10;dNAUM+esOQV5cQjHy3A+02j0xxYi4qsKNW8wUlEY9qLznjh6otgroTcYecg8xg6pvo7bTc0OTcHI&#10;l058n9yWz/Jgt+0VllWXfGElkhrNuUUErtxNxS5dLlL03kLFG4jdWfh+puLzRz5x4h0hKXzOyIqU&#10;LZqbb11g1rJrXhstylFnFTL8DH3B6J8L31tl0aKlzxZeRwvqF1RUw9UXiN15Yn+QEBGvBbDvCtHU&#10;2vMcogIfQ6Kzz/F81nGUuhNc9e57AE5Epnv8UUdbfam+ju+ZWiWkEuH/MbWZwIwxsjz+7iAquqpY&#10;VWilllSt4wtEtpkaAIC3ffO0XFTNayPNSDgmu3P9GTAmE/REzJ9LY4xFRa7/umD1xjFFgacCbyDy&#10;v6YGAOD1R2uyuKgd6tXY80NI729e032JqZfDG4wVGfyQ+5wLfW09/2XqU8Gqyzdf5kYak2F9ESrb&#10;0bx184fH1KV0N9Tfa9dg8/qXjJl3iOD13rWbVpv6TMKzduPFqGhMFOiiRRPXozNxLW0YE2rvcuOP&#10;L2i3N/a9gdiYOQQRn+dZ221ru88b6Cm5Fe/zl55/x6PJ3/M6JBiTO8zXvthWH61svWWRu06NmXeW&#10;LJk3bVti3mDk7/lVtTxK4Znetp4fF2qzWMeJs96U0dQWfYnbhb839UIOP753zlQUY642vmDkaUQa&#10;NxuyaN6eSobXmPpk0bjmtovq6+t3mXoh2b3HFw5MkHS10R9bWOqmX8jx4eHzH9yy/u+mPln4grEt&#10;iNBq6nm08JFMPFwDWentsaz1S3OX1h0vG/49nIVX7ejr+LWpm5Srfwm5CMg7072hilYjKqGprfuV&#10;bperbPmMA3/Pzp2oGHOjP7a8XkHZa21oWF+0c0tn2RW7xsZYfd0ZcLzcxKm1dGYcpr2YDla2Rs+f&#10;U4dlt6yrNfYHBwcbd2378BiDt5guV0v70rKpMVjDF9LJjg+auslEY1+0HCpVecHEG4zeQojXm3oh&#10;cmBvfSpVvkTXBas3rpjXUFc2z+Ozxw6f+USZQuzVZsKxz/C/6URHxRn3T1XKzRXTTqO/O1hH6teI&#10;aCmlAYv+CR488G+p1IbDuSSBzhxkq8+J7+Rtj3yMgDZYWU0UYWGmazLJjpGcTtX/bU2B6KUK4HdE&#10;aMnxUkT/7vjw0JUPbb3hYM6nEQEAZHmwe+kCUD8p2iIsgzA/DkIvS1VQamUCMO9s6QlGwwqxxzxg&#10;PDTzDZlE+Nbcu+r3tXNy36m5+dYFuKThuwrhteYRpRDhZ1n0KzKJ9SOOwyd+mycQ2aiI1ht/Mi48&#10;nH17esu67468He3ramF/7Mude48Ov+PJ+647Uvi7mlffeg7VNfyGCC42/6YUWssuGZSXDdwbfiT3&#10;uwQAUHy+rjpZsOSbuci0iWGWbFb4xTuTnXn/r6r3URVAAJCm1dFLqZ5/q1CdZR5QChH9uyPH8Kpc&#10;OZoTfb082L10IdKdCMVbhOMhAnuA4aUnxn7BeQv0fNVF6j3Gn4wDiwZ8baY3NLJKXXRddyqSTVaj&#10;GzXDDZlEx5ix722PvoSg/IP+CVhE5Hup+IF35vxiRz8HvZff2igNdX9QSMvNvyoFi946eFS/+qH7&#10;rnuq4H5dhevoxG9rCkRvcyNeZ80aYOFheWd6S+d3RoRavK5rCkvdOlV422JXIWU/BUAXIFG9CIu5&#10;dDkRwqwBgQTgmCD8+fhhCD1yf3iaHeauqfcFVt4EBO8HhnkgAkBIdn6bCAuwsCAJAhxj4c2Z5IFP&#10;VVrU2OPv+ScA/CQhXIxEDZX0dS6qhlBAjomwEKq5ec08shz5f1uYjzPiwyiyIZ0IF/nf2cHTFvkM&#10;KfigCM5DEEQCsvOdRoxajQiAIMeA8eupPdmPwASrJZNNy5rYRbqOuxHopQg8FwAEkSY00gsp6OtB&#10;QcqicAMLCRErO+c/l6QSRVA0iBxEwM2peHjEMd0+nrbu1wPAZ4hoZTXGPiIhCDfkAhGt3WBPoEUE&#10;AZCOi7AgUAMIS2XVGLQI4xALHACUj2cSndWK1qoYX1vslUCwEYAbKxv7LCIoiIIscAxy28lzAYAB&#10;GO2OtYKxrwlwTiV9nb8eESALIkMM2OB07APCIIG4BcAFIGivj/LXI2HuegTKXY8Adr7PCAy5lPDH&#10;RHO/JgntiHf+zTzIEo2xes9pOkZAbwWQuSwkSrGy851yfU0iwFoYDwHB5kw8NGaLeZYcljt2Mll+&#10;Wfe58+pd7aTkHaDxpaR0g/2JcQysGR4TgV7W2R4N8wce2np12SXsarOstWvufFx0tnLRu0nwxUjQ&#10;XokRUoywABKw9CLiXYNH4PO76hqehK1Xl11Wz3P+mp5l89yuyxH11SzwfEW4KPdUU+l3GrnZAgBW&#10;4XNYwyAA/J4ZvqWz+Odd93RYWi5vbLymXp22chmCvB2RXpxbSdPi7DpiAUAUjdsE9J8G9VDsoQP/&#10;eBJ23T5oHjmZNLVuOp3RfV6dS64XkbVEstLZ7wLIlaiQkc+o9JzBiEGiBJD/Ahr+cHCQv/bYvfEn&#10;AO7Q5pGlWHVZ97k019VODO9EkReg4vnOfxvwyAqULQMURh7JC/7xfHSu7c85AQuAgBbMouAfBOB/&#10;jvHQnbv7PvyEeeRks6LttrMbpL5Nufg9APhCRF7ovK/ztRudj/2R11j5d8r1de7vqzH2AXLfy8lv&#10;Gzn7QFLJ9ViMFmZ6Ghj/oiH7VdcRSKYslpc6w/e5+QvrB8921dH7lMDLUMHluZbKf1e+j1n4j6D5&#10;D9kh+MbOe9c9PjKMZhnBQQdPLk3+zRe6lZT1jygFs3wqndi3wWn6gsnE44+9XCmwnVdneEiet2Nr&#10;aIyjpFNWtN129lyqTxOBrbQRrOWr6eS+q0/0dZfLF1jyfSS80jy2HKz1Pq25KVcyqbo0+Te/2K3E&#10;duTnkODLdsavtbg9MB38SHmDe24lhHVmy0SYvnDNgcgLXUR/LD5qYrTo1ky805bTsBWqNfYbG2P1&#10;rtPkl3ZLDDHrPlYLXzJw93tHfI+6yNe2NIQu6DaPLYew1szsy/St32G21Qq+ts+dzZTdpcheIkzW&#10;/NV08u5/P2FMd7l8/sXfGxucVB7W/LTW2lc49r3B2FWEYGslW1hrjbJ6IL7u/ry2am3PS+vcynb6&#10;Cc3y8kwiNPp3Te2bPUr0fYQjCZUtokF/KNPb+YW80bHissjiuQ30F6tb13lE4JdwcO/rJ/LzqoRm&#10;f/eLXMplK7WGAABP0tg/GalZIyuPr+22s0G5H59oqZYFnkzHO2qmbIsVvP7oX0nhc0zdRDP/ZyYR&#10;/g9Tnwwmcn4EAGDmfelEuGxIty8YOXAiF1VpRFhS8bDDpztrNLV1f8ntco2JUDMRkb+k4qHnm3ot&#10;4wtGn0bEcYMnIDdR8+EhvfzRbZ17zLY8LYGe3wOpCctWCMLbUndXJyy7HJ41PcuoDv8x4dhneSqd&#10;CJX1J/IEo4MKccIizv29HWX/LU8w9oRCKPtvCQDwoG7NbJtZNyFfMMIT9TUA7O3v7SibYsAXjO63&#10;4ks3cV9H7lFIl5l6IQICMijB9LZwwmzL4/NHvoJGuo1SiHA8FQ+3m3qei9p6Whpc6gFTNxHmx1OJ&#10;cNkyQlbmWdFwLJXscFxtwwoef+RXStErTd0km5V/dVrA/lSj7EVeS5S7KFnLz9PJkCXn31qj0R8L&#10;1ivoNfU8w0PD3h1b12dMfTIp19fAck9/ImQpTN0T6NmlSF1k6nkmmmSrTVPgtkvdVD9usr+hIQzs&#10;3Hpt0tRnAj5/9JeoinNkFWK1rz2ByPsU0bh+Q4OD0LhrW8cEUWHVpdz1qDX/OpMMj/u7C/G0R3cq&#10;KJ1YlbX8I50MWXJG9gUjGxHHDxKw2te1SLm+FtYPpBKdltKBeIKRfoVUssgws3A6EbLkc9Xs71nv&#10;UmqjqecZfBoadu3qmHD73ueP+VBBv6nnGWZ53o6EtV2Ccn3EjJ9KJ661VGrDG4jtG2/3QLN+MJPo&#10;LHmtThaetug7lQu/aep5pmPsnwzMpMkAW9pjY7YAWfTBdLxzwqemWqa5redfXS6Vj9Qa5dCwvujR&#10;CULKJ4vxJhK7N5BqfU61WLnylkXFyUhzMMs/pROhirN/1wLeYPQwlah/1t/bQXb8JDz+7s1Kua4x&#10;9f66vW64a0PW1KeAkmNfQA6kekMlb1LjUep6FAFOxTss3fTz+ILRPyPi80zdbl/XIqX6CCoYs9X6&#10;HF8g+rVS5a8Gn97VsMuGf+QK3+fOnr9Ij1nJzQJdNdB7zR2mPi6t73e31LWM2brTzD/OJMK2XCWq&#10;1UfVwuvvvpmUa0w5rmkc+zOeKdmqqRKSzerRmmM5tMx0AwsAYKCv83ss/Fihxprvni4DCwBAZ8fm&#10;7qpk4Jf6m/7ehgm3bSaLhx664YAWXfTEyswZJwZWU2v0uaY2HaTjoTE5vnSWr7B7088k111r/oUW&#10;3uRkkm1+TsRSSo9xkCGNI466J7BrYMEJI6gIuwYWAEAqHnq+MBfd4Jn5zXb7uhBPW+QzplYJTa23&#10;TeiCUI7DR3lMmalS/TYRpcf+WG0iUonQe4S5KAeiZr7BjoEFALA79aEnzLGvQXbZMrAAALZ+eViY&#10;31UoCfOgXQMLRvtDF10z/b1/tZ05vpBVl32x7FZlOdLJdR8R1kX9Ksz/6WTst/g3l93ytUpz2+1r&#10;TW0mYHvgTCcDfZ1bCt8L4/8rfD+TSdfvv7BwsKWTYUcTpVMyfdc8y8KjGZu1lopvACw4kncGQLKw&#10;E8BaJORkkYl3Pq+orxP7W4qPsIdyjZ/k0A4rW29x/MCQ5ex6KLjTZ/rC425Fl6M/XnwzzMTDo7Xj&#10;KoGG0bYDciE7k9feeyLiC0ALVGq0CbOM5JsDYM0V1+TUGopuHk7SjkAuzqvT1CrBRfUfNTU75PJf&#10;nYAZNlRqPIrmj+bPG4OuuDzLvuz+UT8wZsieyGNnj0z8wAuE8xGRAJnefc3FR1gjlQh/U5hHnP61&#10;HAO0lcW+EBYavQZFeJPVyNzxUHVHHdUKTCU6GwrHWsqhP7CAdlbQewRF2RnlK5tnRhlZAABHjg9d&#10;ALmLUWZqLaOS3LUhK4x7AABE5Bdm87RwHEefHDLJUMXFhtPxa28AABYRHhqGaTUe84io3wsAZEUS&#10;TiNRheUmgC7HY6nOVXetp+22cR1vrTCQWNcNI34Ahwb1OWa7HfKrB1q043FGqqA+W4XIEF4gIgzA&#10;kol3VGwcpROhD42+fnL/hM6+4zGwJTyQyxnEcuzIUFlneCugoirUYe0idMGrTdUu2aN8Yf51OtHx&#10;yeJW66SS4ZtF55L8SdZd8cPMnq0bRkoosQhw1Gy3zgZG5LsBAFh4i5OxLyIvyr1S+HAiVLEBqYez&#10;V8qIUZNy+DADL+hyIZLTORa14DAAgBaxFXlYClSkquGaxCivb26+dYGp1zqObwxTzSPbr9sNAMCA&#10;w9U4cbUEs9wOwDKc5WvNtukgfU9oJxTcbJ3ADAwiYjXv1WQzLK4OEBZiucVss4ty0fzmNQsrvoGc&#10;gN5A5Pq0qVZKuUhCKzDDJwGEM/ED1Smj4+tytE2c2hp6NJcAUyreusgz+pjusBSXaHwAAGAkI3cN&#10;sIFFhBv9MUtO/OMxkvF+JPGkQ5CGEVAyfdfYqu1nwlq+CkCYSTgzRLTQpwBYslkYU5/VDumRbP5Z&#10;Gd+h3go7th7ai0Aounj7uRJ8hxeuEcJXmLpNBBk25B5mQhNGG1vhrEs3Oo2SRAJ8Di2un1EZBGAm&#10;Glk5tDDI7ZUuYdcqmb4DtwEQTlQ/bSoRYRGUsnXxrIAoAywwpmDsdKEOHMjdFJUuW6vNKspNtorV&#10;lgAJ5BKYIGR9KkGgh0WzAFTuj1GIZ8HSfzM1u4igAKq0qdsFRYaqMX1kRX9WeDRpacV4gz0vNbXK&#10;EawjqpGtFUFGdLT9lUcL/MDUKiGTCP1Oa9Q7t4TvNNsqgfWQw7G/QUSzFiTHFSWwTiUUitvpAsRx&#10;rX/vLFFpISyL57lt5U8rgSACKJT/NhtqnRlpZGmme48Cf9zUZz6VL11PFiLwp8ePlQ57t8PRrLyR&#10;COOmPl3govn/gQiArN5qtlUCEv27qdlEQARG8l1VaXL7kq3kiSaI/EZUSq1y6Ljqa+t+KwAAMrzc&#10;bLOFr6sOAAGFLaURKAtiXTW6OavUH4HwsKnbR70Scik0xk1XYIWL1m46DxGFRTta7akeKAQyJ5fJ&#10;3Rk7OPVnU6uUamxfQ27QAgyR07QGAiAwXjoHe2Du45Z3O9p6fnjruqqksmle2/PPAACK0WGKpS4X&#10;AICMkxaklpmRRhah/P6x+EHHS6u1SFWW56uIoNx9wHCErYRHtoQHWNvL4jyZiOh/AyAEwg+abXbw&#10;tUWq4j930eruRiAkABZY0VVvtlfCqjVH15iaLQjfBACgMPsVs8kWpD4KAEAucLTt2DRvyfMQGRHJ&#10;0RhZ2fql0QCDi9p6HG3zPpwIPckizvon5/Sey9yP+C9mmx3qlfoZAJIicWQYX7im+xIAAAvJSSdG&#10;RAAQPGt6nF2PW788zFlxvIoJAAjifPURAEAYP7fz3nX/MHU7rApEvEDVvBcjNJ3rrjQwJI/z8557&#10;+PwYACGgvNbJZ/quWOzImX86qeKJnTpEZ38OsMHRRFuriGBN+CzlycQ7K3Z4NxmkI782tenhSqUU&#10;XQS52bYBwIGvkILRRJirAtGKHY7d9fjH3A2NsOXspf9ptlvF64+NRs7V1ZODlcMuwlw1W1AEjkKn&#10;kbDAkPmR7XQJedwu+d3IFgZ5A5GK/RYb3MdHS1rVEzo1klGz+pMp2mHZsi+N+qsoxPOg9f0Vr0Ai&#10;nahJtzzYPcdst8rcetd9uVcsnkBPxdejpy3y9VyxZ0JVT46jzDTiR0ytAgREO/IPyyOabZejMnGR&#10;/AIxV2fRG4x+w2y3ijfQc3vuFaGb9C+cGDUAIFqk4oCHPEqhHwAAUXBZa1fF1yMKfD2/fenxRy0l&#10;e60VZqSRle677s+5NdGTj4nKg8xkHk7cWHEETjXxBK8YuYEAABD6AouLcpRZxRuIfKzwSd+N8PPi&#10;I6yjUJ1wVCZ4Z6XRiqSgyD/EW6Hh19K+VJ+YHxS2BGLjZoIuhzcYKarR2dK+pyL/Lk/77a8p9BEh&#10;oljxEVYRRIRA/h0SVRx6P4LsTF7ryFBbcv7RIl9Fn8tTUTkerz9aFMSxAOhA4XurNK6NFVR0IFSk&#10;rs5v19jjSqVcUOCHh3CGr2tMLjc77Eh2/MzUKiGV6DzT1Coh49ivq8tFoEYjOQnx3yoNECFSo1Gz&#10;kKtJ+oLC93bJxEMbTM0OPn+kIG0L4dK6xRVtqze3R68sHPtKoWPjbyqpaCKfZZaZijcYu8os94FE&#10;ZzQHemxNKCtX3rKIiIoiARGRfMHoQKFmhVJZn0eMHFuU+hwi/IVdg83bHv2WqQHBO5e1dtmKEDp/&#10;Tc8yQhrjh+X1x2zWPewiBTzGgG1pj475vRPR0r55zDZRqX6bKrxre27PrfScAEld3LwmNpIewBrN&#10;zbcuIIXXFxmiSG5vIDam38rTRfVuGGPktbQvtZ3brqX9udnC7wMAcOaipYfsXo8nM6X6tWXRUtuu&#10;MGOvYcJc0fcrK145dsLpnpuWoSIjmIPQE7A/9l2APzLVsb+3dnGynDjLLDMKnz/yEVT0WVPPI8Nw&#10;W2pLx/WmbuJdG1tNJW5EebRwKhMPT+zr4+uqKzehsoZj6WTHPCurtp5AZK8iGpOpO88zR4bmP3nf&#10;dRNGiY5XwiSP1vo1mWTnhCs3nrWRNyg3/cTU8zDD59KJjjGle0yaV996jquhYVyfF615XyZZvlh5&#10;jiuVL3DFESQa19+tv3evu1qRlFbwBiI9RBQ29Txa4H2ZeMdXTd2kqS36ErcLf2/qeZj5F+lE+DWm&#10;XopyNy8ReCYV7zjD1EtRri4f5Ppa1WKgz9RxpfK1Pzc73g1YixzJxPcttNJHvkDkKSQa97z0DzXU&#10;wdapSwDtCUTfrAj/y9TzsPAX0vHwhL6wnjU9y1S9etzU84iWQ6lkaKGp1xrjneNZZjmp8LVHDiDQ&#10;hANStBxLJUPjrth4g9FHCfE8UzcRZn0Mjp473hapLxD9KZLFigXMkf5EuGQ2cG8g8ipC+qWVkSzC&#10;8VQ8XDLZ6XLfV5YuWHT4CQKa2B9I+In+eHiZKefxBqJPEuHE2zEiQ0/sGzz92YHrD5lNAACeYE+/&#10;QmUpmug4w9oHEx0lfX58/sjnUVlLsSFa35FKdjoNN58QXyByDGni5KPMvC+dGN+I9Pmjj6HCCcuo&#10;sPAw09AFA3dfX/Km5fNHf4cKLaWR0Fl+f6YvXNLZf6KCzoVIln+Z6gv/k6mf7HjbYj+2GgTCzJF0&#10;ubFPZKkcmLD0phKhK0y92lgd+yw8/MxB99KnUx8quYXoCXanFLq8pl4KLbo1E+8c96F3urEwNc8y&#10;y8yiefXt56CbLybkbyBRxVnPRfhZEXwHAnYigaOkfCLwNhEIEkGR34RdtMhNKPAMETrIeg0gAHdw&#10;dvjb5KLvIagJjc/x0CL3ItB6gOHNZHFSLAWz7BPhtyPRuwnxDWa7HQT0h0Sr5aRgTKFbO4jIZmT9&#10;3/3Jgb8CfLnilQDfc6Ln81D2UuVyfQsAxzWYJiKreTeRei/K8KeQXCWNZSuwlmMCfCUiXUWE7zDb&#10;rSK5ProeAFyEWHHZLQEB0fJVIPnh0T0H/rrbYYLY2qKLmoKL2hWrt5r+knZhgU8jyFOIOOLgXhkC&#10;cocAfOmQ6Lsfi6+rODdXU+um05W77nIB2awQHIx92E9av0MUvguJXm+222EY5IMwPNy3Y8t1fWbb&#10;dDFrZM1yUnBO22dPWwANbyWF3YT51RgtALmoncrQcmKIOAllz38OYa4mmJPPyqf4EHD226r1OTDy&#10;WU5+Exh95ITCcwYOPq/4N7HmDADdkLboeL3qsu5z6xrw/UDqEyfUal2Plf6mPNW6Hqs1Poq/g2Th&#10;kSxyeEcyPOMST+bx+mOvE8zeqMjVdkJ10td5WKozZnMw8+PMcONAX9hSYMuy1q65i9yL3kqCt59Y&#10;ia2l6/rE9xCRXwnzzfnM/NOFwx81yyy1jS8YfRgRLzD1iRDmp1OJ8Oiyt8cf+RURvCKX1cDqZKBF&#10;mA4PH9fefC4dT3vPx5HVJ4jAXrSWyJAGfn8m3vktAICWy6NtUgd3oUJbYdEiLML4rXQy9C4YSR+w&#10;ZMXRRxFhqfXflYO1bEsnQ6PFsb3B7lQlq1ki+tlU/MBygNwKhjcQ+R4R2UwSq4VFHR3mIf+u5HUp&#10;yN3o3g3E/0kILju/jVmyIPyRdLJzk9nmFF8w+jSinGbn+wAAZLO8a6AvvCr/3heI9AJCwG4eK615&#10;X3boaPOue258GgCgpS3yOVH0H4iM1r8TizAMZofln3Zs6/wDAICnLfoaIvlxOZ+3Ugiz1lo2DWzp&#10;dLTqOBPwBaNdIvgxe2OfRQsOC/C7B+Kd3wMAaFobbVMu+RMhjevWUAoRFkT4dn9v2HHlBRNPINKv&#10;yH6iUBF+NhXff3beF9IbiH6fCN9iHlee/NgH/65kR8psnW4sDqpZZpnZ+ALRDBI2m7rJRM6UXn/0&#10;K6TwvaZuIiKs9w0uHhjH38jrj7ybFH3N1Euhs/LPmb7Q/5o6jCQyrCOyNLEI86ZU6bpveOmlG+dm&#10;57oeR5zYb421/C2dDD3X1PN4/dG/ksKJi9QyHz6AfOZ4WxbNgcitLqIPm3opGNQF6d4PlSyR5AlG&#10;X68QLYXaa8m+MxNf921TrzLoDcT2lnMMzyOiH07FO1eaeh5fMPLfiPQ6UzcRgGNDGs7elewoWdrK&#10;649cR4puM/VSYJaueKDvml5TBwDwtkWeTy6yVLxbi3Rm4qGIqZ/sNAci/+YispQPKyvw2oF4R8kI&#10;0abWTR53ndtSclZh2ZhKhCyNJSd4grG/KIRx54Y8LHz0EPDp4419X6DnNiRVaq4aA8PQBeneXE3j&#10;WmTWyJrllMEbiN1IBDeZeh7RsjmVDHWYuokv2L0U0TVuMkMWHk7HwxZy3XS5SoVwF9Lf+1cXwB0T&#10;pnPwBiNHyj3ZDmpYNN4NthBvcPNvCGVM2oU8rPU70snO75i6iTcYfQ8hjhsZx5r/lk6GJ5yMG/2x&#10;hfUKxs33xMJH0/HwPFMfy5Uql1JgfKY64s3nj8ZQ4bhJVbMarhtIdky4mtbcHrvCBfA3U8+jQQ9n&#10;ejsnvB6XB7vnLELXUVPPI8w6ldhfN3EfdZGvfakud3MZfBoadu3qGDey9uSn9sZ+tWgORN/lIvy6&#10;qedh5j+mE+EXm7rJRGNfmAdTifCEwSPTTblxMMssJx0+f/QrWGIlSmv5XiYZsly64YLVG1fMa6h7&#10;xNTNbUYr+NpjUmog9vd2lJLHxReIZM2cSwAAh48evXD3vR8Z813Hw+uP3EeKxtQH1Fp/KJPsHM0o&#10;PxGeYOQTCmlM/jGtOZlJhkcTgk7ERWs/fV6De+Gjpm7dmD1BqRQFIiypeHhacjd5A9FfE+ErTF1E&#10;NqfiExv8eZpbIy901dGY7OOs9YPpZKfl2qPLWjedvrTOXbLqhN3rsWRfg8CRun1zdt91Mjm3V06p&#10;PoJK+joYk1J38yPHhy54ZPvUr/I0r43d6nLDmJUz1nxXOhm2XPKnefXt57gaeEwKFwYeTvfaG/vT&#10;xbRMLLPMMl2kkqH3mWmnBADsGFgAAI9sv243M4xJ2mnXwAIAGNIwJiVEf2+D7Qnk4D94galpLTfZ&#10;MbAAANLJ8KWmlhVI2DGwAAAy8fCnRPTDY3QbBhYAwINbPv53Zh5jcKSH51pYwSrmib3Hx2yHDg3R&#10;qK/TVJNOhF5paqLlkB0DCwBgYGv4T8Jwh6nbMbAAAPZsXf9MlrNvMvWndqkx19ZE9D++d4y/IGvd&#10;XgsG1kWB2Kgv4XTCMHRBzmH7BHsfabB9XR/eM7avRfij02FgAQAMbOm4nrWMMY7sGFgAAAPbr3lc&#10;89go4eGnH7J9PU4Xs0bWLKcc/b1/K3A8Zdn3yF7bkxoAQDrR8W+FBb2FZX3xEdbYlex4jEVGE4WK&#10;yK8A7CcPfOyxdccYpMifKJMMfbzwvVXMJ+mBeEew8L1VTH+iXMJP+6QT4c0nIiIBdFZ/qZIEi88O&#10;XH9IA/w9/55ZDu3a1vFg8VFTy+GjXJRENpVMnVb43iqpRMdVhTds8xxaZSCxriiJrBb58dNPl85n&#10;VJbdG44z8/fz540ZspnkOgf1NKuFYD1wwlSng3TvdbtZcNQvSYv8Yc+eq8fdsh2P3bs3HNeiv1io&#10;peLhmwvfTzXpZOhEqTAAfuqAfUMdACCT6Li1cOyL5h/t2nX7jNlqnjWyZjkFuUMLywAAgAZ5as+e&#10;DbYntTwi/IP861Qi1F3cap2jx+TikYmEh57BinPFpHtD78y/HhY9oc9TOfIGJItsMdvsoIXvPfGu&#10;8ozqDPplOSOCJdPX+e9mu1WOHeXRlbqhIdea4tapZ/e94f351VVmftBJTi4RGDfzux2OH9UX519n&#10;4qEri1utk07c/Q7RwgAAg1oKaiJOJyiAtXPvO5YdWpMfa5l4qOJ8fJl450geLpahYf0ys306YK3v&#10;htwcoMdLPGqF4ay8Of8AkUqG/8Vsr2Vq5kKrcfAk/O+UhkFdI8ICDAV5jOyTTqyzmWqgNLvvDT8i&#10;WpiFdbUcgnfEO8d1hraCANwKoGVweI+lTODj8RTT8wEAdJbHLPvbId176I8ACFLSi8U6u+8N789/&#10;xIPbP7TLaJ4eBD8NAKCF1plNdkjFw68QrbVo/oLZZocH7+3shwJDu3Lu0EikAbQ8tCX0gNk6TaDd&#10;1BeTySNbrt+BCCACEwQUWEVg55bOqhjbTkkfPvAiABYRchRFuqMvfMdMvW3NzG89yZx/yc1L5s+p&#10;Xy2I7cD4Uia43EW4GEBABKs0EKaefC4cERZGfJBEejXg3QicpIMHHkilNgyPuCidEnj8keGh49lz&#10;H7rvuqfMNju0tMeENfw/q4kqx6OlPcIs9EQ63lFxlnoocIKtdLsoz0VtkfZ6lL+kkp028vqUpqU9&#10;JsMsz9uRCP3VbLODLxjVOiubBraEJ6wxWQ6fP3YUFcxx2kfVwrs28ipy0y+r8X18wZhmhldlkh2/&#10;Ndvs0NIeE+dBAYLeYOwQIc6rxm+rBmf4uuafuWjRwQMi88ZLITDFoDcYGUSAg6l4+HSz0Q75FAr9&#10;vR1UK3N5S3tMskP8ooGt4T+Zbdbpopb2pTorcutAPOToYW2qcTB4TiZ+pLxtPT/2tMee9fl7sgvm&#10;z30GCH9PBJ8mF74wZ2ABACAgAs3U//LJBhEJFWAjIr3dhfIFAtwCCxYfbWmPaE8wsscXjMZOhWuD&#10;iMipgZXn2PDQPaZmF9HCCHCWqdvmxK3M0U3twb67k6jUmGjFSnFqYAEAsPDjxw4fcVRSCAAAFYxx&#10;FJ5OyEXtAACe9tiEhXMnAAEYD/x9r+O+rg4owFBvOndPJ6fPW/x2AIS5ghX5K04CQkgKQCouuZQn&#10;+8yul+osPFkrBlYeZwYWAMAG1poPg8h/mi21zkl/Ix0PX9ttZ3vaoztb2iPc0r5niFzqjQpg6chN&#10;hXLLybWzpDx5ECIS5kL/CRXS2Yh4bUt7bLilPcK+QPSuxstj41Z4n8kI53xFnMLMf3QaxbNoRWQx&#10;EBKwFqfGUZ4LVm8839Ts8aN8/1Tl+1QH+sWjmUefMVV7dI3Oe4su65owIehUICI3AgAAw6hPXYUI&#10;s+xx4mcIudQSq2DkgcxsswsCIwDCRWs3jYminQ6Q6D0AhC5WY6Iop4PGS25ZDqAR0Ulpmhy7dt0+&#10;RCg/NPWTAQL8zkAi7GienQ5OOSPLF4iua2mPCbrq9yjAxhFD6pTrBwvQiK35/Po58FRLe0w8wWjY&#10;PGgGg6DkiWoYEAg06vxeKeecCV9EJESF5AlEK94K87X1jN6kS+XxsgdKluUv1XgqZtFbTa0yZKsT&#10;x3AAAI9/8ehK2Ln1S8dNmjh1XKmQkAAAFEFBrbtKwaLowEoQ4G25Vyyetkin2W4VX3t0HRASAGGd&#10;i0pWLZhqkGA1AAC6YNpSdxTinlv3xXzNPZ8/4shHFABEI/zZFKcTEalKJKcWuK8ac9FU4/gGM1No&#10;Dm6+2oUzb6mx1hBh0SAfGIh3ngx9iVUatI4/x0xKWKn/ii8Y4cLVh0o/pwDHv63WqFZfVwtfIHYQ&#10;CUbD21nrW9NJR7X8HJ+zwj5y4pfV0t7DhUV7p7uvve09nyXAG/K7FKz1Xelkp63cTdWmpT3Chbsm&#10;091Hs1SXk/5kNvl7XuxW6v9MfRbnsOiXpeO1EcUyk8k7YZu63cnWE4z+TCG+tkgU4f54qGp+VTOd&#10;UpmxRfPxVDI8pv+ngqa10Ta3G5Omfujw0aWP3v+RfaY+FXiC0UGFWJQMl7W+O53snLgeZQE+f3Qr&#10;KixKkWG9DFL1Wdn+hTPnwPCTpj50nH07t4ct1QCsNj5/9CAqLMofJaAl1dtZkVE7S+1xUp9IXzD2&#10;9KyBNXkQqt/5gtH9pj6LdXzB6OOlDCzIbW1bXvb3BCN3jDGwIOdU4wlEShapPtVoDkYeMA0sAABU&#10;1OAJ9Ex5Koem1k2eUgYWAMD8eQ3PejyfrSgpqRM87dFnTQMLAICUusIbiJUsVFwKb6Dn56aBBQBA&#10;SHM9wcgeU59sVl668cw5MtbAAgBwN1Cqcc1tF5n6ZOML9PzDNLAg58eAHn+0Kltss0w/JaacmY83&#10;2PNSQvU7U59l8tBZ/b5MX+e4BYFnKab5ssgFrrk0puRMKY4dGTprvCjI05pvXXDmkronyhWIzXOc&#10;Ye2DiY4q+UbNHDxrepapevW4qZsIAAwOD5//4Jb1oxnhJ4cu8gUW34lErzNbTESgKxXv+JSpV5vm&#10;tZFml5sypl6Kw0d5SS6B6liW+7qXLlo0fvH0QpilKZ0I7XK6tTkRnrbIZ5SLPmrqJizyzXQ89C5T&#10;rzbNgcgFLnI+9meZGZx0RpY3GLmHkC4z9VkmH2bYn050FJUImUUQAAUAoLl90xXErg8R4Vty2d2t&#10;Rm6xsMAxZPj+MMi3QfCQC+VtgOo9iLzIegQYiwiAFvwZov52Jr7upwVzwKTe6KaGgr5eG7sCMfse&#10;InorEtRb7WvJJZFjQP6RCH3rRK6pE59tndG/wdOuuHX+Gdm69xDguwGhJe/obhHWrLci0tddR+p+&#10;eP/9H9ifO1+VfKcuAtjAAADNbZFXIMF7FcEbc23W+giARTQeFpGvEstPsgSDCtTbAOXdqGS+nc8B&#10;IMyK/BC0fGOgL/ybkQa0fz2e6Ovly7sb5p+r3kUC70GFlwPk8gOafzEWFgASLXw/gXxNHRn87v33&#10;f8RBX5/4HZ5g9wtQ1NWVjn0C+O6Qhu/t7AuPrG5X9H1mmQYsnugZAba0x6oSkj+LM/p796r8RH4q&#10;4wlEHyXEcxGBtIasUqysT67jwZKbt52Ge7MIAyOREgEWkQPpROg0+ze32sDrj/YhwRpEJK0lq5RU&#10;pa+1Jq0UuESAGXh3Jh4uqsU4Hk2roy9x1clvAPPpYLTkplsn3yl37kVGPkKAh4ap2WrtRU+w5wkC&#10;dUbueqxeH1XretQatVLoymU+l72peMhS6phVl912ubvBvWUy+hpAoQgLCLAe1M8fuGf93eaRpfAE&#10;e/5OoM6p9tgvvB6F+Z50MlwTha5nGR+HJ702WHFZZPH8uTQtTqKzlEZraM8kO2qgGGzt4PH3/BMR&#10;XY+IzzPbrMAMP+Xs0GZCPADK3UEk76xkCIvATkH96XRv53fMtpOFVcGel7pBhRHh1WabFTTLH3QW&#10;unduDf3SbKuElStvWdRwxpyPIsGHzTYrCAgAw8aD/9Bdjz1WnSzl3mDsKmD+GCm6xGyzAjN8XyR7&#10;uyghJe5rEaGimnIisJUFP5tJXHun2VYJy5d3z1mwnD5BiDdUMj4AALIMt8H+4zcNDFxfFX9GT3v0&#10;NSTw4UrHvjD/lDXHMlvW3WW2zVLbVHYF1hhmSPYstYEepNbMtmtG8u3MUgB6/dF7SaG1mxvLX/oT&#10;oeebMuT8O/7NRfQNUy+FaD6USoYWnWrbDJ62nr8ol7JWLJtxe3/i2jEO29XEjk8OAMCQZJfvjK/7&#10;h6lXjy7yBZc8iIgXmC2lYC23ppOlS5u0tEW+Di6y5tekYVd/cm/zZK56X7R203kNbvejpj4efHzo&#10;grTDxMITgF5/dAuVCAooBQv/MR0Pv9jUZ5k5zGgjq6l10+nuOvfTpj5L7aBFt2binbOGVgmsOL8P&#10;a1y5I3lt2WNgpF5drnRSaUTrz6SSnR8z9VOFRn9seb2Csg7tx6fE6f0EvmDscURYZup5RPjhlMXt&#10;yWrgaY+8RQF939QLKef0nqepddPprjr30+VuLprlLZlEyHESX6v4grEdiOMnH9XCT2Ti4XHPRbU5&#10;74rbz1koXN5wHhxs7N/2YUtbwbPULuXGQc0zu4I1M8gODz9nYIs1X4ZTjeY13Ze46l33mTpUsIIx&#10;3nhglrenE6HvmvqpxsrWW86fUzen5CrFSKTbTlOfbLz+6JOk8ExT1wJPZuIdZ5v6ZNO8tuefXW71&#10;P6YOANDfu8wFcJU29ZL4uupaFi0dNGUAgGoUCq8Enz/yCCpaYeqs5al0MuS8ZqhNVq2OeOsaKGXq&#10;MA0G/yyTx7hPvjUOjndDmaX2cLndfwO48mROiFnxw8rAtnX3DwuOKaNz7Ij7LDsGFgDAsB4as+oh&#10;LH+ZNbByPLT1hkdlSMb4xGRFbpwOAwsAoNTNXYRlOgwsAICBLZ0/Z+E/mvrgIDRaNrAAAFIbhg4f&#10;UGNWhlDru6fDwAIASCXDF+Qc2ospdQ6mgp3bw+ks88fM7/TkPn3OrIF18jAjjSyfP3rA1GapbVra&#10;n5s1tZMFXyD2PlOzw474tbcVvmfgxx667wO2c+PsSF73sNZSlNwyNY4v16lKamvor8I8usIiwjIQ&#10;D322+Kip5fjxbNE21tHB7IWF76ca0wdIi6StRjAWsjv1oSdEZEeh9oDNrPHVZugon1do1BwbkjEr&#10;W1PJQCL8mcL3WstTz2Q6HSVrbfL3TJh/bSrx+SN/MrVTiRlnZHn90cdKZcmdpfbxBGInZQSoII/k&#10;GaqcIa2fn5v8Wfj4UMBst0omGRr9W62hq7h1FgAAHqbRG/3w8eGXF7dOPQ9uXzeabV6LHHlkch2v&#10;LZEd4hflXmnJPoOrzXarHATdnkupADDIMu19vfPedf8QUaMRgw9tDVl2ip8shof080Vyht/TBwYb&#10;zXaboEL1AlOcTlBRTX2fqWZGGVnNa7ovIYXnmvosMwNFsLi5Pdph6jMdQnr5RS2bzjN1O+xMdv5F&#10;tLAIycD26yfMTm6FTHLvtK7Q1CqZbSey3u+858M1UXtTtHwGAAC13GK2TQcDW8N/AgAQQdi1q6Ok&#10;b5UVHouv28taaQCWXYlQbVThkOFPAbBkh7loBXm62LF1/V+BhUVYnnWYMsLn63IjyptNfZbpY0YZ&#10;Wa56VdJBeEoRSWjNb2Xg12c1vFhYnlfb/w0/D1lezppfr1k+oTUfNn/SVOICjJrayUDd/LqLTc0u&#10;jHScgW1vE5oIw8hEveGk3aJ1igBUJddUtdBZ/UMAgHRf+CazbWYjSMjHTXU6Of70/K8CCOw96v60&#10;2TZNoBAyAOw1G+yiFyz6JSIuc+InOhk0BTZZS6FyElJTJ6IcnmDsCYUw5Q6KUx3aO9V4gz1PEKop&#10;7VfN+nAm0XnSbPnmgjAE+ntDjsZTrigs78gkO99uttnhomB3Y71QJpUIu8y2WXK0tEcFAKG/t8PR&#10;OasmLe0xqbXvI8KSiocdPYy3BCLHgaSuv7fT0edUEWxpj3EN9TW2tEe0MLDTMZubi7TUTl93uVra&#10;Fw+xhpvSyfAnzNZTgRo5ERMzlQaWCLBouaq/twNPZgMLACAd7zy7v7cDmfHVIDJktk8GitR8byBa&#10;USbuWmPV6og398r5fE2IXwNhx0/Xh4/yHhb4gqnPUkj+fP2oZqJex4S9TSO+ttvOBgCwXhdzfATJ&#10;DYBwhq9rvtk2TUjeB6oWOK351vkAKEhUpWsRodEfW26q04EnsPi/IFft6L1m26nCjDCyfIHIlC03&#10;Hz84fH4q3qFSydAdZtvJTDpx7a/646F6nT1yek6Z3EmICH9hajMRVz0+YGqVkkrs/Wqmb31RNFYl&#10;PHnfdUe0yKjf0SzFeAOx/zjx+h8fLG6dPkT4qKlNF0yu/x15JY3+WMUO6z7/xhcDaAQgXLJoyUfN&#10;9ulBEAQmLcu8Xc5YVBfOFXwG8AQ2VxypfIbvcyNGLGGdSFXKQTmFkN4AAIAo05KSpBaoeSPLs7b7&#10;BUhQZ+rVhrPwg/7eDnyw/9TOT5Lp++izuZUt+rjZVm18/uiMjn7zBbuXEuLoGPK0Rx3mWqpeeZGd&#10;fZ3fMrVZchCdWOUjolhx6/ShtfMo1WqhSI0UHiZ0Ef/UbLcKKtfvEXPFo92AHzHbpweUbFZqJuJN&#10;Kfhkvni0Ivmy2W6VMxYOjebVQ5c49hF1StPaaNuJKhSEnkDPf5rHnArUupGF5Hb9ynn18vIMHoMz&#10;030dbzH1U5l0ouMzB/7+yFxTryao8JOmNpMQoCKDXAE2NrfHrijUZqktPIFYUR4xyOXxqYmyTzv6&#10;1v3a1KYDnz9SlARXIc31BaPhQs0KHn/00+bc7QtEHil8P13s2Nr5N1ObDnzBni1mH3n90Z8UvreC&#10;19/zdkS18IRC6PNHHAfROMHtxqKxpgjePwNsjqozqcaLU86/5AtLFswffNa8CKuFFjmSiYdqxU+g&#10;ZvEFI88g0mmmXg201p/JzMCaer72WG59vwQHDmRPeyy1znGk0CzVxeuPfpgU3mrqAABZrXsGkp3r&#10;TP1Uw9vW82NyqZIrajzIwfS2cMLUS9HSHnkFAJU0GjkLP5h9qAXwtPXcplzqOlMHAMhquG4g2bHJ&#10;1EuxsjV6/pw6LJlbjVl604nQlD/4edsjQwTkNnUAADmwtz6V2jAl/r+1wHj3iZrA0x57QsHkOLxr&#10;kXQmHvKZ+iyl8bZH/0qAk5KtuYaifCZkZestixrUnD2oYI7ZVgjr7KfTyXWnZDRNLeINRv9IiC80&#10;9UKE4YFUouMSUz9V8Pl7jqNS9aZeiDD/NJUIv8HUC/EGoz8hxLLHaIEjmXjHKfuA6wn2/F2hKuuc&#10;LprvSiXDZa9ZXzD2X4hQPi+WyFB/PFT2vFaLFW2fO3u+S0+YsV4zvz+TCH/F1E9Gavrm1tLewwC5&#10;/fxqwgJH0qfwAK8UXzD6NCKOOMZXj4PH6dy/b7+mKgk4J4vzL9144by5rgcIydYWKmezf0r3rRvJ&#10;nj3LVOML9BxAKtxGmQgBATmY6g0vMltOVnz+6EG7VTRKPaQ2+yOPKEUr7EzYwnIolQjZOD8zG18g&#10;ehDJbl+PLRbuCUbvIZBL7UR/Csuh1KG/nQ6pO6q+iuRZ2/0C5VK/BUTL/tPCrBng1kwifKPZdjJh&#10;+QRNNd610beRG79j6k4RluOpRKjsKsQs4zMZhbm11g9mkp1Oy0lUiS7yti16E5F6NRC802x1CjNk&#10;BaQDdbY3vWX9drN9lsrw+HteDkgBQPiYsjHRW0UD3w5Z/G2mLzQSdTfz8AQib0DEFxNizURUjkEA&#10;GOXbxPA//YmQbd+kWqF5beS16JI2hfSxGr7NgtbyPYXw0/5E6M5c75fnrEs3zjttnuu1IvA+Qqr6&#10;w6MW/SQhho8w9O5OhGvCf88pNXv2Jyv5aP9QQx1svXrY1GexxooVXQ3zz1l0tLorjCz9vc4SHk4G&#10;jWtuu6jOVb9aC3zO5eIzc6r1J8ccLACEwvLfzHJb3WD2vvvuu+6IedQs1aHx8tgZLlfWh0QbqOKa&#10;aVoAFLLwvSwQ0kK7diU7HjOPmqk0r779HHAPNROpzxOKJ3dvtTueR/qI+W4gGiKAF+avdfPICWAA&#10;IBHZobO8Pgt8z4NbTp4Ib1/bbWcDUSOD+pwiuizfb+Zx5cml09EsW0TogEvhSyv7nNzfaJa/o8i1&#10;WZb7dm7pfMg8yipN7Zs9xPxiQrkZERZUcO4BgEWLZEnwa5pdXxs48sx9cJL5a1XQKVPDZGwVHj+e&#10;XVVYjHWWyvD4ox9SSjZXNqhKITz4NM51UiNtKvC2xa4iF/zQ1EvDIoK7U/HQhSPjbMKnxFmqDq64&#10;LLJoTgP8XRFZcg8Q1oNDg+q8Xfd0PG22naysuuymc9Wc+Q9ZXQFklmfSidAZxnVNAF3g8S95Wilc&#10;avxJSbTI0ODhI+c//MCNT5ptJyuNl8fOqKvnR5GowWwrhWY+nPnHo2fCY5HCMlAIAOILRB9HQkvJ&#10;spkhy8PZNQPb1t1vtlULX1v0NnRhSUf+UmS1/H4gGXqZqZ9sVOkmWV1WXRa5vG4uVXUrRTP0ZRId&#10;flOfpTKqvW2oWX6cSYSuNPVaxBeI/AOJzjH1QoYGObjTYiTWLJOPxx/5hFK0wdQL0VmOZfrCIVM/&#10;VfC1xX6BLihbiUFn+f2ZvvIOy55A5H2KqGy+Jxb4STre8SZTP1XwBiOfJ6QPmHohorkrlQx/ytQL&#10;aQ5EXusi+pmpF6JZ7skkQqtNfXLoIk9w8XGFpSML82SPHz93YPv1Ne2HWy1q0sjy+COblaJrTN0J&#10;MymCbSawsvWWRXPq5uw39UrRWvZmkqFJSRMxGTS3R4+4AEs6wff3dtDsylXt4QvE3o8EXzJ1AABh&#10;WJdKdPSY+qmGLxiNIeK1pg4AcGhQn/Pots4JI8cAADyX3t6k5vGAqUNurN+USYYmPdlxrdMUiF3v&#10;JrjF1AEAhofg/+3Y2lHWeDpBF7W0L9WmCrnNuJ+k451Tbsx6A9FhIixZh/FUuxfXnB8MAEC1DSwW&#10;fb2pzeKMh7becEBEHzT1SiGCxaZWywz0huYB82FT1zrbPmtg1SapRMeXmfm3pi6at88aWDlS8VCH&#10;Fj3G/0xrDls1sAAAMvdds0NrHpPAVJgfnzWwcuxIdNyaFfmLqWuG71s3sAAANnB2WMYYUiKwZzoM&#10;LACAdCJUciWr/8DeKUklUUvUpJFVbdLxzttMbRbnDA5B1aJLEAGW+7ot+XJUC28w6ihS7Jlj2aKw&#10;ai2SziTXxQu1WXL4gpHPm1oleALd5XMCTUA6EX6FqaWS4TWmZgP0OKjtV4gv0FOUaX26yMQ7zyt8&#10;r5kPZ5LhaKFmhVJ/k0qEzzU1OzT5e15napXgDcSqslXldfh9BuKh5xfWiRUAyCQ6/rX4qIkZ2BL6&#10;iday74TCkop3lHVpmIiWYM+HTc0Og8PDReNKs2x04tTu80dmZALbk97I0qC/b2qzVIcHt3Vuq1Y1&#10;exHBufPUFPkN5CAAR06XuULMPBqpauYNsouvLXI5QNdJOSYRsaz/iVVE6DKnfaRF/i3/Oqu1Uz9A&#10;QeLqPGygNSfmqYBFRvyuWNhBEmI9qFsBWAQAOAuOrwFFWNavziKI1YpcJ3q+KdmFBT+Qn0eHtB7z&#10;EGCVTDI0+pAqTH8obrUNAqqS1RGssmvL+u3CPBLMxJJJhBwZbQJ4oanNBBxNVrUPS6a30/ZTwSzW&#10;YY0PmlolIAIoYscTli1y0VSO/AMy8bCliCxLIHyk2b941AA4uXDUzaMg4ivPv6TBUaLQTDw0Wjx7&#10;INn54+JWe6y8dOOZIPIeU68EO4klJ5v08JwPQm7LCXYkQveZ7VbJbOvcJkKCAJDu63BYIPhKRUiX&#10;mWoFyInCxc4gwM7z19zkyDhOx/d9GVgYAGBXsnPMdrZ9tBw5zk63Cavy8Mycq08rjI5X+BH4g+ev&#10;6XHU19NBVS60atLUuqlqGcWlKpfJ5CCSu+uIAMofwXW4b82yZ+9dc8nhB9ouP9AfWCVbWt0iufOT&#10;P7YWyfSFVplaZRAiYlW2XayiRQ/7fF0lfQfsorPaeeJEgjZFMOPqOFpl1dqelaZmE1QklzXUz32N&#10;2WAXLTJUjfvInDkNz0OwlrJgRlG1XIKCAnIsl6PJWYe3+J9btYcwrSFrahWBAPPd8y8yZXtsEAAE&#10;ZjlgtthGAAAU7r437OizmttuX1u4jVkpmb7QLQAsWstXzTZ7dBEqdc4Ckimvw+iUmjOy0O2u0r4r&#10;CzN1mup0IQAoAnh0a1v7oW2tdx6+188Htrfpg9vbsgcWrR3UyvWYS7vu0UO4FQYlc4Dw+MF7W4f2&#10;b/Vz7ti19+7f3nZyr8oJtFVtyWMCmtdGmgnQpRcsfqXZVgmoyPFWJyJdyIAjSU9PPlwKnRpHAgDg&#10;Ii6bHsAKhFBXjUstK9kbkUiZul28gZ4OAICLWzd5zLbpQoQPMsv3TN0eKIhAIuT4hs0ATldnAHI1&#10;Gl+sFKvmtT3/bLZVBMEXTMkuqEihiHOncASohkFLavjFplY5hM8cevwOU7XHBgZgAbfL0crzdFBz&#10;RhYxVGU1QwQgO3TY4QRRPQ5vb9t5+F4/DyP+DUi9HnJrN0SEpIiICIr+U0REoJRSuWFDSJeiwHf2&#10;b/Xrg1vbDh/a3naV+W/MdKpxs7IKKexCBCBAR47UeQjR6SoNAAADo/OJtsbwtUd/AACAIo6ifE9r&#10;vnWBMAoQOO4jrIKBBQCgCC4HEAYQhx9IrwIAGHa7Pmm2TBei4QeZZOfbTd02Ig2I6PheQwo+AKCl&#10;efXta802Owiq9wAQklJvNNsqAQEvcfhwiMKsUVlLUDoxmNvGdoCI+iAAobct+u9mWyU8O3DbmEhs&#10;OzQ2XlMP4NxQnw4cX/hVh7gosqVSmFHvuufGac3afGj7ZS2H7vHLgW1+BsSLAACIKh+MRIhKAaHC&#10;eYD4w0P3+OXg9rb3mcdNNcLyZ1OrBBFhp09gViHCt+S2KMWRkeULRkvmp7GLZ+3mNwAwKsXKu3aT&#10;41WxmkLjawEAUClH0U5nLmn4BhISorPJtjBCrbk96sjxHREFAMkb7HnUbLMDEb4CAIAEqnLjrwqE&#10;NtIIlGZl4NZViLnTtaqt+/Vmu30UYp3+nanagQjeOvL/jmqT+oKRwi25iq/JJn/PPyPl7sWrLt/s&#10;wOfsypGHVML6OTQmstMOhLIcAAAUfNpss0vOqX/kIqgQ15ILf1+T9ooFau5LI2NV8iURCjp8unDE&#10;gXva/gFY/wA4NKwmAhG/fOgevxzc2lY1fwW7aIDNplbLrAzcOupHhgjQeMktuQmlAgqf0L1tsYqd&#10;VpVbfpIrU0Qo5Pq92T5T8a7euAIVjBZk9wYi/1J8hHUI+Q35l75gtGLD3kV05+hrwB8Vt1rHG+j5&#10;OUDu/BO6Kr6GVq6NXpx/TYSulZdHq+Tn6Ix0IvRLU7NLHdb9IV8erc7lGu13u3iDsdFtIkVcceDD&#10;Bas3rij0NXLiJ4hIC/Ovm/2Rig0/t8Kf5sY+gKuB7zLbreLzPzeZf01EFT88eoLRd2Lu/gmEePpZ&#10;l26cZx5jB2Z27EelXCciXL2Bni3FrbVNzRlZ1QOfcvJ0USkH+9b8x6F7/EKAjp7a7YIK7zpwz9qj&#10;pj4V6GE+ZGq1zBxq2HHiHWH9/DkVFaT1+HuK6mCSC14GL+gqmeW4HN7A7R2F75XCpY2Xf+aMQm2m&#10;Qg11jxS9J/pB4XurNAd6fp+/EUHOuH3e+ZfcvKT4qIm5aPXt7ebWla8tZt9309dVR6SKfMy8/uhf&#10;C99bZY4bi+rJzZmDBdfnzMXXGj1fIRUZn83BaAWG248UYeEKn8IWf6SinGLzGuoeKbyO6tyqouho&#10;TzBatHLpUvRSAPtj3xeIXF/4fQhxUdOlG22nKmi6dOOFqKAgLxWhLxjpLTzGIqgQv1n4nU6fV+do&#10;q89p7kBvIPKHoj4i1bqsqXoBcpPNyWxkHZzqlaxD29buRbfLsRNkpRDQnEP3+GXPb85y9ORhFyZd&#10;lcR+U4HXHy1ZjNbbHrFlaHn9kZuVUmOiilqGltqKyvK0RdqJeMzSfv2c+U+tbL3lfFOfSfiCPSWN&#10;BZ8/aqtSgCcY/ZCL1EtMfcH8uXtNrRzNa7ovaWjgu00dXdDtCcRaTb0cLYuWjClmTgqf4w1uLlkm&#10;ZTx8gchTpgYA0BKIFBmnM40Vl0UWYx3uNnUX4qs8wdgLTL0cvvY9YyMBFZ3jC0a+bcrl8AVKG2ae&#10;YMRyJnsAgOZA7FaFOMatpaXd3thvbutZi0Rjrhf3vLqHfDbHvnte3UOmhkhBTzD2XlMvhycYK/nA&#10;7A1G7jG1qcDT3vNBIhqTh27pae5pdQWyw5QaIVbw+aOPoMIVpm4XEelPxUOXTNVq1oFtbYNE1qrY&#10;Twk89LIFa+6Zkm2nJv/mC91Kxgxyu4gIp+KhSXN+9wWiB5FwgannYYEj6XjHfFM38QQj96gy+XpE&#10;WJ54hhbv3dVR1phoCUauA6Sy1Qj0oH5NZlvnL0y91vEGYvvKlUpihmw60TFh+gxPoCepSLWZeh4R&#10;liyri3Ykr33YbCvE0979ZgWu/zL1QkSkMxUPRUy9kAsvjp41Z77sKZfTSoTjqXi43dRNfIHIcSQa&#10;14lfgA+mesMVb41NF02tPc9x16myq3rC8vVUIjRhfrGJCtFr4VQmHm4xdZOJxz4fTcfDEz6c+gKR&#10;bUjlI4kPH927ZPe9G8rWdfUFNt+AJDebeiFWxr73sp4WmqseMPUimP/QnwiPeUgx8bVHGAtWjEyY&#10;eV86EZ6ydCXeQPRuIhx3HImw4BCt6t/WUdFq5FQxbodOF1UzshgeSCU6Lp0KI+vQPf5J/zcqQUv2&#10;bYtXb5v0CEtfa/T8Uk+tdpkMI6vRf8tyN875IhFYTB/Awlm6a5DlnQ9tDT2aHyPNV9w6H7khrJA/&#10;Wbh0XQ5m2c+onz8QX3f/ibEmsCoQfX0dkeW8WsKsWeTVmVyiQpyKa9o+XXRhYMkZcwlvBbDqUKwF&#10;mO4dHB56065tH34w99u6cFkrNCxSS9+vFPdY7WvI5T1rzcQ7txXMa+INRF+NhD9HG6v2WebXDSTC&#10;/1P4Oav83Ze5kOJE1iPAsiI37j24b/PTqQ1HR86ZNAciF5DA90hBu7XfxsIid/Lg8LUD26/fU5vn&#10;PndNNrdufCEp9+9IlS4MPBYWZnhLOjv3Ttj6uM7liwJZFYh4FcJvFcq5eX+u8rCwhluPDsKtu+8N&#10;H8z3daM/ttyN8EUi/ifrfc134bB6Z+rE2Mfm5lvnqSV1YUSwPPZF+Bk9xC8e2FY49rvQ61/6z6R4&#10;1AdrIkqMfQAAaVq7sc3lciXKGfvFsGgt1xx+XL7+2GMHB/N97Q1EV6HAT1DxxVb7WjN+OTt45OO7&#10;7hl6NpdaoVp00bJWaFjkXnK1QrRVS7TU2DcOmTYsdOrUMtOMrAPb12YJpy71gF1cpF8+59KtFTtl&#10;WqF2jKwu8vqXrAeA1wLJakKZk7vErU5EJxBhARYWICElKhcdI2j3s/KfA0SICCQsGhDI+uSYQ4Rl&#10;JKqOmOXvGvRfAfHzO+KdfzOPnSqaA9EORHwTMF+uFM3P5eeppL9ZhFFEkEmB60RKBHufc6KvkRAJ&#10;hbnivgYBRiJlfqZ5bDly5ywXfcgasohCgIJ2PyeHltz/qqMokELh/00l938WYMPYrbQpwNO2qYmI&#10;PswCLyTClcDCqJDsnrPcuR/pa2YNIlBJX+ec2UkAGBkgSyCuyq7FgrGPSojY2dgXYEBERCQn1yMi&#10;iQjn/q7C6xGARQQEkYi1ZBGBkOz/rlxfCwAoFC2HBOA+RLwzldi72e716GmLvkYI36NQnouIp1dj&#10;7Avgw5jlP2bFtWnH1msz5rFTjeWnu1nGcugev9SygQUAkGX12yf/6JtwC+zkYAOnk6GNCLwVAY+K&#10;VDbJQs6fAVEpJQAHhYFzUWT2PwuREJRSAHJYmAeRSNmfHEdLrhALH0UUF7Dr29NpYAEADCRCMQRM&#10;EsqxXJi2sj055iBEQgLkQww87KSvUSkFgocF4JiTvh656R8HgEOoVMWfA5C7uYqCg5j7YNufk0Oh&#10;CAIJHyWQR1LJ8Kft3tCqSaZv/Y5jwxITVG4BOopKqUrOWe7ckwKRIQGquK9H/m0SARCNh5yOfSAk&#10;EnE89kdy/x0S1o7HvgAcY4EjTvoIkYiFhwHlUC4ApLLPAVAowCIIxwRkWyrR0VPJ9ZjpC/0vAf8A&#10;AIdZqjP2QSMd1XWfrgUDC2ZXsipn/z1tTynAGRMBtuDy5KSd69pZyRrLGb7PzT9tYTZVylF1PETr&#10;p588MHzRswPXFzmBeoM9Pya0l8BwWOBVO+Idvy7UmgORW11Etoqlai2dmWR5f6HpZtmyrrmLzlt0&#10;X6mAgPHQLENDh46veih1Q1G0lscf2awUXVOoTQSzvD2dCH23UPMGez5MNgvdsvAt6Xj4I4WaJ7D5&#10;DYrE8hYvAACDfDvdGyraOj3/kpuXzJs75yEi66lqhHn3s8eyLU/ed90Rs62W8AQi71NEtrLxi/Cm&#10;VDx8XaHm9fc8j5SylaJDi/whEw8V+R0tW9Y1d9H5S9OKwLIT+Xhj39ceuxMBbOX5kmz2Vam+dUVj&#10;3xuM3kKItpLyMmNHOnFtUZocrz/2dlJgy/G/VF9f2Lapaa7LNWDHFNAC6czBvZdDasOQ2VYNPP7N&#10;m5USW2N/eDj79h1b1hWN/VrBes9OETPByDq8PfAuQfm6qdcyzDK4aE2fZX8SO9SykZXn/DU9yxbU&#10;qwmjIA8f5Qt33xseN7JrxYquhvnnLD1m6iZay/cyydDbTL2QiZx68/T3dtTcOC3HCt9tZ89fVD9h&#10;xJZouDKV7Bi3TEZj4zX19Wc0Hjd1Exb4UzreMSYCqRBLfS0A/fHyfe0N9nyDUE1YxPvw4wvn7N79&#10;rnG/+/lrb165wD13QofdoaPZ5TvvXVcyKq5WaQlE9gDR2aZu0t+7111u9cMT7LlJobrR1E2eOTI0&#10;v5wB2nh57Iz6OVAyirOQoWF90c4tneMG8Fgd+6z199PJzrIl0FraoyNb6+WZaOz7gt2/RHS9ytRN&#10;Bp+Ghl27OsZExObxBaNvRcQJ/XePDw+f/+CW9bYisSvB5+uqw0VLx/2+eUTkV6l46NWmXkuUPYHT&#10;Qa0bWfIjUIeb/ONODLUMZ7P/vGjttv81dafMBCMrR5erXJh19vjxcwe2Xz+hIQYT3LRF6ytTyc5x&#10;jYdCvIFImohK1qvTmn+dSYYnnEBrFV8wwuNtaxwbOrbioa3Fq1fj4Q1GDxNiycgv1tlb0sl1RatO&#10;4+HxR36lFJWsValZ7skkQmWjxvL42nvej6C+ZOp5Jrox5vGs6Vmmyhj+ExkhtYw3GPk8IX3A1AEA&#10;WPOD6WS40dRL0bj2C6vr3cPbTD2P1b4G6KpraV8yON4tb0iyy3fGrRmz5ca+Zn5jJhG2lHTVF4jd&#10;jwSjiWgLsWM8eILRTyvEkoXltfATmXh4mamX4sKLP3PW3AXznzD1PNb7unqUG/ua+bOZRHhCI3y6&#10;mfXJssnBRr+jxGrTCSnXz03t1GJDdnhouOQW7+AgNFo1sAAA+nv/WjKCKqvlRqsGFgBAOhH2spaS&#10;T8cz2cACAEgd3F9y5TSr4cVWDSwAgHQ8VNKnUFg2WjWwoEx/ioZjVg0sAIBUb+eXWZcuN9Lfe63l&#10;OTWzrXOPzg43mzrkjNDFM9XAAgBIx8MfFIYxqQVYyzGrBhYAwK4tH9iuhcOmDmXGYGk2DOmsKpnA&#10;cnAQGq0aWDDuv8vCWt9o1cACAEglOi4R0SXTvFg1sAAAMvHQx1Hgh6YuzNqqgQUA8PADNz4peqhk&#10;qofpMLCgzNhnxs/PBAMLZo0se4gAAYCtpIU1BQIc2L72U6Z8KrFj6/pnRHNXoSZafrXLdq6VO7TO&#10;FpeL0JoPDyRDny3UrJBOhuaamtNJbWXrLVXJr+QJRGz5jxSR2jDEmotyIYnIgYFkxx8LNSuY/aFF&#10;hlKJkC2/NijxOQAAqWTHmP6fiHSy4xMsuqjCQhbpXLs12jJ963ew6KIcX8MsNz+09YbCungzklSi&#10;4xIAKArxL3WtT0QmHo4yQ0HeKRat9WsA7rBVNzTTd82zouUzuei4HDorf6pk7DNzsFARgUPpZKft&#10;sZ+Kdy4q/D4wzjU6EQ/EO948Uvt1BC2pRLiEMVieVPK6P2iBooTNrOEdhe+nmkOHjxbl5mLg4XTi&#10;2g8VarXMrJFlgwPb2u6dzDqEUwEhfdzUTjVSyfCooSksnEpaf2osJNMX7hU5cRPJHN5/WvER1tGa&#10;u3OvWLKaHVe+d6uGD5paBSAA3mCKdkgnw0W+i6l4yHYpnDwj0X4AAKCyWcurISbCPHozZBFb+XgK&#10;OXoMzy00IgbuvsbySmgh6XhnUf28HYnQRwvfTxcef+QtpmaXbJbfkzcisgIVlNTJkU50jF43omEo&#10;kyyfpHM8UslQ0bZapi9U1pdvPNKJcEK0HvEZYnly31DFtStZ49fyr0Xg2uJW6zDr0fp+AlTRtQgA&#10;kIl3nJ0/ZyIs6WTHd8xjppJH7//IPi08+kCjdbbk6m+tMmtk2QJ9pjITOXjP2qKVnFMRYf4pAIAA&#10;VzzxAwDAwb2jxY+dRNtkkvs/DKBFa9IDyfC4/j5WWLEislgRPNfUK0CUjSi48dAsf4ATRpKtlZ5C&#10;jhyHZcLCACz9DpxvU4nwjfkvkY6H1hvNltl9b3h/PndRzn+qclj43tz/g60IxsmEkBwXnR/oC39T&#10;Rjp7YLj//5ntlZBFtFUqxkQEfwk5A9vy1l4pUnreaAb5Zweur7i+3/6/7+vI50FLxTtuN9utcqJG&#10;IIs+rvxmux000L6RF0VRjdPFgd37z8jl0ALYkbyubHWHWmPWyLLI4e1t70Oc2atYeUTE0erEycDg&#10;Yd0hwiLAjiaR1IhhxQBbzTZ7bBAAhUQnntgqpWEZvhkRS/of2aHRf8vyXP4rZ2QSI6H1aC9thcnu&#10;e8P7kQRFsKQfiy1ObK04+n0CeFfuqd+Z/5Ro+RwAAGpVO9sgJO9sauv5rSnbRQCOCQDD1i+PG3Ri&#10;BWb5FADLDiNNh114SN+UWzGWmNlmi61XDwMAaI19Tq6jPXs2HANA0CLjRkhaRUQAgGRge2Wrqnl4&#10;WD4OwJLqC4fMtulgz54NRwEEtYDjPppqZo0siwjil2f6VmEeYVW3Y0fjuDXTTgUOKxkEAGBwlXQ6&#10;t42ArWLFJRBmGAChCVMfTIQL8YumVgluaHhFLmN5lTg4eIcp2aOLAAhZ5N1mi12E8+srzkCtb80l&#10;rHRGpq/zqwAAqb4PjRvdNdUg4ByXwpeauj0E7fqpjQeDPGtqlZDZti6uNeqdfWFbubjGg5BLFlW2&#10;gWiWvxOA44cHRAQA7fg+5UKuMWMmN/Y1a8cPj1PNrJF1CoIIePbRhY5vVDOZpXPcH0EEUCxvN9sq&#10;gRBeZmp2YdB/FYRPmHqlLF/efWIrsxKI/wUAqbk18kKzqRJSqQ87NCA2sAjHn3x68P/MFruQqk6l&#10;hn0HZAsDWY5MmzmI4xt1DhQEmYvVuPETxQDE+XUNANbrK04MknqJ03RILPjHYRFbyU7L0dz81XGL&#10;YVtBE4UACFe1djvadqweG5iz8kj26LEdZkutM2tkWUAe8NWZ2kyGCFAEq3Yzn6H8GwAhKZwwsWQ5&#10;PP7oTlOrFDzGt6XjHT8y9UpZeC6VTYY6EQj0EgAA5cbPmW3ThQj+dt9DNzh64r+wbVNT/vUqf8/z&#10;ilvtsWfH+mcQ+BumXgnCbCtabjLx+iPPBQBwupA5crMXAIUef6woIq8yFC5YTv2mag9BqEJfewLR&#10;e3KvWJxsFwIASBa+uDMRTph6ZSDg4sOOHh4VwqUAAEqpCROUThWI+OWHH7ixKPJxJjBrZFng0OBc&#10;p1tBNQidaSqnDl2u0bImKO4zzugqmYvFCkQyWkKmJRCpOFINACBz33rHT2kef2Q0Xw7aLHFigphb&#10;zUDEFrPNNswbTKkSRMu9Tm9oDaC25F+7BGynkzBA0uTYb2mEmplnTpS1UegNRH5jtltmweFv531Z&#10;lZK7zWarNLZFX5N/jQAXFLfaBYWBxk1wahVCuTT/ujkQcZSzaec25waWJxAdiVIkVJTz8auEZU1d&#10;pyPmAjqUgoqjeKuNBtllajOBWSPLAoLoKHKoJhFEEWdL3DOV4qzvhGc2Lq3Ip8Ljj363KKM5Ucmk&#10;iVPFWZdunKcUXVWoeQOxiib/XFbrE7/N6+9xVIy6PxH+pKlVQmaL9WSPpVjZessictHoVgq5lGpc&#10;c5vlWoslkP4tHRUbD4WkEuGaePDxro0WrYASycvOunRjyazb5Vi+vHuOy43/78R1hNi0pufF5nFW&#10;qHfhaCJlREJPMPqz4iPskUl0ONoG8wWjPzgx9gldVDo57VSxrLVrriIscAEh9AajFQWaLFmy+Ilc&#10;sXcAAARvMNpnHjMdDCRDDn06p4dZI8sCRHhSbRcCAAiw/OlPUBW/lJmEL9D9U1ODXAmY/za1cjS1&#10;bvIohWPqk3kDsVzo8zRw2lz3mG00IrhpZestlgvkQq7Uz4CpkVJXeP2xGZ/Idk7dnIKkljnq6txV&#10;2/Kd6Vx8cfQscqORF0nh6fPqbKcoWHSea0ykrLte/Z9dnypfMPa0qSnE117c1rPW1KeCi1Z3NyLi&#10;vxSrhB5/tCqO+ZWwtG7pGEd1QrzV9tgPRgeQiv0VCXGtrz16ykekV8qskXWKgkCwet5aWwNwpuMJ&#10;Ru9AcpXM1YNIr7P6xOZtjb7aXedOmzrkjJrFvkDEUTi/XZYHu+e0tMcEEUuO5zl1c3b72iKXm3op&#10;vP6eISIa9VkqhBR83BuMfN7UZwI+X/fS8WrOIRK2tMfE1/a5CYsan8ysXBu9WBbguMEJLe0x8fk+&#10;N+HWenPzrQvG62sYMb4a/Rst5RzMXddQshyOuFSfNxDtMPXJxLt20780NLhKGuVK4bjX2GSxrLVr&#10;brl/c07dnN2ewCZLVUpa2mNCiCXHPgLe7PXPzLE/3dTcdlEtFog+dI/f8WfUIkz6nxZdutVZMs4Z&#10;UCDa19b9VnS5LDpwCmiW92cS4a+YLac1X7fgjMXnPmo1QacIfycVD09qSYqWQOybQPBOUy+FCDyS&#10;iu9dVSqnkze4+aOE8hlTHw+NfEXm7nCvqdci3mDkD4RkKbO3iCRS8VAVHLRnEL6uOt/CpQ8gwiqz&#10;qRTC8vVUIlRULimPxx/5obllPR5aJJ2Jpy4DGJs/yxvouZ3IWs4wLXr4mGDT7kT4EbOtWpx2xa0L&#10;zsrW/wMVWoraywp/Z2CSx74vEP0aFm0Rjo9o3p3a+1Az7Lp9JEv9CZqDmz/qsjH2szD8nIHe9VXZ&#10;Ij8VmDWyLHCyGlko2XfNX73tm6Zul9oysq5UPp9PwbyFD6DLZemmMRWIAGcZ3rBDN/wyn8TQNq1f&#10;cnvUkReRUr+ppYGrOfvogexB756tqUG79eSqjc/XVcdzF75XuV1VeeoW5k1waP+N+aSzJwM+X1ed&#10;LFhyKxE6TjQpIoC58AizyRYiMPI5zpEsbzu459HnPvbYwkGADZXkMEOfr8vN85bcoVz4WrPRLpJL&#10;fPrSHXreXyof++93X+RqelU9qv8u8gOdZlj4Id43dPnAwJaj0z32a5WaOVl5Zo2sqUNz9l8Xr9n2&#10;fVO3Sy0YWcuXd8+ZtxzfoAReJEhvJsR5uVIVCIUO3PbQknMAFc7lDXL2OcySJYQ/a+A/Z4ey3921&#10;7cOWCtM2+mO+OpIrRbAdQb8USalc2Hil34cllyCyMBdSJZ+V/xwkEX1QmH4kAn/N7nvwB7tKPDFP&#10;Jo1rN62ud7n+RUBegAiB3LB3cu4Lf5v0g8ivGOl/M/GOu8wjZwpNrT3PcdXBm0ToFYTiqU4f5adG&#10;p5+Tvx4ll0CgIvLfR6Fo/TQT/RhF351OrLOcIb4pEHmVAnoZIF9JSMudzSEF34dZM8HvhOFvDPCT&#10;nYlwSXcDE9/q7kZ201tR4YuA4blE6KqdsZ/7bZphPwL8DIH/lErs/26plfJTmQo6d3KZNbKmEMm+&#10;eMHqbU5D2GvCyCoBQuuXXB73sasVymZ7EwmLZKVraJ+6bdeuvcMAG7gp2PMcF+Bf7D1FsmSZ/nDs&#10;6NErH73/+IEKn6pL0nh57Ax3PfyBCC4228Ynd8MYHBxeNWLg4VmXbpx72jx3FEHeY6+PAIaZX70j&#10;Ef71yDxStd9WLRr9tyyvoznbEfVpdm7cmvkwZQdbUltveHTkt52c4x8AmvwbL3SruodMfSJE+OEj&#10;eviK3X25BLOeNT3LyIW9qOB8u9dRlvnCgdxWH65svWVhvar/BikoiEq0hmj9klSy8w9VPGcIAOL1&#10;9zzvREoLq7BkNfzfsWP1Vz16/5NVH/uuev0nRei13ke58lhDw9K4c0vnQwCAZ/i65p2xYGkUid9t&#10;/XNyaK1fM1Kku1p9fdJiq2Onglkja2pgBlY6u3x+2zbHZVxq1MgqwueP/AkVvcDUTRj4rnRveNwM&#10;5x5/5C1K0cSrf8JP9MfDy0x5MvAGYvuIoKyfmAjLMMjLd8Y7f2+25fEGo32EOGHEloh8MRUPfcDU&#10;a5lyzsGFDGo4b1ey4zFTP9nxrt20Gl1q60QPESxyJB0PlXV+97XHjiLAhBGEw8ddl+3Y/sH7TD2P&#10;J9CzW5GaMDiHRW5Mx0OfNfVq42uLvhVdOLFv55SO/cheIlpi6oWIsCDTS/qTHeM+UFsd+5rhPzOJ&#10;jv8w9VnGp+yAmg5q0cg6sK2NiarlMVAbaGZetHpLHSI43kefCUYWAEDz2tgVLjeMm+8py/KmgUTo&#10;J6Zu0ujvWlivlh4w9TzC8otUIjSaPHEq8AV7diCqcX3Q+ns7LF2/Hn9PWCk1flLV4+zr325tq6PW&#10;8LRHn1WAS00dcpPEsVRvx7xqzBczmXLGqAb5e6Y3NKHRAwDgDcYeJISVpp6nv7eDrPS1NxjZREjr&#10;TD2PDMmK1NbQo6Y+WTT6YwvrFYw79lngJ+l4x5tMfTLxBSMPIdKFpp7H8tgPbP6AIhnXl1EPyyWZ&#10;LaEHTH2W8pQM+Z7FAHlK/UumBCGshoE1kxjY0nE3DOpXmDoAwJDwR60YWAAAu5IbDj7+ZEPJlSMR&#10;fniqDSwAgFS8s0mYj5s62JhkAQAyyc6IFilZYLq/twNnqoEFAJDpDZ1W6r4uwpLq7Zhr5aZ/stPf&#10;24Eiua2lIgSGrBpYAADpeMdFzDLGN0eEZeR6HPtvlCAdD69nzSX94PY8vXfRVBpYAAC7kh0Hn9h7&#10;fKGpQ26V556pNrAAAFLx8MpSY7+gry2RSVz7BRY9JqoaRq6LWQOrMmaNLAsQ4WgZjpMFJLE0yZ1s&#10;9G/r/C0LF51PBnhmZzx8c6E2EfseuvoAay7KqCzCkoqHx316n2xSifCYLRoe5leb2kRk4qEPmPdA&#10;ZvhWkTBNrFrb46h/R1ZQikjFw2O0mcwqiznRxkMDX2ZqcnCvpdQFhaQT5zTkfYHyDB2nswrfWyGd&#10;DL+QhYui8oRl495dG8Yk37VKczA2JpGwVZ4duP6Q1roovQSzZDOJjtWF2lQyduyzaOaXFGsTk453&#10;vl8LFEXSahZHmdZbnFVUmPGcVJPLZLHgsi2OisjWJCIOi6zOXNLxcEFJDZZ0718rSkKZToY3Fj71&#10;Dws4r/HnEA2ysfB9ekv4V4XvrdLfG8JCZ/Z0osNRIe1qgUSvMzV7oAjAaNZ/OQnHgSJwVMJoIL7u&#10;/hPvWCDLkcpSWFylNcDnCg2tXfd0jMnebgXeN3Ra/rUIcCoRqqhkzAiohB09NGSSnQXbalqyoif0&#10;ZyrH0saukqtjdtBaboKCJcKB5LpxfbDKkYnvHYnMHnmfCFnKezYeuq4uZWqnErNG1ikIMwiDzPgS&#10;KQ4Q1vpuAICsSNpJfhfROOoAbjUsezLJ9J64+Rwa1OcUt9pDC2sAAGb9v2bbdOFCeP7y5eZTuz1S&#10;vR1vyL/er49OGAwxw0AEsL16aaKzw825V4T9feFOs90qmd7wtaKFAQCOHxy2vN1oMjBw/Wh9URGx&#10;nJJhHASodHUEO2SzMrIahrAzue5es90OZ5y2+MblQXvlhkwyydDHAQAQWIaGxUFh5w2aBbIAAMxc&#10;kaFWiEKsq0X/76nC8YV2qiCij5naTGbJmq0/NrVTCZbhDhEWFnFU2DXdF/pPAADWXNET+mTy6LZO&#10;Z5Gjgp8GEE4fOvBGs2maQAB5Vf2ZZ3vNhkp5vO+j01ZvbpIQRFIr2m6raHU2T6Zv/Q4Y2QI322yD&#10;OAwg/GD/+r+bTXbQDHcAAKQTIUsVDsqACOj4dw30hb4PAMCCD5ttdkHAly9k9T+mXhkoI2kaKkUE&#10;6DYAlnQiXFFB7zH4utymdKowa2RZhJjfwGzNWbPWIeAxRXJPNeqOcy4RqJSuQWgXAfytqU0XUqXL&#10;lEhlRLNARVtFk4IAorveVTd+9KNFWPhhLTxunb6ZjcB8qhs3DcnUIiiIujj5ZWUg4DdMH69K8Kzp&#10;ORtAY+PlsTPMtkpAga2mZhNUCD5UuMZssEuucwQdrxxpx7+pABbfwiVTHhBQK8waWRaZ37r91zl3&#10;jpkPCb/M1E419Ny6dyMCuHHYkb9BHqWwYkfaaoOj82uXy2iyB/NrUCl1cfsmj9k0Lfi66kAAgOD5&#10;ZpNthP5MgjtMeabTeHnsDEQABr7GbJseUFCkwQykqAQi/YNqfA648R0ACuvqiwNXKkVQShadt4GI&#10;gAsASqYXsUNu5As0NsbqzDY7IOHVAISetttHfeEqobl1Y97Yd1yeaKYya2TZgECPOszOZOa1bqvi&#10;U8rMRES9E4BQRL3XbLNDc6DHkQPtZLIquNB2JFchSPAOAABm19fNtunAM3/hGiTBamSsSyc6/i2b&#10;zV5t6jOdunr9XwBIRNhuttmhec3tlwAATJSc1BIiAIDQePlGn9lkD1oIoNDTFvuL2WIHwtGiyo7O&#10;vycYjQEAEIKjh5mVl0dXITlf6TsBgmuhnUoQY0AieAUAAFH2d2ajHcjt+kQumzxeabadKswaWTZY&#10;sHrbm2b6lqFCOdkcfSuCFF6S+38+w8mKj0J8e/61Z23UycRWFTzB6E3513Xocpi5PBdhhCRBs2U6&#10;UIruzk3YhE1ru99mtttlx9b1GVOb6SDhiA+NM+PIVc+jmdg9bZFocat1PIGe21AhARDW1bkqfrgr&#10;3NojYgcG5JUKBBohZ0kscDL2CXAkjYNA49pNFadvqK/HO/PnyxuMjJsMdCKaA5Ebc68IVT04SDt0&#10;JeW3ZZGo4t8FAEBILwIAQGRcsaKrwWw/FZg1smyCKJ8wtZmCAMDcy/ps1uA6+fAEIveceKfQG1yy&#10;s7DdKt62Tf9R+KSPBNuLj5h6FOLIRJtjVWt3QboK6+Qyf+fr/RH6gtEu85ipZNUVkcsLDQe3y/Wd&#10;4iNmaQ5svrbwvScYrSiJcmtr19zC98pFHYXv7aBIXZc/b6io4pusq0FGHxiQgJrXxtYXH2ENT6A9&#10;gQWRhc3BxRU5iHv80Q8h5u+fCt0ulTCPsQqRHk39QkgfGN31s4mLaPQBC4DF076xooc+X+CKI4Vj&#10;zROMFKWFsYrXHysoQUQ4/+zFNRccNBXMGlk2Wbi67yYGHpPJeCaw8PJkRYP3ZMLXGj1fERUlWyTE&#10;Czxrel5eqE1I65fc5HJ/oVAihS6PP1JRXqpq4A1GxwQ01NW5EtD6JVuRPb5ANGJqiPjJFZdFSma5&#10;n3Re0OWqEyo2YDFX265IO4VZtqxrroskVnhzVIh1PtsrI110vG7pEVMtV25nPEr9TSltIrz+6JdH&#10;0gCMQOhyw8YzfJ8rW0PRpPmSmy9RpFoLNRfSeU3+zfYi6F7Q5VIKby+UCMntC0T+u1Czgi8YYbN4&#10;eUt7zHYx6bH9Sqig7n54gb2VOq8/9ikkqi/UFNL6Sy65uWx9RBNf2+fOJgVvLRKJ5nvaItcXaacA&#10;s0ZWBbi1dpCDZHoQkSqFB89cPP6efxqvxqKqV7/x+CNvMfVSrLisa3FL3fGSEXdK0Su9geiU55Xy&#10;BqMpQlxk6gAA433XUngCkc8gYcjUAQDmz6V9jWtvdrR9UAktQ0uLsn3nUaTO9wajfaZ+quFp29S0&#10;9IKxhhHkfKo+4GmP/qepj0dL+5Jxc8b5ghHLqz7eYM+46RrGGgTj4/VHv0IK32fqAABnLtKHzvdv&#10;HLdmXyG+tZHXuubPLVmM2q3k/6yO/ZWttywa73pEotf5AlGrfrvoC0YOjOfz5gtE/mFq4+ELRMfd&#10;9h7vu5bC6498ihR83NQBAHj+3L3NbbdbSrjqabu9HV26ZPoY5aJbPP7YR0z9ZKbkCZ5OarFAdCkO&#10;bvdvQoRxC5fWGgsmcRWrxgtEIwCINxg5QkhF2yClYJED6Xho8cgDSOETJQKA+IKR/0acOOu4MOvU&#10;P3gBPLZucvOrtXbN9bkWH0SiCftNZyGW6esoZUAhAEhLMDoIRSsGpWHhx9Lx8Hn5vzPbq8XIDXbC&#10;wARh1qlEeg7Aly3fUE4CEADE448mlMIJt4QZeDjdm543Xh95/JFPEMEnx7vp5xEBPj7ccOFDW68u&#10;WTOwqXWTx+VWqYk+BwCAhyWU3hKKmToAAKzoavCeveQQEU64EsPCf0zHS+ZzyvVRIHJIEU246pVl&#10;fXgg0blgvLHfHIj+1EU4YSShMOtnH3ls0ZNPdpc0fFuCkXcAkqWAGX2cr8hsD/eaeo6uBl9g8eGJ&#10;x74WFoqk46FS9ysEAGwJRo9ZGfuieXcqGb6gxNgfmWdjhwlhXoFeEi1yJBMPzS/R1ycdEw6EqWam&#10;GFkAAAe2r72XkC419VqCWWTRmr5JXbGsLSNLcFnrJ+csUoteRKLehi54c86Jc+JJ/wS541nkTgL+&#10;Joh6kRZ+H5HMQyxe2i+HsDASEmu+m4GjzLjVYZJAWLW2Z6Ui13MFdUghXI5IYm9FmkVr3EcEXxTO&#10;bhFQVytFr6ykj7RAlhi/hSI/Pjx3/12779owWOF4yxmwrdHnigteDQAfIJKFdr5Prq8FmXErs4pw&#10;Nrt95wwuZl0CBOhCb/uSF4GWNyDgu4CkwYoxc4LcORYtv2ce/iJQ3cVI+gOEeKadvs4FRCCwxgey&#10;om8n5SYXZK8VQC+igLn9NT4sIiTCsgdQvihapdHF1xDiC3P/htXPgZHrUY6hwNdZw2/Jpd5KCG+2&#10;/zm541n0TwjUt1jgRQTwXkGeb6evT4x9fTcDRIhopQh+UBGflzvC6mflHNCFcSdr3gyEhwghBA7H&#10;fpazWxS6/p0IX1Hp2EfGbzHz/6ALX6+Q3lXJ5wAAiOCvheXLPDyUHNh+/Z4K55CaxUaHTA0zycgC&#10;ADi0ve1pQDzd1GuFw3B8/rLL7yv5RFUtasHIWu7rXjp/Pn0vZzDA6AC2N+hNChMfOvkcGL3BAQBk&#10;mZ8ATW8c2NJxt3lUKTz+zf+kUH8ViEayeNudzEpRjf6BMZ+jWf6QSex7BcAGS36LnrZYlFzQceJL&#10;VOu35T5DhA+ihqv6+8K/MY+aKXgCke8pwrfmpuvJOW+VU6ufAw4/q1qfA5Pw22rtc8DhZxV/H2He&#10;cVjUKx9NXus4k34t4KBjJocqG1mXmPpkcGhb6zNAylHStkmBjp694NIHnjTlauNrveV8rJszrUZW&#10;af7o8gXvSyHCKrNlIljkIT2cDezYuv4ZAABPILpdEV5uHjcRLHIEtX5T6v+3d+/hbV1VosDX2kd+&#10;JG3iJhTStNBw0yaWZGibxLbk8ijlcS9lKJQp5f0Y7sxQKG0kOeljOp0aD1yGNI0l9UmBwr1QKDRM&#10;P5hSBjqlUCi1JNtNSrEkJ04Gt2kbWpp3E1s6e637h2xH3pLlc3RkW7b37/v8fdLa+vRZR9LRPvux&#10;Vs+mX6ptTribI1cJg7ehsL9ji0n+OhlvfzcAwKoNt7oX19b8VgDYzqlFzKlULOgw91GhRn/kdy5E&#10;20XZWcIJBPpCfyL0PbVtvvH6I39CRNsFyYngEBJdnOwJ7QQA8LZEH0EX2E5OLJkzBtG/9CfabwEA&#10;cLduu1mguHnqqatCkumxdCz0LgCAc1rCbXUG/idOsr5wcgzM0J+MBd8EAOD3b1t0BFxPl/fdh70v&#10;1NGGw4+HDoGD7z5LOIEGfai/O9fB9/q6HkVhvEt93FSYiZGMO/oTGzcCALh9264SgF0ojAkL1K3I&#10;n1ptbA43ihrxeFnffYBUqjsw/t33tEWTAsB2uSsGfn6E5Tv2xDYNqm3zxfztZDH3J2PBN0/3SNaY&#10;w0+1/FGIXO6lanD84LElKy5OHlPj0+Hc9dFz6urA8Zek8p2sk6wutpVM2cPZxae92HflcbUNAMDr&#10;jz6MaK0Ar4nkHngyNKDGK2lty7b31rhclnY0EsEPU/FA0cz03pZbzgCj7vmT29InR5JPpBLBKde3&#10;OeXxRX8ghLJDaTIS3tmfCDguZjvXuNvC/QYISx1dc3j4rIEd17+gxiHXabsLEb+oxouRkj6RToTu&#10;V+OQW9v1GcOwtt6ImO5KxUJfUuMAAOe2Rl9fZ8Cki+fzSeKd6Xhwkg0ZHcLra8igMKY8r5AE86gw&#10;l+6LFV9H6W0JP4wuYeG7z2Bm2T3QW/y77/Z13WAI49/UeDFS0mfTk1w0uFtv+xvDYEubbJh4ezIe&#10;LFrdYvV5W1+3aHHtX6z0Boj4cCoenHSXsdcXHlZ3JxbDzJQZxjMGdwbmfVoHC4d1ZlWwk7UrGQu6&#10;Z6qTBQBwdMeGOwGNq9T4TJvORe7FrF7X1byo3nC8y2s6O1mQ6yD9CBE+qsbHSMmD6URwyitf91vv&#10;2mDI7KTJ/piBkrHAtL2OYqbqRPZ3583IldDkj3KpswIz3ZqMha5V49OpUq9tvvL4b7tOIG9R4/ms&#10;HqNKHespn6f2QA08PvWU8lTPwwBXJ7sDU6ap8Pq7vo9oTJrAliU/k0wEp1xf23jhtotd7HpMjeez&#10;doweMJraXiz5+q09z9THqFLPAwTh/nigXQ2rvP7wVkRRMo+Z1f9pPpjyqnXmlX6frSLgpRV7MouW&#10;rOv7kkvQOcQ06Tbo6cTEkZnuYAEA1NUYZ6mxapSMBT4mJRWdtiOmXisdLACA9BNX9UmZKzuhIqbj&#10;M93BgilOWhkiSyMdAAD9sQBKyUVHJcmk8Ex3sAAAshmcdBqi1OteKFKxjbcwwQ1qHHId/hftHKMT&#10;NLxWjY2x8zylHjvM5horHSwYfR5m+KsaBwAwTfqclQ4WAEAy1v5pJvqZGgcAIJZ9VjpYAAADT276&#10;jZktXodPMh0v9bon+ogceRkmnRK1/jylH0umtJyQNHesuWg9TyKy1MECAEjGQteaBPeqcQAASXJP&#10;qf93PqrGTtYBNVIWwtNnY6Ru0Xm9exvW9bqYqGsmSvBICQQsj5yy/IXFS9f3hNT2mcDALWqsWqUT&#10;oUvUGABAKhay9RrSicAjkqEg91gqu3jSofTpdvg5s2AKT5rw3d1xe7vsinU2peQDqZ6QpZNsMeed&#10;t3XKbd2T2dW3MS2B71Hjx144sEiNLVTJeGALMRVMlyZjgTPVWCl749fvJimVhJHE0nzV9uaelw4b&#10;S9RYlvjTdtffJGOB8ZI6YyTDEwM9of+rxktJxkNF0y+kYu2W8j+NGegNPMTMP1bj6dihSTtNxQwO&#10;Bo5kh3lCYmQYndZVY1Mp9l0wie9M9bT3q/FSkrFgI3OunNYYIj6Uitv77g/EA0VSrxCn4+1zLsek&#10;U1XXyWIAy0nYLJj2Ts5klq7v3dSwPiFMojgxExFX9H8hYiaW+xv4uSVL1vU1iLP3FV1HMBMMY2Ip&#10;l2rHtfknf+JSV5SlpGOBDzKf3GHDRLdC35VF8xBZ0+Ho+7hv36YTxPLf82PpnsBYMVxbch22k68t&#10;nQg62tiRXVRbNBGkVenu4Bfy7xPzt4aGOofzYwvd6ILmkzmHRnI1+uxKjS5mzyEm5kfTPTe+kv8Y&#10;K15OXn2MiCfs6twVD96Xf98qacJ4QlJm4nQsYHtjBADAiISG/M/1yIljr5v4CGuSseDHTv68EEvi&#10;m63uqM23a0fwj8Q8vvtbmpyabN1cKUNDncNEnLd2i3ggHhytrWjTCK/NP0apeNBWtvcxE0esJL/w&#10;l/1lPc9c5+ikPh0QoOh0jl2GwcbKlfcUXNnPtGXre/0N63oMBiq64NguImBkuH3pup7ahnV9K7H5&#10;xaILtLXJJR+/+hgTDQEAMOORwcHAEfUxVhHg+OhBMu5sKs3tO/UjjetutzXyoErF2j88djvLZtFR&#10;Oyv25SVRlcR5tR7LIwSsVmN2kYTRkQjiVCz4ebXdjlXnh0/ztkauUONzHTMlcreI+58K7FHbrTJN&#10;OT6ym4q12ys5lef4/oOXMTEBAFA2u15ttyrdE/j22G3J+PTEVusGE4EjknMX8iz5xODOfy574TVJ&#10;eGjsdjoe/MrEVusyknxjnZr0qwdt72Ick4oHP5u7RZyRxqVqu1XJHZv2jA0JSGZbo+AqYhgtCm7g&#10;wb1bDqvtC0HVdbLMQ4cLhmHL1bDqWNF1M7PhtPV99y+5IIFLLkjggJmolUgvMUB2qrE2IiZieYIk&#10;fWDJBQlsWJ8Qp65LbEQE21dN1Q4RxUxN8WYJQ8zEWZI3qW12pGPBdwEAqEPs5RBQsxHqzBvVeLl2&#10;xZyljZAE2wCYjhw23q22zYZU4sBDAMTATnLy5JxSD08AQnlX+lUsGQu1sZSSSBTdkWbVQE97L+TW&#10;dDkyNNQ5TAgmgORU72ZnBdSZ+wEABibdSWgNM90MQMyI/0dtsyOVCH4Acks2CmqG2rGnpz0JIJCZ&#10;GJKdlktgTQ55d2Ljw2rUBibG7wIQpx2maDl04MB7AYil5NvUtoWi6jpZu3Z1Fl3kaJ9AAcbX1Wg1&#10;aG6G7Gnn965YekGidsm6XMdrsr+G9T1Gw7q+xQ0besevmqqJ2x/ZrsbKxSxtT0mUa3fPwZ8BA8EI&#10;WK01VhKxsJZqoARidhs0ddmOqbDMjdI5hQQPsSR+IX1NRd6Xxpaww4ueTmJGNoHjaotdhHw6MNha&#10;hzdnCAOZsQLfS4c9rBwEhkNM6Lh0CoEI5k9jlWt4/5H7mYFTZn/etKgTXLTenx3ElAWACqxHZgBA&#10;4XTpATBVZLDjxbHfc8OMqW0LhbM3osohcsECXq2yEOBv1Vi5mMXDlTqzT62TAAXufnpTRdYAmtmM&#10;4xQWCLAUBK5U43a9ylk/EDnOkZbqORRDY+r8QlNZ09y1GgDAEPB2tc2eKwxERheiT22xy0CxAg0s&#10;WCw8PxCKY+JxNWoXS95BgJercZtYAHYRoPP/B/i2SpwehoY6RxCFgL7idRztMsEo2HBgTwcKFDUA&#10;sFxtsQ9z2wKg09GBSh87/FtnWdxz3Ou7cuczabSpbQvFvO5kAQhc4WBXk1ba6vPuep3ITfFVADED&#10;/kGNTqu8RetOSJI9g09dV/b6FwCA13o7TkUBAkiy0ynToZdePUSAt6tx+7489iPk6P8x0Ph/AAAo&#10;hKOp0HNb37oSQHAlRjPGXtKqVR22M+ZXPYYDyeTVjjvZJPD36VjQ8UhvMh7YgoIsJcwtxUDwABjo&#10;br3N6dQTM1emKDEx/3YwEUiqcTtWt516OoBkO7URS0M498KoszWQyc5sBb5kIGqNbwMIFAI/o7Yt&#10;FBX6gaxeyxbXVGAIViumdtFIWo2VixkgmzFLJvmrMCTmE047EAAAAozxRbnlOn3Jsq8gCkQDhdsf&#10;KZoF27KhzmGSlRieR5Zk9jgdXTRc8Na8u2Uf71qkwdw5S+DqDZGz1XarPL5I59jtRWcsi0xsnQ/4&#10;p2qkHOarw1vVWLmyx4wfqbGyCbpSDdmElepkMfI31ZhddWRsHSti7fZHyk7Ds7bl1tGSPQLrGEY3&#10;QJSNgYvnFbNjrDoGIi8F6HCp7QtBVXaymNjJor0JDMRagAccT3loEzVeuGWJIUTltuQy0J4d9vLn&#10;OMQicfg1TjsQAADJOFgqI1KKEBgcvYUGOh+FGujdXJDDqxzp+JH8DpJtjS1dE3bVNrWFy9vNdVGH&#10;K79cR72DguRC4M1jtw2BTn+wq04yfrgiC/oHn7lhnxor1+AzAUfP5WmNjNdgNZBr1voiTj6X/JdX&#10;wFFKkjHpl8WDaswuIfDTY7cNxK6JrdbVuGoePXlPLnPaqUnGDjlaCtLYHMmbahboaVnueC3lXFSt&#10;nawKLUjM8fhfKJrFViufi+vLTntQDAM6niazKwmV2MkDABAYUSN2NPoiBVM7Xn+kaN2zmefsGLlc&#10;hpIXSbzG0xa1vTvMPbJsPJcQjH5QvL6w7ZEWry9SkIPI7S88/nPb/Mof5m4Nf1wYmJfPSmCNwN87&#10;OV8ccJC2ZYJBZ999ty98QF375PVFbM8QeH3huydGDHS3nnZwYsyuTkejfa4a/En+feGS69a0bitI&#10;vjrfVWUnK9UT+p0ac0IgrvZu+HrZ0wvaRI2t4Ssrsy4mD5KjdQ1zlce/7b9dAgvWDSLiWq8/XJFp&#10;n9ni9YeLnqQFwFOrWm45Q41PxuOPHMuNSE+EQmxuao1aKrQLuWnCX2KRjQUG4ilef6QC06tapa3y&#10;3f1GwxA/VOOQq7VX9PM1V7hbo0PFZgNQYKO7NWx5DdualnAEhZiQrBcAwDDEqV5/eFZyU3n90SKl&#10;5QysMVw715y/zXZG+7ms7CuB6ebxhzOjOy4qZqHVTJoO554brat7LVT4SplJmvzWdE+oW22Zr9zr&#10;u1YadUbBqIqKAQAOH6hLViR/zszw+MIfFUJMuQaHmO9MxSbPSu1ujrzJqMFn1LhqqmLwKzd0LF5e&#10;u3zCSNhkspnsa3f1ba5QGhnNCa+v61EUxug6o8mZGbp4oC/0WzVerax+9wEA+rufcAFsL9JhyfH4&#10;I88KxDeocVWGyGu3vFY5mnyRy0FMHMEqhkjekYq3X6PG56Oq7XR4WiPfEgYWqX9UPkm8M+0wkd1C&#10;52kLZwRUtvMLQNzfHarKUdVKc/vCdyOKTwuEgtGrUkjyS2zAHenu8jNLTyf3+q6VolbcC4iX2D2p&#10;sORHTUlf3tXX/geAz9d4/e7vIBqfUh83FSYeYIatqUTwXgAAd2vXV4XALyAKW+tvmPkwA9ybigU3&#10;qW3a9Gpsjl6Kgm8yDGxV20phJmbmh1NHuy+H5PaqvCDxtnbdRcL4jGH3u0/8EgLckRzNKt/oD18p&#10;GK4VQpyjPrYUBgCS8r504vDnyikBNJnGxi1nGsvqvzW2yN0OlvyoJOwY6A08qbbNF3bPhzOqqS0i&#10;c4nVKoey5qdTvZvKqp+10Hl9kReKTbc4RcRmKh6scMdt9nlaIzcKIz+rNLG6/sK+ic8hGW5MxwKW&#10;p8wqo0N4Whv6hWG4T8acvrb86WcnzwN5z1WJ5zn5HMwQTcYCoxsUNKfWrAt7jHp42hi/aHP6GYKC&#10;5yDT/GOqZ9OMrwPytEb/VRiQl6S0Uq8NKv65JuYHU7GgxXxoVxgef9tTAo3zTsacvraJr4uISbI4&#10;d1di438rD5yTHByY6ef1h6lyuUNOGsnC+sHegLMSDwuM1x/+KaL4oBp3jvhYRnqH+jbbXuw5l6y+&#10;ILKmto4vRRT/JJBeY/+kRCxJPAcsbyGQv9iVuPbPk02PzSAEAPY0d70bBH5IGOKqXCLE3HZ0a3KP&#10;J8kPAcIDBOYqgcaNAmFROceICXYSwN3AWCcAbkCDzyzneSSLl5DpaxniX+/pae9XH6FVFL7+9dvq&#10;l54tPsqEnxXIF9l/z4CkZGIDuwwpf5VMtD829vlUHzjT1jR3rTYQLxOG+Ccs47vPTAwMzxLzVkDI&#10;CjCuQUFNuVY7z0XMEodZwFcRxKPJ2MaEg2OEAMBrW6LvNZAuzX33geyt85YMgEASfw4ED6R6F/0Y&#10;4EqzzP+natl4g2Zeo3/rpS6srchWdNUIZNcPdjuspbVANPmiQyBg2jYOLLi1chvuqfEarz6PhvFa&#10;takYZngxGXviDaXWZlSLxnVbznTV1+6zdvInBuYP9sfaC0pGvd6/bVEDuiwXP2fg7cnu4EfUOMAV&#10;htv/ln0GoqWF9pJ5f7ru4Bvg8cpNp2j2rfVFr68RYLksmnlgeOnAwPVH1XjV2XBPjad2+DkBsEJt&#10;KoZZvpKMda8o8t3HRl/Xf7ksrFkbc6x26aKhxz9X4fW047Bx3ZaVrvp6yxU0slJetivR7jgXV7Wz&#10;cCKcXU1tUWmvd2ydaZqfHOjZVHTnipbj8Uf2CERn2YNLIKa7UrGQs+Sbc1SjL3K5a4pFosOUbd4T&#10;3zxayX7u8PoiaRTYqMbHMDMlY8Ep89dNuTaTAY4zn/Hf8eB4HqVizrkw3FbPouS6D0n88XQ8OOWC&#10;fW3mNLVFS45qMPHvkvHgRWq82jW2Rq5wGfiAGs8nCZrT8UDJ7/6a87edVbvYVTIHmUnm9wfim2Ys&#10;47qnNZwShshbSjARS5LJRMhRDq+5pOo7We7W8G2GAVdbuzK2j5liyVhowdZVKmWqE1wlLLhRLEVj&#10;860XumpqipYTouHMG1M7ri076eZsa/KFj4IQp6pxsLnRwe2LthsCtqlxsPn5OXf9LefU1dUVTXgr&#10;TbpwIe1unUNwslQNRPRIKh5yWHR89qxpCb+91lW8xmQmK8/Z3du+V40X4/V21GLD8qL5urJZefWu&#10;3vY71fh087ZFXkbA09U4E8lkfOF0sGC6RogqKZ0IbeRp/KlHFP6mtig3rttyptq2ULnbuv5lJjpY&#10;zHJeLGx0YqB385NA2YIhczbNS+ZyBwsAoD8eWlKsfImdDhYAQDoe6GLmgmzR2UzWo8ZKGXzquj0k&#10;5fVqnJm+Xx0dLGcZuucpLtaRJqbjc7mDBQCwuyf0OynNH6hxMPlSqx0sAIBksjOToRNeNU4MfbPR&#10;wQIASHYHX8tFllYttA4WzIVOFgAAMH5XDVWaq77+ea8/8ieAjrlxTKaBxxe+pKktygYY/6q2TYdk&#10;rH3apiHnkv745svy7zPx0WTPpl/mx+xqbL71QjU2G46PZCa8xybxh/PvW5WMBf3590nSk7vK2CyR&#10;SrQXVJNIxkJOplJwjW/bx9RgOdy+ZS+psdm04ryttlINTCcmmFCo+ihQwSjJXJRObPrUyd11AJIh&#10;098T/PnER01td/yGFEvOyylHnIoFmvMfY5e3JeqorqccNvKSjko2szQNG6eq35zoUCTjwb9XY9MB&#10;EZua2pZLry88PFeOTSU0+ra+w+uPSCHEL9S26SJJzruacU4Q0ftyJ1vikYxcr7bbc5ELXa5L1Ohs&#10;+POOa4eAaLxszUA8+O8TH2FdxqTo6E1KJUJvUZoty5rZd4/flnJCB7ccBrkmdADLJZBPU2Oz6bT6&#10;2pvU2GxJxgPjdfSY6ZV9sU0nJj5i7pJZcfFYRyt7NHuu2m5VMhEcT6tADEqZHdsQXLRRDdoxsOOa&#10;FyTBodw9hIHe0LRsYqt2c6YjkQW2lZzOCRSirqktKpvawuTxRX/pab3tbQBXGHNhDVsJY/87wkUd&#10;Lrcv/Lee1vBfmtrC5BK1v0GsbD6yUhj4RDre7rh6/XySiof+kyQTAIDTQtnulg83COLxorOzTbLx&#10;JciN0DkqE7T74N7rmZiYydH3cFfP5l+P33a4u6lx3ZaVaPDkC/NtmI50Nc5w89oNt066gHmmMcFR&#10;AMnJWKriufpmU7o38DgTMjDAnv7Nz6nt9kk+NLT4WjVqTwdiBdZBs8x+FoCYJNgenZsvHB/EmeT1&#10;dT2DwniTGp9uo3lKCBAEAB4BwJcY6DgxHkbkg1B1J8eTkGkJIjYAw6kAsAIRG3IJUwhn6aROh58z&#10;T923b/5ciVZKU1uEJfP+dCzk6Eek0R9+2IXifcXWssyWprYoS4mfSCc23q+22eH1R6QkeGwgEXyP&#10;2maHxxc5iAhLrexwLMXtj/6DYPqG07UmY6V/qu49YzqejoWqYtrQ3RJ5v+Hi/7C7pm8OQE9rNMPA&#10;R9KJoK3qBCq3LzpiCKjt7w4IcJBvytPa9TZhGL+rxOexqS1MGcJP7F6gO3fn1Ic1GW9/sxqbCYgC&#10;UQgDUSAiNiDCGoHifJfAtxsoPmgAfKBa/wSKixFwPSKuHe1gQa5m9mx0sIiJ6G7dwSqOmVkwFxSM&#10;tcuFwnZ5i5ngtIMFAMgss66M3Kw22CbgOSLuVcM2oSC6KXfx5UxD7bJNAABrWra+XW2bTQJgkRqb&#10;LSzg76drl/ns6kBhgAsFL1Fb7CLOuInpuJMOFgAACBxdvlAJAnfH/7BdjS4Ujk8OM+3Y8QOOf4S0&#10;WSLxYCoemrQg8MLW4UIEAAZHIyL5zr0gainZ6RzCgPDw4b/CLrXBLpTZjyEIpyd+BgFnIwKAt6NW&#10;bbQDTfowAIBLGA6neSrjTPfXXgNVNoXpEngZAPFa3zbbdS2r2cqVUA/AJNB5TdhdicSzCFiQ3Ncu&#10;YvwCgEB367bb1LbybC/YZbxQzLlO1tDTnYdk1rxRjWvVr9/hUPh81tTa8HEAgSBQNLWFK7I1vaae&#10;d6ux2cJcmatiSeL3lRgJTSauTaYSgVvVuG3EBCCwaZI8RVYJV64WnBDG+9W22XDaslO+NXa7qTnS&#10;MrF1Ngk00PUNNTqXLXvjsi8CMAIAuP2RD6nt9myXIKlo3j07XIJzsx7C5XiDEjGT45G1OWzOdbIA&#10;ANK9m/5NEj+mxrXq1d99wNHal3nPML4H4yMHouz0DV5/5IWx2+Lk9PCsIzTzCsqWz5T4oBqbLU2+&#10;6DNoGI4/1x5fZMLIzFpf5K3592cDAoz/2JPgX01snXnulm3JsdsC5eL5NEqLgLeOTYMa6PzzTVDj&#10;qIpJU0v4npP/D9Suae5ylGonY5pvVGMLyZzsZAEApOPBd0mm/Wpcqz4mZN8C0Llgh4un0tQaKUi0&#10;6fF3XafGprLGF/Yh4oRF815/pCoSvqa7r/2TGivH3r7gs2psNpzT0tUEAiZswvH4ogfz71slBH4/&#10;/36NwN/n359pHn90vEMDACAMscxzYXTWchw1rrv9TMPlyks8a2DtIpjTiXrHeFrDBaNOnrbwl9WY&#10;Hemea15RY7a4xOfz79bUGHvy79u1p7cSOybnrjnbyQIASMdCKyVRWSc2bWZI4o8PdG8uWTNuIXO3&#10;Rq4GAwvSkwg0tqzdcJvlXFCedVtX1QoRU+OI+MZGX9e31bhWvsbGLUvqXUZBp1EIOM3r73pEjU/u&#10;CmOyygoef/hVNTYT3P7IVwVCQSZ9wfBTr/+OsnM4la9DuOqpoOgwAizy+Lvm9EW22xe5ShiiIGmw&#10;ANHh3XBbwTlh+nW4in0ecYZKrM1XVbOo0QmvP/oCIjja9q5VHpvmJU4zl89nXl/0URTwLjWejyQ/&#10;lEoEP6DG87n9XR0GGiWvfiXRnnQ8NAs/kvOL1x+9BhFKLgYmooOpeGi5Gs+32hdZs0hgyQX8uUK6&#10;T9YBbJdq23Rw+8I7DSHOV+P5iCCcigfa1fh0cPsjH5pq+owIDqWOHlgByc6M2lbNPP7wYwLFxWo8&#10;n2T+SToWvEKNT4e1G7reUlNrPKHG8xHT8aP76PRKrIlcSOZFJwsAwOOP/EYgvkONa7NjOOs6e0/v&#10;lxb0MPFEHQKgk1at6qg/5Yxlv0LBb7O+HZ2YTPHj7EH4u8HBwAiMFoWVDad9xWC41voOMGIi3nt8&#10;/+E3DQ11Do/9T+qjtHG5/Z4b7qlpMl4NgYFft/WeARw9ynTGvtim4Vysw1jtb/AtwtI/ZgqSxMTA&#10;awbiTz6Xt0vL6cgCAgCvWtVRf8qKZQk0+E12XpuJcLdx6FAomevc5I6TM+PH2us6/kkU8J1c2Nr/&#10;xETDB0bE2ft3HhidKqumz/XJ7/6i1y3/L8NFb7H6ugCIgcT9I6/A/8599yv4nb2ow9X46vJLXDU0&#10;mpDX2v/ERMMjUq7d03v0eYBOrsB7P69ZOqhzRaMv0ukSeLMa12ZWf+2BGni801TjC43XH/0kA68S&#10;TFeCMM7O5Z0R7GyaXt2lZ+3EOBFTbjeTQCI+BIj3IshnkrH27y30E2bjhvA7DBesB4QrALAVMXec&#10;Rt+7Mo41EEB+hnrOLSe2bew9A2BCBuCfMfDjTMP3pXtutLQGx9vS9Vk2xFkMtNFAY4Wzz2P+51Ag&#10;mfxnMOBuNDmdtFg+ZW1zpEUY+DZmvsQQ+E7E/OPk5FgLZAknGPgHwNCX6gnO+G5Eb8u2T5AQbxAs&#10;rkEDznJ2rCHveAs0ST4rAL+FJqeTfe0/UR9ZjKelq4kF/i8Q8B6U8B5hjP0fyADlVPs4eQ5hSSMg&#10;xHZi7k7vP/gdGOocvajQYL51sgAAvP5tyxFdlk46WmVJomPpeMhxQr35xttyyxkI4nxw1TieOiUG&#10;AuIRYaCjJJEMDEx8E2TM+1I7rp0Xi4gradX54dNOqRNnMpgPCsPVqLbbwgASaL+BeIaTUy4DABA/&#10;DCiDmb+6nhsb1bSrcd3tZ2I9X2QAO9qFBgAgJR0zBb0fhl3JwZ2Bl9V2K7zeO06FpSNnEOPPDGF4&#10;1Xa7iPjODMrIntiRvRUb9SmTt+WOMwhpAxj8oAHgKJcaMGcA+QPHzOzTQz3XlbUe7fX+bYuWApzF&#10;LL4pROnpyikxgEnyx4bgm5LZU4eg78qs+hDNyTe+ynn9kQFEXKvGtekhiW5Ix0Nb1LhW6Bx/1/o6&#10;MHrQYqZwyZxBzK5NdRd2hryt4RNoiHo1Phli/odULHivGtem5vF37RdorFDjkyIK98dDBeuXvP5o&#10;LyJsUOOTkcz/kY4Fp213X2Nz9FJXDVgafYLcdJEcfnnkNXv33nBYbasUrz+6CxHWqPHJsKQHkonQ&#10;R9V4tfE0R9ehi/qsTvETU1aS0bgrsXHadgl7/OGdAkuvxctHJv0o1RP6uBrXirP0Rs9V7pZwm+ES&#10;emfbtGLo7w7O68/RdHG3RuJGkZ2F+aRJ0XRPKKjG861tDQdrDBFW4/lI0sFUovRibG1qjb7I5S6B&#10;JadomPlwMnZwealRlNUbImcvqsWCTrNq5GWoL3fEyi6vL3IIRencapLoa+l46J/V+HRobI5e6KqB&#10;ghQH+Ygpe3QfNcy1xdhrWyN9NQauV+P5iPjOVDw4IxUy3L7oBkPAlGWmDmQOnPJiX+dxNa5NbkH8&#10;OHpaoj8RLrjcwboKbQJiZgDKiAvTTwUK0gZo1rl9kW8YAotnVWb6Sn8sZGmN4dnNd61eUpMtms+G&#10;mf+cjAX/hxrXyjfZlnZifjUVC56qxifj9Yep2KgGM5PT4tXlKLWByDTpvQM9oRlOTPr5mqa2pqI7&#10;B5loJBkPWR7FrTZefziCKAJqHHIXRV9JJax99yunQzS1LZ90J2slikUvRJamK+a6VE/gw/3dAZQS&#10;f8jEk15daqVxrjwCSMKrk7GQ0B0s59Lx4BeKJdVl5oetdrAAAJ7tvWovSSpIYEpEB3UHq/KklAXl&#10;b5iB7HSwAACkyBQZOSKejQ4WAEAqFryYSSprq4iJKDzzHSwAgG9mTYAi+eIkz+UOFgBAMhYKMsuC&#10;aUBiemTmO1gAAJ3EbK6ZuKkhR3ewyrcgOllj0ongp5LxoAEM/5irpaY7XBYRAHHWpDX93QFMx4N3&#10;qQ/QypeOhQpyvCVjwYIf8amkEqGtDDBh2iQVf3LelB+pJulE+8NEsDc/lvkrLM6/b8XAk9cfBUm3&#10;58cog7bf+0pKxttfp8ZSRdaWzZSB7sCTzPznkxHi4WGeF+ttk7H21WqnJhULVaR2aTmSsU2DRPDb&#10;/NhI1iw6sqlZs6A6WWP6Y4FvJ2Mh0d/9h1pm+EUuWth7X+iI2GTJ3+7vDhj93SGxu7d9wo+KVjmm&#10;Kb+Yu0WcBSq7SCwPZ8azdUumfTOVyHIhSsUD5wBIhtxGqxPlrp3qT4Q2jt1mBkr1BUfPSbNHShrd&#10;CUuczfDb1PaZlj8aK1kc37Nj0+DER8xdJPm6sd8fNs1Pqu0zLRUPvXOsoDsTDQ/2bnpcfYxm3YLs&#10;ZJ20XSZjgb/p7w5gf3fIIKL3MZt5V0wLDzO/KIn/Z393QKTiwZpkIviP6mO0yhvoab8nt6QHYFd3&#10;6Kdqu1X56Rj+8tLIhNp6WuVxLnUVJbsP2JomVJHkhwAAJMjtattsMA+IyyDX6YNdfe0lF5/PLMkZ&#10;M+NXo3NZKnE4wjI3q5Ls2eQ4rUYljI3SkgnF14tqlul5VgvcreHPCISPEIg3q21zFQMPCcD7U/HA&#10;3WqbNju8/qgkkofTiXZHuwDHFmXrdRTTz+sLP4gCLuvvDjm6YHW3bPuQ4XI92N89WA9we1kjYpXW&#10;1BZlZuJkzNlrqxSPL/pFIeCuefi5Rq8/LIHwWDIRXKo2zobGlsgnXC6+z+nnWtM0rWp4fF3PeP0R&#10;x5sJGn23/d1ku9+0yvL4wj6vP1KRKdlqe88a/ZFjHl/k52p8tqxpCV9QbceoUrz+yIDbH+5X47Pl&#10;3PXRc+brsZ5pupeqaVWCkX9J5Lws1PCw/CmRrJofx/ns+DAMgISq+XGsJGS4LxUPXqrGZ8vuntBO&#10;NTZvMD929NWRWVvwrhp8KlA0HYxmn+5kaVqVOJ450ZVOBB5R43YNPR06hIw6Ce8MGHo6dMgE/oEa&#10;L4dkWVVlSZjlr3Nr+qsHA1fFmrVKG8mc2Pb8MzfsU+OziYn/qsY0+3QnS9OqxLNP3fSiGiuXdGXu&#10;UGPatEAW1kvSlIJszEIeqskNJDZVXYcmK8WEdBfzxZ4dN1bdbkkT+DNqTNM0TdM0TdM0TdM0TdM0&#10;TdM0TdM0TdM0TdM0TdM0TdM0TdM0TdM0TdM0TdM0TdM0TdM0TdM0TdM0TdM0TdM0TdM0TdM0TdM0&#10;TdM0TdM0TdM0TdM0TdM0TdM0TdM0TdM0TdM0TdM0TdM0TdM0TdM0TdM0TdM0TdM0TdM0TdM0TdM0&#10;TdM0TdM0TdM0TdM0TdM0TdM0TdM0TdM0TdM0TdM0TdM0TdM0TdM0TdM0TdM0TdM0TdM0TdM0TdM0&#10;TdM0TdM0TdM0TdM0TdM0TdM0TdM0TdM0TdM0TdM0TdM0TdM0TdO02fX/AXzvnzv2OTmhAAAAAElF&#10;TkSuQmCCUEsDBBQABgAIAAAAIQDf6Vbc4QAAAAoBAAAPAAAAZHJzL2Rvd25yZXYueG1sTI9BS8NA&#10;EIXvgv9hGcGb3cTYYGMmpRT1VARbofQ2zU6T0OxuyG6T9N+7PentDW9473v5ctKtGLh3jTUI8SwC&#10;waa0qjEVws/u4+kVhPNkFLXWMMKVHSyL+7ucMmVH883D1lcihBiXEULtfZdJ6cqaNbmZ7dgE72R7&#10;TT6cfSVVT2MI1618jqJUampMaKip43XN5Xl70QifI42rJH4fNufT+nrYzb/2m5gRHx+m1RsIz5P/&#10;e4YbfkCHIjAd7cUoJ1qE9CUJWzzCIgZx86MkDeqIkCySOcgil/8nFL8AAAD//wMAUEsDBBQABgAI&#10;AAAAIQCqJg6+vAAAACEBAAAZAAAAZHJzL19yZWxzL2Uyb0RvYy54bWwucmVsc4SPQWrDMBBF94Xc&#10;Qcw+lp1FKMWyN6HgbUgOMEhjWcQaCUkt9e0jyCaBQJfzP/89ph///Cp+KWUXWEHXtCCIdTCOrYLr&#10;5Xv/CSIXZINrYFKwUYZx2H30Z1qx1FFeXMyiUjgrWEqJX1JmvZDH3IRIXJs5JI+lnsnKiPqGluSh&#10;bY8yPTNgeGGKyShIk+lAXLZYzf+zwzw7TaegfzxxeaOQzld3BWKyVBR4Mg4fYddEtiCHXr48NtwB&#10;AAD//wMAUEsBAi0AFAAGAAgAAAAhALGCZ7YKAQAAEwIAABMAAAAAAAAAAAAAAAAAAAAAAFtDb250&#10;ZW50X1R5cGVzXS54bWxQSwECLQAUAAYACAAAACEAOP0h/9YAAACUAQAACwAAAAAAAAAAAAAAAAA7&#10;AQAAX3JlbHMvLnJlbHNQSwECLQAUAAYACAAAACEAJC+0R4MDAAAtCAAADgAAAAAAAAAAAAAAAAA6&#10;AgAAZHJzL2Uyb0RvYy54bWxQSwECLQAKAAAAAAAAACEAYC2Oky3UAQAt1AEAFAAAAAAAAAAAAAAA&#10;AADpBQAAZHJzL21lZGlhL2ltYWdlMS5wbmdQSwECLQAUAAYACAAAACEA3+lW3OEAAAAKAQAADwAA&#10;AAAAAAAAAAAAAABI2gEAZHJzL2Rvd25yZXYueG1sUEsBAi0AFAAGAAgAAAAhAKomDr68AAAAIQEA&#10;ABkAAAAAAAAAAAAAAAAAVtsBAGRycy9fcmVscy9lMm9Eb2MueG1sLnJlbHNQSwUGAAAAAAYABgB8&#10;AQAASdwBAAAA&#10;">
+              <v:group w14:anchorId="586256ED" id="Group 13" o:spid="_x0000_s1026" style="position:absolute;left:0;text-align:left;margin-left:329.7pt;margin-top:2.1pt;width:180.4pt;height:179.2pt;z-index:251675648;mso-width-relative:margin;mso-height-relative:margin" coordorigin="1085,2525" coordsize="22914,22767" o:gfxdata="UEsDBBQABgAIAAAAIQCxgme2CgEAABMCAAATAAAAW0NvbnRlbnRfVHlwZXNdLnhtbJSRwU7DMAyG&#10;70i8Q5QralN2QAit3YGOIyA0HiBK3DaicaI4lO3tSbpNgokh7Rjb3+8vyXK1tSObIJBxWPPbsuIM&#10;UDltsK/5++apuOeMokQtR4dQ8x0QXzXXV8vNzgOxRCPVfIjRPwhBagArqXQeMHU6F6yM6Rh64aX6&#10;kD2IRVXdCeUwAsYi5gzeLFvo5OcY2XqbynsTjz1nj/u5vKrmxmY+18WfRICRThDp/WiUjOluYkJ9&#10;4lUcnMpEzjM0GE83SfzMhtz57fRzwYF7SY8ZjAb2KkN8ljaZCx1IwMK1TpX/Z2RJS4XrOqOgbAOt&#10;Z+rodC5buy8MMF0a3ibsDaZjupi/tPkGAAD//wMAUEsDBBQABgAIAAAAIQA4/SH/1gAAAJQBAAAL&#10;AAAAX3JlbHMvLnJlbHOkkMFqwzAMhu+DvYPRfXGawxijTi+j0GvpHsDYimMaW0Yy2fr2M4PBMnrb&#10;Ub/Q94l/f/hMi1qRJVI2sOt6UJgd+ZiDgffL8ekFlFSbvV0oo4EbChzGx4f9GRdb25HMsYhqlCwG&#10;5lrLq9biZkxWOiqY22YiTra2kYMu1l1tQD30/bPm3wwYN0x18gb45AdQl1tp5j/sFB2T0FQ7R0nT&#10;NEV3j6o9feQzro1iOWA14Fm+Q8a1a8+Bvu/d/dMb2JY5uiPbhG/ktn4cqGU/er3pcvwCAAD//wMA&#10;UEsDBBQABgAIAAAAIQAQ+LcfhQMAABQIAAAOAAAAZHJzL2Uyb0RvYy54bWysVdtu4zYQfS/QfyD0&#10;vtHFkW0ZcRZu0gQLpLtGk2KfaZqyhJVIlqQjp1/fM5R8zQJtF32wPMMZDmfOnCFvPu7ahr1K62qt&#10;5lF6lURMKqHXtdrMoz9eHj5MI+Y8V2veaCXn0Zt00cfbn3+66cxMZrrSzVpahiDKzTozjyrvzSyO&#10;nahky92VNlLBWGrbcg/VbuK15R2it02cJck47rRdG6uFdA6r970xug3xy1IK/6UsnfSsmUfIzYev&#10;Dd8VfePbGz7bWG6qWgxp8B/IouW1wqGHUPfcc7a19btQbS2sdrr0V0K3sS7LWshQA6pJk4tqHq3e&#10;mlDLZtZtzAEmQHuB0w+HFZ9fH615NksLJDqzARZBo1p2pW3pH1myXYDs7QCZ3HkmsJhlRZpMgayA&#10;Lcsm+fR6AFVUQJ72wZ5PQANyyLM8TXvQRfXrSYzryTHGeJJMyCfepxCfJWZqMcNvQAPSOzT+mTXY&#10;5bdWRkOQ9l/FaLn9tjUf0DjDfb2qm9q/BRKiRZSUel3WYml7BcAuLavXqD/NgEqWTUcRU7zFEMCN&#10;TmcjqpJ2knO/lVNpT1p8c0zpu4qrjVw4AxojTsDk3D0m9ezcVVObh7ppqHEkDxWC8heU+Q5IPR3v&#10;tdi2Uvl+vqxsUKxWrqqNi5idyXYlUZX9tB4a6az4HQnSbGWjaRExDFYQwmw5b6UXFbWTcj2mR5oD&#10;79iq+02vgQrfeh1m6IJ3aTEdjfJ3/DkwMCmKPB33DEyLohiPijP2AFLr/KPULSMBqSPbcBB/fXK+&#10;J9rehWBTmgAM2TfqbAGMpJVQCeU+iCiFhgc3mNvjDe0d4v9pSJ8rbiSypLAnXJrm07TIrsfpnksv&#10;hMMvesfCyAzeNM/M77A80IbW+4T3M3UY69PxpAEuAiv57IAvJvwwnaMkHWf5/wgv6+bReJQnoR8H&#10;4Pc4H9Mmye9WO3SFxJVev6FEq9FOXBzOiIcavX3izi+5xQ2ORbxK/gs+ZaNxiB6kiFXa/vW9dfJH&#10;z2CNWIcXYR65P7ecLonmk0I3AQPuNuaDcp1PMij21LI6tahte6fx6KBRyC6I5O+bvVha3X7F47Wg&#10;U2HiSuDseeT34p2HBgMePyEXiyD3d8+Teja4sdIAGjH3ZfeVWzPQ26Nzn/WeP3x2wfLet6f1AiNX&#10;1mEEjqiC1KSAy0EKTw+ks7ftVA9ex8f89m8AAAD//wMAUEsDBAoAAAAAAAAAIQAB9wPpfjoAAH46&#10;AAAUAAAAZHJzL21lZGlhL2ltYWdlMS5wbmeJUE5HDQoaCgAAAA1JSERSAAABLgAAAS4IAgAAAL8i&#10;aBQAAAABc1JHQgCuzhzpAAAACXBIWXMAAA7EAAAOxAGVKw4bAAA6I0lEQVR4Xu1dB3xUVdbPzGRm&#10;0gsJKYRUSijSSxAlIFIEKSoEUQRxBb9PBSxg+wR3EVhdKSpYdq30ElCkWOhdIaAUgZXeUyAhIaRN&#10;/84QQsqc++a9O28mM+G83/x2Meeec8/93/uf9+adc89VWCwWL7rcA4HbM1H9/7hdqzavlf8hdrpr&#10;tmPqiTUIA5HQlHvYcigqJBvBNGz+JmxWKblTUnARAtLXgyjHeM3y6lV1Sg4bogbpSCPpTorSsNuI&#10;qOjIrLm1rt25l8l7af1Aa2kKMnkp0ox03xga0g0RFUXOkYc3k74yEA3pRlioyWdJznlxnldiLBMV&#10;5ZzLu9WWmJVWExu3uj3yOiPbLRHQISrehfQRyxwpN0axNmvAzcsBOWeN03XWgzavOaKinJPqbrZ4&#10;V4XgOJhG+XurFUKWd8rrtIT7ocguFBTMcCv+WF/3M6IQfH6yjYmNLCDthFTFmhUejjxWbPoQyQp7&#10;UMvPQ+iRqGgPdtfKbWKKMqxJRkxRguVaYWNV4CX4WqEmE+tsp98pPCQqupZnInpzLhUduOVKZGPN&#10;nkQM3f2bsNmNSaR+F9BvRfdaAbfnr3IapU4oMpxqJnjt4a9whKw58EPMvebEescS+lEpBw/BPlHR&#10;7abdhQ5J4yXe2o4NTyekPf9l4iEFM1y47EV3ZTO50giD9sO+MUozzsVGe3cV0ci4vKE9cOTh4e1h&#10;0V3R5fMrskN7y0CkmTvN5GIj3q+9m8ctrfJGcg9MKhCi2tvzkyHnGtttJaKiqJmhRlUpzVxw9hZw&#10;hRH35OQdrwQJxR6jIzy0flFRXNE9aSZ7gLF8mI6HGe/AZSfAwBF/qIVNVFLoY4+h0hdS9ScVoqJ0&#10;BF2h4YyohuxsrMltW2B4CFnDigwmqtyNueZOfhKWP65XuRR0V+SaGhcoYfuHZVuUMt4bEXqj6Mjm&#10;uwuwF8tcKbfUGm7X5CE9oLpwXqV35aRnVORWJlOqnSi6iWokHSwZNUQwTEQTAYcQHjpExe7du8s4&#10;fNebSk9Pj4yMRPvt3uNBlj+XL11uGNsQlfpotRs2/ISK5n3y2apV36GivLy8sLAwVncrli+t4qQM&#10;q7jHA71YfV26dCk2NhaVXrp4KTYOF0H7bVs31dAqd3TVd99/9unnrO6+/35lSHCIrfTq1Zzhw4e7&#10;fj3I2OO2bdvY1nAeWtvDb0W+KzU1VUbvXW8qOzubNfDOKV29FGr0k5TUlCXq06cfy+DceZ+ytDRa&#10;f5YI/p6VlW02W6p8zA5ebdp2qNKdxktR+UlMalL1P63/Vt7+JCY2ufPvGv9o3aa9iXGtSF/J0oK/&#10;w3eQ0WSq9jGajEZTZmamwiWXlwJ+n8n/AV6wADGZzJUfs9lU5QPTSsEM138JSOzRsYchwc7s3WZB&#10;bq+JxMEINq+IE5R3a/vh7ktea1xuVI+BYLdGoiIXsLWmJDsvRVBNRBPX4MGiqN2/u8Y9nofSKi9S&#10;iYq1PU1i+pedgNU6FUc1ca3EjOYua8P+cVg9oEFUdPeFcXsmKyfUGbwUxzNxrcQDWjW9xT0TcMSP&#10;BWtp81AqxEqqbeMY2K7RtiFfrbJRbkK6BkPX9mKTHWdDQtsppLuia+fIkd6qp0k5YomtK45nLn6d&#10;45yhOsWqLX52WFnpBVHRKTMiu1Gbx1TowRn3RjArmmeiG8qOhjsatEUDI6HAnPGng0OIf+fOnSgo&#10;CxcudBOwRo0axfIE4oqsEH+jRsksLYiGDRo0EJX+/scfHdq3R0V/nTjRLBm3efny5YYN8ZyB/Px8&#10;H19fXx8fW5t6vb6wsDA8PBztbsDAh9OGDkFFTz/9N9bQ1qxdF85INhAY9fHj/23Rojlq88LFi/Fx&#10;ceXktr0+/mh2SEiI7d9zcnIaxMSwnFwwf76bLK2nR4+2emIzttTUbtu2b7d10v4XJ198H7QEQvxA&#10;RW6zMiqWlpYKTBtfiH/s2P9leThp0uusYH1ys5Yc4zp06LBA9F9ABLF1jkyAQYMfxWxacwAGDnyk&#10;ajy6aqh65szZ1RIDKrICIIgfHFKfHexmSjIzswQi78XFxRw2ZVdZsGBBle2X1V4/WUP8NuF7MdNB&#10;D6hu8iXrBm7gvxOxx1CbR69K76vG+NxgTLK6UJVyogwL4GSrT1QUheld0UjwEQoR3l5oAmriXgK5&#10;NbiS6Vc+GkkkLFchKrr1QnAr5ziWl81TnFsNiOUMJ/3umLP/sxDrmajoEYvDjZzkImTVVVojsG8z&#10;NL6FzI9QDX/Y3TvKUDsuEhX55/Bu1ryzLO2AYJ9XGBOE0rftW2S9UGH8nT0Ce18a8i4AoqK8eN6d&#10;1u5QBxu+6LuOHewq3x/ZWpSJNDKY4f95TFS8O8njpFELclLgKbXKrc7OXU/MTVHM4FA6O3SDdDTj&#10;wVkh/pEjR6LjmjJlihigJLWZNm0a2r6srAwi5CxTAiH++ITGLC29TjdmDB4l37xlq0ajQRVhO+zw&#10;x4exbE6bNhUVHT58ZMJLr6Aio9FYWlIaGBSISsPDw1o0x8PuQcHBkybiNh95dEhBwQ3UYFZW1uPD&#10;0lARxDB1Oj0qKikp+Z//Gcsa9cRXXw7GQvxXc3KioxuwtIpLin2wnAdo/84770haNmIaT3v3XbTZ&#10;okWLnn56NJq8AHHF7ViI3353HKHnchW+EP/kyZPt+ySlRXJyMmsIzgjxy76L38c3kHsK7iiaLZbb&#10;n1tb/kNC67MSAD6YOVtMuLlGm/HjX2IZjG4QxxL5+QcL5CFcv369Rii8/D+B9gI/9opLSlAt+COs&#10;BIm/Eu086L49eTILq1shfvwCXnAgTLv4pZDejdtWPrXJ9fzmksFKfEi0+uQ245PfEfqtKN+ik392&#10;JPhWGWOoVTckeMzblHUv47VXVa/aq1sXA0lUlGMG3caGi1eP24xbqiOyV8+R6gDSnqgoA4i3TfC/&#10;x5bPBzd6hHNkUALVaoTN2i1z4+h7TkdGJaxLVHQetmSZEJCAAFFRAlh1pSk9xrrjTBIV3XFWnO+T&#10;2MQ153vimT3I/G1mnY5aCPFPnz5dRvghmvTXX3+hBrlD/Cld7oO95KjNkuISCN2hIo1GO3UqHmX+&#10;8stvzp49wxp17rVsVAQh/oz9+1larVu1SknpjErD60extB54oEf6iuWY1PLV19+wtJYvW3Hm7FlU&#10;ClkB3t4qVASlBurVq8eyefCP/axd/NHR0SwtSBtghfibN29+4sQJGZcWxMDfZYX4Fy9+mlEgQmKI&#10;vwqnuePLdTjEL4BJWtpwVtg6AXJ0GOX9IyJjWCKBEL/wLv69e/ex/LQT4od8gGrF/2//J2MXv/XA&#10;AtjFzwpbz5o1hzW04JBwjmD3rRA/8wIqsmzeCvHLeQEVmSF+dskYKSH+ahNBD6hyTp7H2KLn01qe&#10;qsow8G1HFLR1uJanpBa6r7YKbJZELTjkgV3y/lTEvgIrpoDuih64EORwudqiIELKASnDRtXsoOpN&#10;qsAO/yQqOnESPMI00dA50yT4G6A6CcvvsURF50yEp1kV8cRFvy/FTyoGp83dscaXIFFRPL7UshwB&#10;9hMXIVQDAQwq1lcaUZGWjzgE8PumiLupOPNVWjnDpmQn2Aoinuirs60qHwXGRlSUNkms0D9YuVFY&#10;yLIF0TCWCCJXLNHJk6cEnDt27Lg01x1ofe1a7qZNmzdtRj5bt25nGYZSA56fnV6DRxK+JqQ+0BMV&#10;pa1Q1jEbYCU4KIhly8/PjyVSKplT0LRpEwHnWrZswZLmX79qMevRz2uTXmVprfnhe5ZWp04d+vbt&#10;j34OHjrEMujt7W3zQCtifUpY7dLmzmWtRdw3EV+Iii6bIOqoKgK2dxsRLL1tgKXrZISd/BuZqOjk&#10;+bvLzYvnVwVQ7nVTZLx3ccasEhWdgSrZrLx/2bmTiXynUYmoS6mK3n+dNLtERScBS2a5OGiXaI48&#10;2Lr3nBAV3Xt+7hrvRD7J1l0mUrbNXbPWaaBujgDdFd18gsi9uwWBWtjFv3LlSnnRlX0X/4kTJ1ke&#10;vvzyq79s2IhKYxo0uJKZiYrCwsLgOHtUBHvSS0vw3ADYxd+2XUeWJ3t/283axS8Ar8DQQCs5uSmq&#10;O3LU6MWLl6Ki+vXrX7t2DRUFBwcX5OMiAQ8hiSIqilmFACq+s3bxN2vWTN51lZaWxjoDAgr1j2Lv&#10;4t+xYweHJ66mIoeL3CqOFNTIyMArWQwf/vj7781AXXrr/95etmwFKoqLi925YxtrIPHxcajowoWL&#10;wmNnKQpoAbeB4WiDcS8+P2/ex6ho9DNjFixYiIoaNWq0ZfMGqUNzBhW51wmHojOoSA+o0iYiMCAA&#10;CIB+4K7IsgWn6LC0BOgkoFIukua6A62DAgNY2v7+fhxDc8CXOqtKVKyzU0sD8ywEiIqeNV/kbZ1F&#10;gKhYZ6eWBuZZCBAVPWu+yNs6iwBRsc5OLQ3MsxAgKnrWfJG3dRYBZ1ERYnq1fnFPmsDOepPJxDJ7&#10;a9M6fkEZb5bILkqoIp8WmBLwRGBoAiLZh2Z31uyO3QUN7DrJ08AZhfp5/HC5TnZ2NmvszVu0YhWf&#10;HzDwEZbW48NHsLRi45JYWmvWrhM4sD4rC3cyPz9fQGtF+kpWd40aN2MpPvpYGkvrsSFpLK1GjZJZ&#10;WukrVwk4CUNAFWFeXL4W5OwQCvXzccpZd0U5B+dyW4GBgaw+o9k5WbENY1hafn6+Lh8E3mFAgD/L&#10;k5gGzENjBLIX/NkG3WTInuIGUdFTZor8rOMIEBXr+ATT8DwFAaKip8wU+VnHESAq1vEJpuF5CgJE&#10;RU+ZKfKzjiNAVKzjE0zD8xQEiIqeMlPkZx1HgH8Xv8DpEZ6CGavqPsTB8/Jy0VG0a9du29ZNqKj/&#10;w4N+/fVXVASF+jOv4Fvy165bf+PGDRZivXv1ioqKtJVeuHChTdsOLC2DwRjI2Oyr0+ktFvyUjk6d&#10;Om3a+DNqc9HiJay+fv75l1vHZiDpRGVlunnzPmIpDhzwcEhIiK20Dq8rO7zgywyo21qdU7qy0kTG&#10;jv1f1tgnTXqdpZXcrKW8iAln2/gHBLM8iW4QxxKNGzeBw8mZs+awDAaHhHMYvGtV6AHVU27hbuqn&#10;3RrCbuq3+7lFVHS/OSGP7koEiIp35bTToN0PAaKi+80JeXRXIkBUvCunnQbtfggQFd1vTsijuxIB&#10;ouJdOe00aPdDgD/EzzeWKVP+vnHTZlQXjl6AAxhQ0Y0bhcHBzJPu01csQ0tlQ2GF7j0eZPk5btwL&#10;I58agUpj4xJZWnCcw/6M31DpjBnvlf8dot3wir9qzHvv3n2sgyWg/b69e6SCCSH++7v1YGnFxcX1&#10;7/fQHWeqNps1aw4r+h8TEwPncKA2J0x4eR/j5ILsrOznnhuDjhr+OPntt1CDcA7C+AkvoyLDrQuS&#10;IlBpfn5BaGgIKnrqqRHjx70gFcnnnnv+8BH85ILMzMwGjIrvubl54eFhrL52bN/COthDyD0XR1Qn&#10;T36HFREOC48UqL8gIDp//gI6CjjqREBr4aLFrLHzhfgFkJw771OWJz6+gRxTwF1Qw5qjo1CjH4EQ&#10;//jxL7G0Wrdpz+H/vn0ZfHOt0fqzFAFkDk8gZ4NlsGFsAjt7IUzAf1h4HJ7QA6rUr1FqX7sIMAt2&#10;1a5bjvdOVHQcQ7JACMiAAFFRBhDJBCHgOAJERccxJAuEgAwIEBVlAJFMEAKOI0BUdBxDskAIyIAA&#10;UVEGEMkEIeA4Avwh/mHDnmB1D/HNhQu/RaXdUh/IvJKJiq5euxbBCPHnFxSEYju+y+0sWjS/a9d7&#10;bW1CiH/ChFdYTkJgNz4OP0N785atrO40Gs1///snavO11964cAHfqn/q9JlOHfFN9xcuXgwOYmYv&#10;zJ37EWsXf8+efVhDU3l7t23TGpVu2botJDgYFeVdv96ndy9UdPDQoQd69GB198UXn0tdiPPnL5g2&#10;7Z+oFpzP0bhJ46REPMsCih74M6L/eoPh3i4pqM0jR/5s3boVKvplw8b64eGoCFbd0CGPoaLde/bo&#10;ynSsUf/++z60QIEdlDhikeUqqd17sqKcI0eOZpl1ZYhfeGiRUTEcsV3Zd/E748wMvl38iUlNWIAM&#10;ZJ8Uwrd+hEP8hw4dZpmFjAiWkxGRzAlNSGjM0kpKasoSQaYHyw3ID6EQv9TvX2pPCHgGAvRb0TPm&#10;ibys8wgQFev8FNMAPQMBoqJnzBN5WecRICrW+SmmAXoGAkRFz5gn8rLOI0BUrPNTTAP0DAT4Q/yJ&#10;iRCGshnkrd1kN4uKnhk9CgVg2fJ0tbe3VVS+0b3cQoVWhw7tamrdEp07d95gNKAi2PGd2r0bekK1&#10;0WjMys5hncu9YePG6OjoSh8q3ID/z9h/ICTkVhz8jocV0uLi4qefHokObceOnaGhoTUxqdhet2HD&#10;T6gWxKw//fQz1mJZMP9bNMRfUFDw+PAnQUup8IqJMDWNM4QFWzRqi0LhZTB6Xcosvl4UcvaKt06v&#10;qIowtD9/4UJCQvzt7qrjf+r06SZNGqMga7XatWtXy7iiIcQ/9d3pKMIQ4m/brm1y0yZodxDQq7nB&#10;vwLh0rLSNjUSGypEJ0+eaprcpNpsVkwoVCewpnNUXY1VVsK5c6dQN+DkgsW2hxdUdLdmzfcu3cUv&#10;EOIXCJvGxTdixUbjExqxIqobNm7i2/Qt+y5+gaH16dOPL97NrWXSZZWdm1R0pGvR4c42n5Sio70N&#10;15aaTWXc9p2n6MAufj+X7eIXCPE7Axl6QJXxu96VpszGvNVlZ8YYC3d6WYxYxxYv0w1d5sdlp0YZ&#10;cldZTIWudI764kCAqMgBWq2rWAxXF+iyPrIYrtlzxWLWnddnfay7MJnYaA+rWpYTFWt5Aji6N938&#10;1XB1kZe5TKyuRW8q2ld66m/m0hNiVaidyxEgKrocckc7NBuuLbOYi6Wasegv6y69C8pSFam9axAg&#10;KroGZ9l6MZeeMRcf5DJnMZed1p0eYzHd5FInJeciQFR0Lr6yWzdc/daCv6cR1ZXZkG3I+cLLYhMZ&#10;EqVNjZyIAFHRieDKb9piMXHeEit9MVxfZ9bhW5zld5gsikaAP8QPNfBZx6bn5eYpVSrUh6KiooCA&#10;AJZ7OdmXURHU9oda8ahIr9crFEq1+lbaQPULgj+lpWV+fr6o4ttvv8Uq1J+Q2BgUUS0I8fv7+6Oi&#10;evVC/3sc3+AvejrsNIS3oCXH+zt+T1MFpfokzJTLKw47EOJ/4823UUVIzDCZjFqtDyqFBABWhfxW&#10;rVqlpnZDtXbu3MUSLV+2Iu96HqoFVSAmTnyVNTqOQwGEgeKnooDdUaOegXQEtAEc53DxIv6VDOde&#10;nD93mmNeZVdJ6XIfHOqAmoVCD2fPnUNFUI2ClVIjl4cWQ27Jfx+Ww5rKr1m6QtNQDlM8NgBeAJlD&#10;ExJZBg0cgCo2a37PiRMnUVFCfDykGaGitKFD0tOXoaLpM96DI15QUWRkRHYWftvgGFS5Cj2gckNX&#10;G4oKjTXXRIbLpL+6UAYzZEI+BIiK8mHpfEsKlb9CxXy8l9S/RXfBy2KSpEKNnYoAUdGp8MptXKFS&#10;+uJ50lJ7gpCGxVQgVYvaOw8BoqLzsHWKZXXYMC+FDLNmpaIx3ykuklEuBGSYVK5+SYkTAVXgvUp1&#10;JKdyFTWFl5mRR+64bbLAgwBRkQc1YR3zteumE+fMN4q8zGb5rStUqpCHHL8xWry8vRRa+d0ji7wI&#10;EBV5kWPrlS1eVzT986K35tx8Y3bZ8p/MOXkWk4wvSBTeoQ8pVKEO+q1QhyrU+HHrDlomdT4EnBJX&#10;7Nmz955f8QPrfX19redyYxdsnM/JvoKKIMQP8VbWCNu0bg0xSVspqICiAC6sCFVys5ZwqDiqWC80&#10;tODGDVSU2u3+8rhi2ZJ1ZSt+rtpG4aNVd7xHfX8HZXiIol6IMiTQyxtPgRA5i8bcdF3WXEdi/arA&#10;rj6JH4rsjq8ZFChgKW7ZsvXzz/+jgKIDNhckZsCflUocn4kTX+ncuRNq9oUXxuXlXUdFUZGR2Tk5&#10;qKhD+/avvzEJFc2Z8/Fvv+HLGFJKli5dzBodRJg5dvE7hYqyh/iBUX379meNHBIDWFT09WMeRwGn&#10;erCybQRC/GPHPGv3iAhLUUnRlLmmM1gmg9pbFROpjK6vCAnUdG6juqeJQqNG6pLYXfsWsz5rriFv&#10;hZeF6xlYofCJn6UKut9uP440WLnqO4GDVQQsHzp4oGZpjIrWMKGsL2U4X4QjA+a5557/8quvUWca&#10;Noy5fBm/NwQHB924wdyNXVpSyEFFekB1ZLHhuooAP79nh8CdEBEbjKbzVwy/HdL/vKto6ic30l4q&#10;HDtF/8tOc2GRpbjUS/xzLOT6RY5R+Xfm816piXc2D/kcu5u1iIpOmX1l0wR1D/w5qkZ/5qt5JZ8t&#10;L3zq9cIXppbMWwy/LY37RSWyQqxfGzfVO/RhL4W0Z12FOkob/55Thk1GHUCAqOgAeGxVeOz0HTFQ&#10;4YvnNKN6lvxC/dZ9ZUvXF//rK+Pxs2LcUniHaBu+qYkYI6ZxRRuFJvpFpQ9+ZJoUO9RWZgSIijID&#10;esecIjjQ/7VnJbGxXNeiNxhPWKl45cbxj3cO/2hn2vKD//f75bWnru3NuXnWaK6+1RBIH/mMT+Ov&#10;4TWMQinMfIXSt5lP0ifeIXAwI/K+xFlAkF1xCBAVxeHE1cq7TbL6PpvKriJMqVsnQ6uMi6uNZp3J&#10;bLxy47/bT3+7/vis1X9OX3Fw8pqj7x/N2lJmvFNTQ6Hyu0cbP0Ob+Im6/ggvJbKHS6mN08ZN90mY&#10;pQroKKJ/alILCBAVnQm62lv7SC9FsOQEbmVMBLiVU1TtMdUM24b1+dk3T57O3bfhxCef73n6y73P&#10;7Tiz4HLB8bySyzqTSel/jyZ6gn/LDb7NfvCJf08T9Zwm6nmIWPg1/9G36XLvkF4USHTmZDtqm6jo&#10;KILC+qrYKL9nh1qLeIu/fLQKtRqIp6u87yHK0KCw7NqBSz+kH35n+R9vrjn2/qaT/864+F1uSZZS&#10;E60K7qmOeFYdMdr64KoOl/pqR7yz1FIuBPjjiocPH2E5Aad8r/8Rr0sfFRWVnZ2NKoaHh2/e9Asq&#10;+m3vvueff5HVnexxxVat2x09egzt7rHHHv1u1Qqp6Jd8OF+/LUOklnezpIAPJhXp8r74bayl/AwD&#10;KRfUNGgf83CPxs9YfxDCD0uLxUsJOW7O+s4VWAYLFy2CKLkU32+3nfnB+71790IVIeSr0+lQ0Rtv&#10;vP7E8GGoyFqon1H5/91pM77/Hj+DAPYH5+RcRQ1CaYiSEjxTBdrnX78aAsX/JV78VISCGlCnAO1u&#10;6NDH5s3F5+Cdv0/98suvUK3Q0JD8/AKW/1mZlwSGhh4sAbHgggI8M6bcFKoFf2/fofPBg4fQ7kaM&#10;eHLxovkSQfYynr5QMv3f5utCztyx6TtysDat7+ncjDVHOUMOgdrwkR1n+yo0hi2veZVdV0S2VwQ1&#10;VATFKcKbK3wkLxHhwc6e/eGk195A2whkVkkF8E77BfO/6dOnN6p+f7ceZ86cQUUCu/gHDnj4iy/+&#10;jWrNmPHeJ4zjTKAoDJSGYY2Cj4pO+bL09fGFVY5+IiOYeY9KpZAzLIPlf0dBgYwHDi0wpVYzd8r7&#10;+eKVcoTXlndSnPYRfAHZKioTY+CPucV45p2YRQz3Uji2xlJyzXJlryXvpPn4ctO+Ocatrxt/eNKw&#10;7hnToW+8ivEvezHGxbdB89rEq6MtQ0JDWHPqzZVLKLxIWN6qVEJrlSPVBjpyChUdhLsOqisVmodT&#10;vds0sz80pVLha03TKdGLuoWiBtUqrUqp9tJVycyC/DhjmZWc146a/vhcv3KwYcUA4/bJplPrLVkH&#10;LIWXrY+ydFVHQPJvA8cAJCo6hp9obYXa23f0I8pwOzsqFAG+Cj9fC6SYmpg/Rez26a3QABUtZQXM&#10;lmajpTjHfHaDafc0w+ZJxo0vGXe8YynCE6btdkcNZEGAqCgLjKKMqBIbalLtZMOpIsOVoUEGsw7i&#10;FqKMYo3U3j5KhcpSmmvfAtwtDcWWwovmc5vNZ6xv2owHjxe9+6lu7VbThUxzbr6lTCf9zZH9bqmF&#10;LQJERReuCqVSO6S3qknFSaNYz4qQIC9/vzJDUUEp/p5ZjLs+3rei/KV4eU+WBUvBOS+zRb99v/HA&#10;sdKvVxVN/KDo/z4smfVt6cIf9Nv3wX5op+yEFjOeu6MNUdGl86wI9Pef+IxCq2H2qlErvL0NpjKH&#10;7opK67sly80saWODsAfcAcsrD8CbH73enJ1ryDii+25jyZwFhWPfufnitNIvV5rOXbbAycYu/iEl&#10;bSQ2raWEdR3siludqMgNHaeiMipcO6gnK+ivDAuGcKDJYjQ58B7FVxNoda4ok9NFVM1sNl3J0a3b&#10;dvPV92++MNWw+3c5jZMtJ71BheL5cFg8et1gbIG3fhFbv5WZF8tg+d9RtVtxReZ14cIFlgz8Z/kh&#10;IBK7nJRKzcAeyqBbbLG5vFtYaysW6a6b+fYE3zLo6w3GLZYSEb8VxTpdpZ3JDCVC9CKoKDyhHD2D&#10;ChyUwJo1szMqCfF5yaXFH+K3HqfOuKZOnfbzLxtQYWRkJOukjbCwsB/Xr0G19mVkvPQS8/QCvmwb&#10;gY3YERH1r17FzyEcPHjgD6u/44K6mpLxz5PF0z63vhSpfgXNf09ZL3jX2UUZF7/n7qVn4zHtovsY&#10;0geJenNT0Y0y6SHv1KklHy7Q78APKbjjj8Lf1+/FEer728NfBJbBggWLPv/3f1ijABjRgPD169fz&#10;rl9v0rgxqpjavSfr23Diq6+kpQ1BtY4dO96yZQuWJykp+A5sgaEJG4QSBByhRX4qCiwUjyioIUBF&#10;gUoKYgpqiKIQHK3z7fe6NVutiWlVruAfPlEolYt/fy3nJv/xIQNbvtY0tL1+aS8vI54jhnookooK&#10;Px+fZx7T9u4K9WeERypcUIMvJUX2ghqiJssljei3oktgtu1EodD07w51bqpKFIEB5Rkq10scOhrF&#10;Tx0CyeReZqPkscH3glnwhYy3SjP4QW2ve+3yUHLXd70CUbHWloAqMsznif5eVaqeqTu2hP+EFzaO&#10;vLOBLHB/bagXUJHjghenJnbdKq3G54mHfYb29WKc2MfRIancQYCoWHuLQaGAcowaeNKruDS3yuEU&#10;lGZBtg23WyoFpL35Wh9N5Y03KBTaAT18HusDaUPcvpGiAAJExVpdHlAEcWif24+psLspNhq8uZB/&#10;mGNvVOWXq9JbrfLx0t/Z4y/HAFUqbb9Un7SHvATToOXo6e61QVSs5blXRoZrBvSwOgHB/Vs3nOyb&#10;+E4fkY56KzWQDm4xlljj9LJcSoX24e6+UE7ST0LVLFl6vquMEBVre7rhwa9fN59h/XyG91f4+4E3&#10;0UFNfNWBkM8Nt0kO56y3RMgS0DN300mzCU/RXdv7PN7Pi55LpQEnuTXPZEvuhBSEEVAqfZ4a6PNo&#10;r/Lq/W0aPPRoq7cH3/PmQ83Gd0t6qnV0n8Sw9hEBiQHaMKCZ3U2AGvihCJd1h5TDd0V4zduzi9/z&#10;wyFfj+bQ2QjwxxVhF/+RI3jx3Fat7hk37gXU9d9+23vvvV1Q0ZYt29LTV6Iio9Hw9ddfsrBI6dyZ&#10;Vahf4NiGZ54Zgx3ZYO0EbkesFydduqRs3oRnL8g4VRBTQI+T0JvKSvU3cksu5ZdkQr54kT6vWJcP&#10;pd8MplLIlYPUNIhFNIvo1if5RfOp9cbd0ySV8bfGFe//R/Gsbw2//lE+Fjjnw/flUcogyWWyytUh&#10;rshKuDl9+swHH8xifa1s37aZVag/feUqFs6vvDKRVeQiJDiYddJJ714Ppqcvk3HuuE05REVWQQ04&#10;iwJOpJDqExxdAAcYsLRgB59Ug8Lto6IbsiqXuCLEz3CuTGfcsOX0pcwbocE+4WF+9UL9ggK18PH3&#10;02g1KrVaBVuLq6rCV4bRrC8zFpUYCssMhVCpMSqoiZ862FKWbz4835x73Kss36K76QU/HU16YWbW&#10;oKK6bXPfcU8qI8Lkhb3cWkbGfqhSw7IscGaGgDPNmt9z4sRJtIFAQY20oUPchIr0gOqMlcZv89eM&#10;i1Pe3/zZN/tmfLjz1Sm/PDP++yGjl/cZuuD+/l/2GPTNoKeWvPj6+tmf/bpq7dHf9l88dRaOTioz&#10;6FUBmvDIgKT40LZJYR2Bh9Ybu0+oqvPL6v7/Vj+6QjP8R80TP8M/vHv+S9nmb8r4noqwZgq/cC9V&#10;tVM9FMENIXCv0FqLiXi3aOT7xlgn8ZAfnTqtSXdFZHpr8a64+sfjb0/fLP5HHjzH+vqoA/w1EfX9&#10;I+oHwL00OMgnwE/j768JCNAEB2qDg3zhf+E//XzVGriveqtUKkitU1iz7w0lXroCr5uZlpKrFrNJ&#10;Fd/dSxts+uus8egpdWpHp/KQ7oq2y46o6F5UnDlv9zdLb/9Uc+QeAD/DgHLe3kqtxhuCG2q1Ev4N&#10;T7e+vup6oT4NooKT4kNiooOAwPVC/AIDNPB3aOZIj5J0iYq2cNEDqqQl5PTG+w/iB/pJ7RjueUaj&#10;uazMeAPqFucVZ2bfvHj5xrmL+cdPXN2992L6D3++//Gu8W/++Piz6b2HzO/S94uBTy4+fIy/boBU&#10;96g9UdHd18CZ8/i5uc72G4i65ue/nN0L2RdAgO6KbrQ84FYG97HacuhmEVcGeW25W+f6JSq60ZTC&#10;Y6RZsJSBG/lKrsiNAP9rm6RGybqyMtSf6OioAwf2oaIpU/6+bv2PqOjixUu+PswsxytXJFfLhoIa&#10;Xe5lHjffonnz9u3xE9dm/PN9VhXw2NjYvXt3yz0Lt+0tXXV42uwdTjJu1+yAvskz/9HXbjPxDSDE&#10;D7Xu0fYlJSUjn3rKFzsKFgrgL1uejorA1Lvv/mPQwAGozVmz5rB8+2DmLLU3XvG9TKeLjW2IKubl&#10;5UFlCVSUn58fGsosabv3t90u3cUvcGaGQIgfqDidMT1hYfUgTMZCkyPED1SETd8sg5CEAH6iUog+&#10;wys+VCTbLn7M+uhxq/f9LnQ0iHgacLR0BhWHDXuC5QlrFz/kXUD2BUtrzZrvWVQUGHLfvv03btqM&#10;NkhKTDx77hwqEohpCZSAAFOlJYUcVKQHVI5F6yyV85f4yxA7yyey6yoEiIquQtpePxB7MBpM9lqJ&#10;kkPcH+KKdhPHRdmiRq5CgKjoKqTt9QPRPyOkczt2QRpNi+SIt15OnfVu39nTHnpzQrcWyfVZWe+O&#10;dUXaMiNAVJQZUG5zJ07nQS44tzooQsr49Ld7rfp2+Mhhbfv3atrvwSZPP9Huu/lP/Gf2oNBgnrPo&#10;HHGGdKUiQFSUipiz2l+8XGBw4AE1MS70y48GP9q/ue098P4uCXCThJRUZ7lOduVAgKgoB4py2Cgu&#10;1puFCx8K9vLis53b3mMtjWN7ATm7do6b824/OdwkG85CgKjoLGQl2YU8m+IS/g2Z96fE932wifBv&#10;wnatozu1s55nTJd7IuBIiL8pa0gQHuzRPRWV/vXXiVtnqcP7ifItsJUvKjZt3qrXM3Ovzp7Bd4UK&#10;wApxxddee7N6g8ru9vz6W2xDPH4FVfo7doQq9OBhuZ+VWr9s2Ai5AaxOIerFN80Go3niO79s2sZT&#10;EdxH6712yYjYGOs2RYEL2D73i73/WbCflc8je1xx4qTXV6/+AXVJp9O1aNECzaMAUWhovfDweij+&#10;vfv05ogrjh//UsV6K3enckKXLlseHIxDl52dHRUVhfqfm5sXHs7cVP3H7xkhISFSVwI/FQVC/AJh&#10;09TUbju2b0G9dJ9d/NOmTZ389luokxCzhiQSVNSnd68NG6ynhXJcJaWGQSOWXMmqcmS3aCvw8Pn1&#10;x4+IaX7g0JW/jV8NtEcby05F4UL9Ag7z7eIXg4BtGygcAQsP1aUQPx+knq0FEcWruTw12uChtF0r&#10;/CeiLSJNk8Jgz6JnI1V3vaeJcYu51RtNBgNPRXCodpOUwEyGrDE2P38N7BJ2iwGTEzYIEBXdYlGc&#10;v1jA5wf8UIwIE1sZ0VulTOnATO905S5+vsHWbS2iolvM77ZdeEayXefgrhgUJKFo90vP3QsVbmzN&#10;arXe/Xsz38PZdYMaOI4AUdFxDB21AO82t+46y2dF7Q3nF1cr3CZsB160/vrzc3t+Glvjs2v9mK6d&#10;4vh8IC1ZECAqygKjQ0Ygsg+FT/lMwF0R6rtJ0vX3g0pTvjU+8BuSUlUlwSh7Y6Ki7JBKNlhaZjTx&#10;JoJDYUWt1nWV2iSPjRREI8AfV0xKano7Sm/TGYT4u6d2Y0nXrlmNugfhnXVr16Na165d69TRevZg&#10;xVUZos0vKFCpvIMCA21FJpMpO+dqTIMGtiL4y/IV6QEBAZW5BlWsG42mRwYPQrtbuGhJvXqhqBa0&#10;58hDAC2owgZ1h0VPWbWG3bsmfD5rUC3e0GbP/vDChYsoVrt277lx4waKFcTxmzdv7ufnaysFUVi9&#10;sPDwcHTWzp47D1FrtLsmTZuOZxwPMWHCK9XhrVw/S5YuDw4KqszmqNKuoODG/fd3Rf2/fPlKw5gY&#10;1gpPX7GMY+swPxX5dvHzLTjYgg0bsfl0WVoCG7EFYrsC2QvcIf4lqw5P562jMSKtzeRXu8uLjCRr&#10;s2Z/+Nprb6Aqfn5+UDiDZY1vF79Go9brDajNuXM/YlGRbxd/586d9u3dIwkNRxrTA6oj6MmgC2lo&#10;Z87xb95v2IBZMUQG50SYqHaCh4j21ISFAFGxltcGvD51pOphg6g7T+a1PBDq3kEEiIoOAuioOuxR&#10;hARUbivRkbV8V+T2nBRrIEBUrOUlUVSsv5ZbzOcEVK+JCBebasPXBWm5DAGiosugxjsqKCy7zLUh&#10;A8xBhJBySmt5/uTrnqgoH5ZcluCHYuFNvLKzXXuhIVC519tuM2rgEQgQFWt5mqDmInd8v2njMKqw&#10;WMvzJ1/3/HHFRo2TS0vxr/MG0dEHDuxFnYQwFMv5ffsyUlI6o9KtW7cfOnQIFUFEGJajRoMmf1mU&#10;SiWr1rr1XABfvA6aQBl2vU4X0xAvSwFFA8aOHYM6uWfPr/fd1xUVHfnzhNKnGQNIr5YtWwYE4L8G&#10;YU9Gv15NoLqUrVkBkHfs2NmdUWBBQARdTJpYI0p+u1sI8S9ctBgdGsT3WRvkoT3sIEe3uh89erxP&#10;X2YZnps3bwZWpnNU6xYQXpm+DPUE4orZOTmoqOhmUUBgACqCMD0rrrho8RLW6fFgatyLz3OE+K2H&#10;z/Jdqd17einU6GfkyNEsm5Mnv8PSCguPZIm4/w7Li+VJZBRkS+D+N4xNYInGjv1flsFJk15naUVE&#10;MvvSaP0FRpeVlc0xOyGh9Vk2oxvEsUSJSU1YooEDH+Fwg08lOztHABCN1o8lnTvvU74eObSs3z6M&#10;xQN/Ly0t5bBJD6jyPWGQJULAAQSIig6AR6qEgHwIEBXlw5IsEQIOIEBUdAA8UiUE5EOAqCgflmSJ&#10;EHAAAaKiA+CRKiEgHwJERfmwJEuEgAMI8If4W7Rsc+HCBbTrjh067NiBlwCHA8DnffIZqmWGtBMT&#10;XgsUBKyYqdlsVYFQPmrz1Vdeat4Cr6s/evSzLNxUKiXLk3vv7bJ50y+oIuyg/fKrb1ARFL2AVARU&#10;ZDAY1Gr8mHgY9Zw5s0JCkDLyxcUlWZmZjZs0Rm1CXFelwqtsgCfliNleWq2mqAhPTI+Kinz//X+i&#10;Wnv37uvSJUWq6PTpMw2io/z8keyFSxcvvT35HdaECsAF+SHPP/8/rDlNGzoEFbFqvZc3ZmmNn/Dy&#10;N9/MZ/V15fJ5jkL9rg7xC4Q+v/jyK4GwKUfMFCKtAgaDQ8LkDfFzeCiscujQYb7cBv+AYJbiBzNn&#10;szodNOhRZvQ/kRn9F8gZ8PNnusE3LtASCPEL5FFA9gVr1JCzwXKmc0pXlhaF+B24/ZOqXQRoQ75d&#10;iJzZgH4rOhNdsk0IiEaAqCgaKmpICDgTAaKiM9El24SAaASIiqKhooaEgDMRICo6E12yTQiIRoCo&#10;KBoqakgIOBMBoiKCrl6vZ2EORwY4czrksc0K4oP1S5cuZWTsRz8gYnVfVMQ8EdkavGVcRqNRnvGI&#10;swLRf1bDY8eOsUYtMKHFxcUsrV27dgs4BfUcxLlcrRV/tk1BQYFAfxzZBrIbBEQEQBEo99DjgV6H&#10;Dx9BRzdq1FML5uMpNRzoC6sIAAK0ad2mA0v9008+fvLJJ1Bpt9QHjh49hori4+Oqn35R2So2tuGl&#10;S5dRrYiI+lev4l9PUK9EgKhHDv8eGxtra9N6zIaXF6sSh8CsdeiYcvYsfkxlXFws1E9B/R88eND8&#10;b79CRVCXZMaM91ARFPWA0h4s/FlnENhZIbLniNQBg5BmwVFQw5UDh+o7AgkrK9JXspxp07YDR0GN&#10;RCdk28AQ5EUsuVlL1tASEhqzRGlpw1luTJv+T5aWQKoWFdSQ/Z5EBgkBlyJAvxVdCjd1RgiwECAq&#10;0togBNwCAaKiW0wDOUEIEBVpDRACboEAUdEtpoGcIAT444o5jMrnHoRpZGQk6m1Kl/sgtouKxo55&#10;9osvPkdFApXbr13LrV//zuHy1bQFROXtIiMjbLuD+gkJEGBgXLNm/eupESNQ4YO9+hw7dhwVJSYm&#10;nDt3HhclJJw7j4sAQ9ZKgMILAnHd8+dOxcfH23YnAKMAICBq0qT56TNnUP9jGza8dBmPi8I+/XRG&#10;ef/pM96DohOoQYHT46F9aUkhR6F+fip27959586dHkS8Gq5mZ2ezqMiK75dbaNOmNTpqKKjBOqwi&#10;IiLi6tWrqBac9iGQ3JOVeQmKWUilokBs/ZWXX3r66ZGoJydPnmraFKe3gAjOzIADJFCDAmVEoL0A&#10;FaOiG7LW1Zo13w8aOAD/vkhqcv48XuFl4MAB0979B8sma0IFloEAINBLcnJTDio6UFAjNdVzeQie&#10;AxXlDTG78swM4RA/X0ENPjRmzZrDioMLF9RghfiFz8xYs3Ydy0+BEL9AQQ2+UTtDi34revT3CTlf&#10;dxAgKtaduaSReDQCREWPnj5yvu4gQFSsO3NJI/FoBIiKHj195HzdQYCoWHfmkkbi0QgQFT16+sj5&#10;uoOAU0L8CxcuTEtLcweQINjNckMgxM/n+aOPpf3000+oLpyKwSr3YDZbvvsuHdWC3Jc33nhLoUCq&#10;dkNcC07UUCrxgt4WixemZO0Edvd/+w2+aX3wI49t3LgZ9SQ6KiorOxsV+fn5ssptCLgBpk6eOM7K&#10;ttmXkSEwBawQf8PYxGvX8DyKkJDQwsJC1ObAAQ8LZNuwdvFDtk12Fp6+w7d4rFrcwcpUdogfqMht&#10;VkZFgWoOMHA3CfH7+Aayhly3z8zw6F38kVExMi7UclP0gMr/LVbXNOnMjFqdUaJircJPnRMCFQgQ&#10;FWktEAJugQBR0S2mgZwgBIiKtAYIAbdAgKjoFtNAThACREVaA4SAWyDgrBD/yJH4VvEpU6asXLlS&#10;3qH/9ddfqEGo5sAX4oeCGuXl4m2v1G7dWAU1HuzVl1UDX6C8vE6nQ/fpQ9dQCl6vNyiVyNclhKF6&#10;9+rV5d4U1MmDBw+2a9eOBfL4cS+golat27NKDahUqrfeegPV2rlzV2pqN1S0evUPrOIdkPAQGhoC&#10;mQ+2ikYjJC8YoQIAarOoqDggwB8VZWZmsaYbkhACAgJQLegsPDyMtX4mTnwVFe3ffyCDnYdw6OAB&#10;d9nFLxDinzx5srw8TE5OZgVbuUP8fIX6nbGLX6Aa/969++SNMg8a/Ciru4EDH+HoK33lKgH/+UQa&#10;rR9LMSIyhqNQf1JSU5YWLAPWqBcuWizgPyw8DrjoAVXebwZPtmbxZOc933eioufPoVwjoGwbuZDk&#10;skNU5IKNlAgBuREgKsqNKNkjBLgQICpywUZKhIDcCBAV5UaU7BECXAgQFblgIyVCQG4EaiHEP336&#10;dBlHAXFF2UP8iUkV9ept3u/nFxSkpHSy+m8jguLtQ4c+hg5t7br1ldX4qyuCQQh239aqLtIb9BDH&#10;Rw/bgMSAjP0HYC856kl2Ts7ttAEbJ3v17vXaJDxs3bhJM4h3owbzC/JTUjqjovNwekdCxdEX1bs7&#10;cfJUZTGB6qKi4iIIgnt7e9vaNJlNbdu2TWYcGbBw0RKoG4B6otFqWBv8d+zY2b07XsxeQASRWz9/&#10;P3RqMrOyHurbh7WMp02bSiH+apFVZ4T4BSLCffr0YwV25877lBUR1mj9BYLFWVn4aQLOKNQ/aBAz&#10;xJ8IR+Uo1OgnukEcX6F+gVFD+QIWklD0gKUIIHME1gVUpk3/J6sv2sUv492UTNkgQHHFWl0U9Fux&#10;VuF3q84p26ZWp4OoWKvwu1XndFes1ekgKtYq/NQ5IVCBAFGR1gIh4BYIEBXdYhrICUKAqEhrgBBw&#10;CwQoxI9MQ6NGyazJuZaby4rtHjnyJ2s/++YtW1nvRK7n59cLDUW7g6wACKzXq1fPVqrT665cvoKK&#10;oPGOnbsC/PGt7s1bNF+/7ge0O4FRX75ypWFMDKplTSeIjERFedevh2HOQ+ObRdYQv7o8xF/9gjSD&#10;xk0aJyUmojYhWcLfryLsXr0FvADu9WBPVAtyIWbO/JdUwvXu0+/smbMsrTNnTkg1aKc9d1SUr1A/&#10;7eKvETUWDvHz7eIPCa3PUvxg5mzWjAvs4ndxiF9g1Hy7+KHAAsc6pxC/zN81ZE4sAhRXFIuUU9rR&#10;b0WnwOqRRimuWKvTRlSsVfipc0KgAgGiIq0FQsAtECAqusU0kBOEAFGR1gAh4BYIEBXdYhrICUKg&#10;FkL8soM+bdo01KYjhfpZTrZp3ZpVqL9btx6wpR1VzMu7HhaGROqhMZwRHxR0azO+zQXV7OvXr+/H&#10;iGjP/fjD2zvrbRRj4/D4ODT09/cf+dSIqhp3QhhLlixleXLq1Gn/O/vZq3eXm5vHKnQPW7cbNWqE&#10;Dq24uBhK8d/exV+9BYwaLtao8/OrFD2ornjy5ElWNf6E+Phdu7ZLXXgQ4mcViABTly6ek2rQTnuO&#10;0Ge5Cl+In7s7DkXuXfwcfYGKMwr1s3bxC3soEOIX2HQ/btwEltnx41/i2MUfHBLOhySfVnKzliwn&#10;KcQv87cGmSME6jAC9FuxDk8uDc2TECAqetJska91GAGiYh2eXBqaJyFAVPSk2SJf6zACRMU6PLk0&#10;NE9CgKjoSbNFvtZhBJwV4ncTyEaNGsXyJDs7O5Kx/VzA+UWLl7Cky5et+P2Pg6gUAmWKypr11Zro&#10;dGW3zp3HdyjBqe63S+5Xt1tQULBu/Y8sT8aPf5lRKN6iVKrMZvOtYwZq9GhJGzpk3ryPUZt9+vbL&#10;yDiAiWBcylv+IxekWMyb9xEqOnv2bFRUFCuO37pVqzZtWktdQg1i4kpKSlEnE+ITJk56BTW4Z8+v&#10;993XFRWtWbNu9+49GFbQ3JKddVmqh3ba84VThUP8MrvoHHNARY6xp6UNZ8WRBQr1c3QkrCJcqH9F&#10;+kp5exQI8bdu057VV/rKVQL78fkK9QuMSyDEn5DQmNWdwMkLnVO6ygujsDV6QHUO0ckqISARAaKi&#10;RMCoOSHgHASIis7BlawSAhIRICpKBIyaEwLOQYCo6BxcySohIBEBoqJEwKg5IeAcBIiKzsGVrBIC&#10;EhFwKMQvsS/3ap6ens4R4h827ImVq75DR9Knd68NG35yzSAhxB9aL4LV14oVS4elDZXRkwkTXp73&#10;yWeowdatWx0+9DsqAqAALg43ILGBI8TfrPk9J06cRLuDXfysAgtwIsDZc/h+/M6dO+3bCyF+F138&#10;VHSRg27WDWSQCHjEyHGRfwzCbkB/8nrCN2oBrXKRgJMc/gt3xzIIWvK6wT3ZREVu6EiREJATAfqt&#10;KCeaZIsQ4EaAqMgNHSkSAnIiQFSUE02yRQhwI0BU5IaOFAkBOREgKsqJJtkiBLgRICpyQ0eKhICc&#10;CBAV5USTbBEC3AgQFbmhI0VCQE4EiIpyokm2CAFuBIiK3NCRIiEgJwJERTnRJFuEADcCREVu6EiR&#10;EJATAaKinGiSLUKAGwGiIjd0pEgIyIkAUVFONMkWIcCNAFGRGzpSJATkROD/AReinQCLsjfYAAAA&#10;AElFTkSuQmCCUEsDBBQABgAIAAAAIQCi3M0/4QAAAAoBAAAPAAAAZHJzL2Rvd25yZXYueG1sTI9B&#10;S8NAEIXvgv9hGcGb3U3aBo2ZlFLUUxFsBfG2TaZJaHY2ZLdJ+u/dnuztDe/x3jfZajKtGKh3jWWE&#10;aKZAEBe2bLhC+N6/Pz2DcF5zqVvLhHAhB6v8/i7TaWlH/qJh5ysRStilGqH2vkuldEVNRruZ7YiD&#10;d7S90T6cfSXLXo+h3LQyViqRRjccFmrd0aam4rQ7G4SPUY/refQ2bE/HzeV3v/z82UaE+PgwrV9B&#10;eJr8fxiu+AEd8sB0sGcunWgRkuXLIkQRFjGIq69iFdQBYZ7ECcg8k7cv5H8AAAD//wMAUEsDBBQA&#10;BgAIAAAAIQCqJg6+vAAAACEBAAAZAAAAZHJzL19yZWxzL2Uyb0RvYy54bWwucmVsc4SPQWrDMBBF&#10;94XcQcw+lp1FKMWyN6HgbUgOMEhjWcQaCUkt9e0jyCaBQJfzP/89ph///Cp+KWUXWEHXtCCIdTCO&#10;rYLr5Xv/CSIXZINrYFKwUYZx2H30Z1qx1FFeXMyiUjgrWEqJX1JmvZDH3IRIXJs5JI+lnsnKiPqG&#10;luShbY8yPTNgeGGKyShIk+lAXLZYzf+zwzw7TaegfzxxeaOQzld3BWKyVBR4Mg4fYddEtiCHXr48&#10;NtwBAAD//wMAUEsBAi0AFAAGAAgAAAAhALGCZ7YKAQAAEwIAABMAAAAAAAAAAAAAAAAAAAAAAFtD&#10;b250ZW50X1R5cGVzXS54bWxQSwECLQAUAAYACAAAACEAOP0h/9YAAACUAQAACwAAAAAAAAAAAAAA&#10;AAA7AQAAX3JlbHMvLnJlbHNQSwECLQAUAAYACAAAACEAEPi3H4UDAAAUCAAADgAAAAAAAAAAAAAA&#10;AAA6AgAAZHJzL2Uyb0RvYy54bWxQSwECLQAKAAAAAAAAACEAAfcD6X46AAB+OgAAFAAAAAAAAAAA&#10;AAAAAADrBQAAZHJzL21lZGlhL2ltYWdlMS5wbmdQSwECLQAUAAYACAAAACEAotzNP+EAAAAKAQAA&#10;DwAAAAAAAAAAAAAAAACbQAAAZHJzL2Rvd25yZXYueG1sUEsBAi0AFAAGAAgAAAAhAKomDr68AAAA&#10;IQEAABkAAAAAAAAAAAAAAAAAqUEAAGRycy9fcmVscy9lMm9Eb2MueG1sLnJlbHNQSwUGAAAAAAYA&#10;BgB8AQAAnEIAAAAA&#10;">
                 <v:shapetype id="_x0000_t75" coordsize="21600,21600" o:spt="75" o:preferrelative="t" path="m@4@5l@4@11@9@11@9@5xe" filled="f" stroked="f">
                   <v:stroke joinstyle="miter"/>
                   <v:formulas>
@@ -570,24 +614,38 @@
                   <v:path o:extrusionok="f" gradientshapeok="t" o:connecttype="rect"/>
                   <o:lock v:ext="edit" aspectratio="t"/>
                 </v:shapetype>
-                <v:shape id="Picture 3" o:spid="_x0000_s1027" type="#_x0000_t75" style="position:absolute;top:636;width:24961;height:23774;visibility:visible;mso-wrap-style:square" o:gfxdata="UEsDBBQABgAIAAAAIQDb4fbL7gAAAIUBAAATAAAAW0NvbnRlbnRfVHlwZXNdLnhtbHyQz07DMAyH&#10;70i8Q+QralM4IITa7kDhCAiNB7ASt43WOlEcyvb2pNu4IODoPz9/n1xv9vOkForiPDdwXVagiI23&#10;jocG3rdPxR0oScgWJ8/UwIEENu3lRb09BBKV0ywNjCmFe63FjDSjlD4Q50nv44wpl3HQAc0OB9I3&#10;VXWrjedEnIq03oC27qjHjympx31un0wiTQLq4bS4shrAECZnMGVTvbD9QSnOhDInjzsyuiBXWQP0&#10;r4R18jfgnHvJr4nOknrFmJ5xzhraRtHWf3Kkpfz/yGo5S+H73hkquyhdjr3R8m2lj09svwAAAP//&#10;AwBQSwMEFAAGAAgAAAAhAFr0LFu/AAAAFQEAAAsAAABfcmVscy8ucmVsc2zPwWrDMAwG4Ptg72B0&#10;X5TuUMaI01uh19I+gLGVxCy2jGSy9e1nemrHjpL4P0nD4SetZiPRyNnCruvBUPYcYp4tXC/Htw8w&#10;Wl0ObuVMFm6kcBhfX4Yzra62kC6xqGlKVgtLreUTUf1CyWnHhXKbTCzJ1VbKjMX5LzcTvvf9HuXR&#10;gPHJNKdgQU5hB+ZyK23zHztFL6w81c5zQp6m6P9TMfB3PtPWFCczVQtB9N4U2rp2HOA44NMz4y8A&#10;AAD//wMAUEsDBBQABgAIAAAAIQDpO81vyQAAAOMAAAAPAAAAZHJzL2Rvd25yZXYueG1sRE9La8JA&#10;EL4L/Q/LCL2IbtxWCamrtNYWLxV8YK9DdkxCs7Mhu8b033cLhR7ne89i1dtadNT6yrGG6SQBQZw7&#10;U3Gh4XR8G6cgfEA2WDsmDd/kYbW8GywwM+7Ge+oOoRAxhH2GGsoQmkxKn5dk0U9cQxy5i2sthni2&#10;hTQt3mK4raVKkrm0WHFsKLGhdUn51+FqNXyuX1+6Xe1Gs+o6z9XH++ZscKP1/bB/fgIRqA//4j/3&#10;1sT5UzVLH5VKH+D3pwiAXP4AAAD//wMAUEsBAi0AFAAGAAgAAAAhANvh9svuAAAAhQEAABMAAAAA&#10;AAAAAAAAAAAAAAAAAFtDb250ZW50X1R5cGVzXS54bWxQSwECLQAUAAYACAAAACEAWvQsW78AAAAV&#10;AQAACwAAAAAAAAAAAAAAAAAfAQAAX3JlbHMvLnJlbHNQSwECLQAUAAYACAAAACEA6TvNb8kAAADj&#10;AAAADwAAAAAAAAAAAAAAAAAHAgAAZHJzL2Rvd25yZXYueG1sUEsFBgAAAAADAAMAtwAAAP0CAAAA&#10;AA==&#10;">
-                  <v:imagedata r:id="rId10" o:title="" cropbottom="3118f"/>
+                <v:shape id="Picture 3" o:spid="_x0000_s1027" type="#_x0000_t75" style="position:absolute;left:1983;top:2525;width:20995;height:19996;visibility:visible;mso-wrap-style:square" o:gfxdata="UEsDBBQABgAIAAAAIQDb4fbL7gAAAIUBAAATAAAAW0NvbnRlbnRfVHlwZXNdLnhtbHyQz07DMAyH&#10;70i8Q+QralM4IITa7kDhCAiNB7ASt43WOlEcyvb2pNu4IODoPz9/n1xv9vOkForiPDdwXVagiI23&#10;jocG3rdPxR0oScgWJ8/UwIEENu3lRb09BBKV0ywNjCmFe63FjDSjlD4Q50nv44wpl3HQAc0OB9I3&#10;VXWrjedEnIq03oC27qjHjympx31un0wiTQLq4bS4shrAECZnMGVTvbD9QSnOhDInjzsyuiBXWQP0&#10;r4R18jfgnHvJr4nOknrFmJ5xzhraRtHWf3Kkpfz/yGo5S+H73hkquyhdjr3R8m2lj09svwAAAP//&#10;AwBQSwMEFAAGAAgAAAAhAFr0LFu/AAAAFQEAAAsAAABfcmVscy8ucmVsc2zPwWrDMAwG4Ptg72B0&#10;X5TuUMaI01uh19I+gLGVxCy2jGSy9e1nemrHjpL4P0nD4SetZiPRyNnCruvBUPYcYp4tXC/Htw8w&#10;Wl0ObuVMFm6kcBhfX4Yzra62kC6xqGlKVgtLreUTUf1CyWnHhXKbTCzJ1VbKjMX5LzcTvvf9HuXR&#10;gPHJNKdgQU5hB+ZyK23zHztFL6w81c5zQp6m6P9TMfB3PtPWFCczVQtB9N4U2rp2HOA44NMz4y8A&#10;AAD//wMAUEsDBBQABgAIAAAAIQDbuJvxyQAAAOMAAAAPAAAAZHJzL2Rvd25yZXYueG1sRE/da8Iw&#10;EH8f+D+EG+xtpmZTajXK6D4QBmNTYeztbG5tsbmUJqvdf78MBB/v933L9WAb0VPna8caJuMEBHHh&#10;TM2lhv3u+TYF4QOywcYxafglD+vV6GqJmXEn/qB+G0oRQ9hnqKEKoc2k9EVFFv3YtcSR+3adxRDP&#10;rpSmw1MMt41USTKTFmuODRW2lFdUHLc/VkPzLsPnyyPvn9Rbn+eb+vVrrg5a31wPDwsQgYZwEZ/d&#10;GxPnT9Q0vVcqvYP/nyIAcvUHAAD//wMAUEsBAi0AFAAGAAgAAAAhANvh9svuAAAAhQEAABMAAAAA&#10;AAAAAAAAAAAAAAAAAFtDb250ZW50X1R5cGVzXS54bWxQSwECLQAUAAYACAAAACEAWvQsW78AAAAV&#10;AQAACwAAAAAAAAAAAAAAAAAfAQAAX3JlbHMvLnJlbHNQSwECLQAUAAYACAAAACEA27ib8ckAAADj&#10;AAAADwAAAAAAAAAAAAAAAAAHAgAAZHJzL2Rvd25yZXYueG1sUEsFBgAAAAADAAMAtwAAAP0CAAAA&#10;AA==&#10;">
+                  <v:imagedata r:id="rId10" o:title="" croptop="1566f" cropbottom="1566f"/>
                 </v:shape>
                 <v:shapetype id="_x0000_t202" coordsize="21600,21600" o:spt="202" path="m,l,21600r21600,l21600,xe">
                   <v:stroke joinstyle="miter"/>
                   <v:path gradientshapeok="t" o:connecttype="rect"/>
                 </v:shapetype>
-                <v:shape id="Text Box 7" o:spid="_x0000_s1028" type="#_x0000_t202" style="position:absolute;left:4414;width:14464;height:3016;visibility:visible;mso-wrap-style:square;v-text-anchor:top" o:gfxdata="UEsDBBQABgAIAAAAIQDb4fbL7gAAAIUBAAATAAAAW0NvbnRlbnRfVHlwZXNdLnhtbHyQz07DMAyH&#10;70i8Q+QralM4IITa7kDhCAiNB7ASt43WOlEcyvb2pNu4IODoPz9/n1xv9vOkForiPDdwXVagiI23&#10;jocG3rdPxR0oScgWJ8/UwIEENu3lRb09BBKV0ywNjCmFe63FjDSjlD4Q50nv44wpl3HQAc0OB9I3&#10;VXWrjedEnIq03oC27qjHjympx31un0wiTQLq4bS4shrAECZnMGVTvbD9QSnOhDInjzsyuiBXWQP0&#10;r4R18jfgnHvJr4nOknrFmJ5xzhraRtHWf3Kkpfz/yGo5S+H73hkquyhdjr3R8m2lj09svwAAAP//&#10;AwBQSwMEFAAGAAgAAAAhAFr0LFu/AAAAFQEAAAsAAABfcmVscy8ucmVsc2zPwWrDMAwG4Ptg72B0&#10;X5TuUMaI01uh19I+gLGVxCy2jGSy9e1nemrHjpL4P0nD4SetZiPRyNnCruvBUPYcYp4tXC/Htw8w&#10;Wl0ObuVMFm6kcBhfX4Yzra62kC6xqGlKVgtLreUTUf1CyWnHhXKbTCzJ1VbKjMX5LzcTvvf9HuXR&#10;gPHJNKdgQU5hB+ZyK23zHztFL6w81c5zQp6m6P9TMfB3PtPWFCczVQtB9N4U2rp2HOA44NMz4y8A&#10;AAD//wMAUEsDBBQABgAIAAAAIQAgCGX/yQAAAOMAAAAPAAAAZHJzL2Rvd25yZXYueG1sRE/NasJA&#10;EL4X+g7LFLzVTUKVGF1FAlIRe9B68TZmxyQ0O5tmV0379F1B6HG+/5ktetOIK3WutqwgHkYgiAur&#10;ay4VHD5XrykI55E1NpZJwQ85WMyfn2aYaXvjHV33vhQhhF2GCirv20xKV1Rk0A1tSxy4s+0M+nB2&#10;pdQd3kK4aWQSRWNpsObQUGFLeUXF1/5iFGzy1QfuTolJf5v8fXtett+H40ipwUu/nILw1Pt/8cO9&#10;1mF+OkrjSfI2juH+UwBAzv8AAAD//wMAUEsBAi0AFAAGAAgAAAAhANvh9svuAAAAhQEAABMAAAAA&#10;AAAAAAAAAAAAAAAAAFtDb250ZW50X1R5cGVzXS54bWxQSwECLQAUAAYACAAAACEAWvQsW78AAAAV&#10;AQAACwAAAAAAAAAAAAAAAAAfAQAAX3JlbHMvLnJlbHNQSwECLQAUAAYACAAAACEAIAhl/8kAAADj&#10;AAAADwAAAAAAAAAAAAAAAAAHAgAAZHJzL2Rvd25yZXYueG1sUEsFBgAAAAADAAMAtwAAAP0CAAAA&#10;AA==&#10;" filled="f" stroked="f" strokeweight=".5pt">
+                <v:shape id="Text Box 7" o:spid="_x0000_s1028" type="#_x0000_t202" style="position:absolute;left:1085;top:22275;width:22915;height:3017;visibility:visible;mso-wrap-style:square;v-text-anchor:top" o:gfxdata="UEsDBBQABgAIAAAAIQDb4fbL7gAAAIUBAAATAAAAW0NvbnRlbnRfVHlwZXNdLnhtbHyQz07DMAyH&#10;70i8Q+QralM4IITa7kDhCAiNB7ASt43WOlEcyvb2pNu4IODoPz9/n1xv9vOkForiPDdwXVagiI23&#10;jocG3rdPxR0oScgWJ8/UwIEENu3lRb09BBKV0ywNjCmFe63FjDSjlD4Q50nv44wpl3HQAc0OB9I3&#10;VXWrjedEnIq03oC27qjHjympx31un0wiTQLq4bS4shrAECZnMGVTvbD9QSnOhDInjzsyuiBXWQP0&#10;r4R18jfgnHvJr4nOknrFmJ5xzhraRtHWf3Kkpfz/yGo5S+H73hkquyhdjr3R8m2lj09svwAAAP//&#10;AwBQSwMEFAAGAAgAAAAhAFr0LFu/AAAAFQEAAAsAAABfcmVscy8ucmVsc2zPwWrDMAwG4Ptg72B0&#10;X5TuUMaI01uh19I+gLGVxCy2jGSy9e1nemrHjpL4P0nD4SetZiPRyNnCruvBUPYcYp4tXC/Htw8w&#10;Wl0ObuVMFm6kcBhfX4Yzra62kC6xqGlKVgtLreUTUf1CyWnHhXKbTCzJ1VbKjMX5LzcTvvf9HuXR&#10;gPHJNKdgQU5hB+ZyK23zHztFL6w81c5zQp6m6P9TMfB3PtPWFCczVQtB9N4U2rp2HOA44NMz4y8A&#10;AAD//wMAUEsDBBQABgAIAAAAIQAgCGX/yQAAAOMAAAAPAAAAZHJzL2Rvd25yZXYueG1sRE/NasJA&#10;EL4X+g7LFLzVTUKVGF1FAlIRe9B68TZmxyQ0O5tmV0379F1B6HG+/5ktetOIK3WutqwgHkYgiAur&#10;ay4VHD5XrykI55E1NpZJwQ85WMyfn2aYaXvjHV33vhQhhF2GCirv20xKV1Rk0A1tSxy4s+0M+nB2&#10;pdQd3kK4aWQSRWNpsObQUGFLeUXF1/5iFGzy1QfuTolJf5v8fXtett+H40ipwUu/nILw1Pt/8cO9&#10;1mF+OkrjSfI2juH+UwBAzv8AAAD//wMAUEsBAi0AFAAGAAgAAAAhANvh9svuAAAAhQEAABMAAAAA&#10;AAAAAAAAAAAAAAAAAFtDb250ZW50X1R5cGVzXS54bWxQSwECLQAUAAYACAAAACEAWvQsW78AAAAV&#10;AQAACwAAAAAAAAAAAAAAAAAfAQAAX3JlbHMvLnJlbHNQSwECLQAUAAYACAAAACEAIAhl/8kAAADj&#10;AAAADwAAAAAAAAAAAAAAAAAHAgAAZHJzL2Rvd25yZXYueG1sUEsFBgAAAAADAAMAtwAAAP0CAAAA&#10;AA==&#10;" filled="f" stroked="f" strokeweight=".5pt">
                   <v:textbox>
                     <w:txbxContent>
                       <w:p>
                         <w:pPr>
                           <w:ind w:left="200"/>
+                          <w:jc w:val="center"/>
                           <w:rPr>
-                            <w:rFonts w:ascii="Aptos" w:eastAsia="Microsoft JhengHei" w:hAnsi="Aptos"/>
                             <w:color w:val="F04E69"/>
                           </w:rPr>
                         </w:pPr>
+                        <w:r>
+                          <w:rPr>
+                            <w:rFonts w:eastAsia="DengXian"/>
+                            <w:lang w:eastAsia="zh-CN"/>
+                          </w:rPr>
+                          <w:t>或</w:t>
+                        </w:r>
+                        <w:r>
+                          <w:rPr>
+                            <w:rFonts w:eastAsia="DengXian" w:hint="eastAsia"/>
+                            <w:lang w:eastAsia="zh-CN"/>
+                          </w:rPr>
+                          <w:t>使用：</w:t>
+                        </w:r>
                         <w:hyperlink r:id="rId11" w:tgtFrame="_blank" w:history="1">
                           <w:r>
                             <w:rPr>
@@ -595,7 +653,7 @@
                               <w:rFonts w:ascii="Aptos" w:eastAsia="Microsoft JhengHei" w:hAnsi="Aptos"/>
                               <w:color w:val="F04E69"/>
                             </w:rPr>
-                            <w:t>qr.link/fwkPK</w:t>
+                            <w:t>qr.link/</w:t>
                           </w:r>
                           <w:r>
                             <w:rPr>
@@ -603,7 +661,7 @@
                               <w:rFonts w:ascii="Aptos" w:eastAsia="Microsoft JhengHei" w:hAnsi="Aptos"/>
                               <w:color w:val="F04E69"/>
                             </w:rPr>
-                            <w:t>4</w:t>
+                            <w:t>KCA</w:t>
                           </w:r>
                           <w:r>
                             <w:rPr>
@@ -611,16 +669,9 @@
                               <w:rFonts w:ascii="Aptos" w:eastAsia="Microsoft JhengHei" w:hAnsi="Aptos"/>
                               <w:color w:val="F04E69"/>
                             </w:rPr>
-                            <w:t>4</w:t>
+                            <w:t>6OT</w:t>
                           </w:r>
                         </w:hyperlink>
-                      </w:p>
-                      <w:p>
-                        <w:pPr>
-                          <w:rPr>
-                            <w:color w:val="F04E69"/>
-                          </w:rPr>
-                        </w:pPr>
                       </w:p>
                     </w:txbxContent>
                   </v:textbox>
@@ -631,21 +682,6 @@
           </mc:Fallback>
         </mc:AlternateContent>
       </w:r>
-    </w:p>
-    <w:p>
-      <w:pPr>
-        <w:pStyle w:val="ListParagraph"/>
-        <w:numPr>
-          <w:ilvl w:val="0"/>
-          <w:numId w:val="7"/>
-        </w:numPr>
-        <w:ind w:rightChars="440" w:right="968"/>
-        <w:rPr>
-          <w:rFonts w:ascii="Aptos" w:eastAsia="Microsoft JhengHei" w:hAnsi="Aptos"/>
-          <w:sz w:val="24"/>
-          <w:szCs w:val="24"/>
-        </w:rPr>
-      </w:pPr>
       <w:r>
         <w:rPr>
           <w:rFonts w:ascii="Aptos" w:eastAsia="Microsoft JhengHei" w:hAnsi="Aptos" w:hint="eastAsia"/>
@@ -679,7 +715,39 @@
           <w:sz w:val="24"/>
           <w:szCs w:val="24"/>
         </w:rPr>
-        <w:t>（或使用網址進入）</w:t>
+        <w:t>（或使用</w:t>
+      </w:r>
+      <w:r>
+        <w:rPr>
+          <w:rFonts w:ascii="DengXian" w:eastAsia="DengXian" w:hAnsi="DengXian" w:hint="eastAsia"/>
+          <w:sz w:val="24"/>
+          <w:szCs w:val="24"/>
+        </w:rPr>
+        <w:t>二維碼</w:t>
+      </w:r>
+      <w:r>
+        <w:rPr>
+          <w:rFonts w:ascii="DengXian" w:eastAsia="DengXian" w:hAnsi="DengXian" w:hint="eastAsia"/>
+          <w:sz w:val="24"/>
+          <w:szCs w:val="24"/>
+        </w:rPr>
+        <w:t>下</w:t>
+      </w:r>
+      <w:r>
+        <w:rPr>
+          <w:rFonts w:ascii="DengXian" w:eastAsia="DengXian" w:hAnsi="DengXian" w:hint="eastAsia"/>
+          <w:sz w:val="24"/>
+          <w:szCs w:val="24"/>
+        </w:rPr>
+        <w:t>的</w:t>
+      </w:r>
+      <w:r>
+        <w:rPr>
+          <w:rFonts w:ascii="DengXian" w:eastAsia="DengXian" w:hAnsi="DengXian" w:hint="eastAsia"/>
+          <w:sz w:val="24"/>
+          <w:szCs w:val="24"/>
+        </w:rPr>
+        <w:t>網址進入）</w:t>
       </w:r>
     </w:p>
     <w:p>
@@ -7655,7 +7723,6 @@
   <w:style w:type="character" w:default="1" w:styleId="DefaultParagraphFont">
     <w:name w:val="Default Paragraph Font"/>
     <w:uiPriority w:val="1"/>
-    <w:semiHidden/>
     <w:unhideWhenUsed/>
   </w:style>
   <w:style w:type="table" w:default="1" w:styleId="TableNormal">

</xml_diff>